<commit_message>
Regenerate Word user guide for v3.13
https://claude.ai/code/session_0131FAs6jpePy9Jo8PPJ4xvS
</commit_message>
<xml_diff>
--- a/Nail_Tracker_User_Guide.docx
+++ b/Nail_Tracker_User_Guide.docx
@@ -2,532 +2,515 @@
 <file path=word/document.xml><?xml version="1.0" encoding="utf-8"?>
 <w:document xmlns:wpc="http://schemas.microsoft.com/office/word/2010/wordprocessingCanvas" xmlns:mo="http://schemas.microsoft.com/office/mac/office/2008/main" xmlns:mc="http://schemas.openxmlformats.org/markup-compatibility/2006" xmlns:mv="urn:schemas-microsoft-com:mac:vml" xmlns:o="urn:schemas-microsoft-com:office:office" xmlns:r="http://schemas.openxmlformats.org/officeDocument/2006/relationships" xmlns:m="http://schemas.openxmlformats.org/officeDocument/2006/math" xmlns:v="urn:schemas-microsoft-com:vml" xmlns:wp14="http://schemas.microsoft.com/office/word/2010/wordprocessingDrawing" xmlns:wp="http://schemas.openxmlformats.org/drawingml/2006/wordprocessingDrawing" xmlns:w10="urn:schemas-microsoft-com:office:word" xmlns:w="http://schemas.openxmlformats.org/wordprocessingml/2006/main" xmlns:w14="http://schemas.microsoft.com/office/word/2010/wordml" xmlns:wpg="http://schemas.microsoft.com/office/word/2010/wordprocessingGroup" xmlns:wpi="http://schemas.microsoft.com/office/word/2010/wordprocessingInk" xmlns:wne="http://schemas.microsoft.com/office/word/2006/wordml" xmlns:wps="http://schemas.microsoft.com/office/word/2010/wordprocessingShape" mc:Ignorable="w14 wp14">
   <w:body>
-    <w:p/>
-    <w:p/>
-    <w:p/>
-    <w:p/>
-    <w:p/>
-    <w:p/>
     <w:p>
       <w:pPr>
-        <w:jc w:val="center"/>
-      </w:pPr>
-      <w:r>
-        <w:rPr>
-          <w:b/>
-          <w:color w:val="1E40AF"/>
-          <w:sz w:val="72"/>
-        </w:rPr>
-        <w:t>Nail Tracker</w:t>
+        <w:pStyle w:val="Heading1"/>
+      </w:pPr>
+      <w:r>
+        <w:t>Nail Tracker — User Guide</w:t>
       </w:r>
     </w:p>
     <w:p>
-      <w:pPr>
-        <w:jc w:val="center"/>
-      </w:pPr>
-      <w:r>
-        <w:rPr>
-          <w:color w:val="64748B"/>
-          <w:sz w:val="48"/>
-        </w:rPr>
-        <w:t>User Guide</w:t>
-      </w:r>
-    </w:p>
-    <w:p/>
-    <w:p>
-      <w:pPr>
-        <w:jc w:val="center"/>
-      </w:pPr>
-      <w:r>
-        <w:rPr>
-          <w:color w:val="64748B"/>
-          <w:sz w:val="28"/>
-        </w:rPr>
-        <w:t>Version 3.0</w:t>
-      </w:r>
-    </w:p>
-    <w:p>
-      <w:pPr>
-        <w:jc w:val="center"/>
-      </w:pPr>
-      <w:r>
-        <w:rPr>
-          <w:color w:val="94A3B8"/>
-          <w:sz w:val="24"/>
-        </w:rPr>
-        <w:t>Summa Orthopaedics Inventory Management System</w:t>
-      </w:r>
-    </w:p>
-    <w:p>
-      <w:r>
-        <w:br w:type="page"/>
-      </w:r>
-    </w:p>
-    <w:p>
-      <w:pPr>
-        <w:pStyle w:val="Heading1"/>
-      </w:pPr>
-      <w:r>
-        <w:t>Table of Contents</w:t>
-      </w:r>
-    </w:p>
-    <w:p>
-      <w:pPr>
-        <w:spacing w:after="40"/>
-      </w:pPr>
-      <w:r>
-        <w:rPr>
-          <w:b/>
-          <w:sz w:val="22"/>
-        </w:rPr>
-        <w:t>1.  Getting Started</w:t>
-      </w:r>
-    </w:p>
-    <w:p>
-      <w:pPr>
-        <w:spacing w:after="40"/>
-      </w:pPr>
-      <w:r>
-        <w:rPr>
-          <w:sz w:val="22"/>
-        </w:rPr>
-        <w:t xml:space="preserve">  1.1  Logging In</w:t>
-      </w:r>
-    </w:p>
-    <w:p>
-      <w:pPr>
-        <w:spacing w:after="40"/>
-      </w:pPr>
-      <w:r>
-        <w:rPr>
-          <w:sz w:val="22"/>
-        </w:rPr>
-        <w:t xml:space="preserve">  1.2  Installing as a Mobile App</w:t>
-      </w:r>
-    </w:p>
-    <w:p>
-      <w:pPr>
-        <w:spacing w:after="40"/>
-      </w:pPr>
-      <w:r>
-        <w:rPr>
-          <w:sz w:val="22"/>
-        </w:rPr>
-        <w:t xml:space="preserve">  1.3  Navigation</w:t>
-      </w:r>
-    </w:p>
-    <w:p>
-      <w:pPr>
-        <w:spacing w:after="40"/>
-      </w:pPr>
-      <w:r>
-        <w:rPr>
-          <w:b/>
-          <w:sz w:val="22"/>
-        </w:rPr>
-        <w:t>2.  Core Workflows</w:t>
-      </w:r>
-    </w:p>
-    <w:p>
-      <w:pPr>
-        <w:spacing w:after="40"/>
-      </w:pPr>
-      <w:r>
-        <w:rPr>
-          <w:sz w:val="22"/>
-        </w:rPr>
-        <w:t xml:space="preserve">  2.1  Receiving Inventory</w:t>
-      </w:r>
-    </w:p>
-    <w:p>
-      <w:pPr>
-        <w:spacing w:after="40"/>
-      </w:pPr>
-      <w:r>
-        <w:rPr>
-          <w:sz w:val="22"/>
-        </w:rPr>
-        <w:t xml:space="preserve">  2.2  Looking Up Items</w:t>
-      </w:r>
-    </w:p>
-    <w:p>
-      <w:pPr>
-        <w:spacing w:after="40"/>
-      </w:pPr>
-      <w:r>
-        <w:rPr>
-          <w:sz w:val="22"/>
-        </w:rPr>
-        <w:t xml:space="preserve">  2.3  Inventory Management</w:t>
-      </w:r>
-    </w:p>
-    <w:p>
-      <w:pPr>
-        <w:spacing w:after="40"/>
-      </w:pPr>
-      <w:r>
-        <w:rPr>
-          <w:sz w:val="22"/>
-        </w:rPr>
-        <w:t xml:space="preserve">  2.4  Banks (Inventory Groups)</w:t>
-      </w:r>
-    </w:p>
-    <w:p>
-      <w:pPr>
-        <w:spacing w:after="40"/>
-      </w:pPr>
-      <w:r>
-        <w:rPr>
-          <w:sz w:val="22"/>
-        </w:rPr>
-        <w:t xml:space="preserve">  2.5  Transfers</w:t>
-      </w:r>
-    </w:p>
-    <w:p>
-      <w:pPr>
-        <w:spacing w:after="40"/>
-      </w:pPr>
-      <w:r>
-        <w:rPr>
-          <w:sz w:val="22"/>
-        </w:rPr>
-        <w:t xml:space="preserve">  2.6  Reports</w:t>
-      </w:r>
-    </w:p>
-    <w:p>
-      <w:pPr>
-        <w:spacing w:after="40"/>
-      </w:pPr>
-      <w:r>
-        <w:rPr>
-          <w:sz w:val="22"/>
-        </w:rPr>
-        <w:t xml:space="preserve">  2.7  Batch Upload</w:t>
-      </w:r>
-    </w:p>
-    <w:p>
-      <w:pPr>
-        <w:spacing w:after="40"/>
-      </w:pPr>
-      <w:r>
-        <w:rPr>
-          <w:sz w:val="22"/>
-        </w:rPr>
-        <w:t xml:space="preserve">  2.8  Distributors</w:t>
-      </w:r>
-    </w:p>
-    <w:p>
-      <w:pPr>
-        <w:spacing w:after="40"/>
-      </w:pPr>
-      <w:r>
-        <w:rPr>
-          <w:b/>
-          <w:sz w:val="22"/>
-        </w:rPr>
-        <w:t>3.  Admin Features</w:t>
-      </w:r>
-    </w:p>
-    <w:p>
-      <w:pPr>
-        <w:spacing w:after="40"/>
-      </w:pPr>
-      <w:r>
-        <w:rPr>
-          <w:sz w:val="22"/>
-        </w:rPr>
-        <w:t xml:space="preserve">  3.1  User Management</w:t>
-      </w:r>
-    </w:p>
-    <w:p>
-      <w:pPr>
-        <w:spacing w:after="40"/>
-      </w:pPr>
-      <w:r>
-        <w:rPr>
-          <w:b/>
-          <w:sz w:val="22"/>
-        </w:rPr>
-        <w:t>4.  Barcode Format</w:t>
-      </w:r>
-    </w:p>
-    <w:p>
-      <w:pPr>
-        <w:spacing w:after="40"/>
-      </w:pPr>
-      <w:r>
-        <w:rPr>
-          <w:b/>
-          <w:sz w:val="22"/>
-        </w:rPr>
-        <w:t>5.  Tips</w:t>
-      </w:r>
-    </w:p>
-    <w:p>
-      <w:r>
-        <w:br w:type="page"/>
-      </w:r>
-    </w:p>
-    <w:p>
-      <w:pPr>
-        <w:pStyle w:val="Heading1"/>
-      </w:pPr>
-      <w:r>
-        <w:t>1. Getting Started</w:t>
-      </w:r>
-    </w:p>
-    <w:p>
-      <w:pPr>
-        <w:pStyle w:val="Heading2"/>
-      </w:pPr>
-      <w:r>
-        <w:t>1.1 Logging In</w:t>
-      </w:r>
-    </w:p>
-    <w:p>
-      <w:pPr>
-        <w:spacing w:after="80"/>
-        <w:ind w:left="432"/>
-      </w:pPr>
-      <w:r>
-        <w:t>1. Open the app at your organization's URL (e.g., inventory.phillyshah.com)</w:t>
-      </w:r>
-    </w:p>
-    <w:p>
-      <w:pPr>
-        <w:spacing w:after="80"/>
-        <w:ind w:left="432"/>
-      </w:pPr>
-      <w:r>
-        <w:t>2. Enter your username and password (login is case-insensitive)</w:t>
-      </w:r>
-    </w:p>
-    <w:p>
-      <w:pPr>
-        <w:spacing w:after="80"/>
-        <w:ind w:left="432"/>
-      </w:pPr>
-      <w:r>
-        <w:t>3. Use the eye icon to toggle password visibility if needed</w:t>
-      </w:r>
-    </w:p>
-    <w:p>
-      <w:pPr>
-        <w:spacing w:before="120"/>
-      </w:pPr>
-      <w:r>
-        <w:t>Sessions last 7 days before requiring re-login.</w:t>
-      </w:r>
-    </w:p>
-    <w:p>
-      <w:pPr>
-        <w:pStyle w:val="Heading2"/>
-      </w:pPr>
-      <w:r>
-        <w:t>1.2 Installing as a Mobile App (Recommended)</w:t>
-      </w:r>
-    </w:p>
-    <w:p>
-      <w:r>
-        <w:t>For the best mobile experience, add Nail Tracker to your home screen:</w:t>
-      </w:r>
-    </w:p>
-    <w:p>
-      <w:pPr>
-        <w:pStyle w:val="ListBullet"/>
-        <w:spacing w:after="80"/>
-      </w:pPr>
-      <w:r>
-        <w:t>iPhone/iPad (Safari): Tap the Share button → "Add to Home Screen"</w:t>
-      </w:r>
-    </w:p>
-    <w:p>
-      <w:pPr>
-        <w:pStyle w:val="ListBullet"/>
-        <w:spacing w:after="80"/>
-      </w:pPr>
-      <w:r>
-        <w:t>Android (Chrome): Tap the three-dot menu → "Add to Home Screen"</w:t>
-      </w:r>
-    </w:p>
-    <w:p>
-      <w:r>
-        <w:t>This removes the browser toolbar and gives you a full-screen app experience.</w:t>
-      </w:r>
-    </w:p>
-    <w:p>
-      <w:pPr>
-        <w:pStyle w:val="Heading2"/>
-      </w:pPr>
-      <w:r>
-        <w:t>1.3 Navigation</w:t>
-      </w:r>
-    </w:p>
-    <w:p>
-      <w:pPr>
-        <w:pStyle w:val="ListBullet"/>
-        <w:spacing w:after="80"/>
-      </w:pPr>
-      <w:r>
-        <w:t>Mobile: Bottom tab bar with Receive, Lookup, Inventory, and Reports. Tap "More" for additional features (Banks, Transfer, Distributors, Batch Upload, User Management).</w:t>
-      </w:r>
-    </w:p>
-    <w:p>
-      <w:pPr>
-        <w:pStyle w:val="ListBullet"/>
-        <w:spacing w:after="80"/>
-      </w:pPr>
-      <w:r>
-        <w:t>Desktop: All navigation items appear in the top bar.</w:t>
-      </w:r>
-    </w:p>
-    <w:p>
-      <w:pPr>
-        <w:pStyle w:val="Heading1"/>
-      </w:pPr>
-      <w:r>
-        <w:t>2. Core Workflows</w:t>
-      </w:r>
-    </w:p>
-    <w:p>
-      <w:pPr>
-        <w:pStyle w:val="Heading2"/>
-      </w:pPr>
-      <w:r>
-        <w:t>2.1 Receiving Inventory</w:t>
-      </w:r>
-    </w:p>
-    <w:p>
+      <w:pPr/>
       <w:r>
         <w:rPr>
           <w:b/>
         </w:rPr>
-        <w:t xml:space="preserve">Location: </w:t>
-      </w:r>
-      <w:r>
-        <w:t>Receive tab (home screen)</w:t>
+        <w:t>Version 3.13</w:t>
+      </w:r>
+      <w:r>
+        <w:t xml:space="preserve"> | Summa Orthopaedics Inventory Management System</w:t>
       </w:r>
     </w:p>
     <w:p>
-      <w:r>
-        <w:t>This is where new items enter the system. All received items go to the Home Office distributor automatically.</w:t>
+      <w:pPr>
+        <w:pStyle w:val="Heading2"/>
+      </w:pPr>
+      <w:r>
+        <w:t>Getting Started</w:t>
       </w:r>
     </w:p>
     <w:p>
+      <w:pPr>
+        <w:pStyle w:val="Heading3"/>
+      </w:pPr>
+      <w:r>
+        <w:t>Logging In</w:t>
+      </w:r>
+    </w:p>
+    <w:p>
+      <w:pPr>
+        <w:pStyle w:val="ListNumber"/>
+      </w:pPr>
+      <w:r>
+        <w:t xml:space="preserve">Open the app at your organization's URL (e.g., </w:t>
+      </w:r>
+      <w:r>
+        <w:rPr>
+          <w:rFonts w:ascii="Courier New" w:hAnsi="Courier New"/>
+          <w:sz w:val="18"/>
+        </w:rPr>
+        <w:t>inventory.phillyshah.com</w:t>
+      </w:r>
+      <w:r>
+        <w:t>)</w:t>
+      </w:r>
+    </w:p>
+    <w:p>
+      <w:pPr>
+        <w:pStyle w:val="ListNumber"/>
+      </w:pPr>
+      <w:r>
+        <w:t>Enter your username and password (login is case-insensitive)</w:t>
+      </w:r>
+    </w:p>
+    <w:p>
+      <w:pPr>
+        <w:pStyle w:val="ListNumber"/>
+      </w:pPr>
+      <w:r>
+        <w:t>Use the eye icon to toggle password visibility if needed</w:t>
+      </w:r>
+    </w:p>
+    <w:p>
+      <w:pPr>
+        <w:pStyle w:val="ListNumber"/>
+      </w:pPr>
+      <w:r>
+        <w:t>Sessions last 7 days before requiring re-login</w:t>
+      </w:r>
+    </w:p>
+    <w:p>
+      <w:pPr>
+        <w:pStyle w:val="Heading3"/>
+      </w:pPr>
+      <w:r>
+        <w:t>Installing as a Mobile App (Recommended)</w:t>
+      </w:r>
+    </w:p>
+    <w:p>
+      <w:pPr/>
+      <w:r>
+        <w:t>For the best mobile experience, add Nail Tracker to your home screen:</w:t>
+      </w:r>
+    </w:p>
+    <w:p>
+      <w:pPr>
+        <w:pStyle w:val="ListBullet"/>
+      </w:pPr>
       <w:r>
         <w:rPr>
           <w:b/>
         </w:rPr>
-        <w:t>Scanning a barcode:</w:t>
+        <w:t>iPhone/iPad (Safari):</w:t>
+      </w:r>
+      <w:r>
+        <w:t xml:space="preserve"> Tap the Share button → "Add to Home Screen"</w:t>
       </w:r>
     </w:p>
     <w:p>
       <w:pPr>
-        <w:spacing w:after="80"/>
-        <w:ind w:left="432"/>
-      </w:pPr>
-      <w:r>
-        <w:t>1. Tap the camera area or the "Take Photo" button</w:t>
-      </w:r>
-    </w:p>
-    <w:p>
-      <w:pPr>
-        <w:spacing w:after="80"/>
-        <w:ind w:left="432"/>
-      </w:pPr>
-      <w:r>
-        <w:t>2. Point your camera at the GS1-128 barcode label</w:t>
-      </w:r>
-    </w:p>
-    <w:p>
-      <w:pPr>
-        <w:spacing w:after="80"/>
-        <w:ind w:left="432"/>
-      </w:pPr>
-      <w:r>
-        <w:t>3. The app reads the barcode, parses the GTIN, lot number, and expiry date, and saves the item immediately</w:t>
-      </w:r>
-    </w:p>
-    <w:p>
-      <w:pPr>
-        <w:spacing w:after="80"/>
-        <w:ind w:left="432"/>
-      </w:pPr>
-      <w:r>
-        <w:t>4. A green confirmation card appears with the product name</w:t>
-      </w:r>
-    </w:p>
-    <w:p>
+        <w:pStyle w:val="ListBullet"/>
+      </w:pPr>
       <w:r>
         <w:rPr>
           <w:b/>
         </w:rPr>
-        <w:t>Manual entry:</w:t>
+        <w:t>Android (Chrome):</w:t>
+      </w:r>
+      <w:r>
+        <w:t xml:space="preserve"> Tap the three-dot menu → "Add to Home Screen"</w:t>
       </w:r>
     </w:p>
     <w:p>
-      <w:pPr>
-        <w:spacing w:after="80"/>
-        <w:ind w:left="432"/>
-      </w:pPr>
-      <w:r>
-        <w:t>1. Tap "Manual Entry"</w:t>
+      <w:pPr/>
+      <w:r>
+        <w:t>This removes the browser toolbar and gives you a full-screen app experience.</w:t>
       </w:r>
     </w:p>
     <w:p>
       <w:pPr>
-        <w:spacing w:after="80"/>
-        <w:ind w:left="432"/>
-      </w:pPr>
-      <w:r>
-        <w:t>2. Type or paste the barcode string, e.g., (01)08880089459148(10)J250929-L021(17)300928</w:t>
+        <w:pStyle w:val="Heading3"/>
+      </w:pPr>
+      <w:r>
+        <w:t>Navigation</w:t>
       </w:r>
     </w:p>
     <w:p>
       <w:pPr>
-        <w:spacing w:after="80"/>
-        <w:ind w:left="432"/>
-      </w:pPr>
-      <w:r>
-        <w:t>3. Press Enter or tap "Add"</w:t>
-      </w:r>
-    </w:p>
-    <w:p>
+        <w:pStyle w:val="ListBullet"/>
+      </w:pPr>
       <w:r>
         <w:rPr>
           <w:b/>
         </w:rPr>
-        <w:t>Batch upload (multiple photos):</w:t>
+        <w:t>Mobile:</w:t>
+      </w:r>
+      <w:r>
+        <w:t xml:space="preserve"> Bottom tab bar with Receive, Lookup, Inventory, and Reports. Tap </w:t>
+      </w:r>
+      <w:r>
+        <w:rPr>
+          <w:b/>
+        </w:rPr>
+        <w:t>More</w:t>
+      </w:r>
+      <w:r>
+        <w:t xml:space="preserve"> for additional features (Banks, Transfer, Distributors, Batch Upload, User Management).</w:t>
       </w:r>
     </w:p>
     <w:p>
       <w:pPr>
-        <w:spacing w:after="80"/>
-        <w:ind w:left="432"/>
-      </w:pPr>
-      <w:r>
-        <w:t>1. Tap "Batch Upload"</w:t>
+        <w:pStyle w:val="ListBullet"/>
+      </w:pPr>
+      <w:r>
+        <w:rPr>
+          <w:b/>
+        </w:rPr>
+        <w:t>Desktop:</w:t>
+      </w:r>
+      <w:r>
+        <w:t xml:space="preserve"> All navigation items appear in the top bar.</w:t>
       </w:r>
     </w:p>
     <w:p>
       <w:pPr>
-        <w:spacing w:after="80"/>
-        <w:ind w:left="432"/>
-      </w:pPr>
-      <w:r>
-        <w:t>2. Select multiple barcode photos from your gallery</w:t>
+        <w:pStyle w:val="Heading3"/>
+      </w:pPr>
+      <w:r>
+        <w:t>What's New / Version Badge</w:t>
       </w:r>
     </w:p>
     <w:p>
-      <w:pPr>
-        <w:spacing w:after="80"/>
-        <w:ind w:left="432"/>
-      </w:pPr>
-      <w:r>
-        <w:t>3. Each photo is processed — up to 4 barcodes can be detected per image</w:t>
+      <w:pPr/>
+      <w:r>
+        <w:t xml:space="preserve">Tap the version badge (e.g., </w:t>
+      </w:r>
+      <w:r>
+        <w:rPr>
+          <w:b/>
+        </w:rPr>
+        <w:t>v3.13</w:t>
+      </w:r>
+      <w:r>
+        <w:t xml:space="preserve">) in the header to open the </w:t>
+      </w:r>
+      <w:r>
+        <w:rPr>
+          <w:b/>
+        </w:rPr>
+        <w:t>What's New</w:t>
+      </w:r>
+      <w:r>
+        <w:t xml:space="preserve"> panel, which shows a summary of recent changes.</w:t>
       </w:r>
     </w:p>
     <w:p>
+      <w:pPr>
+        <w:pStyle w:val="Heading2"/>
+      </w:pPr>
+      <w:r>
+        <w:t>Expiry Alerts (Bell Icon)</w:t>
+      </w:r>
+    </w:p>
+    <w:p>
+      <w:pPr/>
+      <w:r>
+        <w:t xml:space="preserve">The </w:t>
+      </w:r>
+      <w:r>
+        <w:rPr>
+          <w:b/>
+        </w:rPr>
+        <w:t>bell icon</w:t>
+      </w:r>
+      <w:r>
+        <w:t xml:space="preserve"> in the top-right header gives you instant visibility into items expiring soon — without needing to visit the Reports page.</w:t>
+      </w:r>
+    </w:p>
+    <w:p>
+      <w:pPr>
+        <w:pStyle w:val="ListBullet"/>
+      </w:pPr>
+      <w:r>
+        <w:t xml:space="preserve">Tap the bell to see all items expiring within </w:t>
+      </w:r>
+      <w:r>
+        <w:rPr>
+          <w:b/>
+        </w:rPr>
+        <w:t>90 days</w:t>
+      </w:r>
+    </w:p>
+    <w:p>
+      <w:pPr>
+        <w:pStyle w:val="ListBullet"/>
+      </w:pPr>
+      <w:r>
+        <w:t>Each alert shows the product name, lot, expiry date, and current location</w:t>
+      </w:r>
+    </w:p>
+    <w:p>
+      <w:pPr>
+        <w:pStyle w:val="ListBullet"/>
+      </w:pPr>
+      <w:r>
+        <w:t xml:space="preserve">Tap an individual alert to dismiss it, or tap </w:t>
+      </w:r>
+      <w:r>
+        <w:rPr>
+          <w:b/>
+        </w:rPr>
+        <w:t>Dismiss All</w:t>
+      </w:r>
+      <w:r>
+        <w:t xml:space="preserve"> to clear everything</w:t>
+      </w:r>
+    </w:p>
+    <w:p>
+      <w:pPr>
+        <w:pStyle w:val="ListBullet"/>
+      </w:pPr>
+      <w:r>
+        <w:t>Dismissed alerts are remembered across sessions</w:t>
+      </w:r>
+    </w:p>
+    <w:p>
+      <w:pPr>
+        <w:pStyle w:val="Heading2"/>
+      </w:pPr>
+      <w:r>
+        <w:t>Core Workflows</w:t>
+      </w:r>
+    </w:p>
+    <w:p>
+      <w:pPr>
+        <w:pStyle w:val="Heading3"/>
+      </w:pPr>
+      <w:r>
+        <w:t>1. Receiving Inventory</w:t>
+      </w:r>
+    </w:p>
+    <w:p>
+      <w:pPr/>
+      <w:r>
+        <w:rPr>
+          <w:b/>
+        </w:rPr>
+        <w:t>Location:</w:t>
+      </w:r>
+      <w:r>
+        <w:t xml:space="preserve"> Receive tab (home screen)</w:t>
+      </w:r>
+    </w:p>
+    <w:p>
+      <w:pPr/>
+      <w:r>
+        <w:t>This is where new items enter the system. All received items go to the Home Office distributor automatically.</w:t>
+      </w:r>
+    </w:p>
+    <w:p>
+      <w:pPr/>
+      <w:r>
+        <w:rPr>
+          <w:b/>
+        </w:rPr>
+        <w:t>Option A — Live Scan (easiest, continuous):</w:t>
+      </w:r>
+    </w:p>
+    <w:p>
+      <w:pPr>
+        <w:pStyle w:val="ListNumber"/>
+      </w:pPr>
+      <w:r>
+        <w:t xml:space="preserve">Tap </w:t>
+      </w:r>
+      <w:r>
+        <w:rPr>
+          <w:b/>
+        </w:rPr>
+        <w:t>Live Scan</w:t>
+      </w:r>
+    </w:p>
+    <w:p>
+      <w:pPr>
+        <w:pStyle w:val="ListNumber"/>
+      </w:pPr>
+      <w:r>
+        <w:t>Point your camera at the GS1-128 barcode label</w:t>
+      </w:r>
+    </w:p>
+    <w:p>
+      <w:pPr>
+        <w:pStyle w:val="ListNumber"/>
+      </w:pPr>
+      <w:r>
+        <w:t>The app detects the barcode automatically — no button press needed</w:t>
+      </w:r>
+    </w:p>
+    <w:p>
+      <w:pPr>
+        <w:pStyle w:val="ListNumber"/>
+      </w:pPr>
+      <w:r>
+        <w:t>A confirmation card appears immediately; keep scanning the next item</w:t>
+      </w:r>
+    </w:p>
+    <w:p>
+      <w:pPr/>
+      <w:r>
+        <w:rPr>
+          <w:b/>
+        </w:rPr>
+        <w:t>Option B — Take a Photo:</w:t>
+      </w:r>
+    </w:p>
+    <w:p>
+      <w:pPr>
+        <w:pStyle w:val="ListNumber"/>
+      </w:pPr>
+      <w:r>
+        <w:t xml:space="preserve">Tap the camera area or </w:t>
+      </w:r>
+      <w:r>
+        <w:rPr>
+          <w:b/>
+        </w:rPr>
+        <w:t>Take Photo</w:t>
+      </w:r>
+    </w:p>
+    <w:p>
+      <w:pPr>
+        <w:pStyle w:val="ListNumber"/>
+      </w:pPr>
+      <w:r>
+        <w:t>Capture the barcode label</w:t>
+      </w:r>
+    </w:p>
+    <w:p>
+      <w:pPr>
+        <w:pStyle w:val="ListNumber"/>
+      </w:pPr>
+      <w:r>
+        <w:t>The app parses the image and saves the item</w:t>
+      </w:r>
+    </w:p>
+    <w:p>
+      <w:pPr/>
+      <w:r>
+        <w:rPr>
+          <w:b/>
+        </w:rPr>
+        <w:t>Option C — Batch Upload (multiple photos):</w:t>
+      </w:r>
+    </w:p>
+    <w:p>
+      <w:pPr>
+        <w:pStyle w:val="ListNumber"/>
+      </w:pPr>
+      <w:r>
+        <w:t xml:space="preserve">Tap </w:t>
+      </w:r>
+      <w:r>
+        <w:rPr>
+          <w:b/>
+        </w:rPr>
+        <w:t>Batch Upload</w:t>
+      </w:r>
+    </w:p>
+    <w:p>
+      <w:pPr>
+        <w:pStyle w:val="ListNumber"/>
+      </w:pPr>
+      <w:r>
+        <w:t>Select multiple barcode photos from your gallery</w:t>
+      </w:r>
+    </w:p>
+    <w:p>
+      <w:pPr>
+        <w:pStyle w:val="ListNumber"/>
+      </w:pPr>
+      <w:r>
+        <w:t>Each photo is processed — up to 4 barcodes can be detected per image</w:t>
+      </w:r>
+    </w:p>
+    <w:p>
+      <w:pPr>
+        <w:pStyle w:val="ListNumber"/>
+      </w:pPr>
+      <w:r>
+        <w:t>All parsed items are saved to Home Office</w:t>
+      </w:r>
+    </w:p>
+    <w:p>
+      <w:pPr/>
+      <w:r>
+        <w:rPr>
+          <w:b/>
+        </w:rPr>
+        <w:t>Option D — Manual Entry:</w:t>
+      </w:r>
+    </w:p>
+    <w:p>
+      <w:pPr>
+        <w:pStyle w:val="ListNumber"/>
+      </w:pPr>
+      <w:r>
+        <w:t xml:space="preserve">Tap </w:t>
+      </w:r>
+      <w:r>
+        <w:rPr>
+          <w:b/>
+        </w:rPr>
+        <w:t>Manual Entry</w:t>
+      </w:r>
+    </w:p>
+    <w:p>
+      <w:pPr>
+        <w:pStyle w:val="ListNumber"/>
+      </w:pPr>
+      <w:r>
+        <w:t xml:space="preserve">Type or paste the barcode string, e.g., </w:t>
+      </w:r>
+      <w:r>
+        <w:rPr>
+          <w:rFonts w:ascii="Courier New" w:hAnsi="Courier New"/>
+          <w:sz w:val="18"/>
+        </w:rPr>
+        <w:t>(01)08880089459148(10)J250929-L021(17)300928</w:t>
+      </w:r>
+    </w:p>
+    <w:p>
+      <w:pPr>
+        <w:pStyle w:val="ListNumber"/>
+      </w:pPr>
+      <w:r>
+        <w:t xml:space="preserve">Press Enter or tap </w:t>
+      </w:r>
+      <w:r>
+        <w:rPr>
+          <w:b/>
+        </w:rPr>
+        <w:t>Add</w:t>
+      </w:r>
+    </w:p>
+    <w:p>
+      <w:pPr>
+        <w:ind w:left="576" w:right="576"/>
+        <w:pBdr>
+          <w:left w:val="single" w:sz="12" w:space="4" w:color="5B9BD5"/>
+        </w:pBdr>
+      </w:pPr>
+      <w:r>
+        <w:rPr>
+          <w:i/>
+          <w:color w:val="404040"/>
+        </w:rPr>
+        <w:t>**Note:** Multiple units of the same product and lot number (e.g., 50 identical screws from the same manufacturing batch) can each be received individually — the system creates a separate inventory record for each scan.</w:t>
+      </w:r>
+    </w:p>
+    <w:p>
+      <w:pPr/>
       <w:r>
         <w:rPr>
           <w:b/>
@@ -536,148 +519,281 @@
       </w:r>
     </w:p>
     <w:p>
-      <w:r>
-        <w:t>After scanning items, you'll see an option: "Assign received items to a bank?"</w:t>
+      <w:pPr/>
+      <w:r>
+        <w:t>After scanning items, you'll see an option: *"Assign received items to a bank?"*</w:t>
       </w:r>
     </w:p>
     <w:p>
       <w:pPr>
-        <w:spacing w:after="80"/>
-        <w:ind w:left="432"/>
-      </w:pPr>
-      <w:r>
-        <w:t>1. Tap the button</w:t>
+        <w:pStyle w:val="ListNumber"/>
+      </w:pPr>
+      <w:r>
+        <w:t>Tap the button</w:t>
       </w:r>
     </w:p>
     <w:p>
       <w:pPr>
-        <w:spacing w:after="80"/>
-        <w:ind w:left="432"/>
-      </w:pPr>
-      <w:r>
-        <w:t>2. Select a bank from the dropdown (only Home Office banks are shown)</w:t>
+        <w:pStyle w:val="ListNumber"/>
+      </w:pPr>
+      <w:r>
+        <w:t>Select a bank from the dropdown (only Home Office banks are shown)</w:t>
       </w:r>
     </w:p>
     <w:p>
       <w:pPr>
-        <w:spacing w:after="80"/>
-        <w:ind w:left="432"/>
-      </w:pPr>
-      <w:r>
-        <w:t>3. Tap "Assign" to add all newly received items to that bank</w:t>
-      </w:r>
-    </w:p>
-    <w:p>
-      <w:pPr>
-        <w:pStyle w:val="Heading2"/>
-      </w:pPr>
-      <w:r>
-        <w:t>2.2 Looking Up Items</w:t>
-      </w:r>
-    </w:p>
-    <w:p>
+        <w:pStyle w:val="ListNumber"/>
+      </w:pPr>
+      <w:r>
+        <w:t xml:space="preserve">Tap </w:t>
+      </w:r>
       <w:r>
         <w:rPr>
           <w:b/>
         </w:rPr>
-        <w:t xml:space="preserve">Location: </w:t>
-      </w:r>
-      <w:r>
-        <w:t>Lookup tab</w:t>
+        <w:t>Assign</w:t>
+      </w:r>
+      <w:r>
+        <w:t xml:space="preserve"> to add all newly received items to that bank</w:t>
       </w:r>
     </w:p>
     <w:p>
-      <w:r>
-        <w:t>Use this to quickly check if an item is already in the system.</w:t>
+      <w:pPr>
+        <w:pStyle w:val="Heading3"/>
+      </w:pPr>
+      <w:r>
+        <w:t>2. Looking Up Items</w:t>
       </w:r>
     </w:p>
     <w:p>
-      <w:pPr>
-        <w:spacing w:after="80"/>
-        <w:ind w:left="432"/>
-      </w:pPr>
-      <w:r>
-        <w:t>1. Scan or photograph a barcode</w:t>
-      </w:r>
-    </w:p>
-    <w:p>
-      <w:pPr>
-        <w:spacing w:after="80"/>
-        <w:ind w:left="432"/>
-      </w:pPr>
-      <w:r>
-        <w:t>2. The app shows whether the item exists, its current distributor, lot, expiry, and full history</w:t>
-      </w:r>
-    </w:p>
-    <w:p>
-      <w:pPr>
-        <w:pStyle w:val="Heading2"/>
-      </w:pPr>
-      <w:r>
-        <w:t>2.3 Inventory Management</w:t>
-      </w:r>
-    </w:p>
-    <w:p>
+      <w:pPr/>
       <w:r>
         <w:rPr>
           <w:b/>
         </w:rPr>
-        <w:t xml:space="preserve">Location: </w:t>
-      </w:r>
-      <w:r>
-        <w:t>Inventory tab</w:t>
+        <w:t>Location:</w:t>
+      </w:r>
+      <w:r>
+        <w:t xml:space="preserve"> Lookup tab</w:t>
       </w:r>
     </w:p>
     <w:p>
-      <w:r>
-        <w:t>Browse, search, and manage all active items in the system.</w:t>
+      <w:pPr/>
+      <w:r>
+        <w:t>Use this to quickly check if an item is already in the system.</w:t>
       </w:r>
     </w:p>
     <w:p>
+      <w:pPr>
+        <w:pStyle w:val="ListNumber"/>
+      </w:pPr>
+      <w:r>
+        <w:t>Scan or photograph a barcode</w:t>
+      </w:r>
+    </w:p>
+    <w:p>
+      <w:pPr>
+        <w:pStyle w:val="ListNumber"/>
+      </w:pPr>
+      <w:r>
+        <w:t>The app shows whether the item exists, its current distributor, lot, expiry, and full history</w:t>
+      </w:r>
+    </w:p>
+    <w:p>
+      <w:pPr>
+        <w:pStyle w:val="ListNumber"/>
+      </w:pPr>
+      <w:r>
+        <w:t>From the result you can transfer it to another distributor or mark it as used (implanted)</w:t>
+      </w:r>
+    </w:p>
+    <w:p>
+      <w:pPr>
+        <w:pStyle w:val="Heading3"/>
+      </w:pPr>
+      <w:r>
+        <w:t>3. Inventory Management</w:t>
+      </w:r>
+    </w:p>
+    <w:p>
+      <w:pPr/>
       <w:r>
         <w:rPr>
           <w:b/>
         </w:rPr>
-        <w:t>Features:</w:t>
+        <w:t>Location:</w:t>
+      </w:r>
+      <w:r>
+        <w:t xml:space="preserve"> Inventory tab</w:t>
       </w:r>
     </w:p>
     <w:p>
-      <w:pPr>
-        <w:pStyle w:val="ListBullet"/>
-        <w:spacing w:after="80"/>
-      </w:pPr>
-      <w:r>
-        <w:t>Search by UDI, lot number, or product name</w:t>
+      <w:pPr/>
+      <w:r>
+        <w:t>Browse, search, and manage all active items in the system.</w:t>
       </w:r>
     </w:p>
     <w:p>
-      <w:pPr>
-        <w:pStyle w:val="ListBullet"/>
-        <w:spacing w:after="80"/>
-      </w:pPr>
-      <w:r>
-        <w:t>Filter by distributor using the dropdown</w:t>
+      <w:pPr/>
+      <w:r>
+        <w:rPr>
+          <w:b/>
+        </w:rPr>
+        <w:t>Searching and filtering:</w:t>
       </w:r>
     </w:p>
     <w:p>
       <w:pPr>
         <w:pStyle w:val="ListBullet"/>
-        <w:spacing w:after="80"/>
-      </w:pPr>
-      <w:r>
-        <w:t>Bulk reassign: Select multiple items with checkboxes, choose a destination distributor from the "Move to:" dropdown, and tap "Reassign"</w:t>
+      </w:pPr>
+      <w:r>
+        <w:rPr>
+          <w:b/>
+        </w:rPr>
+        <w:t>Search bar</w:t>
+      </w:r>
+      <w:r>
+        <w:t xml:space="preserve"> — find items by item number (REF code), lot number, or product name</w:t>
       </w:r>
     </w:p>
     <w:p>
       <w:pPr>
         <w:pStyle w:val="ListBullet"/>
-        <w:spacing w:after="80"/>
-      </w:pPr>
-      <w:r>
-        <w:t>Tap any item to view full details including barcode image, assignment history, and expiry date</w:t>
+      </w:pPr>
+      <w:r>
+        <w:rPr>
+          <w:b/>
+        </w:rPr>
+        <w:t>Filter panel</w:t>
+      </w:r>
+      <w:r>
+        <w:t xml:space="preserve"> (funnel icon) — narrow by distributor or expiry date</w:t>
       </w:r>
     </w:p>
     <w:p>
+      <w:pPr>
+        <w:pStyle w:val="ListBullet"/>
+      </w:pPr>
+      <w:r>
+        <w:rPr>
+          <w:b/>
+        </w:rPr>
+        <w:t>Filter chip</w:t>
+      </w:r>
+      <w:r>
+        <w:t xml:space="preserve"> — when you arrive from a Reports card or Stock by Item drilldown, a blue chip at the top shows what's filtered (e.g., "Item: SO-S50I-SO-026-T @ Home Office"). Tap </w:t>
+      </w:r>
+      <w:r>
+        <w:rPr>
+          <w:b/>
+        </w:rPr>
+        <w:t>Clear</w:t>
+      </w:r>
+      <w:r>
+        <w:t xml:space="preserve"> to reset.</w:t>
+      </w:r>
+    </w:p>
+    <w:p>
+      <w:pPr/>
+      <w:r>
+        <w:rPr>
+          <w:b/>
+        </w:rPr>
+        <w:t>Sorting:</w:t>
+      </w:r>
+    </w:p>
+    <w:p>
+      <w:pPr>
+        <w:pStyle w:val="ListBullet"/>
+      </w:pPr>
+      <w:r>
+        <w:t>Tap any column header to sort by that field; tap again to reverse the order</w:t>
+      </w:r>
+    </w:p>
+    <w:p>
+      <w:pPr>
+        <w:pStyle w:val="ListBullet"/>
+      </w:pPr>
+      <w:r>
+        <w:t>Default sort is by Item Number</w:t>
+      </w:r>
+    </w:p>
+    <w:p>
+      <w:pPr/>
+      <w:r>
+        <w:rPr>
+          <w:b/>
+        </w:rPr>
+        <w:t>Actions:</w:t>
+      </w:r>
+    </w:p>
+    <w:p>
+      <w:pPr>
+        <w:pStyle w:val="ListBullet"/>
+      </w:pPr>
+      <w:r>
+        <w:rPr>
+          <w:b/>
+        </w:rPr>
+        <w:t>Bulk reassign:</w:t>
+      </w:r>
+      <w:r>
+        <w:t xml:space="preserve"> Select multiple items with checkboxes, choose a destination distributor from the "Move to:" dropdown, and tap </w:t>
+      </w:r>
+      <w:r>
+        <w:rPr>
+          <w:b/>
+        </w:rPr>
+        <w:t>Reassign</w:t>
+      </w:r>
+    </w:p>
+    <w:p>
+      <w:pPr>
+        <w:pStyle w:val="ListBullet"/>
+      </w:pPr>
+      <w:r>
+        <w:rPr>
+          <w:b/>
+        </w:rPr>
+        <w:t>Individual reassign:</w:t>
+      </w:r>
+      <w:r>
+        <w:t xml:space="preserve"> Tap the reassign button on any item card</w:t>
+      </w:r>
+    </w:p>
+    <w:p>
+      <w:pPr>
+        <w:pStyle w:val="ListBullet"/>
+      </w:pPr>
+      <w:r>
+        <w:rPr>
+          <w:b/>
+        </w:rPr>
+        <w:t>Export:</w:t>
+      </w:r>
+      <w:r>
+        <w:t xml:space="preserve"> Tap the </w:t>
+      </w:r>
+      <w:r>
+        <w:rPr>
+          <w:b/>
+        </w:rPr>
+        <w:t>Export</w:t>
+      </w:r>
+      <w:r>
+        <w:t xml:space="preserve"> button to download an Excel (.xlsx) file — expired items are highlighted red in the spreadsheet</w:t>
+      </w:r>
+    </w:p>
+    <w:p>
+      <w:pPr>
+        <w:pStyle w:val="ListBullet"/>
+      </w:pPr>
+      <w:r>
+        <w:t>Tap any item row to open its full detail page</w:t>
+      </w:r>
+    </w:p>
+    <w:p>
+      <w:pPr/>
       <w:r>
         <w:rPr>
           <w:b/>
@@ -686,617 +802,1389 @@
       </w:r>
     </w:p>
     <w:p>
-      <w:r>
-        <w:t>Expiry badges appear only when relevant:</w:t>
-      </w:r>
-    </w:p>
-    <w:p>
       <w:pPr>
         <w:pStyle w:val="ListBullet"/>
-        <w:spacing w:after="80"/>
-      </w:pPr>
-      <w:r>
-        <w:t>Red badge: expired or expiring within 90 days</w:t>
-      </w:r>
-    </w:p>
-    <w:p>
-      <w:pPr>
-        <w:pStyle w:val="ListBullet"/>
-        <w:spacing w:after="80"/>
-      </w:pPr>
-      <w:r>
-        <w:t>Yellow badge: expiring within 6 months</w:t>
-      </w:r>
-    </w:p>
-    <w:p>
-      <w:pPr>
-        <w:pStyle w:val="ListBullet"/>
-        <w:spacing w:after="80"/>
-      </w:pPr>
-      <w:r>
-        <w:t>No badge: more than 6 months out</w:t>
-      </w:r>
-    </w:p>
-    <w:p>
-      <w:pPr>
-        <w:pStyle w:val="Heading2"/>
-      </w:pPr>
-      <w:r>
-        <w:t>2.4 Banks (Inventory Groups)</w:t>
-      </w:r>
-    </w:p>
-    <w:p>
+      </w:pPr>
       <w:r>
         <w:rPr>
           <w:b/>
         </w:rPr>
-        <w:t xml:space="preserve">Location: </w:t>
-      </w:r>
-      <w:r>
-        <w:t>More → Banks</w:t>
+        <w:t>Red badge:</w:t>
+      </w:r>
+      <w:r>
+        <w:t xml:space="preserve"> expired or expiring within 90 days</w:t>
       </w:r>
     </w:p>
     <w:p>
-      <w:r>
-        <w:t>Banks let you group items into named sets that travel together. Think of a bank as a tray or kit that goes to a surgery site.</w:t>
-      </w:r>
-    </w:p>
-    <w:p>
+      <w:pPr>
+        <w:pStyle w:val="ListBullet"/>
+      </w:pPr>
       <w:r>
         <w:rPr>
           <w:b/>
         </w:rPr>
-        <w:t>Creating a bank:</w:t>
+        <w:t>Yellow badge:</w:t>
+      </w:r>
+      <w:r>
+        <w:t xml:space="preserve"> expiring within 6 months</w:t>
       </w:r>
     </w:p>
     <w:p>
       <w:pPr>
-        <w:spacing w:after="80"/>
-        <w:ind w:left="432"/>
-      </w:pPr>
-      <w:r>
-        <w:t>1. Tap "Create Bank"</w:t>
+        <w:pStyle w:val="ListBullet"/>
+      </w:pPr>
+      <w:r>
+        <w:t>No badge: more than 6 months out</w:t>
       </w:r>
     </w:p>
     <w:p>
       <w:pPr>
-        <w:spacing w:after="80"/>
-        <w:ind w:left="432"/>
-      </w:pPr>
-      <w:r>
-        <w:t>2. Enter a name, optional description, and select the distributor where the bank currently lives</w:t>
+        <w:pStyle w:val="Heading3"/>
+      </w:pPr>
+      <w:r>
+        <w:t>4. Inventory Item Detail</w:t>
       </w:r>
     </w:p>
     <w:p>
-      <w:pPr>
-        <w:spacing w:after="80"/>
-        <w:ind w:left="432"/>
-      </w:pPr>
-      <w:r>
-        <w:t>3. Tap "Create"</w:t>
-      </w:r>
-    </w:p>
-    <w:p>
+      <w:pPr/>
       <w:r>
         <w:rPr>
           <w:b/>
         </w:rPr>
-        <w:t>Adding items to a bank:</w:t>
+        <w:t>Location:</w:t>
+      </w:r>
+      <w:r>
+        <w:t xml:space="preserve"> Tap any item in Inventory, Distributor Detail, or a drilldown result</w:t>
       </w:r>
     </w:p>
     <w:p>
-      <w:pPr>
-        <w:spacing w:after="80"/>
-        <w:ind w:left="432"/>
-      </w:pPr>
-      <w:r>
-        <w:t>1. Open a bank → tap "Add Items"</w:t>
+      <w:pPr/>
+      <w:r>
+        <w:t>Displays everything about a single item and lets you correct or act on it.</w:t>
       </w:r>
     </w:p>
     <w:p>
-      <w:pPr>
-        <w:spacing w:after="80"/>
-        <w:ind w:left="432"/>
-      </w:pPr>
-      <w:r>
-        <w:t>2. You'll see available items at the same distributor as the bank (items already in another bank won't appear)</w:t>
-      </w:r>
-    </w:p>
-    <w:p>
-      <w:pPr>
-        <w:spacing w:after="80"/>
-        <w:ind w:left="432"/>
-      </w:pPr>
-      <w:r>
-        <w:t>3. Select items and tap "Add"</w:t>
-      </w:r>
-    </w:p>
-    <w:p>
+      <w:pPr/>
       <w:r>
         <w:rPr>
           <w:b/>
         </w:rPr>
-        <w:t>Removing items:</w:t>
+        <w:t>Information shown:</w:t>
       </w:r>
     </w:p>
     <w:p>
-      <w:r>
-        <w:t>Tap the X next to any item in the bank to remove it (the item stays in inventory, just leaves the bank).</w:t>
+      <w:pPr>
+        <w:pStyle w:val="ListBullet"/>
+      </w:pPr>
+      <w:r>
+        <w:t>Product label, Item Number (REF code), GTIN, GTIN Short</w:t>
       </w:r>
     </w:p>
     <w:p>
+      <w:pPr>
+        <w:pStyle w:val="ListBullet"/>
+      </w:pPr>
+      <w:r>
+        <w:t>Lot number, expiry date, current distributor</w:t>
+      </w:r>
+    </w:p>
+    <w:p>
+      <w:pPr>
+        <w:pStyle w:val="ListBullet"/>
+      </w:pPr>
+      <w:r>
+        <w:t xml:space="preserve">Barcode photo (tap to view full screen; press </w:t>
+      </w:r>
       <w:r>
         <w:rPr>
           <w:b/>
         </w:rPr>
-        <w:t>Moving a bank:</w:t>
+        <w:t>ESC</w:t>
+      </w:r>
+      <w:r>
+        <w:t xml:space="preserve"> to close)</w:t>
       </w:r>
     </w:p>
     <w:p>
       <w:pPr>
-        <w:spacing w:after="80"/>
-        <w:ind w:left="432"/>
-      </w:pPr>
-      <w:r>
-        <w:t>1. Open a bank → tap "Move Bank"</w:t>
+        <w:pStyle w:val="ListBullet"/>
+      </w:pPr>
+      <w:r>
+        <w:t>Full assignment history with who moved it, when, and why</w:t>
       </w:r>
     </w:p>
     <w:p>
-      <w:pPr>
-        <w:spacing w:after="80"/>
-        <w:ind w:left="432"/>
-      </w:pPr>
-      <w:r>
-        <w:t>2. Select the destination distributor</w:t>
-      </w:r>
-    </w:p>
-    <w:p>
-      <w:pPr>
-        <w:spacing w:after="80"/>
-        <w:ind w:left="432"/>
-      </w:pPr>
-      <w:r>
-        <w:t>3. All items in the bank are reassigned to the new distributor and an audit trail is created</w:t>
-      </w:r>
-    </w:p>
-    <w:p>
-      <w:pPr>
-        <w:pStyle w:val="Heading2"/>
-      </w:pPr>
-      <w:r>
-        <w:t>2.5 Transfers</w:t>
-      </w:r>
-    </w:p>
-    <w:p>
+      <w:pPr/>
       <w:r>
         <w:rPr>
           <w:b/>
         </w:rPr>
-        <w:t xml:space="preserve">Location: </w:t>
-      </w:r>
-      <w:r>
-        <w:t>More → Transfer</w:t>
-      </w:r>
-    </w:p>
-    <w:p>
-      <w:r>
-        <w:t>Create formal transfer records when moving inventory between distributors.</w:t>
-      </w:r>
-    </w:p>
-    <w:p>
-      <w:r>
-        <w:rPr>
-          <w:b/>
-        </w:rPr>
-        <w:t>Creating a transfer:</w:t>
-      </w:r>
-    </w:p>
-    <w:p>
-      <w:pPr>
-        <w:spacing w:after="80"/>
-        <w:ind w:left="432"/>
-      </w:pPr>
-      <w:r>
-        <w:t>1. Select the source distributor (From)</w:t>
-      </w:r>
-    </w:p>
-    <w:p>
-      <w:pPr>
-        <w:spacing w:after="80"/>
-        <w:ind w:left="432"/>
-      </w:pPr>
-      <w:r>
-        <w:t>2. Select the destination distributor (To)</w:t>
-      </w:r>
-    </w:p>
-    <w:p>
-      <w:pPr>
-        <w:spacing w:after="80"/>
-        <w:ind w:left="432"/>
-      </w:pPr>
-      <w:r>
-        <w:t>3. Select items to transfer</w:t>
-      </w:r>
-    </w:p>
-    <w:p>
-      <w:pPr>
-        <w:spacing w:after="80"/>
-        <w:ind w:left="432"/>
-      </w:pPr>
-      <w:r>
-        <w:t>4. Add an optional note</w:t>
-      </w:r>
-    </w:p>
-    <w:p>
-      <w:pPr>
-        <w:spacing w:after="80"/>
-        <w:ind w:left="432"/>
-      </w:pPr>
-      <w:r>
-        <w:t>5. Submit — a transfer ID is auto-generated (format: TRF-YYYYMMDD-NNNN)</w:t>
-      </w:r>
-    </w:p>
-    <w:p>
-      <w:r>
-        <w:rPr>
-          <w:b/>
-        </w:rPr>
-        <w:t>Printing a transfer report:</w:t>
-      </w:r>
-    </w:p>
-    <w:p>
-      <w:pPr>
-        <w:spacing w:after="80"/>
-        <w:ind w:left="432"/>
-      </w:pPr>
-      <w:r>
-        <w:t>1. Open a transfer from the Reports page or navigate to it directly</w:t>
-      </w:r>
-    </w:p>
-    <w:p>
-      <w:pPr>
-        <w:spacing w:after="80"/>
-        <w:ind w:left="432"/>
-      </w:pPr>
-      <w:r>
-        <w:t>2. Tap "Print" — the report opens in a print-friendly format</w:t>
-      </w:r>
-    </w:p>
-    <w:p>
-      <w:pPr>
-        <w:spacing w:after="80"/>
-        <w:ind w:left="432"/>
-      </w:pPr>
-      <w:r>
-        <w:t>3. The PDF filename defaults to the transfer ID</w:t>
-      </w:r>
-    </w:p>
-    <w:p>
-      <w:pPr>
-        <w:pStyle w:val="Heading2"/>
-      </w:pPr>
-      <w:r>
-        <w:t>2.6 Reports</w:t>
-      </w:r>
-    </w:p>
-    <w:p>
-      <w:r>
-        <w:rPr>
-          <w:b/>
-        </w:rPr>
-        <w:t xml:space="preserve">Location: </w:t>
-      </w:r>
-      <w:r>
-        <w:t>Reports tab</w:t>
-      </w:r>
-    </w:p>
-    <w:p>
-      <w:r>
-        <w:t>View system-wide inventory statistics and history.</w:t>
-      </w:r>
-    </w:p>
-    <w:p>
-      <w:r>
-        <w:rPr>
-          <w:b/>
-        </w:rPr>
-        <w:t>Available reports:</w:t>
-      </w:r>
-    </w:p>
-    <w:p>
-      <w:pPr>
-        <w:pStyle w:val="ListBullet"/>
-        <w:spacing w:after="80"/>
-      </w:pPr>
-      <w:r>
-        <w:t>Summary counts: Total items, items per distributor</w:t>
-      </w:r>
-    </w:p>
-    <w:p>
-      <w:pPr>
-        <w:pStyle w:val="ListBullet"/>
-        <w:spacing w:after="80"/>
-      </w:pPr>
-      <w:r>
-        <w:t>Distributor breakdown: Tap any distributor name to see its full item list (with download CSV and share options)</w:t>
-      </w:r>
-    </w:p>
-    <w:p>
-      <w:pPr>
-        <w:pStyle w:val="ListBullet"/>
-        <w:spacing w:after="80"/>
-      </w:pPr>
-      <w:r>
-        <w:t>Transfer history: Searchable list of all transfers with clickable transfer IDs</w:t>
-      </w:r>
-    </w:p>
-    <w:p>
-      <w:pPr>
-        <w:pStyle w:val="Heading2"/>
-      </w:pPr>
-      <w:r>
-        <w:t>2.7 Batch Upload</w:t>
-      </w:r>
-    </w:p>
-    <w:p>
-      <w:r>
-        <w:rPr>
-          <w:b/>
-        </w:rPr>
-        <w:t xml:space="preserve">Location: </w:t>
-      </w:r>
-      <w:r>
-        <w:t>More → Batch Upload</w:t>
-      </w:r>
-    </w:p>
-    <w:p>
-      <w:r>
-        <w:t>For high-volume receiving when you have many barcode images or a spreadsheet.</w:t>
-      </w:r>
-    </w:p>
-    <w:p>
-      <w:r>
-        <w:rPr>
-          <w:b/>
-        </w:rPr>
-        <w:t>Image upload:</w:t>
-      </w:r>
-    </w:p>
-    <w:p>
-      <w:pPr>
-        <w:pStyle w:val="ListBullet"/>
-        <w:spacing w:after="80"/>
-      </w:pPr>
-      <w:r>
-        <w:t>Select multiple barcode photos — up to 4 barcodes are detected per image</w:t>
-      </w:r>
-    </w:p>
-    <w:p>
-      <w:pPr>
-        <w:pStyle w:val="ListBullet"/>
-        <w:spacing w:after="80"/>
-      </w:pPr>
-      <w:r>
-        <w:t>Each barcode becomes a separate inventory item</w:t>
-      </w:r>
-    </w:p>
-    <w:p>
-      <w:r>
-        <w:rPr>
-          <w:b/>
-        </w:rPr>
-        <w:t>CSV/Excel upload:</w:t>
-      </w:r>
-    </w:p>
-    <w:p>
-      <w:pPr>
-        <w:pStyle w:val="ListBullet"/>
-        <w:spacing w:after="80"/>
-      </w:pPr>
-      <w:r>
-        <w:t>Upload a .csv file with barcode data</w:t>
-      </w:r>
-    </w:p>
-    <w:p>
-      <w:pPr>
-        <w:pStyle w:val="ListBullet"/>
-        <w:spacing w:after="80"/>
-      </w:pPr>
-      <w:r>
-        <w:t>The system parses each row and creates inventory items</w:t>
-      </w:r>
-    </w:p>
-    <w:p>
-      <w:pPr>
-        <w:pStyle w:val="Heading2"/>
-      </w:pPr>
-      <w:r>
-        <w:t>2.8 Distributors</w:t>
-      </w:r>
-    </w:p>
-    <w:p>
-      <w:r>
-        <w:rPr>
-          <w:b/>
-        </w:rPr>
-        <w:t xml:space="preserve">Location: </w:t>
-      </w:r>
-      <w:r>
-        <w:t>More → Distributors</w:t>
-      </w:r>
-    </w:p>
-    <w:p>
-      <w:r>
-        <w:t>View and manage your distributor network.</w:t>
-      </w:r>
-    </w:p>
-    <w:p>
-      <w:pPr>
-        <w:pStyle w:val="ListBullet"/>
-        <w:spacing w:after="80"/>
-      </w:pPr>
-      <w:r>
-        <w:t>See each distributor's active item count</w:t>
-      </w:r>
-    </w:p>
-    <w:p>
-      <w:pPr>
-        <w:pStyle w:val="ListBullet"/>
-        <w:spacing w:after="80"/>
-      </w:pPr>
-      <w:r>
-        <w:t>Tap a distributor to view all their items</w:t>
-      </w:r>
-    </w:p>
-    <w:p>
-      <w:pPr>
-        <w:pStyle w:val="ListBullet"/>
-        <w:spacing w:after="80"/>
-      </w:pPr>
-      <w:r>
-        <w:t>The Home Office distributor is the central receiving location — all scanned items go here first</w:t>
-      </w:r>
-    </w:p>
-    <w:p>
-      <w:pPr>
-        <w:pStyle w:val="Heading1"/>
-      </w:pPr>
-      <w:r>
-        <w:t>3. Admin Features</w:t>
-      </w:r>
-    </w:p>
-    <w:p>
-      <w:pPr>
-        <w:pStyle w:val="Heading2"/>
-      </w:pPr>
-      <w:r>
-        <w:t>3.1 User Management</w:t>
-      </w:r>
-    </w:p>
-    <w:p>
-      <w:r>
-        <w:rPr>
-          <w:b/>
-        </w:rPr>
-        <w:t xml:space="preserve">Location: </w:t>
-      </w:r>
-      <w:r>
-        <w:t>More → User Management (admin only)</w:t>
-      </w:r>
-    </w:p>
-    <w:p>
-      <w:r>
-        <w:rPr>
-          <w:b/>
-        </w:rPr>
-        <w:t>Adding a user:</w:t>
-      </w:r>
-    </w:p>
-    <w:p>
-      <w:pPr>
-        <w:spacing w:after="80"/>
-        <w:ind w:left="432"/>
-      </w:pPr>
-      <w:r>
-        <w:t>1. Tap "Add User"</w:t>
-      </w:r>
-    </w:p>
-    <w:p>
-      <w:pPr>
-        <w:spacing w:after="80"/>
-        <w:ind w:left="432"/>
-      </w:pPr>
-      <w:r>
-        <w:t>2. Enter a username (minimum 2 characters) and password (minimum 6 characters)</w:t>
-      </w:r>
-    </w:p>
-    <w:p>
-      <w:pPr>
-        <w:spacing w:after="80"/>
-        <w:ind w:left="432"/>
-      </w:pPr>
-      <w:r>
-        <w:t>3. Select role: User or Admin</w:t>
-      </w:r>
-    </w:p>
-    <w:p>
-      <w:pPr>
-        <w:spacing w:after="80"/>
-        <w:ind w:left="432"/>
-      </w:pPr>
-      <w:r>
-        <w:t>4. Tap "Create User"</w:t>
-      </w:r>
-    </w:p>
-    <w:p>
-      <w:r>
-        <w:rPr>
-          <w:b/>
-        </w:rPr>
-        <w:t>Managing users:</w:t>
-      </w:r>
-    </w:p>
-    <w:p>
-      <w:pPr>
-        <w:pStyle w:val="ListBullet"/>
-        <w:spacing w:after="80"/>
-      </w:pPr>
-      <w:r>
-        <w:t>Toggle role: Tap the shield icon next to a user to switch between User and Admin (you cannot change your own role)</w:t>
-      </w:r>
-    </w:p>
-    <w:p>
-      <w:pPr>
-        <w:pStyle w:val="ListBullet"/>
-        <w:spacing w:after="80"/>
-      </w:pPr>
-      <w:r>
-        <w:t>Change password: Tap the key icon</w:t>
-      </w:r>
-    </w:p>
-    <w:p>
-      <w:pPr>
-        <w:pStyle w:val="ListBullet"/>
-        <w:spacing w:after="80"/>
-      </w:pPr>
-      <w:r>
-        <w:t>Delete user: Tap the trash icon (you cannot delete yourself or the last admin)</w:t>
-      </w:r>
-    </w:p>
-    <w:p>
-      <w:pPr>
-        <w:pStyle w:val="Heading1"/>
-      </w:pPr>
-      <w:r>
-        <w:t>4. Barcode Format</w:t>
-      </w:r>
-    </w:p>
-    <w:p>
-      <w:r>
-        <w:t>Nail Tracker reads GS1-128 barcodes with these Application Identifiers:</w:t>
+        <w:t>Available actions:</w:t>
       </w:r>
     </w:p>
     <w:tbl>
       <w:tblPr>
-        <w:tblStyle w:val="LightShading-Accent1"/>
+        <w:tblStyle w:val="TableGrid"/>
         <w:tblW w:type="auto" w:w="0"/>
-        <w:jc w:val="center"/>
         <w:tblLook w:firstColumn="1" w:firstRow="1" w:lastColumn="0" w:lastRow="0" w:noHBand="0" w:noVBand="1" w:val="04A0"/>
       </w:tblPr>
       <w:tblGrid>
-        <w:gridCol w:w="2880"/>
-        <w:gridCol w:w="2880"/>
-        <w:gridCol w:w="2880"/>
+        <w:gridCol w:w="4536"/>
+        <w:gridCol w:w="4536"/>
       </w:tblGrid>
       <w:tr>
         <w:tc>
           <w:tcPr>
-            <w:tcW w:type="dxa" w:w="2880"/>
+            <w:tcW w:type="dxa" w:w="4536"/>
+            <w:shd w:val="clear" w:color="auto" w:fill="2E74B5"/>
+            <w:tcBorders>
+              <w:top w:val="single" w:sz="4" w:space="0" w:color="999999"/>
+              <w:left w:val="single" w:sz="4" w:space="0" w:color="999999"/>
+              <w:bottom w:val="single" w:sz="4" w:space="0" w:color="999999"/>
+              <w:right w:val="single" w:sz="4" w:space="0" w:color="999999"/>
+            </w:tcBorders>
           </w:tcPr>
           <w:p>
             <w:r>
               <w:rPr>
                 <w:b/>
+                <w:color w:val="FFFFFF"/>
+                <w:sz w:val="20"/>
+              </w:rPr>
+              <w:t>Action</w:t>
+            </w:r>
+          </w:p>
+        </w:tc>
+        <w:tc>
+          <w:tcPr>
+            <w:tcW w:type="dxa" w:w="4536"/>
+            <w:shd w:val="clear" w:color="auto" w:fill="2E74B5"/>
+            <w:tcBorders>
+              <w:top w:val="single" w:sz="4" w:space="0" w:color="999999"/>
+              <w:left w:val="single" w:sz="4" w:space="0" w:color="999999"/>
+              <w:bottom w:val="single" w:sz="4" w:space="0" w:color="999999"/>
+              <w:right w:val="single" w:sz="4" w:space="0" w:color="999999"/>
+            </w:tcBorders>
+          </w:tcPr>
+          <w:p>
+            <w:r>
+              <w:rPr>
+                <w:b/>
+                <w:color w:val="FFFFFF"/>
+                <w:sz w:val="20"/>
+              </w:rPr>
+              <w:t>Description</w:t>
+            </w:r>
+          </w:p>
+        </w:tc>
+      </w:tr>
+      <w:tr>
+        <w:tc>
+          <w:tcPr>
+            <w:tcW w:type="dxa" w:w="4536"/>
+            <w:shd w:val="clear" w:color="auto" w:fill="F2F7FC"/>
+            <w:tcBorders>
+              <w:top w:val="single" w:sz="4" w:space="0" w:color="999999"/>
+              <w:left w:val="single" w:sz="4" w:space="0" w:color="999999"/>
+              <w:bottom w:val="single" w:sz="4" w:space="0" w:color="999999"/>
+              <w:right w:val="single" w:sz="4" w:space="0" w:color="999999"/>
+            </w:tcBorders>
+          </w:tcPr>
+          <w:p>
+            <w:r>
+              <w:rPr>
+                <w:b/>
+                <w:sz w:val="20"/>
+              </w:rPr>
+              <w:t>Edit</w:t>
+            </w:r>
+          </w:p>
+        </w:tc>
+        <w:tc>
+          <w:tcPr>
+            <w:tcW w:type="dxa" w:w="4536"/>
+            <w:shd w:val="clear" w:color="auto" w:fill="F2F7FC"/>
+            <w:tcBorders>
+              <w:top w:val="single" w:sz="4" w:space="0" w:color="999999"/>
+              <w:left w:val="single" w:sz="4" w:space="0" w:color="999999"/>
+              <w:bottom w:val="single" w:sz="4" w:space="0" w:color="999999"/>
+              <w:right w:val="single" w:sz="4" w:space="0" w:color="999999"/>
+            </w:tcBorders>
+          </w:tcPr>
+          <w:p>
+            <w:r>
+              <w:rPr>
+                <w:sz w:val="20"/>
+              </w:rPr>
+              <w:t>Fix GTIN, Item Number (REF), Lot, Expiry, or Product Label — every change is logged with your username and timestamp</w:t>
+            </w:r>
+          </w:p>
+        </w:tc>
+      </w:tr>
+      <w:tr>
+        <w:tc>
+          <w:tcPr>
+            <w:tcW w:type="dxa" w:w="4536"/>
+            <w:shd w:val="clear" w:color="auto" w:fill="FFFFFF"/>
+            <w:tcBorders>
+              <w:top w:val="single" w:sz="4" w:space="0" w:color="999999"/>
+              <w:left w:val="single" w:sz="4" w:space="0" w:color="999999"/>
+              <w:bottom w:val="single" w:sz="4" w:space="0" w:color="999999"/>
+              <w:right w:val="single" w:sz="4" w:space="0" w:color="999999"/>
+            </w:tcBorders>
+          </w:tcPr>
+          <w:p>
+            <w:r>
+              <w:rPr>
+                <w:b/>
+                <w:sz w:val="20"/>
+              </w:rPr>
+              <w:t>Reassign</w:t>
+            </w:r>
+          </w:p>
+        </w:tc>
+        <w:tc>
+          <w:tcPr>
+            <w:tcW w:type="dxa" w:w="4536"/>
+            <w:shd w:val="clear" w:color="auto" w:fill="FFFFFF"/>
+            <w:tcBorders>
+              <w:top w:val="single" w:sz="4" w:space="0" w:color="999999"/>
+              <w:left w:val="single" w:sz="4" w:space="0" w:color="999999"/>
+              <w:bottom w:val="single" w:sz="4" w:space="0" w:color="999999"/>
+              <w:right w:val="single" w:sz="4" w:space="0" w:color="999999"/>
+            </w:tcBorders>
+          </w:tcPr>
+          <w:p>
+            <w:r>
+              <w:rPr>
+                <w:sz w:val="20"/>
+              </w:rPr>
+              <w:t>Move the item to a different distributor; a Transfer record is created automatically</w:t>
+            </w:r>
+          </w:p>
+        </w:tc>
+      </w:tr>
+      <w:tr>
+        <w:tc>
+          <w:tcPr>
+            <w:tcW w:type="dxa" w:w="4536"/>
+            <w:shd w:val="clear" w:color="auto" w:fill="F2F7FC"/>
+            <w:tcBorders>
+              <w:top w:val="single" w:sz="4" w:space="0" w:color="999999"/>
+              <w:left w:val="single" w:sz="4" w:space="0" w:color="999999"/>
+              <w:bottom w:val="single" w:sz="4" w:space="0" w:color="999999"/>
+              <w:right w:val="single" w:sz="4" w:space="0" w:color="999999"/>
+            </w:tcBorders>
+          </w:tcPr>
+          <w:p>
+            <w:r>
+              <w:rPr>
+                <w:b/>
+                <w:sz w:val="20"/>
+              </w:rPr>
+              <w:t>Mark as Used</w:t>
+            </w:r>
+          </w:p>
+        </w:tc>
+        <w:tc>
+          <w:tcPr>
+            <w:tcW w:type="dxa" w:w="4536"/>
+            <w:shd w:val="clear" w:color="auto" w:fill="F2F7FC"/>
+            <w:tcBorders>
+              <w:top w:val="single" w:sz="4" w:space="0" w:color="999999"/>
+              <w:left w:val="single" w:sz="4" w:space="0" w:color="999999"/>
+              <w:bottom w:val="single" w:sz="4" w:space="0" w:color="999999"/>
+              <w:right w:val="single" w:sz="4" w:space="0" w:color="999999"/>
+            </w:tcBorders>
+          </w:tcPr>
+          <w:p>
+            <w:r>
+              <w:rPr>
+                <w:sz w:val="20"/>
+              </w:rPr>
+              <w:t>Flag the item as implanted; it disappears from active inventory</w:t>
+            </w:r>
+          </w:p>
+        </w:tc>
+      </w:tr>
+      <w:tr>
+        <w:tc>
+          <w:tcPr>
+            <w:tcW w:type="dxa" w:w="4536"/>
+            <w:shd w:val="clear" w:color="auto" w:fill="FFFFFF"/>
+            <w:tcBorders>
+              <w:top w:val="single" w:sz="4" w:space="0" w:color="999999"/>
+              <w:left w:val="single" w:sz="4" w:space="0" w:color="999999"/>
+              <w:bottom w:val="single" w:sz="4" w:space="0" w:color="999999"/>
+              <w:right w:val="single" w:sz="4" w:space="0" w:color="999999"/>
+            </w:tcBorders>
+          </w:tcPr>
+          <w:p>
+            <w:r>
+              <w:rPr>
+                <w:b/>
+                <w:sz w:val="20"/>
+              </w:rPr>
+              <w:t>Delete</w:t>
+            </w:r>
+          </w:p>
+        </w:tc>
+        <w:tc>
+          <w:tcPr>
+            <w:tcW w:type="dxa" w:w="4536"/>
+            <w:shd w:val="clear" w:color="auto" w:fill="FFFFFF"/>
+            <w:tcBorders>
+              <w:top w:val="single" w:sz="4" w:space="0" w:color="999999"/>
+              <w:left w:val="single" w:sz="4" w:space="0" w:color="999999"/>
+              <w:bottom w:val="single" w:sz="4" w:space="0" w:color="999999"/>
+              <w:right w:val="single" w:sz="4" w:space="0" w:color="999999"/>
+            </w:tcBorders>
+          </w:tcPr>
+          <w:p>
+            <w:r>
+              <w:rPr>
+                <w:sz w:val="20"/>
+              </w:rPr>
+              <w:t>Remove the item from the system</w:t>
+            </w:r>
+          </w:p>
+        </w:tc>
+      </w:tr>
+    </w:tbl>
+    <w:p/>
+    <w:p>
+      <w:pPr>
+        <w:ind w:left="576" w:right="576"/>
+        <w:pBdr>
+          <w:left w:val="single" w:sz="12" w:space="4" w:color="5B9BD5"/>
+        </w:pBdr>
+      </w:pPr>
+      <w:r>
+        <w:rPr>
+          <w:i/>
+          <w:color w:val="404040"/>
+        </w:rPr>
+        <w:t>**Tip:** Press **ESC** at any time to close the full-screen barcode image or any open modal.</w:t>
+      </w:r>
+    </w:p>
+    <w:p>
+      <w:pPr>
+        <w:pStyle w:val="Heading3"/>
+      </w:pPr>
+      <w:r>
+        <w:t>5. Banks (Inventory Groups)</w:t>
+      </w:r>
+    </w:p>
+    <w:p>
+      <w:pPr/>
+      <w:r>
+        <w:rPr>
+          <w:b/>
+        </w:rPr>
+        <w:t>Location:</w:t>
+      </w:r>
+      <w:r>
+        <w:t xml:space="preserve"> More → Banks</w:t>
+      </w:r>
+    </w:p>
+    <w:p>
+      <w:pPr/>
+      <w:r>
+        <w:t>Banks let you group items into named sets that travel together — think of a bank as a tray or kit that goes to a surgery site.</w:t>
+      </w:r>
+    </w:p>
+    <w:p>
+      <w:pPr/>
+      <w:r>
+        <w:rPr>
+          <w:b/>
+        </w:rPr>
+        <w:t>Creating a bank:</w:t>
+      </w:r>
+    </w:p>
+    <w:p>
+      <w:pPr>
+        <w:pStyle w:val="ListNumber"/>
+      </w:pPr>
+      <w:r>
+        <w:t xml:space="preserve">Tap </w:t>
+      </w:r>
+      <w:r>
+        <w:rPr>
+          <w:b/>
+        </w:rPr>
+        <w:t>Create Bank</w:t>
+      </w:r>
+    </w:p>
+    <w:p>
+      <w:pPr>
+        <w:pStyle w:val="ListNumber"/>
+      </w:pPr>
+      <w:r>
+        <w:t>Enter a name, optional description, and select the distributor where the bank currently lives</w:t>
+      </w:r>
+    </w:p>
+    <w:p>
+      <w:pPr>
+        <w:pStyle w:val="ListNumber"/>
+      </w:pPr>
+      <w:r>
+        <w:t xml:space="preserve">Tap </w:t>
+      </w:r>
+      <w:r>
+        <w:rPr>
+          <w:b/>
+        </w:rPr>
+        <w:t>Create</w:t>
+      </w:r>
+    </w:p>
+    <w:p>
+      <w:pPr/>
+      <w:r>
+        <w:rPr>
+          <w:b/>
+        </w:rPr>
+        <w:t>Adding items to a bank:</w:t>
+      </w:r>
+    </w:p>
+    <w:p>
+      <w:pPr>
+        <w:pStyle w:val="ListNumber"/>
+      </w:pPr>
+      <w:r>
+        <w:t xml:space="preserve">Open a bank → tap </w:t>
+      </w:r>
+      <w:r>
+        <w:rPr>
+          <w:b/>
+        </w:rPr>
+        <w:t>Add Items</w:t>
+      </w:r>
+    </w:p>
+    <w:p>
+      <w:pPr>
+        <w:pStyle w:val="ListNumber"/>
+      </w:pPr>
+      <w:r>
+        <w:t>Items at the same distributor as the bank are shown (items already in another bank are excluded)</w:t>
+      </w:r>
+    </w:p>
+    <w:p>
+      <w:pPr>
+        <w:pStyle w:val="ListNumber"/>
+      </w:pPr>
+      <w:r>
+        <w:t xml:space="preserve">Select items and tap </w:t>
+      </w:r>
+      <w:r>
+        <w:rPr>
+          <w:b/>
+        </w:rPr>
+        <w:t>Add</w:t>
+      </w:r>
+    </w:p>
+    <w:p>
+      <w:pPr/>
+      <w:r>
+        <w:rPr>
+          <w:b/>
+        </w:rPr>
+        <w:t>Removing items:</w:t>
+      </w:r>
+    </w:p>
+    <w:p>
+      <w:pPr/>
+      <w:r>
+        <w:t xml:space="preserve">Tap the </w:t>
+      </w:r>
+      <w:r>
+        <w:rPr>
+          <w:b/>
+        </w:rPr>
+        <w:t>X</w:t>
+      </w:r>
+      <w:r>
+        <w:t xml:space="preserve"> next to any item in the bank to remove it. The item stays in inventory — it just leaves the bank.</w:t>
+      </w:r>
+    </w:p>
+    <w:p>
+      <w:pPr/>
+      <w:r>
+        <w:rPr>
+          <w:b/>
+        </w:rPr>
+        <w:t>Moving a bank:</w:t>
+      </w:r>
+    </w:p>
+    <w:p>
+      <w:pPr>
+        <w:pStyle w:val="ListNumber"/>
+      </w:pPr>
+      <w:r>
+        <w:t xml:space="preserve">Open a bank → tap </w:t>
+      </w:r>
+      <w:r>
+        <w:rPr>
+          <w:b/>
+        </w:rPr>
+        <w:t>Move Bank</w:t>
+      </w:r>
+    </w:p>
+    <w:p>
+      <w:pPr>
+        <w:pStyle w:val="ListNumber"/>
+      </w:pPr>
+      <w:r>
+        <w:t>Select the destination distributor</w:t>
+      </w:r>
+    </w:p>
+    <w:p>
+      <w:pPr>
+        <w:pStyle w:val="ListNumber"/>
+      </w:pPr>
+      <w:r>
+        <w:t>All items in the bank are reassigned to the new distributor and an audit trail is created</w:t>
+      </w:r>
+    </w:p>
+    <w:p>
+      <w:pPr>
+        <w:pStyle w:val="Heading3"/>
+      </w:pPr>
+      <w:r>
+        <w:t>6. Transfers</w:t>
+      </w:r>
+    </w:p>
+    <w:p>
+      <w:pPr/>
+      <w:r>
+        <w:rPr>
+          <w:b/>
+        </w:rPr>
+        <w:t>Location:</w:t>
+      </w:r>
+      <w:r>
+        <w:t xml:space="preserve"> More → Transfer</w:t>
+      </w:r>
+    </w:p>
+    <w:p>
+      <w:pPr/>
+      <w:r>
+        <w:t>Create formal transfer records when moving inventory between distributors.</w:t>
+      </w:r>
+    </w:p>
+    <w:p>
+      <w:pPr/>
+      <w:r>
+        <w:rPr>
+          <w:b/>
+        </w:rPr>
+        <w:t>Creating a transfer:</w:t>
+      </w:r>
+    </w:p>
+    <w:p>
+      <w:pPr>
+        <w:pStyle w:val="ListNumber"/>
+      </w:pPr>
+      <w:r>
+        <w:t>Select the source distributor (</w:t>
+      </w:r>
+      <w:r>
+        <w:rPr>
+          <w:b/>
+        </w:rPr>
+        <w:t>From</w:t>
+      </w:r>
+      <w:r>
+        <w:t>)</w:t>
+      </w:r>
+    </w:p>
+    <w:p>
+      <w:pPr>
+        <w:pStyle w:val="ListNumber"/>
+      </w:pPr>
+      <w:r>
+        <w:t>Select the destination distributor (</w:t>
+      </w:r>
+      <w:r>
+        <w:rPr>
+          <w:b/>
+        </w:rPr>
+        <w:t>To</w:t>
+      </w:r>
+      <w:r>
+        <w:t>)</w:t>
+      </w:r>
+    </w:p>
+    <w:p>
+      <w:pPr>
+        <w:pStyle w:val="ListNumber"/>
+      </w:pPr>
+      <w:r>
+        <w:t xml:space="preserve">Select items to transfer (use </w:t>
+      </w:r>
+      <w:r>
+        <w:rPr>
+          <w:b/>
+        </w:rPr>
+        <w:t>Select All</w:t>
+      </w:r>
+      <w:r>
+        <w:t xml:space="preserve"> for speed)</w:t>
+      </w:r>
+    </w:p>
+    <w:p>
+      <w:pPr>
+        <w:pStyle w:val="ListNumber"/>
+      </w:pPr>
+      <w:r>
+        <w:t>Add an optional note</w:t>
+      </w:r>
+    </w:p>
+    <w:p>
+      <w:pPr>
+        <w:pStyle w:val="ListNumber"/>
+      </w:pPr>
+      <w:r>
+        <w:t xml:space="preserve">Tap </w:t>
+      </w:r>
+      <w:r>
+        <w:rPr>
+          <w:b/>
+        </w:rPr>
+        <w:t>Confirm Transfer</w:t>
+      </w:r>
+      <w:r>
+        <w:t xml:space="preserve"> — a transfer ID is auto-generated (</w:t>
+      </w:r>
+      <w:r>
+        <w:rPr>
+          <w:rFonts w:ascii="Courier New" w:hAnsi="Courier New"/>
+          <w:sz w:val="18"/>
+        </w:rPr>
+        <w:t>TRF-YYYYMMDD-NNNN</w:t>
+      </w:r>
+      <w:r>
+        <w:t>)</w:t>
+      </w:r>
+    </w:p>
+    <w:p>
+      <w:pPr>
+        <w:ind w:left="576" w:right="576"/>
+        <w:pBdr>
+          <w:left w:val="single" w:sz="12" w:space="4" w:color="5B9BD5"/>
+        </w:pBdr>
+      </w:pPr>
+      <w:r>
+        <w:rPr>
+          <w:i/>
+          <w:color w:val="404040"/>
+        </w:rPr>
+        <w:t>**Note:** When you reassign a single item from its detail page, a Transfer record is also created automatically and appears in Transfer History.</w:t>
+      </w:r>
+    </w:p>
+    <w:p>
+      <w:pPr/>
+      <w:r>
+        <w:rPr>
+          <w:b/>
+        </w:rPr>
+        <w:t>Viewing and printing a transfer:</w:t>
+      </w:r>
+    </w:p>
+    <w:p>
+      <w:pPr>
+        <w:pStyle w:val="ListNumber"/>
+      </w:pPr>
+      <w:r>
+        <w:t>Open the transfer from Reports → Transfer History (or navigate directly to its URL)</w:t>
+      </w:r>
+    </w:p>
+    <w:p>
+      <w:pPr>
+        <w:pStyle w:val="ListNumber"/>
+      </w:pPr>
+      <w:r>
+        <w:t xml:space="preserve">Tap </w:t>
+      </w:r>
+      <w:r>
+        <w:rPr>
+          <w:b/>
+        </w:rPr>
+        <w:t>Print</w:t>
+      </w:r>
+      <w:r>
+        <w:t xml:space="preserve"> — a clean, print-formatted report opens</w:t>
+      </w:r>
+    </w:p>
+    <w:p>
+      <w:pPr>
+        <w:pStyle w:val="ListNumber"/>
+      </w:pPr>
+      <w:r>
+        <w:t>The PDF filename defaults to the transfer ID</w:t>
+      </w:r>
+    </w:p>
+    <w:p>
+      <w:pPr>
+        <w:pStyle w:val="Heading3"/>
+      </w:pPr>
+      <w:r>
+        <w:t>7. Reports</w:t>
+      </w:r>
+    </w:p>
+    <w:p>
+      <w:pPr/>
+      <w:r>
+        <w:rPr>
+          <w:b/>
+        </w:rPr>
+        <w:t>Location:</w:t>
+      </w:r>
+      <w:r>
+        <w:t xml:space="preserve"> Reports tab</w:t>
+      </w:r>
+    </w:p>
+    <w:p>
+      <w:pPr/>
+      <w:r>
+        <w:rPr>
+          <w:b/>
+        </w:rPr>
+        <w:t>Metric cards (clickable):</w:t>
+      </w:r>
+    </w:p>
+    <w:p>
+      <w:pPr/>
+      <w:r>
+        <w:t>Tap any card to jump to a filtered inventory list:</w:t>
+      </w:r>
+    </w:p>
+    <w:p>
+      <w:pPr>
+        <w:pStyle w:val="ListBullet"/>
+      </w:pPr>
+      <w:r>
+        <w:rPr>
+          <w:b/>
+        </w:rPr>
+        <w:t>Total Units</w:t>
+      </w:r>
+      <w:r>
+        <w:t xml:space="preserve"> → all active inventory</w:t>
+      </w:r>
+    </w:p>
+    <w:p>
+      <w:pPr>
+        <w:pStyle w:val="ListBullet"/>
+      </w:pPr>
+      <w:r>
+        <w:rPr>
+          <w:b/>
+        </w:rPr>
+        <w:t>Active Distributors</w:t>
+      </w:r>
+      <w:r>
+        <w:t xml:space="preserve"> → distributor list</w:t>
+      </w:r>
+    </w:p>
+    <w:p>
+      <w:pPr>
+        <w:pStyle w:val="ListBullet"/>
+      </w:pPr>
+      <w:r>
+        <w:rPr>
+          <w:b/>
+        </w:rPr>
+        <w:t>Expiring &lt; 180d</w:t>
+      </w:r>
+      <w:r>
+        <w:t xml:space="preserve"> → items expiring within 6 months</w:t>
+      </w:r>
+    </w:p>
+    <w:p>
+      <w:pPr>
+        <w:pStyle w:val="ListBullet"/>
+      </w:pPr>
+      <w:r>
+        <w:rPr>
+          <w:b/>
+        </w:rPr>
+        <w:t>Expired</w:t>
+      </w:r>
+      <w:r>
+        <w:t xml:space="preserve"> → all expired items</w:t>
+      </w:r>
+    </w:p>
+    <w:p>
+      <w:pPr>
+        <w:pStyle w:val="ListBullet"/>
+      </w:pPr>
+      <w:r>
+        <w:rPr>
+          <w:b/>
+        </w:rPr>
+        <w:t>Unassigned</w:t>
+      </w:r>
+      <w:r>
+        <w:t xml:space="preserve"> → items not yet at a distributor</w:t>
+      </w:r>
+    </w:p>
+    <w:p>
+      <w:pPr/>
+      <w:r>
+        <w:rPr>
+          <w:b/>
+        </w:rPr>
+        <w:t>Stock by Item Number:</w:t>
+      </w:r>
+    </w:p>
+    <w:p>
+      <w:pPr/>
+      <w:r>
+        <w:t xml:space="preserve">Tap the </w:t>
+      </w:r>
+      <w:r>
+        <w:rPr>
+          <w:b/>
+        </w:rPr>
+        <w:t>Stock by Item Number</w:t>
+      </w:r>
+      <w:r>
+        <w:t xml:space="preserve"> card to open a full matrix view:</w:t>
+      </w:r>
+    </w:p>
+    <w:p>
+      <w:pPr>
+        <w:pStyle w:val="ListBullet"/>
+      </w:pPr>
+      <w:r>
+        <w:t>Rows = every item number in your inventory</w:t>
+      </w:r>
+    </w:p>
+    <w:p>
+      <w:pPr>
+        <w:pStyle w:val="ListBullet"/>
+      </w:pPr>
+      <w:r>
+        <w:t>Columns = Home Office + each distributor + Total</w:t>
+      </w:r>
+    </w:p>
+    <w:p>
+      <w:pPr>
+        <w:pStyle w:val="ListBullet"/>
+      </w:pPr>
+      <w:r>
+        <w:rPr>
+          <w:b/>
+        </w:rPr>
+        <w:t>Click an item number or Total</w:t>
+      </w:r>
+      <w:r>
+        <w:t xml:space="preserve"> → shows all units of that item across every location</w:t>
+      </w:r>
+    </w:p>
+    <w:p>
+      <w:pPr>
+        <w:pStyle w:val="ListBullet"/>
+      </w:pPr>
+      <w:r>
+        <w:rPr>
+          <w:b/>
+        </w:rPr>
+        <w:t>Click a count</w:t>
+      </w:r>
+      <w:r>
+        <w:t xml:space="preserve"> (e.g., 13 at Home Office) → shows only that item at that specific location</w:t>
+      </w:r>
+    </w:p>
+    <w:p>
+      <w:pPr>
+        <w:pStyle w:val="ListBullet"/>
+      </w:pPr>
+      <w:r>
+        <w:t>Sortable by any column; searchable by item number or description</w:t>
+      </w:r>
+    </w:p>
+    <w:p>
+      <w:pPr>
+        <w:pStyle w:val="ListBullet"/>
+      </w:pPr>
+      <w:r>
+        <w:rPr>
+          <w:b/>
+        </w:rPr>
+        <w:t>Export Excel</w:t>
+      </w:r>
+      <w:r>
+        <w:t xml:space="preserve"> button downloads a formatted spreadsheet</w:t>
+      </w:r>
+    </w:p>
+    <w:p>
+      <w:pPr/>
+      <w:r>
+        <w:rPr>
+          <w:b/>
+        </w:rPr>
+        <w:t>Export Inventory:</w:t>
+      </w:r>
+    </w:p>
+    <w:p>
+      <w:pPr/>
+      <w:r>
+        <w:t>Download the full inventory, or per-distributor breakdowns, as Excel files.</w:t>
+      </w:r>
+    </w:p>
+    <w:p>
+      <w:pPr/>
+      <w:r>
+        <w:rPr>
+          <w:b/>
+        </w:rPr>
+        <w:t>Transfer History:</w:t>
+      </w:r>
+    </w:p>
+    <w:p>
+      <w:pPr>
+        <w:pStyle w:val="ListBullet"/>
+      </w:pPr>
+      <w:r>
+        <w:t>Searchable list of all transfers</w:t>
+      </w:r>
+    </w:p>
+    <w:p>
+      <w:pPr>
+        <w:pStyle w:val="ListBullet"/>
+      </w:pPr>
+      <w:r>
+        <w:t>Sortable by Transfer ID, Date, From/To, Item Count</w:t>
+      </w:r>
+    </w:p>
+    <w:p>
+      <w:pPr>
+        <w:pStyle w:val="ListBullet"/>
+      </w:pPr>
+      <w:r>
+        <w:t>Tap any Transfer ID to see the full list of items transferred</w:t>
+      </w:r>
+    </w:p>
+    <w:p>
+      <w:pPr/>
+      <w:r>
+        <w:rPr>
+          <w:b/>
+        </w:rPr>
+        <w:t>Expiring Items table:</w:t>
+      </w:r>
+    </w:p>
+    <w:p>
+      <w:pPr/>
+      <w:r>
+        <w:t>Shows up to 20 items expiring within the next 180 days, sorted by days remaining. Sortable by all columns.</w:t>
+      </w:r>
+    </w:p>
+    <w:p>
+      <w:pPr>
+        <w:pStyle w:val="Heading3"/>
+      </w:pPr>
+      <w:r>
+        <w:t>8. Batch Upload</w:t>
+      </w:r>
+    </w:p>
+    <w:p>
+      <w:pPr/>
+      <w:r>
+        <w:rPr>
+          <w:b/>
+        </w:rPr>
+        <w:t>Location:</w:t>
+      </w:r>
+      <w:r>
+        <w:t xml:space="preserve"> More → Batch Upload</w:t>
+      </w:r>
+    </w:p>
+    <w:p>
+      <w:pPr/>
+      <w:r>
+        <w:t>For high-volume receiving when you have many barcode images or a spreadsheet.</w:t>
+      </w:r>
+    </w:p>
+    <w:p>
+      <w:pPr/>
+      <w:r>
+        <w:rPr>
+          <w:b/>
+        </w:rPr>
+        <w:t>Image upload:</w:t>
+      </w:r>
+    </w:p>
+    <w:p>
+      <w:pPr>
+        <w:pStyle w:val="ListBullet"/>
+      </w:pPr>
+      <w:r>
+        <w:t>Select multiple barcode photos — up to 4 barcodes are detected per image</w:t>
+      </w:r>
+    </w:p>
+    <w:p>
+      <w:pPr>
+        <w:pStyle w:val="ListBullet"/>
+      </w:pPr>
+      <w:r>
+        <w:t>Each barcode becomes a separate inventory item</w:t>
+      </w:r>
+    </w:p>
+    <w:p>
+      <w:pPr/>
+      <w:r>
+        <w:rPr>
+          <w:b/>
+        </w:rPr>
+        <w:t>CSV/Excel upload:</w:t>
+      </w:r>
+    </w:p>
+    <w:p>
+      <w:pPr>
+        <w:pStyle w:val="ListBullet"/>
+      </w:pPr>
+      <w:r>
+        <w:t xml:space="preserve">Upload a </w:t>
+      </w:r>
+      <w:r>
+        <w:rPr>
+          <w:rFonts w:ascii="Courier New" w:hAnsi="Courier New"/>
+          <w:sz w:val="18"/>
+        </w:rPr>
+        <w:t>.csv</w:t>
+      </w:r>
+      <w:r>
+        <w:t xml:space="preserve"> file with barcode strings (one per row in the first column)</w:t>
+      </w:r>
+    </w:p>
+    <w:p>
+      <w:pPr>
+        <w:pStyle w:val="ListBullet"/>
+      </w:pPr>
+      <w:r>
+        <w:t>Items sharing the same GTIN and lot number are each created as individual units — no rows are skipped</w:t>
+      </w:r>
+    </w:p>
+    <w:p>
+      <w:pPr/>
+      <w:r>
+        <w:rPr>
+          <w:b/>
+        </w:rPr>
+        <w:t>After upload:</w:t>
+      </w:r>
+    </w:p>
+    <w:p>
+      <w:pPr>
+        <w:pStyle w:val="ListBullet"/>
+      </w:pPr>
+      <w:r>
+        <w:t>A results grid shows status for each item (success / error)</w:t>
+      </w:r>
+    </w:p>
+    <w:p>
+      <w:pPr>
+        <w:pStyle w:val="ListBullet"/>
+      </w:pPr>
+      <w:r>
+        <w:t>Select the items you want to keep and choose a destination distributor</w:t>
+      </w:r>
+    </w:p>
+    <w:p>
+      <w:pPr>
+        <w:pStyle w:val="ListBullet"/>
+      </w:pPr>
+      <w:r>
+        <w:t xml:space="preserve">Tap </w:t>
+      </w:r>
+      <w:r>
+        <w:rPr>
+          <w:b/>
+        </w:rPr>
+        <w:t>Assign</w:t>
+      </w:r>
+      <w:r>
+        <w:t xml:space="preserve"> to save them</w:t>
+      </w:r>
+    </w:p>
+    <w:p>
+      <w:pPr>
+        <w:pStyle w:val="Heading3"/>
+      </w:pPr>
+      <w:r>
+        <w:t>9. Distributors</w:t>
+      </w:r>
+    </w:p>
+    <w:p>
+      <w:pPr/>
+      <w:r>
+        <w:rPr>
+          <w:b/>
+        </w:rPr>
+        <w:t>Location:</w:t>
+      </w:r>
+      <w:r>
+        <w:t xml:space="preserve"> More → Distributors</w:t>
+      </w:r>
+    </w:p>
+    <w:p>
+      <w:pPr/>
+      <w:r>
+        <w:t>View and manage your distributor network.</w:t>
+      </w:r>
+    </w:p>
+    <w:p>
+      <w:pPr>
+        <w:pStyle w:val="ListBullet"/>
+      </w:pPr>
+      <w:r>
+        <w:t>See each distributor's active item count</w:t>
+      </w:r>
+    </w:p>
+    <w:p>
+      <w:pPr>
+        <w:pStyle w:val="ListBullet"/>
+      </w:pPr>
+      <w:r>
+        <w:t>Tap a distributor to view all their items, download an Excel export, or share a link</w:t>
+      </w:r>
+    </w:p>
+    <w:p>
+      <w:pPr>
+        <w:pStyle w:val="ListBullet"/>
+      </w:pPr>
+      <w:r>
+        <w:t xml:space="preserve">Items in the </w:t>
+      </w:r>
+      <w:r>
+        <w:rPr>
+          <w:b/>
+        </w:rPr>
+        <w:t>Distributor Detail</w:t>
+      </w:r>
+      <w:r>
+        <w:t xml:space="preserve"> view link back to the full inventory detail page</w:t>
+      </w:r>
+    </w:p>
+    <w:p>
+      <w:pPr>
+        <w:pStyle w:val="ListBullet"/>
+      </w:pPr>
+      <w:r>
+        <w:t xml:space="preserve">The </w:t>
+      </w:r>
+      <w:r>
+        <w:rPr>
+          <w:b/>
+        </w:rPr>
+        <w:t>Home Office</w:t>
+      </w:r>
+      <w:r>
+        <w:t xml:space="preserve"> distributor is the central receiving location — all scanned items go here first</w:t>
+      </w:r>
+    </w:p>
+    <w:p>
+      <w:pPr>
+        <w:pStyle w:val="Heading2"/>
+      </w:pPr>
+      <w:r>
+        <w:t>Admin Features</w:t>
+      </w:r>
+    </w:p>
+    <w:p>
+      <w:pPr>
+        <w:pStyle w:val="Heading3"/>
+      </w:pPr>
+      <w:r>
+        <w:t>User Management</w:t>
+      </w:r>
+    </w:p>
+    <w:p>
+      <w:pPr/>
+      <w:r>
+        <w:rPr>
+          <w:b/>
+        </w:rPr>
+        <w:t>Location:</w:t>
+      </w:r>
+      <w:r>
+        <w:t xml:space="preserve"> More → User Management (admin only)</w:t>
+      </w:r>
+    </w:p>
+    <w:p>
+      <w:pPr/>
+      <w:r>
+        <w:rPr>
+          <w:b/>
+        </w:rPr>
+        <w:t>Adding a user:</w:t>
+      </w:r>
+    </w:p>
+    <w:p>
+      <w:pPr>
+        <w:pStyle w:val="ListNumber"/>
+      </w:pPr>
+      <w:r>
+        <w:t xml:space="preserve">Tap </w:t>
+      </w:r>
+      <w:r>
+        <w:rPr>
+          <w:b/>
+        </w:rPr>
+        <w:t>Add User</w:t>
+      </w:r>
+    </w:p>
+    <w:p>
+      <w:pPr>
+        <w:pStyle w:val="ListNumber"/>
+      </w:pPr>
+      <w:r>
+        <w:t>Enter a username (minimum 2 characters) and password (minimum 6 characters)</w:t>
+      </w:r>
+    </w:p>
+    <w:p>
+      <w:pPr>
+        <w:pStyle w:val="ListNumber"/>
+      </w:pPr>
+      <w:r>
+        <w:t xml:space="preserve">Select role: </w:t>
+      </w:r>
+      <w:r>
+        <w:rPr>
+          <w:b/>
+        </w:rPr>
+        <w:t>User</w:t>
+      </w:r>
+      <w:r>
+        <w:t xml:space="preserve"> or </w:t>
+      </w:r>
+      <w:r>
+        <w:rPr>
+          <w:b/>
+        </w:rPr>
+        <w:t>Admin</w:t>
+      </w:r>
+    </w:p>
+    <w:p>
+      <w:pPr>
+        <w:pStyle w:val="ListNumber"/>
+      </w:pPr>
+      <w:r>
+        <w:t xml:space="preserve">Tap </w:t>
+      </w:r>
+      <w:r>
+        <w:rPr>
+          <w:b/>
+        </w:rPr>
+        <w:t>Create User</w:t>
+      </w:r>
+    </w:p>
+    <w:p>
+      <w:pPr/>
+      <w:r>
+        <w:rPr>
+          <w:b/>
+        </w:rPr>
+        <w:t>Managing users:</w:t>
+      </w:r>
+    </w:p>
+    <w:p>
+      <w:pPr>
+        <w:pStyle w:val="ListBullet"/>
+      </w:pPr>
+      <w:r>
+        <w:rPr>
+          <w:b/>
+        </w:rPr>
+        <w:t>Toggle role:</w:t>
+      </w:r>
+      <w:r>
+        <w:t xml:space="preserve"> Tap the shield icon to switch between User and Admin (you cannot change your own role)</w:t>
+      </w:r>
+    </w:p>
+    <w:p>
+      <w:pPr>
+        <w:pStyle w:val="ListBullet"/>
+      </w:pPr>
+      <w:r>
+        <w:rPr>
+          <w:b/>
+        </w:rPr>
+        <w:t>Change password:</w:t>
+      </w:r>
+      <w:r>
+        <w:t xml:space="preserve"> Tap the key icon</w:t>
+      </w:r>
+    </w:p>
+    <w:p>
+      <w:pPr>
+        <w:pStyle w:val="ListBullet"/>
+      </w:pPr>
+      <w:r>
+        <w:rPr>
+          <w:b/>
+        </w:rPr>
+        <w:t>Delete user:</w:t>
+      </w:r>
+      <w:r>
+        <w:t xml:space="preserve"> Tap the trash icon (you cannot delete yourself or the last admin)</w:t>
+      </w:r>
+    </w:p>
+    <w:p>
+      <w:pPr>
+        <w:pStyle w:val="Heading2"/>
+      </w:pPr>
+      <w:r>
+        <w:t>Barcode Format</w:t>
+      </w:r>
+    </w:p>
+    <w:p>
+      <w:pPr/>
+      <w:r>
+        <w:t xml:space="preserve">Nail Tracker reads </w:t>
+      </w:r>
+      <w:r>
+        <w:rPr>
+          <w:b/>
+        </w:rPr>
+        <w:t>GS1-128</w:t>
+      </w:r>
+      <w:r>
+        <w:t xml:space="preserve"> barcodes with these Application Identifiers:</w:t>
+      </w:r>
+    </w:p>
+    <w:tbl>
+      <w:tblPr>
+        <w:tblStyle w:val="TableGrid"/>
+        <w:tblW w:type="auto" w:w="0"/>
+        <w:tblLook w:firstColumn="1" w:firstRow="1" w:lastColumn="0" w:lastRow="0" w:noHBand="0" w:noVBand="1" w:val="04A0"/>
+      </w:tblPr>
+      <w:tblGrid>
+        <w:gridCol w:w="3024"/>
+        <w:gridCol w:w="3024"/>
+        <w:gridCol w:w="3024"/>
+      </w:tblGrid>
+      <w:tr>
+        <w:tc>
+          <w:tcPr>
+            <w:tcW w:type="dxa" w:w="3024"/>
+            <w:shd w:val="clear" w:color="auto" w:fill="2E74B5"/>
+            <w:tcBorders>
+              <w:top w:val="single" w:sz="4" w:space="0" w:color="999999"/>
+              <w:left w:val="single" w:sz="4" w:space="0" w:color="999999"/>
+              <w:bottom w:val="single" w:sz="4" w:space="0" w:color="999999"/>
+              <w:right w:val="single" w:sz="4" w:space="0" w:color="999999"/>
+            </w:tcBorders>
+          </w:tcPr>
+          <w:p>
+            <w:r>
+              <w:rPr>
+                <w:b/>
+                <w:color w:val="FFFFFF"/>
+                <w:sz w:val="20"/>
               </w:rPr>
               <w:t>AI</w:t>
             </w:r>
@@ -1304,12 +2192,21 @@
         </w:tc>
         <w:tc>
           <w:tcPr>
-            <w:tcW w:type="dxa" w:w="2880"/>
+            <w:tcW w:type="dxa" w:w="3024"/>
+            <w:shd w:val="clear" w:color="auto" w:fill="2E74B5"/>
+            <w:tcBorders>
+              <w:top w:val="single" w:sz="4" w:space="0" w:color="999999"/>
+              <w:left w:val="single" w:sz="4" w:space="0" w:color="999999"/>
+              <w:bottom w:val="single" w:sz="4" w:space="0" w:color="999999"/>
+              <w:right w:val="single" w:sz="4" w:space="0" w:color="999999"/>
+            </w:tcBorders>
           </w:tcPr>
           <w:p>
             <w:r>
               <w:rPr>
                 <w:b/>
+                <w:color w:val="FFFFFF"/>
+                <w:sz w:val="20"/>
               </w:rPr>
               <w:t>Field</w:t>
             </w:r>
@@ -1317,12 +2214,21 @@
         </w:tc>
         <w:tc>
           <w:tcPr>
-            <w:tcW w:type="dxa" w:w="2880"/>
+            <w:tcW w:type="dxa" w:w="3024"/>
+            <w:shd w:val="clear" w:color="auto" w:fill="2E74B5"/>
+            <w:tcBorders>
+              <w:top w:val="single" w:sz="4" w:space="0" w:color="999999"/>
+              <w:left w:val="single" w:sz="4" w:space="0" w:color="999999"/>
+              <w:bottom w:val="single" w:sz="4" w:space="0" w:color="999999"/>
+              <w:right w:val="single" w:sz="4" w:space="0" w:color="999999"/>
+            </w:tcBorders>
           </w:tcPr>
           <w:p>
             <w:r>
               <w:rPr>
                 <w:b/>
+                <w:color w:val="FFFFFF"/>
+                <w:sz w:val="20"/>
               </w:rPr>
               <w:t>Format</w:t>
             </w:r>
@@ -1332,30 +2238,60 @@
       <w:tr>
         <w:tc>
           <w:tcPr>
-            <w:tcW w:type="dxa" w:w="2880"/>
+            <w:tcW w:type="dxa" w:w="3024"/>
+            <w:shd w:val="clear" w:color="auto" w:fill="F2F7FC"/>
+            <w:tcBorders>
+              <w:top w:val="single" w:sz="4" w:space="0" w:color="999999"/>
+              <w:left w:val="single" w:sz="4" w:space="0" w:color="999999"/>
+              <w:bottom w:val="single" w:sz="4" w:space="0" w:color="999999"/>
+              <w:right w:val="single" w:sz="4" w:space="0" w:color="999999"/>
+            </w:tcBorders>
           </w:tcPr>
           <w:p>
             <w:r>
+              <w:rPr>
+                <w:sz w:val="20"/>
+              </w:rPr>
               <w:t>01</w:t>
             </w:r>
           </w:p>
         </w:tc>
         <w:tc>
           <w:tcPr>
-            <w:tcW w:type="dxa" w:w="2880"/>
+            <w:tcW w:type="dxa" w:w="3024"/>
+            <w:shd w:val="clear" w:color="auto" w:fill="F2F7FC"/>
+            <w:tcBorders>
+              <w:top w:val="single" w:sz="4" w:space="0" w:color="999999"/>
+              <w:left w:val="single" w:sz="4" w:space="0" w:color="999999"/>
+              <w:bottom w:val="single" w:sz="4" w:space="0" w:color="999999"/>
+              <w:right w:val="single" w:sz="4" w:space="0" w:color="999999"/>
+            </w:tcBorders>
           </w:tcPr>
           <w:p>
             <w:r>
+              <w:rPr>
+                <w:sz w:val="20"/>
+              </w:rPr>
               <w:t>GTIN</w:t>
             </w:r>
           </w:p>
         </w:tc>
         <w:tc>
           <w:tcPr>
-            <w:tcW w:type="dxa" w:w="2880"/>
+            <w:tcW w:type="dxa" w:w="3024"/>
+            <w:shd w:val="clear" w:color="auto" w:fill="F2F7FC"/>
+            <w:tcBorders>
+              <w:top w:val="single" w:sz="4" w:space="0" w:color="999999"/>
+              <w:left w:val="single" w:sz="4" w:space="0" w:color="999999"/>
+              <w:bottom w:val="single" w:sz="4" w:space="0" w:color="999999"/>
+              <w:right w:val="single" w:sz="4" w:space="0" w:color="999999"/>
+            </w:tcBorders>
           </w:tcPr>
           <w:p>
             <w:r>
+              <w:rPr>
+                <w:sz w:val="20"/>
+              </w:rPr>
               <w:t>14 digits</w:t>
             </w:r>
           </w:p>
@@ -1364,30 +2300,60 @@
       <w:tr>
         <w:tc>
           <w:tcPr>
-            <w:tcW w:type="dxa" w:w="2880"/>
+            <w:tcW w:type="dxa" w:w="3024"/>
+            <w:shd w:val="clear" w:color="auto" w:fill="FFFFFF"/>
+            <w:tcBorders>
+              <w:top w:val="single" w:sz="4" w:space="0" w:color="999999"/>
+              <w:left w:val="single" w:sz="4" w:space="0" w:color="999999"/>
+              <w:bottom w:val="single" w:sz="4" w:space="0" w:color="999999"/>
+              <w:right w:val="single" w:sz="4" w:space="0" w:color="999999"/>
+            </w:tcBorders>
           </w:tcPr>
           <w:p>
             <w:r>
+              <w:rPr>
+                <w:sz w:val="20"/>
+              </w:rPr>
               <w:t>10</w:t>
             </w:r>
           </w:p>
         </w:tc>
         <w:tc>
           <w:tcPr>
-            <w:tcW w:type="dxa" w:w="2880"/>
+            <w:tcW w:type="dxa" w:w="3024"/>
+            <w:shd w:val="clear" w:color="auto" w:fill="FFFFFF"/>
+            <w:tcBorders>
+              <w:top w:val="single" w:sz="4" w:space="0" w:color="999999"/>
+              <w:left w:val="single" w:sz="4" w:space="0" w:color="999999"/>
+              <w:bottom w:val="single" w:sz="4" w:space="0" w:color="999999"/>
+              <w:right w:val="single" w:sz="4" w:space="0" w:color="999999"/>
+            </w:tcBorders>
           </w:tcPr>
           <w:p>
             <w:r>
+              <w:rPr>
+                <w:sz w:val="20"/>
+              </w:rPr>
               <w:t>Lot Number</w:t>
             </w:r>
           </w:p>
         </w:tc>
         <w:tc>
           <w:tcPr>
-            <w:tcW w:type="dxa" w:w="2880"/>
+            <w:tcW w:type="dxa" w:w="3024"/>
+            <w:shd w:val="clear" w:color="auto" w:fill="FFFFFF"/>
+            <w:tcBorders>
+              <w:top w:val="single" w:sz="4" w:space="0" w:color="999999"/>
+              <w:left w:val="single" w:sz="4" w:space="0" w:color="999999"/>
+              <w:bottom w:val="single" w:sz="4" w:space="0" w:color="999999"/>
+              <w:right w:val="single" w:sz="4" w:space="0" w:color="999999"/>
+            </w:tcBorders>
           </w:tcPr>
           <w:p>
             <w:r>
+              <w:rPr>
+                <w:sz w:val="20"/>
+              </w:rPr>
               <w:t>Variable length</w:t>
             </w:r>
           </w:p>
@@ -1396,30 +2362,60 @@
       <w:tr>
         <w:tc>
           <w:tcPr>
-            <w:tcW w:type="dxa" w:w="2880"/>
+            <w:tcW w:type="dxa" w:w="3024"/>
+            <w:shd w:val="clear" w:color="auto" w:fill="F2F7FC"/>
+            <w:tcBorders>
+              <w:top w:val="single" w:sz="4" w:space="0" w:color="999999"/>
+              <w:left w:val="single" w:sz="4" w:space="0" w:color="999999"/>
+              <w:bottom w:val="single" w:sz="4" w:space="0" w:color="999999"/>
+              <w:right w:val="single" w:sz="4" w:space="0" w:color="999999"/>
+            </w:tcBorders>
           </w:tcPr>
           <w:p>
             <w:r>
+              <w:rPr>
+                <w:sz w:val="20"/>
+              </w:rPr>
               <w:t>17</w:t>
             </w:r>
           </w:p>
         </w:tc>
         <w:tc>
           <w:tcPr>
-            <w:tcW w:type="dxa" w:w="2880"/>
+            <w:tcW w:type="dxa" w:w="3024"/>
+            <w:shd w:val="clear" w:color="auto" w:fill="F2F7FC"/>
+            <w:tcBorders>
+              <w:top w:val="single" w:sz="4" w:space="0" w:color="999999"/>
+              <w:left w:val="single" w:sz="4" w:space="0" w:color="999999"/>
+              <w:bottom w:val="single" w:sz="4" w:space="0" w:color="999999"/>
+              <w:right w:val="single" w:sz="4" w:space="0" w:color="999999"/>
+            </w:tcBorders>
           </w:tcPr>
           <w:p>
             <w:r>
+              <w:rPr>
+                <w:sz w:val="20"/>
+              </w:rPr>
               <w:t>Expiry Date</w:t>
             </w:r>
           </w:p>
         </w:tc>
         <w:tc>
           <w:tcPr>
-            <w:tcW w:type="dxa" w:w="2880"/>
+            <w:tcW w:type="dxa" w:w="3024"/>
+            <w:shd w:val="clear" w:color="auto" w:fill="F2F7FC"/>
+            <w:tcBorders>
+              <w:top w:val="single" w:sz="4" w:space="0" w:color="999999"/>
+              <w:left w:val="single" w:sz="4" w:space="0" w:color="999999"/>
+              <w:bottom w:val="single" w:sz="4" w:space="0" w:color="999999"/>
+              <w:right w:val="single" w:sz="4" w:space="0" w:color="999999"/>
+            </w:tcBorders>
           </w:tcPr>
           <w:p>
             <w:r>
+              <w:rPr>
+                <w:sz w:val="20"/>
+              </w:rPr>
               <w:t>YYMMDD (6 digits)</w:t>
             </w:r>
           </w:p>
@@ -1428,6 +2424,7 @@
     </w:tbl>
     <w:p/>
     <w:p>
+      <w:pPr/>
       <w:r>
         <w:rPr>
           <w:b/>
@@ -1438,46 +2435,94 @@
     <w:p>
       <w:pPr>
         <w:pStyle w:val="ListBullet"/>
-        <w:spacing w:after="80"/>
-      </w:pPr>
-      <w:r>
-        <w:t>Parenthesized: (01)08880089459148(10)J250929-L021(17)300928</w:t>
+      </w:pPr>
+      <w:r>
+        <w:t xml:space="preserve">Parenthesized: </w:t>
+      </w:r>
+      <w:r>
+        <w:rPr>
+          <w:rFonts w:ascii="Courier New" w:hAnsi="Courier New"/>
+          <w:sz w:val="18"/>
+        </w:rPr>
+        <w:t>(01)08880089459148(10)J250929-L021(17)300928</w:t>
       </w:r>
     </w:p>
     <w:p>
       <w:pPr>
         <w:pStyle w:val="ListBullet"/>
-        <w:spacing w:after="80"/>
-      </w:pPr>
-      <w:r>
-        <w:t>Raw stream: 010888008945914810J250929-L02117300928</w:t>
+      </w:pPr>
+      <w:r>
+        <w:t xml:space="preserve">Raw stream: </w:t>
+      </w:r>
+      <w:r>
+        <w:rPr>
+          <w:rFonts w:ascii="Courier New" w:hAnsi="Courier New"/>
+          <w:sz w:val="18"/>
+        </w:rPr>
+        <w:t>010888008945914810J250929-L02117300928</w:t>
       </w:r>
     </w:p>
     <w:p>
-      <w:r>
-        <w:t>The system also recognizes REF codes to auto-categorize products:</w:t>
+      <w:pPr>
+        <w:pStyle w:val="ListBullet"/>
+      </w:pPr>
+      <w:r>
+        <w:t xml:space="preserve">Hourglass date format: </w:t>
+      </w:r>
+      <w:r>
+        <w:rPr>
+          <w:rFonts w:ascii="Courier New" w:hAnsi="Courier New"/>
+          <w:sz w:val="18"/>
+        </w:rPr>
+        <w:t>YYYY-MM-DD</w:t>
+      </w:r>
+      <w:r>
+        <w:t xml:space="preserve"> (used on some label printers)</w:t>
+      </w:r>
+    </w:p>
+    <w:p>
+      <w:pPr/>
+      <w:r>
+        <w:t xml:space="preserve">The system also recognizes </w:t>
+      </w:r>
+      <w:r>
+        <w:rPr>
+          <w:b/>
+        </w:rPr>
+        <w:t>REF codes</w:t>
+      </w:r>
+      <w:r>
+        <w:t xml:space="preserve"> to auto-categorize products:</w:t>
       </w:r>
     </w:p>
     <w:tbl>
       <w:tblPr>
-        <w:tblStyle w:val="LightShading-Accent1"/>
+        <w:tblStyle w:val="TableGrid"/>
         <w:tblW w:type="auto" w:w="0"/>
-        <w:jc w:val="center"/>
         <w:tblLook w:firstColumn="1" w:firstRow="1" w:lastColumn="0" w:lastRow="0" w:noHBand="0" w:noVBand="1" w:val="04A0"/>
       </w:tblPr>
       <w:tblGrid>
-        <w:gridCol w:w="4320"/>
-        <w:gridCol w:w="4320"/>
+        <w:gridCol w:w="4536"/>
+        <w:gridCol w:w="4536"/>
       </w:tblGrid>
       <w:tr>
         <w:tc>
           <w:tcPr>
-            <w:tcW w:type="dxa" w:w="4320"/>
+            <w:tcW w:type="dxa" w:w="4536"/>
+            <w:shd w:val="clear" w:color="auto" w:fill="2E74B5"/>
+            <w:tcBorders>
+              <w:top w:val="single" w:sz="4" w:space="0" w:color="999999"/>
+              <w:left w:val="single" w:sz="4" w:space="0" w:color="999999"/>
+              <w:bottom w:val="single" w:sz="4" w:space="0" w:color="999999"/>
+              <w:right w:val="single" w:sz="4" w:space="0" w:color="999999"/>
+            </w:tcBorders>
           </w:tcPr>
           <w:p>
             <w:r>
               <w:rPr>
                 <w:b/>
+                <w:color w:val="FFFFFF"/>
+                <w:sz w:val="20"/>
               </w:rPr>
               <w:t>REF Prefix</w:t>
             </w:r>
@@ -1485,12 +2530,21 @@
         </w:tc>
         <w:tc>
           <w:tcPr>
-            <w:tcW w:type="dxa" w:w="4320"/>
+            <w:tcW w:type="dxa" w:w="4536"/>
+            <w:shd w:val="clear" w:color="auto" w:fill="2E74B5"/>
+            <w:tcBorders>
+              <w:top w:val="single" w:sz="4" w:space="0" w:color="999999"/>
+              <w:left w:val="single" w:sz="4" w:space="0" w:color="999999"/>
+              <w:bottom w:val="single" w:sz="4" w:space="0" w:color="999999"/>
+              <w:right w:val="single" w:sz="4" w:space="0" w:color="999999"/>
+            </w:tcBorders>
           </w:tcPr>
           <w:p>
             <w:r>
               <w:rPr>
                 <w:b/>
+                <w:color w:val="FFFFFF"/>
+                <w:sz w:val="20"/>
               </w:rPr>
               <w:t>Product</w:t>
             </w:r>
@@ -1500,20 +2554,40 @@
       <w:tr>
         <w:tc>
           <w:tcPr>
-            <w:tcW w:type="dxa" w:w="4320"/>
+            <w:tcW w:type="dxa" w:w="4536"/>
+            <w:shd w:val="clear" w:color="auto" w:fill="F2F7FC"/>
+            <w:tcBorders>
+              <w:top w:val="single" w:sz="4" w:space="0" w:color="999999"/>
+              <w:left w:val="single" w:sz="4" w:space="0" w:color="999999"/>
+              <w:bottom w:val="single" w:sz="4" w:space="0" w:color="999999"/>
+              <w:right w:val="single" w:sz="4" w:space="0" w:color="999999"/>
+            </w:tcBorders>
           </w:tcPr>
           <w:p>
             <w:r>
+              <w:rPr>
+                <w:sz w:val="20"/>
+              </w:rPr>
               <w:t>SO-SPFN</w:t>
             </w:r>
           </w:p>
         </w:tc>
         <w:tc>
           <w:tcPr>
-            <w:tcW w:type="dxa" w:w="4320"/>
+            <w:tcW w:type="dxa" w:w="4536"/>
+            <w:shd w:val="clear" w:color="auto" w:fill="F2F7FC"/>
+            <w:tcBorders>
+              <w:top w:val="single" w:sz="4" w:space="0" w:color="999999"/>
+              <w:left w:val="single" w:sz="4" w:space="0" w:color="999999"/>
+              <w:bottom w:val="single" w:sz="4" w:space="0" w:color="999999"/>
+              <w:right w:val="single" w:sz="4" w:space="0" w:color="999999"/>
+            </w:tcBorders>
           </w:tcPr>
           <w:p>
             <w:r>
+              <w:rPr>
+                <w:sz w:val="20"/>
+              </w:rPr>
               <w:t>Short Femoral Nail</w:t>
             </w:r>
           </w:p>
@@ -1522,20 +2596,40 @@
       <w:tr>
         <w:tc>
           <w:tcPr>
-            <w:tcW w:type="dxa" w:w="4320"/>
+            <w:tcW w:type="dxa" w:w="4536"/>
+            <w:shd w:val="clear" w:color="auto" w:fill="FFFFFF"/>
+            <w:tcBorders>
+              <w:top w:val="single" w:sz="4" w:space="0" w:color="999999"/>
+              <w:left w:val="single" w:sz="4" w:space="0" w:color="999999"/>
+              <w:bottom w:val="single" w:sz="4" w:space="0" w:color="999999"/>
+              <w:right w:val="single" w:sz="4" w:space="0" w:color="999999"/>
+            </w:tcBorders>
           </w:tcPr>
           <w:p>
             <w:r>
+              <w:rPr>
+                <w:sz w:val="20"/>
+              </w:rPr>
               <w:t>SO-LPFN</w:t>
             </w:r>
           </w:p>
         </w:tc>
         <w:tc>
           <w:tcPr>
-            <w:tcW w:type="dxa" w:w="4320"/>
+            <w:tcW w:type="dxa" w:w="4536"/>
+            <w:shd w:val="clear" w:color="auto" w:fill="FFFFFF"/>
+            <w:tcBorders>
+              <w:top w:val="single" w:sz="4" w:space="0" w:color="999999"/>
+              <w:left w:val="single" w:sz="4" w:space="0" w:color="999999"/>
+              <w:bottom w:val="single" w:sz="4" w:space="0" w:color="999999"/>
+              <w:right w:val="single" w:sz="4" w:space="0" w:color="999999"/>
+            </w:tcBorders>
           </w:tcPr>
           <w:p>
             <w:r>
+              <w:rPr>
+                <w:sz w:val="20"/>
+              </w:rPr>
               <w:t>Long Femoral Nail</w:t>
             </w:r>
           </w:p>
@@ -1544,20 +2638,40 @@
       <w:tr>
         <w:tc>
           <w:tcPr>
-            <w:tcW w:type="dxa" w:w="4320"/>
+            <w:tcW w:type="dxa" w:w="4536"/>
+            <w:shd w:val="clear" w:color="auto" w:fill="F2F7FC"/>
+            <w:tcBorders>
+              <w:top w:val="single" w:sz="4" w:space="0" w:color="999999"/>
+              <w:left w:val="single" w:sz="4" w:space="0" w:color="999999"/>
+              <w:bottom w:val="single" w:sz="4" w:space="0" w:color="999999"/>
+              <w:right w:val="single" w:sz="4" w:space="0" w:color="999999"/>
+            </w:tcBorders>
           </w:tcPr>
           <w:p>
             <w:r>
+              <w:rPr>
+                <w:sz w:val="20"/>
+              </w:rPr>
               <w:t>SO-SPFL-N</w:t>
             </w:r>
           </w:p>
         </w:tc>
         <w:tc>
           <w:tcPr>
-            <w:tcW w:type="dxa" w:w="4320"/>
+            <w:tcW w:type="dxa" w:w="4536"/>
+            <w:shd w:val="clear" w:color="auto" w:fill="F2F7FC"/>
+            <w:tcBorders>
+              <w:top w:val="single" w:sz="4" w:space="0" w:color="999999"/>
+              <w:left w:val="single" w:sz="4" w:space="0" w:color="999999"/>
+              <w:bottom w:val="single" w:sz="4" w:space="0" w:color="999999"/>
+              <w:right w:val="single" w:sz="4" w:space="0" w:color="999999"/>
+            </w:tcBorders>
           </w:tcPr>
           <w:p>
             <w:r>
+              <w:rPr>
+                <w:sz w:val="20"/>
+              </w:rPr>
               <w:t>Lag Screw (Normal)</w:t>
             </w:r>
           </w:p>
@@ -1566,20 +2680,40 @@
       <w:tr>
         <w:tc>
           <w:tcPr>
-            <w:tcW w:type="dxa" w:w="4320"/>
+            <w:tcW w:type="dxa" w:w="4536"/>
+            <w:shd w:val="clear" w:color="auto" w:fill="FFFFFF"/>
+            <w:tcBorders>
+              <w:top w:val="single" w:sz="4" w:space="0" w:color="999999"/>
+              <w:left w:val="single" w:sz="4" w:space="0" w:color="999999"/>
+              <w:bottom w:val="single" w:sz="4" w:space="0" w:color="999999"/>
+              <w:right w:val="single" w:sz="4" w:space="0" w:color="999999"/>
+            </w:tcBorders>
           </w:tcPr>
           <w:p>
             <w:r>
+              <w:rPr>
+                <w:sz w:val="20"/>
+              </w:rPr>
               <w:t>SO-SPFL-A</w:t>
             </w:r>
           </w:p>
         </w:tc>
         <w:tc>
           <w:tcPr>
-            <w:tcW w:type="dxa" w:w="4320"/>
+            <w:tcW w:type="dxa" w:w="4536"/>
+            <w:shd w:val="clear" w:color="auto" w:fill="FFFFFF"/>
+            <w:tcBorders>
+              <w:top w:val="single" w:sz="4" w:space="0" w:color="999999"/>
+              <w:left w:val="single" w:sz="4" w:space="0" w:color="999999"/>
+              <w:bottom w:val="single" w:sz="4" w:space="0" w:color="999999"/>
+              <w:right w:val="single" w:sz="4" w:space="0" w:color="999999"/>
+            </w:tcBorders>
           </w:tcPr>
           <w:p>
             <w:r>
+              <w:rPr>
+                <w:sz w:val="20"/>
+              </w:rPr>
               <w:t>Lag Screw (Anti-Rotation)</w:t>
             </w:r>
           </w:p>
@@ -1588,20 +2722,40 @@
       <w:tr>
         <w:tc>
           <w:tcPr>
-            <w:tcW w:type="dxa" w:w="4320"/>
+            <w:tcW w:type="dxa" w:w="4536"/>
+            <w:shd w:val="clear" w:color="auto" w:fill="F2F7FC"/>
+            <w:tcBorders>
+              <w:top w:val="single" w:sz="4" w:space="0" w:color="999999"/>
+              <w:left w:val="single" w:sz="4" w:space="0" w:color="999999"/>
+              <w:bottom w:val="single" w:sz="4" w:space="0" w:color="999999"/>
+              <w:right w:val="single" w:sz="4" w:space="0" w:color="999999"/>
+            </w:tcBorders>
           </w:tcPr>
           <w:p>
             <w:r>
+              <w:rPr>
+                <w:sz w:val="20"/>
+              </w:rPr>
               <w:t>SO-SPFL-T</w:t>
             </w:r>
           </w:p>
         </w:tc>
         <w:tc>
           <w:tcPr>
-            <w:tcW w:type="dxa" w:w="4320"/>
+            <w:tcW w:type="dxa" w:w="4536"/>
+            <w:shd w:val="clear" w:color="auto" w:fill="F2F7FC"/>
+            <w:tcBorders>
+              <w:top w:val="single" w:sz="4" w:space="0" w:color="999999"/>
+              <w:left w:val="single" w:sz="4" w:space="0" w:color="999999"/>
+              <w:bottom w:val="single" w:sz="4" w:space="0" w:color="999999"/>
+              <w:right w:val="single" w:sz="4" w:space="0" w:color="999999"/>
+            </w:tcBorders>
           </w:tcPr>
           <w:p>
             <w:r>
+              <w:rPr>
+                <w:sz w:val="20"/>
+              </w:rPr>
               <w:t>Lag Screw (Telescopic)</w:t>
             </w:r>
           </w:p>
@@ -1610,20 +2764,40 @@
       <w:tr>
         <w:tc>
           <w:tcPr>
-            <w:tcW w:type="dxa" w:w="4320"/>
+            <w:tcW w:type="dxa" w:w="4536"/>
+            <w:shd w:val="clear" w:color="auto" w:fill="FFFFFF"/>
+            <w:tcBorders>
+              <w:top w:val="single" w:sz="4" w:space="0" w:color="999999"/>
+              <w:left w:val="single" w:sz="4" w:space="0" w:color="999999"/>
+              <w:bottom w:val="single" w:sz="4" w:space="0" w:color="999999"/>
+              <w:right w:val="single" w:sz="4" w:space="0" w:color="999999"/>
+            </w:tcBorders>
           </w:tcPr>
           <w:p>
             <w:r>
-              <w:t>SO-IS</w:t>
+              <w:rPr>
+                <w:sz w:val="20"/>
+              </w:rPr>
+              <w:t>SO-S50I-SO</w:t>
             </w:r>
           </w:p>
         </w:tc>
         <w:tc>
           <w:tcPr>
-            <w:tcW w:type="dxa" w:w="4320"/>
+            <w:tcW w:type="dxa" w:w="4536"/>
+            <w:shd w:val="clear" w:color="auto" w:fill="FFFFFF"/>
+            <w:tcBorders>
+              <w:top w:val="single" w:sz="4" w:space="0" w:color="999999"/>
+              <w:left w:val="single" w:sz="4" w:space="0" w:color="999999"/>
+              <w:bottom w:val="single" w:sz="4" w:space="0" w:color="999999"/>
+              <w:right w:val="single" w:sz="4" w:space="0" w:color="999999"/>
+            </w:tcBorders>
           </w:tcPr>
           <w:p>
             <w:r>
+              <w:rPr>
+                <w:sz w:val="20"/>
+              </w:rPr>
               <w:t>Interlocking Screw</w:t>
             </w:r>
           </w:p>
@@ -1632,21 +2806,41 @@
       <w:tr>
         <w:tc>
           <w:tcPr>
-            <w:tcW w:type="dxa" w:w="4320"/>
+            <w:tcW w:type="dxa" w:w="4536"/>
+            <w:shd w:val="clear" w:color="auto" w:fill="F2F7FC"/>
+            <w:tcBorders>
+              <w:top w:val="single" w:sz="4" w:space="0" w:color="999999"/>
+              <w:left w:val="single" w:sz="4" w:space="0" w:color="999999"/>
+              <w:bottom w:val="single" w:sz="4" w:space="0" w:color="999999"/>
+              <w:right w:val="single" w:sz="4" w:space="0" w:color="999999"/>
+            </w:tcBorders>
           </w:tcPr>
           <w:p>
             <w:r>
-              <w:t>SO-EC</w:t>
+              <w:rPr>
+                <w:sz w:val="20"/>
+              </w:rPr>
+              <w:t>SO-SPFC</w:t>
             </w:r>
           </w:p>
         </w:tc>
         <w:tc>
           <w:tcPr>
-            <w:tcW w:type="dxa" w:w="4320"/>
+            <w:tcW w:type="dxa" w:w="4536"/>
+            <w:shd w:val="clear" w:color="auto" w:fill="F2F7FC"/>
+            <w:tcBorders>
+              <w:top w:val="single" w:sz="4" w:space="0" w:color="999999"/>
+              <w:left w:val="single" w:sz="4" w:space="0" w:color="999999"/>
+              <w:bottom w:val="single" w:sz="4" w:space="0" w:color="999999"/>
+              <w:right w:val="single" w:sz="4" w:space="0" w:color="999999"/>
+            </w:tcBorders>
           </w:tcPr>
           <w:p>
             <w:r>
-              <w:t>End Cap</w:t>
+              <w:rPr>
+                <w:sz w:val="20"/>
+              </w:rPr>
+              <w:t>Cap Screw</w:t>
             </w:r>
           </w:p>
         </w:tc>
@@ -1654,21 +2848,167 @@
       <w:tr>
         <w:tc>
           <w:tcPr>
-            <w:tcW w:type="dxa" w:w="4320"/>
+            <w:tcW w:type="dxa" w:w="4536"/>
+            <w:shd w:val="clear" w:color="auto" w:fill="FFFFFF"/>
+            <w:tcBorders>
+              <w:top w:val="single" w:sz="4" w:space="0" w:color="999999"/>
+              <w:left w:val="single" w:sz="4" w:space="0" w:color="999999"/>
+              <w:bottom w:val="single" w:sz="4" w:space="0" w:color="999999"/>
+              <w:right w:val="single" w:sz="4" w:space="0" w:color="999999"/>
+            </w:tcBorders>
           </w:tcPr>
           <w:p>
             <w:r>
+              <w:rPr>
+                <w:sz w:val="20"/>
+              </w:rPr>
+              <w:t>SO-SPFS</w:t>
+            </w:r>
+          </w:p>
+        </w:tc>
+        <w:tc>
+          <w:tcPr>
+            <w:tcW w:type="dxa" w:w="4536"/>
+            <w:shd w:val="clear" w:color="auto" w:fill="FFFFFF"/>
+            <w:tcBorders>
+              <w:top w:val="single" w:sz="4" w:space="0" w:color="999999"/>
+              <w:left w:val="single" w:sz="4" w:space="0" w:color="999999"/>
+              <w:bottom w:val="single" w:sz="4" w:space="0" w:color="999999"/>
+              <w:right w:val="single" w:sz="4" w:space="0" w:color="999999"/>
+            </w:tcBorders>
+          </w:tcPr>
+          <w:p>
+            <w:r>
+              <w:rPr>
+                <w:sz w:val="20"/>
+              </w:rPr>
+              <w:t>Set Screw</w:t>
+            </w:r>
+          </w:p>
+        </w:tc>
+      </w:tr>
+      <w:tr>
+        <w:tc>
+          <w:tcPr>
+            <w:tcW w:type="dxa" w:w="4536"/>
+            <w:shd w:val="clear" w:color="auto" w:fill="F2F7FC"/>
+            <w:tcBorders>
+              <w:top w:val="single" w:sz="4" w:space="0" w:color="999999"/>
+              <w:left w:val="single" w:sz="4" w:space="0" w:color="999999"/>
+              <w:bottom w:val="single" w:sz="4" w:space="0" w:color="999999"/>
+              <w:right w:val="single" w:sz="4" w:space="0" w:color="999999"/>
+            </w:tcBorders>
+          </w:tcPr>
+          <w:p>
+            <w:r>
+              <w:rPr>
+                <w:sz w:val="20"/>
+              </w:rPr>
+              <w:t>SO-IS</w:t>
+            </w:r>
+          </w:p>
+        </w:tc>
+        <w:tc>
+          <w:tcPr>
+            <w:tcW w:type="dxa" w:w="4536"/>
+            <w:shd w:val="clear" w:color="auto" w:fill="F2F7FC"/>
+            <w:tcBorders>
+              <w:top w:val="single" w:sz="4" w:space="0" w:color="999999"/>
+              <w:left w:val="single" w:sz="4" w:space="0" w:color="999999"/>
+              <w:bottom w:val="single" w:sz="4" w:space="0" w:color="999999"/>
+              <w:right w:val="single" w:sz="4" w:space="0" w:color="999999"/>
+            </w:tcBorders>
+          </w:tcPr>
+          <w:p>
+            <w:r>
+              <w:rPr>
+                <w:sz w:val="20"/>
+              </w:rPr>
+              <w:t>Interlocking Screw (legacy)</w:t>
+            </w:r>
+          </w:p>
+        </w:tc>
+      </w:tr>
+      <w:tr>
+        <w:tc>
+          <w:tcPr>
+            <w:tcW w:type="dxa" w:w="4536"/>
+            <w:shd w:val="clear" w:color="auto" w:fill="FFFFFF"/>
+            <w:tcBorders>
+              <w:top w:val="single" w:sz="4" w:space="0" w:color="999999"/>
+              <w:left w:val="single" w:sz="4" w:space="0" w:color="999999"/>
+              <w:bottom w:val="single" w:sz="4" w:space="0" w:color="999999"/>
+              <w:right w:val="single" w:sz="4" w:space="0" w:color="999999"/>
+            </w:tcBorders>
+          </w:tcPr>
+          <w:p>
+            <w:r>
+              <w:rPr>
+                <w:sz w:val="20"/>
+              </w:rPr>
+              <w:t>SO-EC</w:t>
+            </w:r>
+          </w:p>
+        </w:tc>
+        <w:tc>
+          <w:tcPr>
+            <w:tcW w:type="dxa" w:w="4536"/>
+            <w:shd w:val="clear" w:color="auto" w:fill="FFFFFF"/>
+            <w:tcBorders>
+              <w:top w:val="single" w:sz="4" w:space="0" w:color="999999"/>
+              <w:left w:val="single" w:sz="4" w:space="0" w:color="999999"/>
+              <w:bottom w:val="single" w:sz="4" w:space="0" w:color="999999"/>
+              <w:right w:val="single" w:sz="4" w:space="0" w:color="999999"/>
+            </w:tcBorders>
+          </w:tcPr>
+          <w:p>
+            <w:r>
+              <w:rPr>
+                <w:sz w:val="20"/>
+              </w:rPr>
+              <w:t>End Cap (legacy)</w:t>
+            </w:r>
+          </w:p>
+        </w:tc>
+      </w:tr>
+      <w:tr>
+        <w:tc>
+          <w:tcPr>
+            <w:tcW w:type="dxa" w:w="4536"/>
+            <w:shd w:val="clear" w:color="auto" w:fill="F2F7FC"/>
+            <w:tcBorders>
+              <w:top w:val="single" w:sz="4" w:space="0" w:color="999999"/>
+              <w:left w:val="single" w:sz="4" w:space="0" w:color="999999"/>
+              <w:bottom w:val="single" w:sz="4" w:space="0" w:color="999999"/>
+              <w:right w:val="single" w:sz="4" w:space="0" w:color="999999"/>
+            </w:tcBorders>
+          </w:tcPr>
+          <w:p>
+            <w:r>
+              <w:rPr>
+                <w:sz w:val="20"/>
+              </w:rPr>
               <w:t>SO-SS</w:t>
             </w:r>
           </w:p>
         </w:tc>
         <w:tc>
           <w:tcPr>
-            <w:tcW w:type="dxa" w:w="4320"/>
+            <w:tcW w:type="dxa" w:w="4536"/>
+            <w:shd w:val="clear" w:color="auto" w:fill="F2F7FC"/>
+            <w:tcBorders>
+              <w:top w:val="single" w:sz="4" w:space="0" w:color="999999"/>
+              <w:left w:val="single" w:sz="4" w:space="0" w:color="999999"/>
+              <w:bottom w:val="single" w:sz="4" w:space="0" w:color="999999"/>
+              <w:right w:val="single" w:sz="4" w:space="0" w:color="999999"/>
+            </w:tcBorders>
           </w:tcPr>
           <w:p>
             <w:r>
-              <w:t>Set Screw</w:t>
+              <w:rPr>
+                <w:sz w:val="20"/>
+              </w:rPr>
+              <w:t>Set Screw (legacy)</w:t>
             </w:r>
           </w:p>
         </w:tc>
@@ -1676,52 +3016,157 @@
     </w:tbl>
     <w:p/>
     <w:p>
-      <w:pPr>
-        <w:pStyle w:val="Heading1"/>
-      </w:pPr>
-      <w:r>
-        <w:t>5. Tips</w:t>
+      <w:pPr/>
+      <w:r>
+        <w:t xml:space="preserve">All 105 Summa Orthopaedics products are recognized. Items not yet in the database show "Unknown — GTIN: XXXXXXXXXX" and can be corrected using the </w:t>
+      </w:r>
+      <w:r>
+        <w:rPr>
+          <w:b/>
+        </w:rPr>
+        <w:t>Edit</w:t>
+      </w:r>
+      <w:r>
+        <w:t xml:space="preserve"> button on the item detail page.</w:t>
       </w:r>
     </w:p>
     <w:p>
       <w:pPr>
-        <w:pStyle w:val="ListBullet"/>
-        <w:spacing w:after="80"/>
-      </w:pPr>
-      <w:r>
-        <w:t>Best scanning results: Hold the phone steady, ensure good lighting, and frame the entire barcode in the photo</w:t>
+        <w:pStyle w:val="Heading2"/>
+      </w:pPr>
+      <w:r>
+        <w:t>Tips</w:t>
       </w:r>
     </w:p>
     <w:p>
       <w:pPr>
         <w:pStyle w:val="ListBullet"/>
-        <w:spacing w:after="80"/>
-      </w:pPr>
-      <w:r>
-        <w:t>Help banners: Dismissible help text appears on key pages — tap "? Help" to bring them back</w:t>
+      </w:pPr>
+      <w:r>
+        <w:rPr>
+          <w:b/>
+        </w:rPr>
+        <w:t>Best scanning results:</w:t>
+      </w:r>
+      <w:r>
+        <w:t xml:space="preserve"> Good lighting and holding the phone steady get the most reliable reads. Live Scan mode works best for continuous high-volume receiving.</w:t>
       </w:r>
     </w:p>
     <w:p>
       <w:pPr>
         <w:pStyle w:val="ListBullet"/>
-        <w:spacing w:after="80"/>
-      </w:pPr>
-      <w:r>
-        <w:t>Deleted items can be re-added: If an item was previously deleted or marked as used, scanning it again will restore it</w:t>
+      </w:pPr>
+      <w:r>
+        <w:rPr>
+          <w:b/>
+        </w:rPr>
+        <w:t>Same lot, multiple units:</w:t>
+      </w:r>
+      <w:r>
+        <w:t xml:space="preserve"> Scanning the same barcode label 10 times creates 10 individual inventory records — which is correct for tracking individual physical implants.</w:t>
       </w:r>
     </w:p>
     <w:p>
       <w:pPr>
         <w:pStyle w:val="ListBullet"/>
-        <w:spacing w:after="80"/>
-      </w:pPr>
-      <w:r>
-        <w:t>Print reports: Use your browser's print function (Ctrl+P / Cmd+P) — headers and navigation are automatically hidden in print mode</w:t>
+      </w:pPr>
+      <w:r>
+        <w:rPr>
+          <w:b/>
+        </w:rPr>
+        <w:t>Help banners:</w:t>
+      </w:r>
+      <w:r>
+        <w:t xml:space="preserve"> Dismissible help text appears on key pages. Tap </w:t>
+      </w:r>
+      <w:r>
+        <w:rPr>
+          <w:b/>
+        </w:rPr>
+        <w:t>? Help</w:t>
+      </w:r>
+      <w:r>
+        <w:t xml:space="preserve"> to bring them back.</w:t>
+      </w:r>
+    </w:p>
+    <w:p>
+      <w:pPr>
+        <w:pStyle w:val="ListBullet"/>
+      </w:pPr>
+      <w:r>
+        <w:rPr>
+          <w:b/>
+        </w:rPr>
+        <w:t>Excel exports:</w:t>
+      </w:r>
+      <w:r>
+        <w:t xml:space="preserve"> All downloads are </w:t>
+      </w:r>
+      <w:r>
+        <w:rPr>
+          <w:rFonts w:ascii="Courier New" w:hAnsi="Courier New"/>
+          <w:sz w:val="18"/>
+        </w:rPr>
+        <w:t>.xlsx</w:t>
+      </w:r>
+      <w:r>
+        <w:t xml:space="preserve"> with a bold header row. Expired items are highlighted red. Open in Excel or Google Sheets.</w:t>
+      </w:r>
+    </w:p>
+    <w:p>
+      <w:pPr>
+        <w:pStyle w:val="ListBullet"/>
+      </w:pPr>
+      <w:r>
+        <w:rPr>
+          <w:b/>
+        </w:rPr>
+        <w:t>Keyboard shortcut:</w:t>
+      </w:r>
+      <w:r>
+        <w:t xml:space="preserve"> Press </w:t>
+      </w:r>
+      <w:r>
+        <w:rPr>
+          <w:b/>
+        </w:rPr>
+        <w:t>ESC</w:t>
+      </w:r>
+      <w:r>
+        <w:t xml:space="preserve"> to close full-screen images and modal dialogs.</w:t>
+      </w:r>
+    </w:p>
+    <w:p>
+      <w:pPr>
+        <w:pStyle w:val="ListBullet"/>
+      </w:pPr>
+      <w:r>
+        <w:rPr>
+          <w:b/>
+        </w:rPr>
+        <w:t>Print reports:</w:t>
+      </w:r>
+      <w:r>
+        <w:t xml:space="preserve"> Use Ctrl+P / Cmd+P — page headers and navigation are automatically hidden in print mode.</w:t>
+      </w:r>
+    </w:p>
+    <w:p>
+      <w:pPr>
+        <w:pStyle w:val="ListBullet"/>
+      </w:pPr>
+      <w:r>
+        <w:rPr>
+          <w:b/>
+        </w:rPr>
+        <w:t>REF code auto-fill:</w:t>
+      </w:r>
+      <w:r>
+        <w:t xml:space="preserve"> When editing an item, entering a known Item Number (REF code) auto-fills the correct GTIN and product description.</w:t>
       </w:r>
     </w:p>
     <w:sectPr>
       <w:pgSz w:w="12240" w:h="15840"/>
-      <w:pgMar w:top="1440" w:right="1800" w:bottom="1440" w:left="1800" w:header="720" w:footer="720" w:gutter="0"/>
+      <w:pgMar w:top="1440" w:right="1584" w:bottom="1440" w:left="1584" w:header="720" w:footer="720" w:gutter="0"/>
       <w:cols w:space="720"/>
       <w:docGrid w:linePitch="360"/>
     </w:sectPr>
@@ -2156,11 +3601,11 @@
       <w:outlineLvl w:val="0"/>
     </w:pPr>
     <w:rPr>
-      <w:rFonts w:asciiTheme="majorHAnsi" w:eastAsiaTheme="majorEastAsia" w:hAnsiTheme="majorHAnsi" w:cstheme="majorBidi"/>
+      <w:rFonts w:asciiTheme="majorHAnsi" w:eastAsiaTheme="majorEastAsia" w:hAnsiTheme="majorHAnsi" w:cstheme="majorBidi" w:ascii="Calibri" w:hAnsi="Calibri"/>
       <w:b/>
       <w:bCs/>
-      <w:color w:val="365F91" w:themeColor="accent1" w:themeShade="BF"/>
-      <w:sz w:val="28"/>
+      <w:color w:val="1F3864"/>
+      <w:sz w:val="44"/>
       <w:szCs w:val="28"/>
     </w:rPr>
   </w:style>
@@ -2180,11 +3625,11 @@
       <w:outlineLvl w:val="1"/>
     </w:pPr>
     <w:rPr>
-      <w:rFonts w:asciiTheme="majorHAnsi" w:eastAsiaTheme="majorEastAsia" w:hAnsiTheme="majorHAnsi" w:cstheme="majorBidi"/>
+      <w:rFonts w:asciiTheme="majorHAnsi" w:eastAsiaTheme="majorEastAsia" w:hAnsiTheme="majorHAnsi" w:cstheme="majorBidi" w:ascii="Calibri" w:hAnsi="Calibri"/>
       <w:b/>
       <w:bCs/>
-      <w:color w:val="4F81BD" w:themeColor="accent1"/>
-      <w:sz w:val="26"/>
+      <w:color w:val="2E74B5"/>
+      <w:sz w:val="32"/>
       <w:szCs w:val="26"/>
     </w:rPr>
   </w:style>
@@ -2204,10 +3649,11 @@
       <w:outlineLvl w:val="2"/>
     </w:pPr>
     <w:rPr>
-      <w:rFonts w:asciiTheme="majorHAnsi" w:eastAsiaTheme="majorEastAsia" w:hAnsiTheme="majorHAnsi" w:cstheme="majorBidi"/>
+      <w:rFonts w:asciiTheme="majorHAnsi" w:eastAsiaTheme="majorEastAsia" w:hAnsiTheme="majorHAnsi" w:cstheme="majorBidi" w:ascii="Calibri" w:hAnsi="Calibri"/>
       <w:b/>
       <w:bCs/>
-      <w:color w:val="4F81BD" w:themeColor="accent1"/>
+      <w:color w:val="2E74B5"/>
+      <w:sz w:val="26"/>
     </w:rPr>
   </w:style>
   <w:style w:type="paragraph" w:styleId="Heading4">
@@ -2227,12 +3673,13 @@
       <w:outlineLvl w:val="3"/>
     </w:pPr>
     <w:rPr>
-      <w:rFonts w:asciiTheme="majorHAnsi" w:eastAsiaTheme="majorEastAsia" w:hAnsiTheme="majorHAnsi" w:cstheme="majorBidi"/>
+      <w:rFonts w:asciiTheme="majorHAnsi" w:eastAsiaTheme="majorEastAsia" w:hAnsiTheme="majorHAnsi" w:cstheme="majorBidi" w:ascii="Calibri" w:hAnsi="Calibri"/>
       <w:b/>
       <w:bCs/>
       <w:i/>
       <w:iCs/>
-      <w:color w:val="4F81BD" w:themeColor="accent1"/>
+      <w:color w:val="404040"/>
+      <w:sz w:val="22"/>
     </w:rPr>
   </w:style>
   <w:style w:type="paragraph" w:styleId="Heading5">

</xml_diff>

<commit_message>
Rewrite user guide for HS-educated audience; add guide link to login page
- USER_GUIDE.md: full rewrite with plain English, more context, step-by-step detail,
  troubleshooting section, and real-world framing for inventory workers
- Nail_Tracker_User_Guide.docx: regenerated from updated Markdown
- Login page: add prominent User Guide download button above the What's New link

https://claude.ai/code/session_0131FAs6jpePy9Jo8PPJ4xvS
</commit_message>
<xml_diff>
--- a/Nail_Tracker_User_Guide.docx
+++ b/Nail_Tracker_User_Guide.docx
@@ -27,23 +27,49 @@
         <w:pStyle w:val="Heading2"/>
       </w:pPr>
       <w:r>
-        <w:t>Getting Started</w:t>
+        <w:t>What Is Nail Tracker?</w:t>
       </w:r>
     </w:p>
     <w:p>
-      <w:pPr>
-        <w:pStyle w:val="Heading3"/>
-      </w:pPr>
-      <w:r>
-        <w:t>Logging In</w:t>
+      <w:pPr/>
+      <w:r>
+        <w:t>Nail Tracker is the system your company uses to keep track of orthopedic implants — things like nails, screws, and caps — as they move from the Home Office warehouse out to sales reps and distributors in the field.</w:t>
       </w:r>
     </w:p>
     <w:p>
+      <w:pPr/>
+      <w:r>
+        <w:t>Every time a box of implants arrives, gets moved, or gets used in surgery, Nail Tracker records it. That way, you always know exactly what you have, where it is, and when it expires.</w:t>
+      </w:r>
+    </w:p>
+    <w:p>
+      <w:pPr/>
+      <w:r>
+        <w:t>This guide will walk you through everything you need to know to use the system confidently.</w:t>
+      </w:r>
+    </w:p>
+    <w:p>
+      <w:pPr>
+        <w:pStyle w:val="Heading2"/>
+      </w:pPr>
+      <w:r>
+        <w:t>Getting Started</w:t>
+      </w:r>
+    </w:p>
+    <w:p>
+      <w:pPr>
+        <w:pStyle w:val="Heading3"/>
+      </w:pPr>
+      <w:r>
+        <w:t>Logging In</w:t>
+      </w:r>
+    </w:p>
+    <w:p>
       <w:pPr>
         <w:pStyle w:val="ListNumber"/>
       </w:pPr>
       <w:r>
-        <w:t xml:space="preserve">Open the app at your organization's URL (e.g., </w:t>
+        <w:t xml:space="preserve">On your phone or computer, open the app at your company's web address (e.g., </w:t>
       </w:r>
       <w:r>
         <w:rPr>
@@ -61,7 +87,7 @@
         <w:pStyle w:val="ListNumber"/>
       </w:pPr>
       <w:r>
-        <w:t>Enter your username and password (login is case-insensitive)</w:t>
+        <w:t>Type your username and password — it doesn't matter if you use capital letters or not</w:t>
       </w:r>
     </w:p>
     <w:p>
@@ -69,7 +95,7 @@
         <w:pStyle w:val="ListNumber"/>
       </w:pPr>
       <w:r>
-        <w:t>Use the eye icon to toggle password visibility if needed</w:t>
+        <w:t>If you need to see the password you typed, tap the eye icon on the right side of the password box</w:t>
       </w:r>
     </w:p>
     <w:p>
@@ -77,77 +103,226 @@
         <w:pStyle w:val="ListNumber"/>
       </w:pPr>
       <w:r>
-        <w:t>Sessions last 7 days before requiring re-login</w:t>
+        <w:t>Once you're in, you'll stay logged in for 7 days before you need to sign in again</w:t>
       </w:r>
     </w:p>
     <w:p>
       <w:pPr>
+        <w:ind w:left="576" w:right="576"/>
+        <w:pBdr>
+          <w:left w:val="single" w:sz="12" w:space="4" w:color="5B9BD5"/>
+        </w:pBdr>
+      </w:pPr>
+      <w:r>
+        <w:rPr>
+          <w:i/>
+          <w:color w:val="404040"/>
+        </w:rPr>
+        <w:t>**Forgot your login?** Ask your manager or system administrator to reset it for you.</w:t>
+      </w:r>
+    </w:p>
+    <w:p>
+      <w:pPr>
         <w:pStyle w:val="Heading3"/>
       </w:pPr>
       <w:r>
-        <w:t>Installing as a Mobile App (Recommended)</w:t>
+        <w:t>Installing the App on Your Phone (Recommended)</w:t>
       </w:r>
     </w:p>
     <w:p>
       <w:pPr/>
       <w:r>
-        <w:t>For the best mobile experience, add Nail Tracker to your home screen:</w:t>
+        <w:t>Nail Tracker works in a web browser, but you can also add it to your phone's home screen so it opens like a regular app — no browser bar, no extra steps.</w:t>
       </w:r>
     </w:p>
     <w:p>
-      <w:pPr>
-        <w:pStyle w:val="ListBullet"/>
-      </w:pPr>
+      <w:pPr/>
       <w:r>
         <w:rPr>
           <w:b/>
         </w:rPr>
-        <w:t>iPhone/iPad (Safari):</w:t>
-      </w:r>
-      <w:r>
-        <w:t xml:space="preserve"> Tap the Share button → "Add to Home Screen"</w:t>
+        <w:t>On an iPhone or iPad:</w:t>
       </w:r>
     </w:p>
     <w:p>
       <w:pPr>
-        <w:pStyle w:val="ListBullet"/>
-      </w:pPr>
+        <w:pStyle w:val="ListNumber"/>
+      </w:pPr>
+      <w:r>
+        <w:t xml:space="preserve">Open the app in </w:t>
+      </w:r>
       <w:r>
         <w:rPr>
           <w:b/>
         </w:rPr>
-        <w:t>Android (Chrome):</w:t>
-      </w:r>
-      <w:r>
-        <w:t xml:space="preserve"> Tap the three-dot menu → "Add to Home Screen"</w:t>
+        <w:t>Safari</w:t>
+      </w:r>
+      <w:r>
+        <w:t xml:space="preserve"> (must be Safari, not Chrome)</w:t>
+      </w:r>
+    </w:p>
+    <w:p>
+      <w:pPr>
+        <w:pStyle w:val="ListNumber"/>
+      </w:pPr>
+      <w:r>
+        <w:t xml:space="preserve">Tap the </w:t>
+      </w:r>
+      <w:r>
+        <w:rPr>
+          <w:b/>
+        </w:rPr>
+        <w:t>Share</w:t>
+      </w:r>
+      <w:r>
+        <w:t xml:space="preserve"> button (the box with an arrow pointing up)</w:t>
+      </w:r>
+    </w:p>
+    <w:p>
+      <w:pPr>
+        <w:pStyle w:val="ListNumber"/>
+      </w:pPr>
+      <w:r>
+        <w:t xml:space="preserve">Scroll down and tap </w:t>
+      </w:r>
+      <w:r>
+        <w:rPr>
+          <w:b/>
+        </w:rPr>
+        <w:t>"Add to Home Screen"</w:t>
+      </w:r>
+    </w:p>
+    <w:p>
+      <w:pPr>
+        <w:pStyle w:val="ListNumber"/>
+      </w:pPr>
+      <w:r>
+        <w:t xml:space="preserve">Tap </w:t>
+      </w:r>
+      <w:r>
+        <w:rPr>
+          <w:b/>
+        </w:rPr>
+        <w:t>Add</w:t>
+      </w:r>
+      <w:r>
+        <w:t xml:space="preserve"> — the app icon will appear on your home screen</w:t>
       </w:r>
     </w:p>
     <w:p>
       <w:pPr/>
       <w:r>
-        <w:t>This removes the browser toolbar and gives you a full-screen app experience.</w:t>
-      </w:r>
-    </w:p>
-    <w:p>
-      <w:pPr>
-        <w:pStyle w:val="Heading3"/>
-      </w:pPr>
-      <w:r>
-        <w:t>Navigation</w:t>
-      </w:r>
-    </w:p>
-    <w:p>
-      <w:pPr>
-        <w:pStyle w:val="ListBullet"/>
-      </w:pPr>
-      <w:r>
         <w:rPr>
           <w:b/>
         </w:rPr>
-        <w:t>Mobile:</w:t>
-      </w:r>
-      <w:r>
-        <w:t xml:space="preserve"> Bottom tab bar with Receive, Lookup, Inventory, and Reports. Tap </w:t>
+        <w:t>On an Android phone:</w:t>
+      </w:r>
+    </w:p>
+    <w:p>
+      <w:pPr>
+        <w:pStyle w:val="ListNumber"/>
+      </w:pPr>
+      <w:r>
+        <w:t xml:space="preserve">Open the app in </w:t>
+      </w:r>
+      <w:r>
+        <w:rPr>
+          <w:b/>
+        </w:rPr>
+        <w:t>Chrome</w:t>
+      </w:r>
+    </w:p>
+    <w:p>
+      <w:pPr>
+        <w:pStyle w:val="ListNumber"/>
+      </w:pPr>
+      <w:r>
+        <w:t>Tap the three-dot menu in the top right</w:t>
+      </w:r>
+    </w:p>
+    <w:p>
+      <w:pPr>
+        <w:pStyle w:val="ListNumber"/>
+      </w:pPr>
+      <w:r>
+        <w:t xml:space="preserve">Tap </w:t>
+      </w:r>
+      <w:r>
+        <w:rPr>
+          <w:b/>
+        </w:rPr>
+        <w:t>"Add to Home Screen"</w:t>
+      </w:r>
+      <w:r>
+        <w:t xml:space="preserve"> or </w:t>
+      </w:r>
+      <w:r>
+        <w:rPr>
+          <w:b/>
+        </w:rPr>
+        <w:t>"Install App"</w:t>
+      </w:r>
+    </w:p>
+    <w:p>
+      <w:pPr/>
+      <w:r>
+        <w:t>Once installed, it opens full-screen just like any other app on your phone.</w:t>
+      </w:r>
+    </w:p>
+    <w:p>
+      <w:pPr>
+        <w:pStyle w:val="Heading3"/>
+      </w:pPr>
+      <w:r>
+        <w:t>Finding Your Way Around</w:t>
+      </w:r>
+    </w:p>
+    <w:p>
+      <w:pPr/>
+      <w:r>
+        <w:rPr>
+          <w:b/>
+        </w:rPr>
+        <w:t>On a phone:</w:t>
+      </w:r>
+      <w:r>
+        <w:t xml:space="preserve"> You'll see four tabs at the bottom of the screen — </w:t>
+      </w:r>
+      <w:r>
+        <w:rPr>
+          <w:b/>
+        </w:rPr>
+        <w:t>Receive</w:t>
+      </w:r>
+      <w:r>
+        <w:t xml:space="preserve">, </w:t>
+      </w:r>
+      <w:r>
+        <w:rPr>
+          <w:b/>
+        </w:rPr>
+        <w:t>Lookup</w:t>
+      </w:r>
+      <w:r>
+        <w:t xml:space="preserve">, </w:t>
+      </w:r>
+      <w:r>
+        <w:rPr>
+          <w:b/>
+        </w:rPr>
+        <w:t>Inventory</w:t>
+      </w:r>
+      <w:r>
+        <w:t xml:space="preserve">, and </w:t>
+      </w:r>
+      <w:r>
+        <w:rPr>
+          <w:b/>
+        </w:rPr>
+        <w:t>Reports</w:t>
+      </w:r>
+      <w:r>
+        <w:t xml:space="preserve">. Tap </w:t>
       </w:r>
       <w:r>
         <w:rPr>
@@ -156,35 +331,31 @@
         <w:t>More</w:t>
       </w:r>
       <w:r>
-        <w:t xml:space="preserve"> for additional features (Banks, Transfer, Distributors, Batch Upload, User Management).</w:t>
+        <w:t xml:space="preserve"> to access the rest: Banks, Transfer, Distributors, Batch Upload, and User Management.</w:t>
       </w:r>
     </w:p>
     <w:p>
-      <w:pPr>
-        <w:pStyle w:val="ListBullet"/>
-      </w:pPr>
+      <w:pPr/>
       <w:r>
         <w:rPr>
           <w:b/>
         </w:rPr>
-        <w:t>Desktop:</w:t>
-      </w:r>
-      <w:r>
-        <w:t xml:space="preserve"> All navigation items appear in the top bar.</w:t>
-      </w:r>
-    </w:p>
-    <w:p>
-      <w:pPr>
-        <w:pStyle w:val="Heading3"/>
-      </w:pPr>
-      <w:r>
-        <w:t>What's New / Version Badge</w:t>
+        <w:t>On a computer:</w:t>
+      </w:r>
+      <w:r>
+        <w:t xml:space="preserve"> All the pages are listed in the navigation bar at the top.</w:t>
       </w:r>
     </w:p>
     <w:p>
       <w:pPr/>
       <w:r>
-        <w:t xml:space="preserve">Tap the version badge (e.g., </w:t>
+        <w:rPr>
+          <w:b/>
+        </w:rPr>
+        <w:t>Version badge:</w:t>
+      </w:r>
+      <w:r>
+        <w:t xml:space="preserve"> You'll see a small button like </w:t>
       </w:r>
       <w:r>
         <w:rPr>
@@ -193,16 +364,7 @@
         <w:t>v3.13</w:t>
       </w:r>
       <w:r>
-        <w:t xml:space="preserve">) in the header to open the </w:t>
-      </w:r>
-      <w:r>
-        <w:rPr>
-          <w:b/>
-        </w:rPr>
-        <w:t>What's New</w:t>
-      </w:r>
-      <w:r>
-        <w:t xml:space="preserve"> panel, which shows a summary of recent changes.</w:t>
+        <w:t xml:space="preserve"> near the top of the screen. Tap it to see a summary of recent changes to the app.</w:t>
       </w:r>
     </w:p>
     <w:p>
@@ -210,13 +372,21 @@
         <w:pStyle w:val="Heading2"/>
       </w:pPr>
       <w:r>
-        <w:t>Expiry Alerts (Bell Icon)</w:t>
+        <w:t>Expiry Alerts</w:t>
+      </w:r>
+    </w:p>
+    <w:p>
+      <w:pPr>
+        <w:pStyle w:val="Heading3"/>
+      </w:pPr>
+      <w:r>
+        <w:t>The Bell Icon — Your Early Warning System</w:t>
       </w:r>
     </w:p>
     <w:p>
       <w:pPr/>
       <w:r>
-        <w:t xml:space="preserve">The </w:t>
+        <w:t xml:space="preserve">Near the top-right corner of the screen, there's a </w:t>
       </w:r>
       <w:r>
         <w:rPr>
@@ -225,7 +395,7 @@
         <w:t>bell icon</w:t>
       </w:r>
       <w:r>
-        <w:t xml:space="preserve"> in the top-right header gives you instant visibility into items expiring soon — without needing to visit the Reports page.</w:t>
+        <w:t>. This is one of the most important tools in the app — it tells you immediately if anything in your inventory is getting close to its expiration date, without you having to go looking for it.</w:t>
       </w:r>
     </w:p>
     <w:p>
@@ -233,13 +403,13 @@
         <w:pStyle w:val="ListBullet"/>
       </w:pPr>
       <w:r>
-        <w:t xml:space="preserve">Tap the bell to see all items expiring within </w:t>
+        <w:t xml:space="preserve">Tap the bell to see a list of all items expiring </w:t>
       </w:r>
       <w:r>
         <w:rPr>
           <w:b/>
         </w:rPr>
-        <w:t>90 days</w:t>
+        <w:t>within the next 90 days</w:t>
       </w:r>
     </w:p>
     <w:p>
@@ -247,7 +417,7 @@
         <w:pStyle w:val="ListBullet"/>
       </w:pPr>
       <w:r>
-        <w:t>Each alert shows the product name, lot, expiry date, and current location</w:t>
+        <w:t>Each alert tells you the product name, lot number, expiry date, and where it's currently located</w:t>
       </w:r>
     </w:p>
     <w:p>
@@ -255,7 +425,16 @@
         <w:pStyle w:val="ListBullet"/>
       </w:pPr>
       <w:r>
-        <w:t xml:space="preserve">Tap an individual alert to dismiss it, or tap </w:t>
+        <w:t xml:space="preserve">Once you've reviewed an alert, tap the </w:t>
+      </w:r>
+      <w:r>
+        <w:rPr>
+          <w:b/>
+        </w:rPr>
+        <w:t>X</w:t>
+      </w:r>
+      <w:r>
+        <w:t xml:space="preserve"> next to it to dismiss it, or tap </w:t>
       </w:r>
       <w:r>
         <w:rPr>
@@ -264,7 +443,7 @@
         <w:t>Dismiss All</w:t>
       </w:r>
       <w:r>
-        <w:t xml:space="preserve"> to clear everything</w:t>
+        <w:t xml:space="preserve"> to clear the whole list</w:t>
       </w:r>
     </w:p>
     <w:p>
@@ -272,23 +451,7 @@
         <w:pStyle w:val="ListBullet"/>
       </w:pPr>
       <w:r>
-        <w:t>Dismissed alerts are remembered across sessions</w:t>
-      </w:r>
-    </w:p>
-    <w:p>
-      <w:pPr>
-        <w:pStyle w:val="Heading2"/>
-      </w:pPr>
-      <w:r>
-        <w:t>Core Workflows</w:t>
-      </w:r>
-    </w:p>
-    <w:p>
-      <w:pPr>
-        <w:pStyle w:val="Heading3"/>
-      </w:pPr>
-      <w:r>
-        <w:t>1. Receiving Inventory</w:t>
+        <w:t>The app remembers which alerts you've dismissed, so they won't keep coming back</w:t>
       </w:r>
     </w:p>
     <w:p>
@@ -297,33 +460,84 @@
         <w:rPr>
           <w:b/>
         </w:rPr>
-        <w:t>Location:</w:t>
-      </w:r>
-      <w:r>
-        <w:t xml:space="preserve"> Receive tab (home screen)</w:t>
+        <w:t>Why this matters:</w:t>
+      </w:r>
+      <w:r>
+        <w:t xml:space="preserve"> Expired implants cannot be used in surgery. Catching items early gives you time to arrange returns or replacements before they become a problem.</w:t>
+      </w:r>
+    </w:p>
+    <w:p>
+      <w:pPr>
+        <w:pStyle w:val="Heading2"/>
+      </w:pPr>
+      <w:r>
+        <w:t>Core Workflows</w:t>
+      </w:r>
+    </w:p>
+    <w:p>
+      <w:pPr>
+        <w:pStyle w:val="Heading3"/>
+      </w:pPr>
+      <w:r>
+        <w:t>1. Receiving Inventory</w:t>
       </w:r>
     </w:p>
     <w:p>
       <w:pPr/>
       <w:r>
-        <w:t>This is where new items enter the system. All received items go to the Home Office distributor automatically.</w:t>
+        <w:rPr>
+          <w:b/>
+        </w:rPr>
+        <w:t>Where to go:</w:t>
+      </w:r>
+      <w:r>
+        <w:t xml:space="preserve"> Tap the </w:t>
+      </w:r>
+      <w:r>
+        <w:rPr>
+          <w:b/>
+        </w:rPr>
+        <w:t>Receive</w:t>
+      </w:r>
+      <w:r>
+        <w:t xml:space="preserve"> tab (it's the home screen when you open the app)</w:t>
       </w:r>
     </w:p>
     <w:p>
       <w:pPr/>
       <w:r>
+        <w:t>This is where you bring new items into the system. When a shipment arrives at the Home Office warehouse, you scan each item here. The system automatically records it under "Home Office."</w:t>
+      </w:r>
+    </w:p>
+    <w:p>
+      <w:pPr/>
+      <w:r>
         <w:rPr>
           <w:b/>
         </w:rPr>
-        <w:t>Option A — Live Scan (easiest, continuous):</w:t>
+        <w:t>The four ways to receive an item:</w:t>
       </w:r>
     </w:p>
     <w:p>
       <w:pPr>
+        <w:pStyle w:val="Heading4"/>
+      </w:pPr>
+      <w:r>
+        <w:t>Option A — Live Scan *(best for high volume)*</w:t>
+      </w:r>
+    </w:p>
+    <w:p>
+      <w:pPr/>
+      <w:r>
+        <w:t>This is the fastest method for scanning many items in a row.</w:t>
+      </w:r>
+    </w:p>
+    <w:p>
+      <w:pPr>
         <w:pStyle w:val="ListNumber"/>
       </w:pPr>
       <w:r>
-        <w:t xml:space="preserve">Tap </w:t>
+        <w:t xml:space="preserve">Tap the </w:t>
       </w:r>
       <w:r>
         <w:rPr>
@@ -331,13 +545,16 @@
         </w:rPr>
         <w:t>Live Scan</w:t>
       </w:r>
+      <w:r>
+        <w:t xml:space="preserve"> button</w:t>
+      </w:r>
     </w:p>
     <w:p>
       <w:pPr>
         <w:pStyle w:val="ListNumber"/>
       </w:pPr>
       <w:r>
-        <w:t>Point your camera at the GS1-128 barcode label</w:t>
+        <w:t>Hold your phone camera over a barcode label</w:t>
       </w:r>
     </w:p>
     <w:p>
@@ -345,7 +562,7 @@
         <w:pStyle w:val="ListNumber"/>
       </w:pPr>
       <w:r>
-        <w:t>The app detects the barcode automatically — no button press needed</w:t>
+        <w:t>The app reads it automatically — you don't have to tap anything</w:t>
       </w:r>
     </w:p>
     <w:p>
@@ -353,16 +570,44 @@
         <w:pStyle w:val="ListNumber"/>
       </w:pPr>
       <w:r>
-        <w:t>A confirmation card appears immediately; keep scanning the next item</w:t>
+        <w:t>A green card appears confirming what was just received</w:t>
+      </w:r>
+    </w:p>
+    <w:p>
+      <w:pPr>
+        <w:pStyle w:val="ListNumber"/>
+      </w:pPr>
+      <w:r>
+        <w:t>Move on to the next item — the camera stays ready</w:t>
+      </w:r>
+    </w:p>
+    <w:p>
+      <w:pPr>
+        <w:ind w:left="576" w:right="576"/>
+        <w:pBdr>
+          <w:left w:val="single" w:sz="12" w:space="4" w:color="5B9BD5"/>
+        </w:pBdr>
+      </w:pPr>
+      <w:r>
+        <w:rPr>
+          <w:i/>
+          <w:color w:val="404040"/>
+        </w:rPr>
+        <w:t>**Tip:** Make sure the barcode is well-lit and fully in frame. The app will beep or show a confirmation when it successfully reads a barcode.</w:t>
+      </w:r>
+    </w:p>
+    <w:p>
+      <w:pPr>
+        <w:pStyle w:val="Heading4"/>
+      </w:pPr>
+      <w:r>
+        <w:t>Option B — Take a Photo</w:t>
       </w:r>
     </w:p>
     <w:p>
       <w:pPr/>
       <w:r>
-        <w:rPr>
-          <w:b/>
-        </w:rPr>
-        <w:t>Option B — Take a Photo:</w:t>
+        <w:t>Good for single items or when Live Scan isn't working.</w:t>
       </w:r>
     </w:p>
     <w:p>
@@ -370,13 +615,7 @@
         <w:pStyle w:val="ListNumber"/>
       </w:pPr>
       <w:r>
-        <w:t xml:space="preserve">Tap the camera area or </w:t>
-      </w:r>
-      <w:r>
-        <w:rPr>
-          <w:b/>
-        </w:rPr>
-        <w:t>Take Photo</w:t>
+        <w:t>Tap the camera area on screen</w:t>
       </w:r>
     </w:p>
     <w:p>
@@ -384,7 +623,7 @@
         <w:pStyle w:val="ListNumber"/>
       </w:pPr>
       <w:r>
-        <w:t>Capture the barcode label</w:t>
+        <w:t>Point at the barcode label and take a photo</w:t>
       </w:r>
     </w:p>
     <w:p>
@@ -392,16 +631,29 @@
         <w:pStyle w:val="ListNumber"/>
       </w:pPr>
       <w:r>
-        <w:t>The app parses the image and saves the item</w:t>
+        <w:t>The app will analyze the photo and pull out the product details</w:t>
+      </w:r>
+    </w:p>
+    <w:p>
+      <w:pPr>
+        <w:pStyle w:val="ListNumber"/>
+      </w:pPr>
+      <w:r>
+        <w:t>You'll see a confirmation card if it was successful, or an error message if it couldn't read the barcode</w:t>
+      </w:r>
+    </w:p>
+    <w:p>
+      <w:pPr>
+        <w:pStyle w:val="Heading4"/>
+      </w:pPr>
+      <w:r>
+        <w:t>Option C — Batch Upload *(for large shipments)*</w:t>
       </w:r>
     </w:p>
     <w:p>
       <w:pPr/>
       <w:r>
-        <w:rPr>
-          <w:b/>
-        </w:rPr>
-        <w:t>Option C — Batch Upload (multiple photos):</w:t>
+        <w:t>If you have a lot of items to scan and want to do them all at once using photos already saved on your phone:</w:t>
       </w:r>
     </w:p>
     <w:p>
@@ -423,7 +675,7 @@
         <w:pStyle w:val="ListNumber"/>
       </w:pPr>
       <w:r>
-        <w:t>Select multiple barcode photos from your gallery</w:t>
+        <w:t>Select multiple photos from your phone's gallery — you can pick as many as you want</w:t>
       </w:r>
     </w:p>
     <w:p>
@@ -431,7 +683,13 @@
         <w:pStyle w:val="ListNumber"/>
       </w:pPr>
       <w:r>
-        <w:t>Each photo is processed — up to 4 barcodes can be detected per image</w:t>
+        <w:t xml:space="preserve">The app will work through each photo and can detect up to </w:t>
+      </w:r>
+      <w:r>
+        <w:rPr>
+          <w:b/>
+        </w:rPr>
+        <w:t>4 barcodes per image</w:t>
       </w:r>
     </w:p>
     <w:p>
@@ -439,16 +697,21 @@
         <w:pStyle w:val="ListNumber"/>
       </w:pPr>
       <w:r>
-        <w:t>All parsed items are saved to Home Office</w:t>
+        <w:t>All successfully scanned items are saved to Home Office automatically</w:t>
+      </w:r>
+    </w:p>
+    <w:p>
+      <w:pPr>
+        <w:pStyle w:val="Heading4"/>
+      </w:pPr>
+      <w:r>
+        <w:t>Option D — Manual Entry</w:t>
       </w:r>
     </w:p>
     <w:p>
       <w:pPr/>
       <w:r>
-        <w:rPr>
-          <w:b/>
-        </w:rPr>
-        <w:t>Option D — Manual Entry:</w:t>
+        <w:t>Use this if a barcode won't scan (damaged label, etc.) and you can read the numbers by eye.</w:t>
       </w:r>
     </w:p>
     <w:p>
@@ -470,7 +733,7 @@
         <w:pStyle w:val="ListNumber"/>
       </w:pPr>
       <w:r>
-        <w:t xml:space="preserve">Type or paste the barcode string, e.g., </w:t>
+        <w:t xml:space="preserve">Type the barcode string exactly as it appears — for example: </w:t>
       </w:r>
       <w:r>
         <w:rPr>
@@ -506,7 +769,7 @@
           <w:i/>
           <w:color w:val="404040"/>
         </w:rPr>
-        <w:t>**Note:** Multiple units of the same product and lot number (e.g., 50 identical screws from the same manufacturing batch) can each be received individually — the system creates a separate inventory record for each scan.</w:t>
+        <w:t>**About duplicate lot numbers:** If you're receiving 50 screws that all came from the same manufacturing batch (same lot number), that's completely fine — scan each one individually and the system will create a separate record for each physical item. This is the correct way to do it.</w:t>
       </w:r>
     </w:p>
     <w:p>
@@ -515,13 +778,13 @@
         <w:rPr>
           <w:b/>
         </w:rPr>
-        <w:t>Assigning to a bank after receiving:</w:t>
+        <w:t>Assigning received items to a bank:</w:t>
       </w:r>
     </w:p>
     <w:p>
       <w:pPr/>
       <w:r>
-        <w:t>After scanning items, you'll see an option: *"Assign received items to a bank?"*</w:t>
+        <w:t>After scanning, you may see a prompt: *"Assign received items to a bank?"* A "bank" is a named group of items (like a kit or tray). If these items belong to a specific kit:</w:t>
       </w:r>
     </w:p>
     <w:p>
@@ -529,7 +792,16 @@
         <w:pStyle w:val="ListNumber"/>
       </w:pPr>
       <w:r>
-        <w:t>Tap the button</w:t>
+        <w:t xml:space="preserve">Tap the </w:t>
+      </w:r>
+      <w:r>
+        <w:rPr>
+          <w:b/>
+        </w:rPr>
+        <w:t>Assign to Bank</w:t>
+      </w:r>
+      <w:r>
+        <w:t xml:space="preserve"> button</w:t>
       </w:r>
     </w:p>
     <w:p>
@@ -537,7 +809,7 @@
         <w:pStyle w:val="ListNumber"/>
       </w:pPr>
       <w:r>
-        <w:t>Select a bank from the dropdown (only Home Office banks are shown)</w:t>
+        <w:t>Choose the bank from the dropdown</w:t>
       </w:r>
     </w:p>
     <w:p>
@@ -553,34 +825,46 @@
         </w:rPr>
         <w:t>Assign</w:t>
       </w:r>
-      <w:r>
-        <w:t xml:space="preserve"> to add all newly received items to that bank</w:t>
-      </w:r>
-    </w:p>
-    <w:p>
-      <w:pPr>
-        <w:pStyle w:val="Heading3"/>
-      </w:pPr>
-      <w:r>
-        <w:t>2. Looking Up Items</w:t>
-      </w:r>
     </w:p>
     <w:p>
       <w:pPr/>
       <w:r>
+        <w:t>If they don't belong to a kit yet, just skip this step — you can always assign them later.</w:t>
+      </w:r>
+    </w:p>
+    <w:p>
+      <w:pPr>
+        <w:pStyle w:val="Heading3"/>
+      </w:pPr>
+      <w:r>
+        <w:t>2. Looking Up an Item</w:t>
+      </w:r>
+    </w:p>
+    <w:p>
+      <w:pPr/>
+      <w:r>
         <w:rPr>
           <w:b/>
         </w:rPr>
-        <w:t>Location:</w:t>
-      </w:r>
-      <w:r>
-        <w:t xml:space="preserve"> Lookup tab</w:t>
+        <w:t>Where to go:</w:t>
+      </w:r>
+      <w:r>
+        <w:t xml:space="preserve"> Tap </w:t>
+      </w:r>
+      <w:r>
+        <w:rPr>
+          <w:b/>
+        </w:rPr>
+        <w:t>Lookup</w:t>
+      </w:r>
+      <w:r>
+        <w:t xml:space="preserve"> in the bottom navigation</w:t>
       </w:r>
     </w:p>
     <w:p>
       <w:pPr/>
       <w:r>
-        <w:t>Use this to quickly check if an item is already in the system.</w:t>
+        <w:t>Use this when you want to check on a specific item — maybe you scanned something and want to know where it is, or a rep called and wants to know the status of a particular lot.</w:t>
       </w:r>
     </w:p>
     <w:p>
@@ -588,7 +872,7 @@
         <w:pStyle w:val="ListNumber"/>
       </w:pPr>
       <w:r>
-        <w:t>Scan or photograph a barcode</w:t>
+        <w:t>Scan the barcode (or type it manually)</w:t>
       </w:r>
     </w:p>
     <w:p>
@@ -596,23 +880,73 @@
         <w:pStyle w:val="ListNumber"/>
       </w:pPr>
       <w:r>
-        <w:t>The app shows whether the item exists, its current distributor, lot, expiry, and full history</w:t>
+        <w:t>The app will show you:</w:t>
       </w:r>
     </w:p>
     <w:p>
       <w:pPr>
-        <w:pStyle w:val="ListNumber"/>
-      </w:pPr>
-      <w:r>
-        <w:t>From the result you can transfer it to another distributor or mark it as used (implanted)</w:t>
+        <w:pStyle w:val="ListBullet2"/>
+      </w:pPr>
+      <w:r>
+        <w:t>Whether the item is in the system</w:t>
       </w:r>
     </w:p>
     <w:p>
       <w:pPr>
+        <w:pStyle w:val="ListBullet2"/>
+      </w:pPr>
+      <w:r>
+        <w:t>Where it currently is (which distributor has it)</w:t>
+      </w:r>
+    </w:p>
+    <w:p>
+      <w:pPr>
+        <w:pStyle w:val="ListBullet2"/>
+      </w:pPr>
+      <w:r>
+        <w:t>Its lot number and expiry date</w:t>
+      </w:r>
+    </w:p>
+    <w:p>
+      <w:pPr>
+        <w:pStyle w:val="ListBullet2"/>
+      </w:pPr>
+      <w:r>
+        <w:t>Its full history — every time it was moved and who moved it</w:t>
+      </w:r>
+    </w:p>
+    <w:p>
+      <w:pPr>
+        <w:pStyle w:val="ListNumber"/>
+      </w:pPr>
+      <w:r>
+        <w:t xml:space="preserve">From here, you can also </w:t>
+      </w:r>
+      <w:r>
+        <w:rPr>
+          <w:b/>
+        </w:rPr>
+        <w:t>transfer it</w:t>
+      </w:r>
+      <w:r>
+        <w:t xml:space="preserve"> to another location or </w:t>
+      </w:r>
+      <w:r>
+        <w:rPr>
+          <w:b/>
+        </w:rPr>
+        <w:t>mark it as used</w:t>
+      </w:r>
+      <w:r>
+        <w:t xml:space="preserve"> (meaning it was implanted in a patient)</w:t>
+      </w:r>
+    </w:p>
+    <w:p>
+      <w:pPr>
         <w:pStyle w:val="Heading3"/>
       </w:pPr>
       <w:r>
-        <w:t>3. Inventory Management</w:t>
+        <w:t>3. Browsing Your Inventory</w:t>
       </w:r>
     </w:p>
     <w:p>
@@ -621,16 +955,25 @@
         <w:rPr>
           <w:b/>
         </w:rPr>
-        <w:t>Location:</w:t>
-      </w:r>
-      <w:r>
-        <w:t xml:space="preserve"> Inventory tab</w:t>
+        <w:t>Where to go:</w:t>
+      </w:r>
+      <w:r>
+        <w:t xml:space="preserve"> Tap </w:t>
+      </w:r>
+      <w:r>
+        <w:rPr>
+          <w:b/>
+        </w:rPr>
+        <w:t>Inventory</w:t>
+      </w:r>
+      <w:r>
+        <w:t xml:space="preserve"> in the bottom navigation</w:t>
       </w:r>
     </w:p>
     <w:p>
       <w:pPr/>
       <w:r>
-        <w:t>Browse, search, and manage all active items in the system.</w:t>
+        <w:t>This page shows all active items in the system — everything that hasn't been used or deleted. Think of it as a live spreadsheet of your entire stock.</w:t>
       </w:r>
     </w:p>
     <w:p>
@@ -639,7 +982,7 @@
         <w:rPr>
           <w:b/>
         </w:rPr>
-        <w:t>Searching and filtering:</w:t>
+        <w:t>Finding what you're looking for:</w:t>
       </w:r>
     </w:p>
     <w:p>
@@ -653,7 +996,7 @@
         <w:t>Search bar</w:t>
       </w:r>
       <w:r>
-        <w:t xml:space="preserve"> — find items by item number (REF code), lot number, or product name</w:t>
+        <w:t xml:space="preserve"> at the top: Type a product name, lot number, or item number (REF code). The list filters as you search.</w:t>
       </w:r>
     </w:p>
     <w:p>
@@ -664,10 +1007,10 @@
         <w:rPr>
           <w:b/>
         </w:rPr>
-        <w:t>Filter panel</w:t>
-      </w:r>
-      <w:r>
-        <w:t xml:space="preserve"> (funnel icon) — narrow by distributor or expiry date</w:t>
+        <w:t>Filter button</w:t>
+      </w:r>
+      <w:r>
+        <w:t xml:space="preserve"> (the funnel icon): Narrow down by distributor or expiry date.</w:t>
       </w:r>
     </w:p>
     <w:p>
@@ -681,7 +1024,7 @@
         <w:t>Filter chip</w:t>
       </w:r>
       <w:r>
-        <w:t xml:space="preserve"> — when you arrive from a Reports card or Stock by Item drilldown, a blue chip at the top shows what's filtered (e.g., "Item: SO-S50I-SO-026-T @ Home Office"). Tap </w:t>
+        <w:t xml:space="preserve">: If you arrive at this page by tapping a report card or clicking through from the Stock report, you'll see a blue bar at the top showing what filter is active — for example, *"Item: SO-S50I-SO-026-T @ Home Office"*. Tap </w:t>
       </w:r>
       <w:r>
         <w:rPr>
@@ -690,7 +1033,7 @@
         <w:t>Clear</w:t>
       </w:r>
       <w:r>
-        <w:t xml:space="preserve"> to reset.</w:t>
+        <w:t xml:space="preserve"> to go back to the full list.</w:t>
       </w:r>
     </w:p>
     <w:p>
@@ -699,32 +1042,22 @@
         <w:rPr>
           <w:b/>
         </w:rPr>
-        <w:t>Sorting:</w:t>
-      </w:r>
-    </w:p>
-    <w:p>
-      <w:pPr>
-        <w:pStyle w:val="ListBullet"/>
-      </w:pPr>
-      <w:r>
-        <w:t>Tap any column header to sort by that field; tap again to reverse the order</w:t>
-      </w:r>
-    </w:p>
-    <w:p>
-      <w:pPr>
-        <w:pStyle w:val="ListBullet"/>
-      </w:pPr>
-      <w:r>
-        <w:t>Default sort is by Item Number</w:t>
+        <w:t>Sorting the list:</w:t>
       </w:r>
     </w:p>
     <w:p>
       <w:pPr/>
       <w:r>
+        <w:t>Tap any column header to sort by that column. Tap it again to reverse the order (A→Z or Z→A, newest or oldest, etc.). By default, items are sorted by Item Number.</w:t>
+      </w:r>
+    </w:p>
+    <w:p>
+      <w:pPr/>
+      <w:r>
         <w:rPr>
           <w:b/>
         </w:rPr>
-        <w:t>Actions:</w:t>
+        <w:t>Taking action on items:</w:t>
       </w:r>
     </w:p>
     <w:p>
@@ -735,10 +1068,10 @@
         <w:rPr>
           <w:b/>
         </w:rPr>
-        <w:t>Bulk reassign:</w:t>
-      </w:r>
-      <w:r>
-        <w:t xml:space="preserve"> Select multiple items with checkboxes, choose a destination distributor from the "Move to:" dropdown, and tap </w:t>
+        <w:t>Move one item:</w:t>
+      </w:r>
+      <w:r>
+        <w:t xml:space="preserve"> Tap the item row to open its detail page, then use the </w:t>
       </w:r>
       <w:r>
         <w:rPr>
@@ -746,6 +1079,9 @@
         </w:rPr>
         <w:t>Reassign</w:t>
       </w:r>
+      <w:r>
+        <w:t xml:space="preserve"> button there</w:t>
+      </w:r>
     </w:p>
     <w:p>
       <w:pPr>
@@ -755,21 +1091,36 @@
         <w:rPr>
           <w:b/>
         </w:rPr>
-        <w:t>Individual reassign:</w:t>
-      </w:r>
-      <w:r>
-        <w:t xml:space="preserve"> Tap the reassign button on any item card</w:t>
-      </w:r>
-    </w:p>
-    <w:p>
-      <w:pPr>
-        <w:pStyle w:val="ListBullet"/>
-      </w:pPr>
+        <w:t>Move several items at once:</w:t>
+      </w:r>
+      <w:r>
+        <w:t xml:space="preserve"> Check the box next to each item you want to move, then choose a destination from the </w:t>
+      </w:r>
       <w:r>
         <w:rPr>
           <w:b/>
         </w:rPr>
-        <w:t>Export:</w:t>
+        <w:t>"Move to:"</w:t>
+      </w:r>
+      <w:r>
+        <w:t xml:space="preserve"> dropdown and tap </w:t>
+      </w:r>
+      <w:r>
+        <w:rPr>
+          <w:b/>
+        </w:rPr>
+        <w:t>Reassign</w:t>
+      </w:r>
+    </w:p>
+    <w:p>
+      <w:pPr>
+        <w:pStyle w:val="ListBullet"/>
+      </w:pPr>
+      <w:r>
+        <w:rPr>
+          <w:b/>
+        </w:rPr>
+        <w:t>Download to Excel:</w:t>
       </w:r>
       <w:r>
         <w:t xml:space="preserve"> Tap the </w:t>
@@ -781,15 +1132,7 @@
         <w:t>Export</w:t>
       </w:r>
       <w:r>
-        <w:t xml:space="preserve"> button to download an Excel (.xlsx) file — expired items are highlighted red in the spreadsheet</w:t>
-      </w:r>
-    </w:p>
-    <w:p>
-      <w:pPr>
-        <w:pStyle w:val="ListBullet"/>
-      </w:pPr>
-      <w:r>
-        <w:t>Tap any item row to open its full detail page</w:t>
+        <w:t xml:space="preserve"> button to get a spreadsheet of your current filtered inventory. Expired items are highlighted in red automatically.</w:t>
       </w:r>
     </w:p>
     <w:p>
@@ -798,128 +1141,7 @@
         <w:rPr>
           <w:b/>
         </w:rPr>
-        <w:t>Item status indicators:</w:t>
-      </w:r>
-    </w:p>
-    <w:p>
-      <w:pPr>
-        <w:pStyle w:val="ListBullet"/>
-      </w:pPr>
-      <w:r>
-        <w:rPr>
-          <w:b/>
-        </w:rPr>
-        <w:t>Red badge:</w:t>
-      </w:r>
-      <w:r>
-        <w:t xml:space="preserve"> expired or expiring within 90 days</w:t>
-      </w:r>
-    </w:p>
-    <w:p>
-      <w:pPr>
-        <w:pStyle w:val="ListBullet"/>
-      </w:pPr>
-      <w:r>
-        <w:rPr>
-          <w:b/>
-        </w:rPr>
-        <w:t>Yellow badge:</w:t>
-      </w:r>
-      <w:r>
-        <w:t xml:space="preserve"> expiring within 6 months</w:t>
-      </w:r>
-    </w:p>
-    <w:p>
-      <w:pPr>
-        <w:pStyle w:val="ListBullet"/>
-      </w:pPr>
-      <w:r>
-        <w:t>No badge: more than 6 months out</w:t>
-      </w:r>
-    </w:p>
-    <w:p>
-      <w:pPr>
-        <w:pStyle w:val="Heading3"/>
-      </w:pPr>
-      <w:r>
-        <w:t>4. Inventory Item Detail</w:t>
-      </w:r>
-    </w:p>
-    <w:p>
-      <w:pPr/>
-      <w:r>
-        <w:rPr>
-          <w:b/>
-        </w:rPr>
-        <w:t>Location:</w:t>
-      </w:r>
-      <w:r>
-        <w:t xml:space="preserve"> Tap any item in Inventory, Distributor Detail, or a drilldown result</w:t>
-      </w:r>
-    </w:p>
-    <w:p>
-      <w:pPr/>
-      <w:r>
-        <w:t>Displays everything about a single item and lets you correct or act on it.</w:t>
-      </w:r>
-    </w:p>
-    <w:p>
-      <w:pPr/>
-      <w:r>
-        <w:rPr>
-          <w:b/>
-        </w:rPr>
-        <w:t>Information shown:</w:t>
-      </w:r>
-    </w:p>
-    <w:p>
-      <w:pPr>
-        <w:pStyle w:val="ListBullet"/>
-      </w:pPr>
-      <w:r>
-        <w:t>Product label, Item Number (REF code), GTIN, GTIN Short</w:t>
-      </w:r>
-    </w:p>
-    <w:p>
-      <w:pPr>
-        <w:pStyle w:val="ListBullet"/>
-      </w:pPr>
-      <w:r>
-        <w:t>Lot number, expiry date, current distributor</w:t>
-      </w:r>
-    </w:p>
-    <w:p>
-      <w:pPr>
-        <w:pStyle w:val="ListBullet"/>
-      </w:pPr>
-      <w:r>
-        <w:t xml:space="preserve">Barcode photo (tap to view full screen; press </w:t>
-      </w:r>
-      <w:r>
-        <w:rPr>
-          <w:b/>
-        </w:rPr>
-        <w:t>ESC</w:t>
-      </w:r>
-      <w:r>
-        <w:t xml:space="preserve"> to close)</w:t>
-      </w:r>
-    </w:p>
-    <w:p>
-      <w:pPr>
-        <w:pStyle w:val="ListBullet"/>
-      </w:pPr>
-      <w:r>
-        <w:t>Full assignment history with who moved it, when, and why</w:t>
-      </w:r>
-    </w:p>
-    <w:p>
-      <w:pPr/>
-      <w:r>
-        <w:rPr>
-          <w:b/>
-        </w:rPr>
-        <w:t>Available actions:</w:t>
+        <w:t>What the color badges mean:</w:t>
       </w:r>
     </w:p>
     <w:tbl>
@@ -938,10 +1160,10 @@
             <w:tcW w:type="dxa" w:w="4536"/>
             <w:shd w:val="clear" w:color="auto" w:fill="2E74B5"/>
             <w:tcBorders>
-              <w:top w:val="single" w:sz="4" w:space="0" w:color="999999"/>
-              <w:left w:val="single" w:sz="4" w:space="0" w:color="999999"/>
-              <w:bottom w:val="single" w:sz="4" w:space="0" w:color="999999"/>
-              <w:right w:val="single" w:sz="4" w:space="0" w:color="999999"/>
+              <w:top w:val="single" w:sz="4" w:space="0" w:color="AAAAAA"/>
+              <w:left w:val="single" w:sz="4" w:space="0" w:color="AAAAAA"/>
+              <w:bottom w:val="single" w:sz="4" w:space="0" w:color="AAAAAA"/>
+              <w:right w:val="single" w:sz="4" w:space="0" w:color="AAAAAA"/>
             </w:tcBorders>
           </w:tcPr>
           <w:p>
@@ -951,7 +1173,7 @@
                 <w:color w:val="FFFFFF"/>
                 <w:sz w:val="20"/>
               </w:rPr>
-              <w:t>Action</w:t>
+              <w:t>Badge Color</w:t>
             </w:r>
           </w:p>
         </w:tc>
@@ -960,10 +1182,10 @@
             <w:tcW w:type="dxa" w:w="4536"/>
             <w:shd w:val="clear" w:color="auto" w:fill="2E74B5"/>
             <w:tcBorders>
-              <w:top w:val="single" w:sz="4" w:space="0" w:color="999999"/>
-              <w:left w:val="single" w:sz="4" w:space="0" w:color="999999"/>
-              <w:bottom w:val="single" w:sz="4" w:space="0" w:color="999999"/>
-              <w:right w:val="single" w:sz="4" w:space="0" w:color="999999"/>
+              <w:top w:val="single" w:sz="4" w:space="0" w:color="AAAAAA"/>
+              <w:left w:val="single" w:sz="4" w:space="0" w:color="AAAAAA"/>
+              <w:bottom w:val="single" w:sz="4" w:space="0" w:color="AAAAAA"/>
+              <w:right w:val="single" w:sz="4" w:space="0" w:color="AAAAAA"/>
             </w:tcBorders>
           </w:tcPr>
           <w:p>
@@ -973,7 +1195,7 @@
                 <w:color w:val="FFFFFF"/>
                 <w:sz w:val="20"/>
               </w:rPr>
-              <w:t>Description</w:t>
+              <w:t>What It Means</w:t>
             </w:r>
           </w:p>
         </w:tc>
@@ -984,10 +1206,287 @@
             <w:tcW w:type="dxa" w:w="4536"/>
             <w:shd w:val="clear" w:color="auto" w:fill="F2F7FC"/>
             <w:tcBorders>
-              <w:top w:val="single" w:sz="4" w:space="0" w:color="999999"/>
-              <w:left w:val="single" w:sz="4" w:space="0" w:color="999999"/>
-              <w:bottom w:val="single" w:sz="4" w:space="0" w:color="999999"/>
-              <w:right w:val="single" w:sz="4" w:space="0" w:color="999999"/>
+              <w:top w:val="single" w:sz="4" w:space="0" w:color="AAAAAA"/>
+              <w:left w:val="single" w:sz="4" w:space="0" w:color="AAAAAA"/>
+              <w:bottom w:val="single" w:sz="4" w:space="0" w:color="AAAAAA"/>
+              <w:right w:val="single" w:sz="4" w:space="0" w:color="AAAAAA"/>
+            </w:tcBorders>
+          </w:tcPr>
+          <w:p>
+            <w:r>
+              <w:rPr>
+                <w:sz w:val="20"/>
+              </w:rPr>
+              <w:t>Red</w:t>
+            </w:r>
+          </w:p>
+        </w:tc>
+        <w:tc>
+          <w:tcPr>
+            <w:tcW w:type="dxa" w:w="4536"/>
+            <w:shd w:val="clear" w:color="auto" w:fill="F2F7FC"/>
+            <w:tcBorders>
+              <w:top w:val="single" w:sz="4" w:space="0" w:color="AAAAAA"/>
+              <w:left w:val="single" w:sz="4" w:space="0" w:color="AAAAAA"/>
+              <w:bottom w:val="single" w:sz="4" w:space="0" w:color="AAAAAA"/>
+              <w:right w:val="single" w:sz="4" w:space="0" w:color="AAAAAA"/>
+            </w:tcBorders>
+          </w:tcPr>
+          <w:p>
+            <w:r>
+              <w:rPr>
+                <w:sz w:val="20"/>
+              </w:rPr>
+              <w:t>Expired, or expiring within 90 days — needs attention</w:t>
+            </w:r>
+          </w:p>
+        </w:tc>
+      </w:tr>
+      <w:tr>
+        <w:tc>
+          <w:tcPr>
+            <w:tcW w:type="dxa" w:w="4536"/>
+            <w:shd w:val="clear" w:color="auto" w:fill="FFFFFF"/>
+            <w:tcBorders>
+              <w:top w:val="single" w:sz="4" w:space="0" w:color="AAAAAA"/>
+              <w:left w:val="single" w:sz="4" w:space="0" w:color="AAAAAA"/>
+              <w:bottom w:val="single" w:sz="4" w:space="0" w:color="AAAAAA"/>
+              <w:right w:val="single" w:sz="4" w:space="0" w:color="AAAAAA"/>
+            </w:tcBorders>
+          </w:tcPr>
+          <w:p>
+            <w:r>
+              <w:rPr>
+                <w:sz w:val="20"/>
+              </w:rPr>
+              <w:t>Yellow</w:t>
+            </w:r>
+          </w:p>
+        </w:tc>
+        <w:tc>
+          <w:tcPr>
+            <w:tcW w:type="dxa" w:w="4536"/>
+            <w:shd w:val="clear" w:color="auto" w:fill="FFFFFF"/>
+            <w:tcBorders>
+              <w:top w:val="single" w:sz="4" w:space="0" w:color="AAAAAA"/>
+              <w:left w:val="single" w:sz="4" w:space="0" w:color="AAAAAA"/>
+              <w:bottom w:val="single" w:sz="4" w:space="0" w:color="AAAAAA"/>
+              <w:right w:val="single" w:sz="4" w:space="0" w:color="AAAAAA"/>
+            </w:tcBorders>
+          </w:tcPr>
+          <w:p>
+            <w:r>
+              <w:rPr>
+                <w:sz w:val="20"/>
+              </w:rPr>
+              <w:t>Expiring within 6 months — keep an eye on it</w:t>
+            </w:r>
+          </w:p>
+        </w:tc>
+      </w:tr>
+      <w:tr>
+        <w:tc>
+          <w:tcPr>
+            <w:tcW w:type="dxa" w:w="4536"/>
+            <w:shd w:val="clear" w:color="auto" w:fill="F2F7FC"/>
+            <w:tcBorders>
+              <w:top w:val="single" w:sz="4" w:space="0" w:color="AAAAAA"/>
+              <w:left w:val="single" w:sz="4" w:space="0" w:color="AAAAAA"/>
+              <w:bottom w:val="single" w:sz="4" w:space="0" w:color="AAAAAA"/>
+              <w:right w:val="single" w:sz="4" w:space="0" w:color="AAAAAA"/>
+            </w:tcBorders>
+          </w:tcPr>
+          <w:p>
+            <w:r>
+              <w:rPr>
+                <w:sz w:val="20"/>
+              </w:rPr>
+              <w:t>No badge</w:t>
+            </w:r>
+          </w:p>
+        </w:tc>
+        <w:tc>
+          <w:tcPr>
+            <w:tcW w:type="dxa" w:w="4536"/>
+            <w:shd w:val="clear" w:color="auto" w:fill="F2F7FC"/>
+            <w:tcBorders>
+              <w:top w:val="single" w:sz="4" w:space="0" w:color="AAAAAA"/>
+              <w:left w:val="single" w:sz="4" w:space="0" w:color="AAAAAA"/>
+              <w:bottom w:val="single" w:sz="4" w:space="0" w:color="AAAAAA"/>
+              <w:right w:val="single" w:sz="4" w:space="0" w:color="AAAAAA"/>
+            </w:tcBorders>
+          </w:tcPr>
+          <w:p>
+            <w:r>
+              <w:rPr>
+                <w:sz w:val="20"/>
+              </w:rPr>
+              <w:t>More than 6 months until expiry — you're fine</w:t>
+            </w:r>
+          </w:p>
+        </w:tc>
+      </w:tr>
+    </w:tbl>
+    <w:p/>
+    <w:p>
+      <w:pPr>
+        <w:pStyle w:val="Heading3"/>
+      </w:pPr>
+      <w:r>
+        <w:t>4. Viewing and Editing an Item</w:t>
+      </w:r>
+    </w:p>
+    <w:p>
+      <w:pPr/>
+      <w:r>
+        <w:rPr>
+          <w:b/>
+        </w:rPr>
+        <w:t>Where to go:</w:t>
+      </w:r>
+      <w:r>
+        <w:t xml:space="preserve"> Tap any item row anywhere in the app (Inventory, Distributor page, etc.)</w:t>
+      </w:r>
+    </w:p>
+    <w:p>
+      <w:pPr/>
+      <w:r>
+        <w:t>This page shows you everything about one specific physical item.</w:t>
+      </w:r>
+    </w:p>
+    <w:p>
+      <w:pPr/>
+      <w:r>
+        <w:rPr>
+          <w:b/>
+        </w:rPr>
+        <w:t>What you'll see:</w:t>
+      </w:r>
+    </w:p>
+    <w:p>
+      <w:pPr>
+        <w:pStyle w:val="ListBullet"/>
+      </w:pPr>
+      <w:r>
+        <w:t>Product name and Item Number (the REF code, like SO-SPFN-0180-11-25)</w:t>
+      </w:r>
+    </w:p>
+    <w:p>
+      <w:pPr>
+        <w:pStyle w:val="ListBullet"/>
+      </w:pPr>
+      <w:r>
+        <w:t>GTIN (the long product code), GTIN Short, lot number, and expiry date</w:t>
+      </w:r>
+    </w:p>
+    <w:p>
+      <w:pPr>
+        <w:pStyle w:val="ListBullet"/>
+      </w:pPr>
+      <w:r>
+        <w:t>Which distributor currently has it</w:t>
+      </w:r>
+    </w:p>
+    <w:p>
+      <w:pPr>
+        <w:pStyle w:val="ListBullet"/>
+      </w:pPr>
+      <w:r>
+        <w:t xml:space="preserve">A photo of the barcode label (tap to expand; press </w:t>
+      </w:r>
+      <w:r>
+        <w:rPr>
+          <w:b/>
+        </w:rPr>
+        <w:t>ESC</w:t>
+      </w:r>
+      <w:r>
+        <w:t xml:space="preserve"> or tap outside to close)</w:t>
+      </w:r>
+    </w:p>
+    <w:p>
+      <w:pPr>
+        <w:pStyle w:val="ListBullet"/>
+      </w:pPr>
+      <w:r>
+        <w:t>A full history of everywhere the item has been and who moved it</w:t>
+      </w:r>
+    </w:p>
+    <w:p>
+      <w:pPr/>
+      <w:r>
+        <w:rPr>
+          <w:b/>
+        </w:rPr>
+        <w:t>What you can do:</w:t>
+      </w:r>
+    </w:p>
+    <w:tbl>
+      <w:tblPr>
+        <w:tblStyle w:val="TableGrid"/>
+        <w:tblW w:type="auto" w:w="0"/>
+        <w:tblLook w:firstColumn="1" w:firstRow="1" w:lastColumn="0" w:lastRow="0" w:noHBand="0" w:noVBand="1" w:val="04A0"/>
+      </w:tblPr>
+      <w:tblGrid>
+        <w:gridCol w:w="4536"/>
+        <w:gridCol w:w="4536"/>
+      </w:tblGrid>
+      <w:tr>
+        <w:tc>
+          <w:tcPr>
+            <w:tcW w:type="dxa" w:w="4536"/>
+            <w:shd w:val="clear" w:color="auto" w:fill="2E74B5"/>
+            <w:tcBorders>
+              <w:top w:val="single" w:sz="4" w:space="0" w:color="AAAAAA"/>
+              <w:left w:val="single" w:sz="4" w:space="0" w:color="AAAAAA"/>
+              <w:bottom w:val="single" w:sz="4" w:space="0" w:color="AAAAAA"/>
+              <w:right w:val="single" w:sz="4" w:space="0" w:color="AAAAAA"/>
+            </w:tcBorders>
+          </w:tcPr>
+          <w:p>
+            <w:r>
+              <w:rPr>
+                <w:b/>
+                <w:color w:val="FFFFFF"/>
+                <w:sz w:val="20"/>
+              </w:rPr>
+              <w:t>Button</w:t>
+            </w:r>
+          </w:p>
+        </w:tc>
+        <w:tc>
+          <w:tcPr>
+            <w:tcW w:type="dxa" w:w="4536"/>
+            <w:shd w:val="clear" w:color="auto" w:fill="2E74B5"/>
+            <w:tcBorders>
+              <w:top w:val="single" w:sz="4" w:space="0" w:color="AAAAAA"/>
+              <w:left w:val="single" w:sz="4" w:space="0" w:color="AAAAAA"/>
+              <w:bottom w:val="single" w:sz="4" w:space="0" w:color="AAAAAA"/>
+              <w:right w:val="single" w:sz="4" w:space="0" w:color="AAAAAA"/>
+            </w:tcBorders>
+          </w:tcPr>
+          <w:p>
+            <w:r>
+              <w:rPr>
+                <w:b/>
+                <w:color w:val="FFFFFF"/>
+                <w:sz w:val="20"/>
+              </w:rPr>
+              <w:t>What It Does</w:t>
+            </w:r>
+          </w:p>
+        </w:tc>
+      </w:tr>
+      <w:tr>
+        <w:tc>
+          <w:tcPr>
+            <w:tcW w:type="dxa" w:w="4536"/>
+            <w:shd w:val="clear" w:color="auto" w:fill="F2F7FC"/>
+            <w:tcBorders>
+              <w:top w:val="single" w:sz="4" w:space="0" w:color="AAAAAA"/>
+              <w:left w:val="single" w:sz="4" w:space="0" w:color="AAAAAA"/>
+              <w:bottom w:val="single" w:sz="4" w:space="0" w:color="AAAAAA"/>
+              <w:right w:val="single" w:sz="4" w:space="0" w:color="AAAAAA"/>
             </w:tcBorders>
           </w:tcPr>
           <w:p>
@@ -1005,10 +1504,10 @@
             <w:tcW w:type="dxa" w:w="4536"/>
             <w:shd w:val="clear" w:color="auto" w:fill="F2F7FC"/>
             <w:tcBorders>
-              <w:top w:val="single" w:sz="4" w:space="0" w:color="999999"/>
-              <w:left w:val="single" w:sz="4" w:space="0" w:color="999999"/>
-              <w:bottom w:val="single" w:sz="4" w:space="0" w:color="999999"/>
-              <w:right w:val="single" w:sz="4" w:space="0" w:color="999999"/>
+              <w:top w:val="single" w:sz="4" w:space="0" w:color="AAAAAA"/>
+              <w:left w:val="single" w:sz="4" w:space="0" w:color="AAAAAA"/>
+              <w:bottom w:val="single" w:sz="4" w:space="0" w:color="AAAAAA"/>
+              <w:right w:val="single" w:sz="4" w:space="0" w:color="AAAAAA"/>
             </w:tcBorders>
           </w:tcPr>
           <w:p>
@@ -1016,7 +1515,7 @@
               <w:rPr>
                 <w:sz w:val="20"/>
               </w:rPr>
-              <w:t>Fix GTIN, Item Number (REF), Lot, Expiry, or Product Label — every change is logged with your username and timestamp</w:t>
+              <w:t>Fix a mistake — wrong lot number, wrong expiry date, wrong product label. Every change is saved with your name and the time so there's a full audit trail.</w:t>
             </w:r>
           </w:p>
         </w:tc>
@@ -1027,10 +1526,10 @@
             <w:tcW w:type="dxa" w:w="4536"/>
             <w:shd w:val="clear" w:color="auto" w:fill="FFFFFF"/>
             <w:tcBorders>
-              <w:top w:val="single" w:sz="4" w:space="0" w:color="999999"/>
-              <w:left w:val="single" w:sz="4" w:space="0" w:color="999999"/>
-              <w:bottom w:val="single" w:sz="4" w:space="0" w:color="999999"/>
-              <w:right w:val="single" w:sz="4" w:space="0" w:color="999999"/>
+              <w:top w:val="single" w:sz="4" w:space="0" w:color="AAAAAA"/>
+              <w:left w:val="single" w:sz="4" w:space="0" w:color="AAAAAA"/>
+              <w:bottom w:val="single" w:sz="4" w:space="0" w:color="AAAAAA"/>
+              <w:right w:val="single" w:sz="4" w:space="0" w:color="AAAAAA"/>
             </w:tcBorders>
           </w:tcPr>
           <w:p>
@@ -1048,10 +1547,10 @@
             <w:tcW w:type="dxa" w:w="4536"/>
             <w:shd w:val="clear" w:color="auto" w:fill="FFFFFF"/>
             <w:tcBorders>
-              <w:top w:val="single" w:sz="4" w:space="0" w:color="999999"/>
-              <w:left w:val="single" w:sz="4" w:space="0" w:color="999999"/>
-              <w:bottom w:val="single" w:sz="4" w:space="0" w:color="999999"/>
-              <w:right w:val="single" w:sz="4" w:space="0" w:color="999999"/>
+              <w:top w:val="single" w:sz="4" w:space="0" w:color="AAAAAA"/>
+              <w:left w:val="single" w:sz="4" w:space="0" w:color="AAAAAA"/>
+              <w:bottom w:val="single" w:sz="4" w:space="0" w:color="AAAAAA"/>
+              <w:right w:val="single" w:sz="4" w:space="0" w:color="AAAAAA"/>
             </w:tcBorders>
           </w:tcPr>
           <w:p>
@@ -1059,7 +1558,7 @@
               <w:rPr>
                 <w:sz w:val="20"/>
               </w:rPr>
-              <w:t>Move the item to a different distributor; a Transfer record is created automatically</w:t>
+              <w:t>Move the item to a different distributor. A transfer record is created automatically.</w:t>
             </w:r>
           </w:p>
         </w:tc>
@@ -1070,10 +1569,10 @@
             <w:tcW w:type="dxa" w:w="4536"/>
             <w:shd w:val="clear" w:color="auto" w:fill="F2F7FC"/>
             <w:tcBorders>
-              <w:top w:val="single" w:sz="4" w:space="0" w:color="999999"/>
-              <w:left w:val="single" w:sz="4" w:space="0" w:color="999999"/>
-              <w:bottom w:val="single" w:sz="4" w:space="0" w:color="999999"/>
-              <w:right w:val="single" w:sz="4" w:space="0" w:color="999999"/>
+              <w:top w:val="single" w:sz="4" w:space="0" w:color="AAAAAA"/>
+              <w:left w:val="single" w:sz="4" w:space="0" w:color="AAAAAA"/>
+              <w:bottom w:val="single" w:sz="4" w:space="0" w:color="AAAAAA"/>
+              <w:right w:val="single" w:sz="4" w:space="0" w:color="AAAAAA"/>
             </w:tcBorders>
           </w:tcPr>
           <w:p>
@@ -1091,10 +1590,10 @@
             <w:tcW w:type="dxa" w:w="4536"/>
             <w:shd w:val="clear" w:color="auto" w:fill="F2F7FC"/>
             <w:tcBorders>
-              <w:top w:val="single" w:sz="4" w:space="0" w:color="999999"/>
-              <w:left w:val="single" w:sz="4" w:space="0" w:color="999999"/>
-              <w:bottom w:val="single" w:sz="4" w:space="0" w:color="999999"/>
-              <w:right w:val="single" w:sz="4" w:space="0" w:color="999999"/>
+              <w:top w:val="single" w:sz="4" w:space="0" w:color="AAAAAA"/>
+              <w:left w:val="single" w:sz="4" w:space="0" w:color="AAAAAA"/>
+              <w:bottom w:val="single" w:sz="4" w:space="0" w:color="AAAAAA"/>
+              <w:right w:val="single" w:sz="4" w:space="0" w:color="AAAAAA"/>
             </w:tcBorders>
           </w:tcPr>
           <w:p>
@@ -1102,7 +1601,7 @@
               <w:rPr>
                 <w:sz w:val="20"/>
               </w:rPr>
-              <w:t>Flag the item as implanted; it disappears from active inventory</w:t>
+              <w:t>Record that this item was implanted in a patient. It will disappear from active inventory.</w:t>
             </w:r>
           </w:p>
         </w:tc>
@@ -1113,10 +1612,10 @@
             <w:tcW w:type="dxa" w:w="4536"/>
             <w:shd w:val="clear" w:color="auto" w:fill="FFFFFF"/>
             <w:tcBorders>
-              <w:top w:val="single" w:sz="4" w:space="0" w:color="999999"/>
-              <w:left w:val="single" w:sz="4" w:space="0" w:color="999999"/>
-              <w:bottom w:val="single" w:sz="4" w:space="0" w:color="999999"/>
-              <w:right w:val="single" w:sz="4" w:space="0" w:color="999999"/>
+              <w:top w:val="single" w:sz="4" w:space="0" w:color="AAAAAA"/>
+              <w:left w:val="single" w:sz="4" w:space="0" w:color="AAAAAA"/>
+              <w:bottom w:val="single" w:sz="4" w:space="0" w:color="AAAAAA"/>
+              <w:right w:val="single" w:sz="4" w:space="0" w:color="AAAAAA"/>
             </w:tcBorders>
           </w:tcPr>
           <w:p>
@@ -1134,10 +1633,10 @@
             <w:tcW w:type="dxa" w:w="4536"/>
             <w:shd w:val="clear" w:color="auto" w:fill="FFFFFF"/>
             <w:tcBorders>
-              <w:top w:val="single" w:sz="4" w:space="0" w:color="999999"/>
-              <w:left w:val="single" w:sz="4" w:space="0" w:color="999999"/>
-              <w:bottom w:val="single" w:sz="4" w:space="0" w:color="999999"/>
-              <w:right w:val="single" w:sz="4" w:space="0" w:color="999999"/>
+              <w:top w:val="single" w:sz="4" w:space="0" w:color="AAAAAA"/>
+              <w:left w:val="single" w:sz="4" w:space="0" w:color="AAAAAA"/>
+              <w:bottom w:val="single" w:sz="4" w:space="0" w:color="AAAAAA"/>
+              <w:right w:val="single" w:sz="4" w:space="0" w:color="AAAAAA"/>
             </w:tcBorders>
           </w:tcPr>
           <w:p>
@@ -1145,7 +1644,7 @@
               <w:rPr>
                 <w:sz w:val="20"/>
               </w:rPr>
-              <w:t>Remove the item from the system</w:t>
+              <w:t>Remove the item entirely. Use with caution.</w:t>
             </w:r>
           </w:p>
         </w:tc>
@@ -1164,7 +1663,7 @@
           <w:i/>
           <w:color w:val="404040"/>
         </w:rPr>
-        <w:t>**Tip:** Press **ESC** at any time to close the full-screen barcode image or any open modal.</w:t>
+        <w:t>**Keyboard shortcut:** If you're on a computer, press **ESC** at any time to close a photo or a pop-up window.</w:t>
       </w:r>
     </w:p>
     <w:p>
@@ -1172,7 +1671,7 @@
         <w:pStyle w:val="Heading3"/>
       </w:pPr>
       <w:r>
-        <w:t>5. Banks (Inventory Groups)</w:t>
+        <w:t>5. Banks (Item Kits)</w:t>
       </w:r>
     </w:p>
     <w:p>
@@ -1181,16 +1680,31 @@
         <w:rPr>
           <w:b/>
         </w:rPr>
-        <w:t>Location:</w:t>
-      </w:r>
-      <w:r>
-        <w:t xml:space="preserve"> More → Banks</w:t>
+        <w:t>Where to go:</w:t>
+      </w:r>
+      <w:r>
+        <w:t xml:space="preserve"> Tap </w:t>
+      </w:r>
+      <w:r>
+        <w:rPr>
+          <w:b/>
+        </w:rPr>
+        <w:t>More</w:t>
+      </w:r>
+      <w:r>
+        <w:t xml:space="preserve"> → </w:t>
+      </w:r>
+      <w:r>
+        <w:rPr>
+          <w:b/>
+        </w:rPr>
+        <w:t>Banks</w:t>
       </w:r>
     </w:p>
     <w:p>
       <w:pPr/>
       <w:r>
-        <w:t>Banks let you group items into named sets that travel together — think of a bank as a tray or kit that goes to a surgery site.</w:t>
+        <w:t>A "bank" is a named group of items that belong together — for example, a kit that a sales rep takes to a specific hospital, or a tray of implants for a particular surgery type. Banks make it easy to move a whole group of items at once instead of one by one.</w:t>
       </w:r>
     </w:p>
     <w:p>
@@ -1221,7 +1735,15 @@
         <w:pStyle w:val="ListNumber"/>
       </w:pPr>
       <w:r>
-        <w:t>Enter a name, optional description, and select the distributor where the bank currently lives</w:t>
+        <w:t>Give it a name (e.g., "Smith - General Hospital Kit") and an optional description</w:t>
+      </w:r>
+    </w:p>
+    <w:p>
+      <w:pPr>
+        <w:pStyle w:val="ListNumber"/>
+      </w:pPr>
+      <w:r>
+        <w:t>Select which distributor it belongs to</w:t>
       </w:r>
     </w:p>
     <w:p>
@@ -1252,7 +1774,7 @@
         <w:pStyle w:val="ListNumber"/>
       </w:pPr>
       <w:r>
-        <w:t xml:space="preserve">Open a bank → tap </w:t>
+        <w:t xml:space="preserve">Open the bank, then tap </w:t>
       </w:r>
       <w:r>
         <w:rPr>
@@ -1266,7 +1788,7 @@
         <w:pStyle w:val="ListNumber"/>
       </w:pPr>
       <w:r>
-        <w:t>Items at the same distributor as the bank are shown (items already in another bank are excluded)</w:t>
+        <w:t>You'll see a list of items at the same distributor as the bank — items already in another bank won't appear here</w:t>
       </w:r>
     </w:p>
     <w:p>
@@ -1274,7 +1796,7 @@
         <w:pStyle w:val="ListNumber"/>
       </w:pPr>
       <w:r>
-        <w:t xml:space="preserve">Select items and tap </w:t>
+        <w:t xml:space="preserve">Check the items you want to add, then tap </w:t>
       </w:r>
       <w:r>
         <w:rPr>
@@ -1289,7 +1811,7 @@
         <w:rPr>
           <w:b/>
         </w:rPr>
-        <w:t>Removing items:</w:t>
+        <w:t>Removing an item:</w:t>
       </w:r>
     </w:p>
     <w:p>
@@ -1304,7 +1826,7 @@
         <w:t>X</w:t>
       </w:r>
       <w:r>
-        <w:t xml:space="preserve"> next to any item in the bank to remove it. The item stays in inventory — it just leaves the bank.</w:t>
+        <w:t xml:space="preserve"> next to an item in the bank list. The item doesn't get deleted — it just leaves the bank and stays in that distributor's regular inventory.</w:t>
       </w:r>
     </w:p>
     <w:p>
@@ -1313,7 +1835,7 @@
         <w:rPr>
           <w:b/>
         </w:rPr>
-        <w:t>Moving a bank:</w:t>
+        <w:t>Moving a whole bank:</w:t>
       </w:r>
     </w:p>
     <w:p>
@@ -1321,7 +1843,7 @@
         <w:pStyle w:val="ListNumber"/>
       </w:pPr>
       <w:r>
-        <w:t xml:space="preserve">Open a bank → tap </w:t>
+        <w:t xml:space="preserve">Open the bank, tap </w:t>
       </w:r>
       <w:r>
         <w:rPr>
@@ -1335,7 +1857,7 @@
         <w:pStyle w:val="ListNumber"/>
       </w:pPr>
       <w:r>
-        <w:t>Select the destination distributor</w:t>
+        <w:t>Choose the destination distributor</w:t>
       </w:r>
     </w:p>
     <w:p>
@@ -1343,7 +1865,7 @@
         <w:pStyle w:val="ListNumber"/>
       </w:pPr>
       <w:r>
-        <w:t>All items in the bank are reassigned to the new distributor and an audit trail is created</w:t>
+        <w:t>Every item in the bank gets reassigned to that distributor, and the move is logged in the history</w:t>
       </w:r>
     </w:p>
     <w:p>
@@ -1360,16 +1882,41 @@
         <w:rPr>
           <w:b/>
         </w:rPr>
-        <w:t>Location:</w:t>
-      </w:r>
-      <w:r>
-        <w:t xml:space="preserve"> More → Transfer</w:t>
+        <w:t>Where to go:</w:t>
+      </w:r>
+      <w:r>
+        <w:t xml:space="preserve"> Tap </w:t>
+      </w:r>
+      <w:r>
+        <w:rPr>
+          <w:b/>
+        </w:rPr>
+        <w:t>More</w:t>
+      </w:r>
+      <w:r>
+        <w:t xml:space="preserve"> → </w:t>
+      </w:r>
+      <w:r>
+        <w:rPr>
+          <w:b/>
+        </w:rPr>
+        <w:t>Transfer</w:t>
       </w:r>
     </w:p>
     <w:p>
       <w:pPr/>
       <w:r>
-        <w:t>Create formal transfer records when moving inventory between distributors.</w:t>
+        <w:t xml:space="preserve">Use this when you need to officially move items from one distributor to another — for example, pulling items back from a rep or shipping a set of implants out to a new location. Every transfer gets its own ID (like </w:t>
+      </w:r>
+      <w:r>
+        <w:rPr>
+          <w:rFonts w:ascii="Courier New" w:hAnsi="Courier New"/>
+          <w:sz w:val="18"/>
+        </w:rPr>
+        <w:t>TRF-20260514-0001</w:t>
+      </w:r>
+      <w:r>
+        <w:t>) so you can reference it later.</w:t>
       </w:r>
     </w:p>
     <w:p>
@@ -1386,7 +1933,7 @@
         <w:pStyle w:val="ListNumber"/>
       </w:pPr>
       <w:r>
-        <w:t>Select the source distributor (</w:t>
+        <w:t xml:space="preserve">Under </w:t>
       </w:r>
       <w:r>
         <w:rPr>
@@ -1395,7 +1942,7 @@
         <w:t>From</w:t>
       </w:r>
       <w:r>
-        <w:t>)</w:t>
+        <w:t>, choose where the items are coming from</w:t>
       </w:r>
     </w:p>
     <w:p>
@@ -1403,7 +1950,7 @@
         <w:pStyle w:val="ListNumber"/>
       </w:pPr>
       <w:r>
-        <w:t>Select the destination distributor (</w:t>
+        <w:t xml:space="preserve">Under </w:t>
       </w:r>
       <w:r>
         <w:rPr>
@@ -1412,7 +1959,7 @@
         <w:t>To</w:t>
       </w:r>
       <w:r>
-        <w:t>)</w:t>
+        <w:t>, choose where they're going</w:t>
       </w:r>
     </w:p>
     <w:p>
@@ -1420,7 +1967,7 @@
         <w:pStyle w:val="ListNumber"/>
       </w:pPr>
       <w:r>
-        <w:t xml:space="preserve">Select items to transfer (use </w:t>
+        <w:t xml:space="preserve">Check the boxes next to the items you want to move. Tap </w:t>
       </w:r>
       <w:r>
         <w:rPr>
@@ -1429,7 +1976,7 @@
         <w:t>Select All</w:t>
       </w:r>
       <w:r>
-        <w:t xml:space="preserve"> for speed)</w:t>
+        <w:t xml:space="preserve"> if you want everything.</w:t>
       </w:r>
     </w:p>
     <w:p>
@@ -1437,7 +1984,7 @@
         <w:pStyle w:val="ListNumber"/>
       </w:pPr>
       <w:r>
-        <w:t>Add an optional note</w:t>
+        <w:t>Add an optional note (e.g., "Returning expired stock" or "Filling new rep order")</w:t>
       </w:r>
     </w:p>
     <w:p>
@@ -1453,18 +2000,11 @@
         </w:rPr>
         <w:t>Confirm Transfer</w:t>
       </w:r>
-      <w:r>
-        <w:t xml:space="preserve"> — a transfer ID is auto-generated (</w:t>
-      </w:r>
-      <w:r>
-        <w:rPr>
-          <w:rFonts w:ascii="Courier New" w:hAnsi="Courier New"/>
-          <w:sz w:val="18"/>
-        </w:rPr>
-        <w:t>TRF-YYYYMMDD-NNNN</w:t>
-      </w:r>
-      <w:r>
-        <w:t>)</w:t>
+    </w:p>
+    <w:p>
+      <w:pPr/>
+      <w:r>
+        <w:t>The system creates a transfer record and updates every item's location automatically.</w:t>
       </w:r>
     </w:p>
     <w:p>
@@ -1479,7 +2019,7 @@
           <w:i/>
           <w:color w:val="404040"/>
         </w:rPr>
-        <w:t>**Note:** When you reassign a single item from its detail page, a Transfer record is also created automatically and appears in Transfer History.</w:t>
+        <w:t>**Single-item reassignment also counts:** If you move one item from its detail page using the Reassign button, a transfer record is created for that too — so every move is always tracked.</w:t>
       </w:r>
     </w:p>
     <w:p>
@@ -1488,15 +2028,13 @@
         <w:rPr>
           <w:b/>
         </w:rPr>
-        <w:t>Viewing and printing a transfer:</w:t>
+        <w:t>Printing a transfer report:</w:t>
       </w:r>
     </w:p>
     <w:p>
-      <w:pPr>
-        <w:pStyle w:val="ListNumber"/>
-      </w:pPr>
-      <w:r>
-        <w:t>Open the transfer from Reports → Transfer History (or navigate directly to its URL)</w:t>
+      <w:pPr/>
+      <w:r>
+        <w:t>If you need a paper record of a transfer:</w:t>
       </w:r>
     </w:p>
     <w:p>
@@ -1504,7 +2042,33 @@
         <w:pStyle w:val="ListNumber"/>
       </w:pPr>
       <w:r>
-        <w:t xml:space="preserve">Tap </w:t>
+        <w:t xml:space="preserve">Find the transfer in </w:t>
+      </w:r>
+      <w:r>
+        <w:rPr>
+          <w:b/>
+        </w:rPr>
+        <w:t>Reports</w:t>
+      </w:r>
+      <w:r>
+        <w:t xml:space="preserve"> → </w:t>
+      </w:r>
+      <w:r>
+        <w:rPr>
+          <w:b/>
+        </w:rPr>
+        <w:t>Transfer History</w:t>
+      </w:r>
+      <w:r>
+        <w:t xml:space="preserve"> and tap its ID (e.g., TRF-20260514-0001)</w:t>
+      </w:r>
+    </w:p>
+    <w:p>
+      <w:pPr>
+        <w:pStyle w:val="ListNumber"/>
+      </w:pPr>
+      <w:r>
+        <w:t xml:space="preserve">Tap the </w:t>
       </w:r>
       <w:r>
         <w:rPr>
@@ -1513,7 +2077,7 @@
         <w:t>Print</w:t>
       </w:r>
       <w:r>
-        <w:t xml:space="preserve"> — a clean, print-formatted report opens</w:t>
+        <w:t xml:space="preserve"> button</w:t>
       </w:r>
     </w:p>
     <w:p>
@@ -1521,7 +2085,7 @@
         <w:pStyle w:val="ListNumber"/>
       </w:pPr>
       <w:r>
-        <w:t>The PDF filename defaults to the transfer ID</w:t>
+        <w:t>A clean, print-ready version opens — use Ctrl+P (Windows) or Cmd+P (Mac) to print or save as PDF</w:t>
       </w:r>
     </w:p>
     <w:p>
@@ -1538,622 +2102,46 @@
         <w:rPr>
           <w:b/>
         </w:rPr>
-        <w:t>Location:</w:t>
-      </w:r>
-      <w:r>
-        <w:t xml:space="preserve"> Reports tab</w:t>
+        <w:t>Where to go:</w:t>
+      </w:r>
+      <w:r>
+        <w:t xml:space="preserve"> Tap </w:t>
+      </w:r>
+      <w:r>
+        <w:rPr>
+          <w:b/>
+        </w:rPr>
+        <w:t>Reports</w:t>
+      </w:r>
+      <w:r>
+        <w:t xml:space="preserve"> in the bottom navigation</w:t>
       </w:r>
     </w:p>
     <w:p>
       <w:pPr/>
       <w:r>
+        <w:t>The Reports page gives you a bird's-eye view of your entire inventory at a glance.</w:t>
+      </w:r>
+    </w:p>
+    <w:p>
+      <w:pPr/>
+      <w:r>
         <w:rPr>
           <w:b/>
         </w:rPr>
-        <w:t>Metric cards (clickable):</w:t>
+        <w:t>The summary cards at the top:</w:t>
       </w:r>
     </w:p>
     <w:p>
       <w:pPr/>
       <w:r>
-        <w:t>Tap any card to jump to a filtered inventory list:</w:t>
-      </w:r>
-    </w:p>
-    <w:p>
-      <w:pPr>
-        <w:pStyle w:val="ListBullet"/>
-      </w:pPr>
+        <w:t xml:space="preserve">There are five colored cards that each show a number. </w:t>
+      </w:r>
       <w:r>
         <w:rPr>
           <w:b/>
         </w:rPr>
-        <w:t>Total Units</w:t>
-      </w:r>
-      <w:r>
-        <w:t xml:space="preserve"> → all active inventory</w:t>
-      </w:r>
-    </w:p>
-    <w:p>
-      <w:pPr>
-        <w:pStyle w:val="ListBullet"/>
-      </w:pPr>
-      <w:r>
-        <w:rPr>
-          <w:b/>
-        </w:rPr>
-        <w:t>Active Distributors</w:t>
-      </w:r>
-      <w:r>
-        <w:t xml:space="preserve"> → distributor list</w:t>
-      </w:r>
-    </w:p>
-    <w:p>
-      <w:pPr>
-        <w:pStyle w:val="ListBullet"/>
-      </w:pPr>
-      <w:r>
-        <w:rPr>
-          <w:b/>
-        </w:rPr>
-        <w:t>Expiring &lt; 180d</w:t>
-      </w:r>
-      <w:r>
-        <w:t xml:space="preserve"> → items expiring within 6 months</w:t>
-      </w:r>
-    </w:p>
-    <w:p>
-      <w:pPr>
-        <w:pStyle w:val="ListBullet"/>
-      </w:pPr>
-      <w:r>
-        <w:rPr>
-          <w:b/>
-        </w:rPr>
-        <w:t>Expired</w:t>
-      </w:r>
-      <w:r>
-        <w:t xml:space="preserve"> → all expired items</w:t>
-      </w:r>
-    </w:p>
-    <w:p>
-      <w:pPr>
-        <w:pStyle w:val="ListBullet"/>
-      </w:pPr>
-      <w:r>
-        <w:rPr>
-          <w:b/>
-        </w:rPr>
-        <w:t>Unassigned</w:t>
-      </w:r>
-      <w:r>
-        <w:t xml:space="preserve"> → items not yet at a distributor</w:t>
-      </w:r>
-    </w:p>
-    <w:p>
-      <w:pPr/>
-      <w:r>
-        <w:rPr>
-          <w:b/>
-        </w:rPr>
-        <w:t>Stock by Item Number:</w:t>
-      </w:r>
-    </w:p>
-    <w:p>
-      <w:pPr/>
-      <w:r>
-        <w:t xml:space="preserve">Tap the </w:t>
-      </w:r>
-      <w:r>
-        <w:rPr>
-          <w:b/>
-        </w:rPr>
-        <w:t>Stock by Item Number</w:t>
-      </w:r>
-      <w:r>
-        <w:t xml:space="preserve"> card to open a full matrix view:</w:t>
-      </w:r>
-    </w:p>
-    <w:p>
-      <w:pPr>
-        <w:pStyle w:val="ListBullet"/>
-      </w:pPr>
-      <w:r>
-        <w:t>Rows = every item number in your inventory</w:t>
-      </w:r>
-    </w:p>
-    <w:p>
-      <w:pPr>
-        <w:pStyle w:val="ListBullet"/>
-      </w:pPr>
-      <w:r>
-        <w:t>Columns = Home Office + each distributor + Total</w:t>
-      </w:r>
-    </w:p>
-    <w:p>
-      <w:pPr>
-        <w:pStyle w:val="ListBullet"/>
-      </w:pPr>
-      <w:r>
-        <w:rPr>
-          <w:b/>
-        </w:rPr>
-        <w:t>Click an item number or Total</w:t>
-      </w:r>
-      <w:r>
-        <w:t xml:space="preserve"> → shows all units of that item across every location</w:t>
-      </w:r>
-    </w:p>
-    <w:p>
-      <w:pPr>
-        <w:pStyle w:val="ListBullet"/>
-      </w:pPr>
-      <w:r>
-        <w:rPr>
-          <w:b/>
-        </w:rPr>
-        <w:t>Click a count</w:t>
-      </w:r>
-      <w:r>
-        <w:t xml:space="preserve"> (e.g., 13 at Home Office) → shows only that item at that specific location</w:t>
-      </w:r>
-    </w:p>
-    <w:p>
-      <w:pPr>
-        <w:pStyle w:val="ListBullet"/>
-      </w:pPr>
-      <w:r>
-        <w:t>Sortable by any column; searchable by item number or description</w:t>
-      </w:r>
-    </w:p>
-    <w:p>
-      <w:pPr>
-        <w:pStyle w:val="ListBullet"/>
-      </w:pPr>
-      <w:r>
-        <w:rPr>
-          <w:b/>
-        </w:rPr>
-        <w:t>Export Excel</w:t>
-      </w:r>
-      <w:r>
-        <w:t xml:space="preserve"> button downloads a formatted spreadsheet</w:t>
-      </w:r>
-    </w:p>
-    <w:p>
-      <w:pPr/>
-      <w:r>
-        <w:rPr>
-          <w:b/>
-        </w:rPr>
-        <w:t>Export Inventory:</w:t>
-      </w:r>
-    </w:p>
-    <w:p>
-      <w:pPr/>
-      <w:r>
-        <w:t>Download the full inventory, or per-distributor breakdowns, as Excel files.</w:t>
-      </w:r>
-    </w:p>
-    <w:p>
-      <w:pPr/>
-      <w:r>
-        <w:rPr>
-          <w:b/>
-        </w:rPr>
-        <w:t>Transfer History:</w:t>
-      </w:r>
-    </w:p>
-    <w:p>
-      <w:pPr>
-        <w:pStyle w:val="ListBullet"/>
-      </w:pPr>
-      <w:r>
-        <w:t>Searchable list of all transfers</w:t>
-      </w:r>
-    </w:p>
-    <w:p>
-      <w:pPr>
-        <w:pStyle w:val="ListBullet"/>
-      </w:pPr>
-      <w:r>
-        <w:t>Sortable by Transfer ID, Date, From/To, Item Count</w:t>
-      </w:r>
-    </w:p>
-    <w:p>
-      <w:pPr>
-        <w:pStyle w:val="ListBullet"/>
-      </w:pPr>
-      <w:r>
-        <w:t>Tap any Transfer ID to see the full list of items transferred</w:t>
-      </w:r>
-    </w:p>
-    <w:p>
-      <w:pPr/>
-      <w:r>
-        <w:rPr>
-          <w:b/>
-        </w:rPr>
-        <w:t>Expiring Items table:</w:t>
-      </w:r>
-    </w:p>
-    <w:p>
-      <w:pPr/>
-      <w:r>
-        <w:t>Shows up to 20 items expiring within the next 180 days, sorted by days remaining. Sortable by all columns.</w:t>
-      </w:r>
-    </w:p>
-    <w:p>
-      <w:pPr>
-        <w:pStyle w:val="Heading3"/>
-      </w:pPr>
-      <w:r>
-        <w:t>8. Batch Upload</w:t>
-      </w:r>
-    </w:p>
-    <w:p>
-      <w:pPr/>
-      <w:r>
-        <w:rPr>
-          <w:b/>
-        </w:rPr>
-        <w:t>Location:</w:t>
-      </w:r>
-      <w:r>
-        <w:t xml:space="preserve"> More → Batch Upload</w:t>
-      </w:r>
-    </w:p>
-    <w:p>
-      <w:pPr/>
-      <w:r>
-        <w:t>For high-volume receiving when you have many barcode images or a spreadsheet.</w:t>
-      </w:r>
-    </w:p>
-    <w:p>
-      <w:pPr/>
-      <w:r>
-        <w:rPr>
-          <w:b/>
-        </w:rPr>
-        <w:t>Image upload:</w:t>
-      </w:r>
-    </w:p>
-    <w:p>
-      <w:pPr>
-        <w:pStyle w:val="ListBullet"/>
-      </w:pPr>
-      <w:r>
-        <w:t>Select multiple barcode photos — up to 4 barcodes are detected per image</w:t>
-      </w:r>
-    </w:p>
-    <w:p>
-      <w:pPr>
-        <w:pStyle w:val="ListBullet"/>
-      </w:pPr>
-      <w:r>
-        <w:t>Each barcode becomes a separate inventory item</w:t>
-      </w:r>
-    </w:p>
-    <w:p>
-      <w:pPr/>
-      <w:r>
-        <w:rPr>
-          <w:b/>
-        </w:rPr>
-        <w:t>CSV/Excel upload:</w:t>
-      </w:r>
-    </w:p>
-    <w:p>
-      <w:pPr>
-        <w:pStyle w:val="ListBullet"/>
-      </w:pPr>
-      <w:r>
-        <w:t xml:space="preserve">Upload a </w:t>
-      </w:r>
-      <w:r>
-        <w:rPr>
-          <w:rFonts w:ascii="Courier New" w:hAnsi="Courier New"/>
-          <w:sz w:val="18"/>
-        </w:rPr>
-        <w:t>.csv</w:t>
-      </w:r>
-      <w:r>
-        <w:t xml:space="preserve"> file with barcode strings (one per row in the first column)</w:t>
-      </w:r>
-    </w:p>
-    <w:p>
-      <w:pPr>
-        <w:pStyle w:val="ListBullet"/>
-      </w:pPr>
-      <w:r>
-        <w:t>Items sharing the same GTIN and lot number are each created as individual units — no rows are skipped</w:t>
-      </w:r>
-    </w:p>
-    <w:p>
-      <w:pPr/>
-      <w:r>
-        <w:rPr>
-          <w:b/>
-        </w:rPr>
-        <w:t>After upload:</w:t>
-      </w:r>
-    </w:p>
-    <w:p>
-      <w:pPr>
-        <w:pStyle w:val="ListBullet"/>
-      </w:pPr>
-      <w:r>
-        <w:t>A results grid shows status for each item (success / error)</w:t>
-      </w:r>
-    </w:p>
-    <w:p>
-      <w:pPr>
-        <w:pStyle w:val="ListBullet"/>
-      </w:pPr>
-      <w:r>
-        <w:t>Select the items you want to keep and choose a destination distributor</w:t>
-      </w:r>
-    </w:p>
-    <w:p>
-      <w:pPr>
-        <w:pStyle w:val="ListBullet"/>
-      </w:pPr>
-      <w:r>
-        <w:t xml:space="preserve">Tap </w:t>
-      </w:r>
-      <w:r>
-        <w:rPr>
-          <w:b/>
-        </w:rPr>
-        <w:t>Assign</w:t>
-      </w:r>
-      <w:r>
-        <w:t xml:space="preserve"> to save them</w:t>
-      </w:r>
-    </w:p>
-    <w:p>
-      <w:pPr>
-        <w:pStyle w:val="Heading3"/>
-      </w:pPr>
-      <w:r>
-        <w:t>9. Distributors</w:t>
-      </w:r>
-    </w:p>
-    <w:p>
-      <w:pPr/>
-      <w:r>
-        <w:rPr>
-          <w:b/>
-        </w:rPr>
-        <w:t>Location:</w:t>
-      </w:r>
-      <w:r>
-        <w:t xml:space="preserve"> More → Distributors</w:t>
-      </w:r>
-    </w:p>
-    <w:p>
-      <w:pPr/>
-      <w:r>
-        <w:t>View and manage your distributor network.</w:t>
-      </w:r>
-    </w:p>
-    <w:p>
-      <w:pPr>
-        <w:pStyle w:val="ListBullet"/>
-      </w:pPr>
-      <w:r>
-        <w:t>See each distributor's active item count</w:t>
-      </w:r>
-    </w:p>
-    <w:p>
-      <w:pPr>
-        <w:pStyle w:val="ListBullet"/>
-      </w:pPr>
-      <w:r>
-        <w:t>Tap a distributor to view all their items, download an Excel export, or share a link</w:t>
-      </w:r>
-    </w:p>
-    <w:p>
-      <w:pPr>
-        <w:pStyle w:val="ListBullet"/>
-      </w:pPr>
-      <w:r>
-        <w:t xml:space="preserve">Items in the </w:t>
-      </w:r>
-      <w:r>
-        <w:rPr>
-          <w:b/>
-        </w:rPr>
-        <w:t>Distributor Detail</w:t>
-      </w:r>
-      <w:r>
-        <w:t xml:space="preserve"> view link back to the full inventory detail page</w:t>
-      </w:r>
-    </w:p>
-    <w:p>
-      <w:pPr>
-        <w:pStyle w:val="ListBullet"/>
-      </w:pPr>
-      <w:r>
-        <w:t xml:space="preserve">The </w:t>
-      </w:r>
-      <w:r>
-        <w:rPr>
-          <w:b/>
-        </w:rPr>
-        <w:t>Home Office</w:t>
-      </w:r>
-      <w:r>
-        <w:t xml:space="preserve"> distributor is the central receiving location — all scanned items go here first</w:t>
-      </w:r>
-    </w:p>
-    <w:p>
-      <w:pPr>
-        <w:pStyle w:val="Heading2"/>
-      </w:pPr>
-      <w:r>
-        <w:t>Admin Features</w:t>
-      </w:r>
-    </w:p>
-    <w:p>
-      <w:pPr>
-        <w:pStyle w:val="Heading3"/>
-      </w:pPr>
-      <w:r>
-        <w:t>User Management</w:t>
-      </w:r>
-    </w:p>
-    <w:p>
-      <w:pPr/>
-      <w:r>
-        <w:rPr>
-          <w:b/>
-        </w:rPr>
-        <w:t>Location:</w:t>
-      </w:r>
-      <w:r>
-        <w:t xml:space="preserve"> More → User Management (admin only)</w:t>
-      </w:r>
-    </w:p>
-    <w:p>
-      <w:pPr/>
-      <w:r>
-        <w:rPr>
-          <w:b/>
-        </w:rPr>
-        <w:t>Adding a user:</w:t>
-      </w:r>
-    </w:p>
-    <w:p>
-      <w:pPr>
-        <w:pStyle w:val="ListNumber"/>
-      </w:pPr>
-      <w:r>
-        <w:t xml:space="preserve">Tap </w:t>
-      </w:r>
-      <w:r>
-        <w:rPr>
-          <w:b/>
-        </w:rPr>
-        <w:t>Add User</w:t>
-      </w:r>
-    </w:p>
-    <w:p>
-      <w:pPr>
-        <w:pStyle w:val="ListNumber"/>
-      </w:pPr>
-      <w:r>
-        <w:t>Enter a username (minimum 2 characters) and password (minimum 6 characters)</w:t>
-      </w:r>
-    </w:p>
-    <w:p>
-      <w:pPr>
-        <w:pStyle w:val="ListNumber"/>
-      </w:pPr>
-      <w:r>
-        <w:t xml:space="preserve">Select role: </w:t>
-      </w:r>
-      <w:r>
-        <w:rPr>
-          <w:b/>
-        </w:rPr>
-        <w:t>User</w:t>
-      </w:r>
-      <w:r>
-        <w:t xml:space="preserve"> or </w:t>
-      </w:r>
-      <w:r>
-        <w:rPr>
-          <w:b/>
-        </w:rPr>
-        <w:t>Admin</w:t>
-      </w:r>
-    </w:p>
-    <w:p>
-      <w:pPr>
-        <w:pStyle w:val="ListNumber"/>
-      </w:pPr>
-      <w:r>
-        <w:t xml:space="preserve">Tap </w:t>
-      </w:r>
-      <w:r>
-        <w:rPr>
-          <w:b/>
-        </w:rPr>
-        <w:t>Create User</w:t>
-      </w:r>
-    </w:p>
-    <w:p>
-      <w:pPr/>
-      <w:r>
-        <w:rPr>
-          <w:b/>
-        </w:rPr>
-        <w:t>Managing users:</w:t>
-      </w:r>
-    </w:p>
-    <w:p>
-      <w:pPr>
-        <w:pStyle w:val="ListBullet"/>
-      </w:pPr>
-      <w:r>
-        <w:rPr>
-          <w:b/>
-        </w:rPr>
-        <w:t>Toggle role:</w:t>
-      </w:r>
-      <w:r>
-        <w:t xml:space="preserve"> Tap the shield icon to switch between User and Admin (you cannot change your own role)</w:t>
-      </w:r>
-    </w:p>
-    <w:p>
-      <w:pPr>
-        <w:pStyle w:val="ListBullet"/>
-      </w:pPr>
-      <w:r>
-        <w:rPr>
-          <w:b/>
-        </w:rPr>
-        <w:t>Change password:</w:t>
-      </w:r>
-      <w:r>
-        <w:t xml:space="preserve"> Tap the key icon</w:t>
-      </w:r>
-    </w:p>
-    <w:p>
-      <w:pPr>
-        <w:pStyle w:val="ListBullet"/>
-      </w:pPr>
-      <w:r>
-        <w:rPr>
-          <w:b/>
-        </w:rPr>
-        <w:t>Delete user:</w:t>
-      </w:r>
-      <w:r>
-        <w:t xml:space="preserve"> Tap the trash icon (you cannot delete yourself or the last admin)</w:t>
-      </w:r>
-    </w:p>
-    <w:p>
-      <w:pPr>
-        <w:pStyle w:val="Heading2"/>
-      </w:pPr>
-      <w:r>
-        <w:t>Barcode Format</w:t>
-      </w:r>
-    </w:p>
-    <w:p>
-      <w:pPr/>
-      <w:r>
-        <w:t xml:space="preserve">Nail Tracker reads </w:t>
-      </w:r>
-      <w:r>
-        <w:rPr>
-          <w:b/>
-        </w:rPr>
-        <w:t>GS1-128</w:t>
-      </w:r>
-      <w:r>
-        <w:t xml:space="preserve"> barcodes with these Application Identifiers:</w:t>
+        <w:t>Tap any card to see the matching list of items.</w:t>
       </w:r>
     </w:p>
     <w:tbl>
@@ -2173,10 +2161,10 @@
             <w:tcW w:type="dxa" w:w="3024"/>
             <w:shd w:val="clear" w:color="auto" w:fill="2E74B5"/>
             <w:tcBorders>
-              <w:top w:val="single" w:sz="4" w:space="0" w:color="999999"/>
-              <w:left w:val="single" w:sz="4" w:space="0" w:color="999999"/>
-              <w:bottom w:val="single" w:sz="4" w:space="0" w:color="999999"/>
-              <w:right w:val="single" w:sz="4" w:space="0" w:color="999999"/>
+              <w:top w:val="single" w:sz="4" w:space="0" w:color="AAAAAA"/>
+              <w:left w:val="single" w:sz="4" w:space="0" w:color="AAAAAA"/>
+              <w:bottom w:val="single" w:sz="4" w:space="0" w:color="AAAAAA"/>
+              <w:right w:val="single" w:sz="4" w:space="0" w:color="AAAAAA"/>
             </w:tcBorders>
           </w:tcPr>
           <w:p>
@@ -2186,7 +2174,7 @@
                 <w:color w:val="FFFFFF"/>
                 <w:sz w:val="20"/>
               </w:rPr>
-              <w:t>AI</w:t>
+              <w:t>Card</w:t>
             </w:r>
           </w:p>
         </w:tc>
@@ -2195,10 +2183,10 @@
             <w:tcW w:type="dxa" w:w="3024"/>
             <w:shd w:val="clear" w:color="auto" w:fill="2E74B5"/>
             <w:tcBorders>
-              <w:top w:val="single" w:sz="4" w:space="0" w:color="999999"/>
-              <w:left w:val="single" w:sz="4" w:space="0" w:color="999999"/>
-              <w:bottom w:val="single" w:sz="4" w:space="0" w:color="999999"/>
-              <w:right w:val="single" w:sz="4" w:space="0" w:color="999999"/>
+              <w:top w:val="single" w:sz="4" w:space="0" w:color="AAAAAA"/>
+              <w:left w:val="single" w:sz="4" w:space="0" w:color="AAAAAA"/>
+              <w:bottom w:val="single" w:sz="4" w:space="0" w:color="AAAAAA"/>
+              <w:right w:val="single" w:sz="4" w:space="0" w:color="AAAAAA"/>
             </w:tcBorders>
           </w:tcPr>
           <w:p>
@@ -2208,7 +2196,7 @@
                 <w:color w:val="FFFFFF"/>
                 <w:sz w:val="20"/>
               </w:rPr>
-              <w:t>Field</w:t>
+              <w:t>What It Shows</w:t>
             </w:r>
           </w:p>
         </w:tc>
@@ -2217,10 +2205,10 @@
             <w:tcW w:type="dxa" w:w="3024"/>
             <w:shd w:val="clear" w:color="auto" w:fill="2E74B5"/>
             <w:tcBorders>
-              <w:top w:val="single" w:sz="4" w:space="0" w:color="999999"/>
-              <w:left w:val="single" w:sz="4" w:space="0" w:color="999999"/>
-              <w:bottom w:val="single" w:sz="4" w:space="0" w:color="999999"/>
-              <w:right w:val="single" w:sz="4" w:space="0" w:color="999999"/>
+              <w:top w:val="single" w:sz="4" w:space="0" w:color="AAAAAA"/>
+              <w:left w:val="single" w:sz="4" w:space="0" w:color="AAAAAA"/>
+              <w:bottom w:val="single" w:sz="4" w:space="0" w:color="AAAAAA"/>
+              <w:right w:val="single" w:sz="4" w:space="0" w:color="AAAAAA"/>
             </w:tcBorders>
           </w:tcPr>
           <w:p>
@@ -2230,7 +2218,7 @@
                 <w:color w:val="FFFFFF"/>
                 <w:sz w:val="20"/>
               </w:rPr>
-              <w:t>Format</w:t>
+              <w:t>Tap to See</w:t>
             </w:r>
           </w:p>
         </w:tc>
@@ -2241,10 +2229,986 @@
             <w:tcW w:type="dxa" w:w="3024"/>
             <w:shd w:val="clear" w:color="auto" w:fill="F2F7FC"/>
             <w:tcBorders>
-              <w:top w:val="single" w:sz="4" w:space="0" w:color="999999"/>
-              <w:left w:val="single" w:sz="4" w:space="0" w:color="999999"/>
-              <w:bottom w:val="single" w:sz="4" w:space="0" w:color="999999"/>
-              <w:right w:val="single" w:sz="4" w:space="0" w:color="999999"/>
+              <w:top w:val="single" w:sz="4" w:space="0" w:color="AAAAAA"/>
+              <w:left w:val="single" w:sz="4" w:space="0" w:color="AAAAAA"/>
+              <w:bottom w:val="single" w:sz="4" w:space="0" w:color="AAAAAA"/>
+              <w:right w:val="single" w:sz="4" w:space="0" w:color="AAAAAA"/>
+            </w:tcBorders>
+          </w:tcPr>
+          <w:p>
+            <w:r>
+              <w:rPr>
+                <w:sz w:val="20"/>
+              </w:rPr>
+              <w:t>Total Units</w:t>
+            </w:r>
+          </w:p>
+        </w:tc>
+        <w:tc>
+          <w:tcPr>
+            <w:tcW w:type="dxa" w:w="3024"/>
+            <w:shd w:val="clear" w:color="auto" w:fill="F2F7FC"/>
+            <w:tcBorders>
+              <w:top w:val="single" w:sz="4" w:space="0" w:color="AAAAAA"/>
+              <w:left w:val="single" w:sz="4" w:space="0" w:color="AAAAAA"/>
+              <w:bottom w:val="single" w:sz="4" w:space="0" w:color="AAAAAA"/>
+              <w:right w:val="single" w:sz="4" w:space="0" w:color="AAAAAA"/>
+            </w:tcBorders>
+          </w:tcPr>
+          <w:p>
+            <w:r>
+              <w:rPr>
+                <w:sz w:val="20"/>
+              </w:rPr>
+              <w:t>How many items are in the system right now</w:t>
+            </w:r>
+          </w:p>
+        </w:tc>
+        <w:tc>
+          <w:tcPr>
+            <w:tcW w:type="dxa" w:w="3024"/>
+            <w:shd w:val="clear" w:color="auto" w:fill="F2F7FC"/>
+            <w:tcBorders>
+              <w:top w:val="single" w:sz="4" w:space="0" w:color="AAAAAA"/>
+              <w:left w:val="single" w:sz="4" w:space="0" w:color="AAAAAA"/>
+              <w:bottom w:val="single" w:sz="4" w:space="0" w:color="AAAAAA"/>
+              <w:right w:val="single" w:sz="4" w:space="0" w:color="AAAAAA"/>
+            </w:tcBorders>
+          </w:tcPr>
+          <w:p>
+            <w:r>
+              <w:rPr>
+                <w:sz w:val="20"/>
+              </w:rPr>
+              <w:t>All inventory</w:t>
+            </w:r>
+          </w:p>
+        </w:tc>
+      </w:tr>
+      <w:tr>
+        <w:tc>
+          <w:tcPr>
+            <w:tcW w:type="dxa" w:w="3024"/>
+            <w:shd w:val="clear" w:color="auto" w:fill="FFFFFF"/>
+            <w:tcBorders>
+              <w:top w:val="single" w:sz="4" w:space="0" w:color="AAAAAA"/>
+              <w:left w:val="single" w:sz="4" w:space="0" w:color="AAAAAA"/>
+              <w:bottom w:val="single" w:sz="4" w:space="0" w:color="AAAAAA"/>
+              <w:right w:val="single" w:sz="4" w:space="0" w:color="AAAAAA"/>
+            </w:tcBorders>
+          </w:tcPr>
+          <w:p>
+            <w:r>
+              <w:rPr>
+                <w:sz w:val="20"/>
+              </w:rPr>
+              <w:t>Active Distributors</w:t>
+            </w:r>
+          </w:p>
+        </w:tc>
+        <w:tc>
+          <w:tcPr>
+            <w:tcW w:type="dxa" w:w="3024"/>
+            <w:shd w:val="clear" w:color="auto" w:fill="FFFFFF"/>
+            <w:tcBorders>
+              <w:top w:val="single" w:sz="4" w:space="0" w:color="AAAAAA"/>
+              <w:left w:val="single" w:sz="4" w:space="0" w:color="AAAAAA"/>
+              <w:bottom w:val="single" w:sz="4" w:space="0" w:color="AAAAAA"/>
+              <w:right w:val="single" w:sz="4" w:space="0" w:color="AAAAAA"/>
+            </w:tcBorders>
+          </w:tcPr>
+          <w:p>
+            <w:r>
+              <w:rPr>
+                <w:sz w:val="20"/>
+              </w:rPr>
+              <w:t>How many distributors have items</w:t>
+            </w:r>
+          </w:p>
+        </w:tc>
+        <w:tc>
+          <w:tcPr>
+            <w:tcW w:type="dxa" w:w="3024"/>
+            <w:shd w:val="clear" w:color="auto" w:fill="FFFFFF"/>
+            <w:tcBorders>
+              <w:top w:val="single" w:sz="4" w:space="0" w:color="AAAAAA"/>
+              <w:left w:val="single" w:sz="4" w:space="0" w:color="AAAAAA"/>
+              <w:bottom w:val="single" w:sz="4" w:space="0" w:color="AAAAAA"/>
+              <w:right w:val="single" w:sz="4" w:space="0" w:color="AAAAAA"/>
+            </w:tcBorders>
+          </w:tcPr>
+          <w:p>
+            <w:r>
+              <w:rPr>
+                <w:sz w:val="20"/>
+              </w:rPr>
+              <w:t>Distributor list</w:t>
+            </w:r>
+          </w:p>
+        </w:tc>
+      </w:tr>
+      <w:tr>
+        <w:tc>
+          <w:tcPr>
+            <w:tcW w:type="dxa" w:w="3024"/>
+            <w:shd w:val="clear" w:color="auto" w:fill="F2F7FC"/>
+            <w:tcBorders>
+              <w:top w:val="single" w:sz="4" w:space="0" w:color="AAAAAA"/>
+              <w:left w:val="single" w:sz="4" w:space="0" w:color="AAAAAA"/>
+              <w:bottom w:val="single" w:sz="4" w:space="0" w:color="AAAAAA"/>
+              <w:right w:val="single" w:sz="4" w:space="0" w:color="AAAAAA"/>
+            </w:tcBorders>
+          </w:tcPr>
+          <w:p>
+            <w:r>
+              <w:rPr>
+                <w:sz w:val="20"/>
+              </w:rPr>
+              <w:t>Expiring &lt; 180d</w:t>
+            </w:r>
+          </w:p>
+        </w:tc>
+        <w:tc>
+          <w:tcPr>
+            <w:tcW w:type="dxa" w:w="3024"/>
+            <w:shd w:val="clear" w:color="auto" w:fill="F2F7FC"/>
+            <w:tcBorders>
+              <w:top w:val="single" w:sz="4" w:space="0" w:color="AAAAAA"/>
+              <w:left w:val="single" w:sz="4" w:space="0" w:color="AAAAAA"/>
+              <w:bottom w:val="single" w:sz="4" w:space="0" w:color="AAAAAA"/>
+              <w:right w:val="single" w:sz="4" w:space="0" w:color="AAAAAA"/>
+            </w:tcBorders>
+          </w:tcPr>
+          <w:p>
+            <w:r>
+              <w:rPr>
+                <w:sz w:val="20"/>
+              </w:rPr>
+              <w:t>Items that expire within 6 months</w:t>
+            </w:r>
+          </w:p>
+        </w:tc>
+        <w:tc>
+          <w:tcPr>
+            <w:tcW w:type="dxa" w:w="3024"/>
+            <w:shd w:val="clear" w:color="auto" w:fill="F2F7FC"/>
+            <w:tcBorders>
+              <w:top w:val="single" w:sz="4" w:space="0" w:color="AAAAAA"/>
+              <w:left w:val="single" w:sz="4" w:space="0" w:color="AAAAAA"/>
+              <w:bottom w:val="single" w:sz="4" w:space="0" w:color="AAAAAA"/>
+              <w:right w:val="single" w:sz="4" w:space="0" w:color="AAAAAA"/>
+            </w:tcBorders>
+          </w:tcPr>
+          <w:p>
+            <w:r>
+              <w:rPr>
+                <w:sz w:val="20"/>
+              </w:rPr>
+              <w:t>Those specific items</w:t>
+            </w:r>
+          </w:p>
+        </w:tc>
+      </w:tr>
+      <w:tr>
+        <w:tc>
+          <w:tcPr>
+            <w:tcW w:type="dxa" w:w="3024"/>
+            <w:shd w:val="clear" w:color="auto" w:fill="FFFFFF"/>
+            <w:tcBorders>
+              <w:top w:val="single" w:sz="4" w:space="0" w:color="AAAAAA"/>
+              <w:left w:val="single" w:sz="4" w:space="0" w:color="AAAAAA"/>
+              <w:bottom w:val="single" w:sz="4" w:space="0" w:color="AAAAAA"/>
+              <w:right w:val="single" w:sz="4" w:space="0" w:color="AAAAAA"/>
+            </w:tcBorders>
+          </w:tcPr>
+          <w:p>
+            <w:r>
+              <w:rPr>
+                <w:sz w:val="20"/>
+              </w:rPr>
+              <w:t>Expired</w:t>
+            </w:r>
+          </w:p>
+        </w:tc>
+        <w:tc>
+          <w:tcPr>
+            <w:tcW w:type="dxa" w:w="3024"/>
+            <w:shd w:val="clear" w:color="auto" w:fill="FFFFFF"/>
+            <w:tcBorders>
+              <w:top w:val="single" w:sz="4" w:space="0" w:color="AAAAAA"/>
+              <w:left w:val="single" w:sz="4" w:space="0" w:color="AAAAAA"/>
+              <w:bottom w:val="single" w:sz="4" w:space="0" w:color="AAAAAA"/>
+              <w:right w:val="single" w:sz="4" w:space="0" w:color="AAAAAA"/>
+            </w:tcBorders>
+          </w:tcPr>
+          <w:p>
+            <w:r>
+              <w:rPr>
+                <w:sz w:val="20"/>
+              </w:rPr>
+              <w:t>Items that are already past their expiry date</w:t>
+            </w:r>
+          </w:p>
+        </w:tc>
+        <w:tc>
+          <w:tcPr>
+            <w:tcW w:type="dxa" w:w="3024"/>
+            <w:shd w:val="clear" w:color="auto" w:fill="FFFFFF"/>
+            <w:tcBorders>
+              <w:top w:val="single" w:sz="4" w:space="0" w:color="AAAAAA"/>
+              <w:left w:val="single" w:sz="4" w:space="0" w:color="AAAAAA"/>
+              <w:bottom w:val="single" w:sz="4" w:space="0" w:color="AAAAAA"/>
+              <w:right w:val="single" w:sz="4" w:space="0" w:color="AAAAAA"/>
+            </w:tcBorders>
+          </w:tcPr>
+          <w:p>
+            <w:r>
+              <w:rPr>
+                <w:sz w:val="20"/>
+              </w:rPr>
+              <w:t>Those specific items</w:t>
+            </w:r>
+          </w:p>
+        </w:tc>
+      </w:tr>
+      <w:tr>
+        <w:tc>
+          <w:tcPr>
+            <w:tcW w:type="dxa" w:w="3024"/>
+            <w:shd w:val="clear" w:color="auto" w:fill="F2F7FC"/>
+            <w:tcBorders>
+              <w:top w:val="single" w:sz="4" w:space="0" w:color="AAAAAA"/>
+              <w:left w:val="single" w:sz="4" w:space="0" w:color="AAAAAA"/>
+              <w:bottom w:val="single" w:sz="4" w:space="0" w:color="AAAAAA"/>
+              <w:right w:val="single" w:sz="4" w:space="0" w:color="AAAAAA"/>
+            </w:tcBorders>
+          </w:tcPr>
+          <w:p>
+            <w:r>
+              <w:rPr>
+                <w:sz w:val="20"/>
+              </w:rPr>
+              <w:t>Unassigned</w:t>
+            </w:r>
+          </w:p>
+        </w:tc>
+        <w:tc>
+          <w:tcPr>
+            <w:tcW w:type="dxa" w:w="3024"/>
+            <w:shd w:val="clear" w:color="auto" w:fill="F2F7FC"/>
+            <w:tcBorders>
+              <w:top w:val="single" w:sz="4" w:space="0" w:color="AAAAAA"/>
+              <w:left w:val="single" w:sz="4" w:space="0" w:color="AAAAAA"/>
+              <w:bottom w:val="single" w:sz="4" w:space="0" w:color="AAAAAA"/>
+              <w:right w:val="single" w:sz="4" w:space="0" w:color="AAAAAA"/>
+            </w:tcBorders>
+          </w:tcPr>
+          <w:p>
+            <w:r>
+              <w:rPr>
+                <w:sz w:val="20"/>
+              </w:rPr>
+              <w:t>Items at Home Office not yet sent anywhere</w:t>
+            </w:r>
+          </w:p>
+        </w:tc>
+        <w:tc>
+          <w:tcPr>
+            <w:tcW w:type="dxa" w:w="3024"/>
+            <w:shd w:val="clear" w:color="auto" w:fill="F2F7FC"/>
+            <w:tcBorders>
+              <w:top w:val="single" w:sz="4" w:space="0" w:color="AAAAAA"/>
+              <w:left w:val="single" w:sz="4" w:space="0" w:color="AAAAAA"/>
+              <w:bottom w:val="single" w:sz="4" w:space="0" w:color="AAAAAA"/>
+              <w:right w:val="single" w:sz="4" w:space="0" w:color="AAAAAA"/>
+            </w:tcBorders>
+          </w:tcPr>
+          <w:p>
+            <w:r>
+              <w:rPr>
+                <w:sz w:val="20"/>
+              </w:rPr>
+              <w:t>Those specific items</w:t>
+            </w:r>
+          </w:p>
+        </w:tc>
+      </w:tr>
+    </w:tbl>
+    <w:p/>
+    <w:p>
+      <w:pPr/>
+      <w:r>
+        <w:rPr>
+          <w:b/>
+        </w:rPr>
+        <w:t>Stock by Item Number:</w:t>
+      </w:r>
+    </w:p>
+    <w:p>
+      <w:pPr/>
+      <w:r>
+        <w:t xml:space="preserve">Tap the </w:t>
+      </w:r>
+      <w:r>
+        <w:rPr>
+          <w:b/>
+        </w:rPr>
+        <w:t>Stock by Item Number</w:t>
+      </w:r>
+      <w:r>
+        <w:t xml:space="preserve"> button to open a detailed matrix view. This is one of the most useful reports in the system.</w:t>
+      </w:r>
+    </w:p>
+    <w:p>
+      <w:pPr>
+        <w:pStyle w:val="ListBullet"/>
+      </w:pPr>
+      <w:r>
+        <w:t>Every row is one type of product (one item number)</w:t>
+      </w:r>
+    </w:p>
+    <w:p>
+      <w:pPr>
+        <w:pStyle w:val="ListBullet"/>
+      </w:pPr>
+      <w:r>
+        <w:t>Every column is a location (Home Office, plus each distributor)</w:t>
+      </w:r>
+    </w:p>
+    <w:p>
+      <w:pPr>
+        <w:pStyle w:val="ListBullet"/>
+      </w:pPr>
+      <w:r>
+        <w:t xml:space="preserve">The </w:t>
+      </w:r>
+      <w:r>
+        <w:rPr>
+          <w:b/>
+        </w:rPr>
+        <w:t>Total</w:t>
+      </w:r>
+      <w:r>
+        <w:t xml:space="preserve"> column on the right shows how many of that item exist across everywhere</w:t>
+      </w:r>
+    </w:p>
+    <w:p>
+      <w:pPr/>
+      <w:r>
+        <w:rPr>
+          <w:b/>
+        </w:rPr>
+        <w:t>Drilling down:</w:t>
+      </w:r>
+    </w:p>
+    <w:p>
+      <w:pPr>
+        <w:pStyle w:val="ListBullet"/>
+      </w:pPr>
+      <w:r>
+        <w:t xml:space="preserve">Tap an </w:t>
+      </w:r>
+      <w:r>
+        <w:rPr>
+          <w:b/>
+        </w:rPr>
+        <w:t>item number</w:t>
+      </w:r>
+      <w:r>
+        <w:t xml:space="preserve"> in the leftmost column (or its Total) → see all units of that product across all locations</w:t>
+      </w:r>
+    </w:p>
+    <w:p>
+      <w:pPr>
+        <w:pStyle w:val="ListBullet"/>
+      </w:pPr>
+      <w:r>
+        <w:t xml:space="preserve">Tap a </w:t>
+      </w:r>
+      <w:r>
+        <w:rPr>
+          <w:b/>
+        </w:rPr>
+        <w:t>specific count</w:t>
+      </w:r>
+      <w:r>
+        <w:t xml:space="preserve"> (e.g., the "13" under a distributor's column) → see only that product at that location</w:t>
+      </w:r>
+    </w:p>
+    <w:p>
+      <w:pPr/>
+      <w:r>
+        <w:t>You can also search by item number or description at the top, sort by any column, and download the whole matrix as an Excel file.</w:t>
+      </w:r>
+    </w:p>
+    <w:p>
+      <w:pPr/>
+      <w:r>
+        <w:rPr>
+          <w:b/>
+        </w:rPr>
+        <w:t>Transfer History:</w:t>
+      </w:r>
+    </w:p>
+    <w:p>
+      <w:pPr/>
+      <w:r>
+        <w:t>A searchable list of every transfer ever created. Type a transfer ID, distributor name, or date in the search bar to find what you're looking for. Tap any transfer ID to see the full detail and print it.</w:t>
+      </w:r>
+    </w:p>
+    <w:p>
+      <w:pPr/>
+      <w:r>
+        <w:rPr>
+          <w:b/>
+        </w:rPr>
+        <w:t>Expiring Items:</w:t>
+      </w:r>
+    </w:p>
+    <w:p>
+      <w:pPr/>
+      <w:r>
+        <w:t>A table showing up to 20 items that expire in the next 180 days, sorted by how many days are left. Tap any column header to re-sort the list.</w:t>
+      </w:r>
+    </w:p>
+    <w:p>
+      <w:pPr>
+        <w:pStyle w:val="Heading3"/>
+      </w:pPr>
+      <w:r>
+        <w:t>8. Batch Upload</w:t>
+      </w:r>
+    </w:p>
+    <w:p>
+      <w:pPr/>
+      <w:r>
+        <w:rPr>
+          <w:b/>
+        </w:rPr>
+        <w:t>Where to go:</w:t>
+      </w:r>
+      <w:r>
+        <w:t xml:space="preserve"> Tap </w:t>
+      </w:r>
+      <w:r>
+        <w:rPr>
+          <w:b/>
+        </w:rPr>
+        <w:t>More</w:t>
+      </w:r>
+      <w:r>
+        <w:t xml:space="preserve"> → </w:t>
+      </w:r>
+      <w:r>
+        <w:rPr>
+          <w:b/>
+        </w:rPr>
+        <w:t>Batch Upload</w:t>
+      </w:r>
+    </w:p>
+    <w:p>
+      <w:pPr/>
+      <w:r>
+        <w:t>Use this when you have a large number of items to add to the system and you'd rather upload photos or a spreadsheet than scan them one at a time.</w:t>
+      </w:r>
+    </w:p>
+    <w:p>
+      <w:pPr/>
+      <w:r>
+        <w:rPr>
+          <w:b/>
+        </w:rPr>
+        <w:t>Uploading photos:</w:t>
+      </w:r>
+    </w:p>
+    <w:p>
+      <w:pPr>
+        <w:pStyle w:val="ListNumber"/>
+      </w:pPr>
+      <w:r>
+        <w:t>Tap the upload area and select images from your phone or computer</w:t>
+      </w:r>
+    </w:p>
+    <w:p>
+      <w:pPr>
+        <w:pStyle w:val="ListNumber"/>
+      </w:pPr>
+      <w:r>
+        <w:t xml:space="preserve">The app scans each photo automatically — it can find up to </w:t>
+      </w:r>
+      <w:r>
+        <w:rPr>
+          <w:b/>
+        </w:rPr>
+        <w:t>4 barcodes per image</w:t>
+      </w:r>
+    </w:p>
+    <w:p>
+      <w:pPr>
+        <w:pStyle w:val="ListNumber"/>
+      </w:pPr>
+      <w:r>
+        <w:t>You'll see results appear one by one showing what was found (or any errors)</w:t>
+      </w:r>
+    </w:p>
+    <w:p>
+      <w:pPr/>
+      <w:r>
+        <w:rPr>
+          <w:b/>
+        </w:rPr>
+        <w:t>Uploading a CSV/Excel file:</w:t>
+      </w:r>
+    </w:p>
+    <w:p>
+      <w:pPr/>
+      <w:r>
+        <w:t>If your shipping documents come as a spreadsheet with barcode data:</w:t>
+      </w:r>
+    </w:p>
+    <w:p>
+      <w:pPr>
+        <w:pStyle w:val="ListNumber"/>
+      </w:pPr>
+      <w:r>
+        <w:t>Make sure the barcode strings are in the first column</w:t>
+      </w:r>
+    </w:p>
+    <w:p>
+      <w:pPr>
+        <w:pStyle w:val="ListNumber"/>
+      </w:pPr>
+      <w:r>
+        <w:t>Tap the upload area and select your file</w:t>
+      </w:r>
+    </w:p>
+    <w:p>
+      <w:pPr>
+        <w:pStyle w:val="ListNumber"/>
+      </w:pPr>
+      <w:r>
+        <w:t>Each row becomes one inventory item — items that share a lot number are each created individually, not skipped</w:t>
+      </w:r>
+    </w:p>
+    <w:p>
+      <w:pPr/>
+      <w:r>
+        <w:rPr>
+          <w:b/>
+        </w:rPr>
+        <w:t>After uploading:</w:t>
+      </w:r>
+    </w:p>
+    <w:p>
+      <w:pPr>
+        <w:pStyle w:val="ListNumber"/>
+      </w:pPr>
+      <w:r>
+        <w:t>A grid shows all the items that were found, with a checkmark (success) or X (failed to read)</w:t>
+      </w:r>
+    </w:p>
+    <w:p>
+      <w:pPr>
+        <w:pStyle w:val="ListNumber"/>
+      </w:pPr>
+      <w:r>
+        <w:t>Select the items you want to keep</w:t>
+      </w:r>
+    </w:p>
+    <w:p>
+      <w:pPr>
+        <w:pStyle w:val="ListNumber"/>
+      </w:pPr>
+      <w:r>
+        <w:t>Choose a destination distributor from the dropdown</w:t>
+      </w:r>
+    </w:p>
+    <w:p>
+      <w:pPr>
+        <w:pStyle w:val="ListNumber"/>
+      </w:pPr>
+      <w:r>
+        <w:t xml:space="preserve">Tap </w:t>
+      </w:r>
+      <w:r>
+        <w:rPr>
+          <w:b/>
+        </w:rPr>
+        <w:t>Assign</w:t>
+      </w:r>
+      <w:r>
+        <w:t xml:space="preserve"> to save them</w:t>
+      </w:r>
+    </w:p>
+    <w:p>
+      <w:pPr>
+        <w:pStyle w:val="Heading3"/>
+      </w:pPr>
+      <w:r>
+        <w:t>9. Distributors</w:t>
+      </w:r>
+    </w:p>
+    <w:p>
+      <w:pPr/>
+      <w:r>
+        <w:rPr>
+          <w:b/>
+        </w:rPr>
+        <w:t>Where to go:</w:t>
+      </w:r>
+      <w:r>
+        <w:t xml:space="preserve"> Tap </w:t>
+      </w:r>
+      <w:r>
+        <w:rPr>
+          <w:b/>
+        </w:rPr>
+        <w:t>More</w:t>
+      </w:r>
+      <w:r>
+        <w:t xml:space="preserve"> → </w:t>
+      </w:r>
+      <w:r>
+        <w:rPr>
+          <w:b/>
+        </w:rPr>
+        <w:t>Distributors</w:t>
+      </w:r>
+    </w:p>
+    <w:p>
+      <w:pPr/>
+      <w:r>
+        <w:t>This page shows your full list of distributors — the sales reps, hospitals, or other locations where your inventory lives.</w:t>
+      </w:r>
+    </w:p>
+    <w:p>
+      <w:pPr>
+        <w:pStyle w:val="ListBullet"/>
+      </w:pPr>
+      <w:r>
+        <w:t>Each distributor card shows how many items they currently have</w:t>
+      </w:r>
+    </w:p>
+    <w:p>
+      <w:pPr>
+        <w:pStyle w:val="ListBullet"/>
+      </w:pPr>
+      <w:r>
+        <w:t>Tap a distributor to see their full item list, download it as Excel, or share a link to the page</w:t>
+      </w:r>
+    </w:p>
+    <w:p>
+      <w:pPr>
+        <w:pStyle w:val="ListBullet"/>
+      </w:pPr>
+      <w:r>
+        <w:t>From the distributor detail page, tap any item to open its full detail page</w:t>
+      </w:r>
+    </w:p>
+    <w:p>
+      <w:pPr>
+        <w:pStyle w:val="ListBullet"/>
+      </w:pPr>
+      <w:r>
+        <w:rPr>
+          <w:b/>
+        </w:rPr>
+        <w:t>Home Office</w:t>
+      </w:r>
+      <w:r>
+        <w:t xml:space="preserve"> is always the starting point — all items come here first before going anywhere else</w:t>
+      </w:r>
+    </w:p>
+    <w:p>
+      <w:pPr>
+        <w:pStyle w:val="Heading2"/>
+      </w:pPr>
+      <w:r>
+        <w:t>Admin Features</w:t>
+      </w:r>
+    </w:p>
+    <w:p>
+      <w:pPr>
+        <w:pStyle w:val="Heading3"/>
+      </w:pPr>
+      <w:r>
+        <w:t>User Management</w:t>
+      </w:r>
+    </w:p>
+    <w:p>
+      <w:pPr/>
+      <w:r>
+        <w:rPr>
+          <w:b/>
+        </w:rPr>
+        <w:t>Where to go:</w:t>
+      </w:r>
+      <w:r>
+        <w:t xml:space="preserve"> Tap </w:t>
+      </w:r>
+      <w:r>
+        <w:rPr>
+          <w:b/>
+        </w:rPr>
+        <w:t>More</w:t>
+      </w:r>
+      <w:r>
+        <w:t xml:space="preserve"> → </w:t>
+      </w:r>
+      <w:r>
+        <w:rPr>
+          <w:b/>
+        </w:rPr>
+        <w:t>User Management</w:t>
+      </w:r>
+      <w:r>
+        <w:t xml:space="preserve"> *(only visible to admins)*</w:t>
+      </w:r>
+    </w:p>
+    <w:p>
+      <w:pPr/>
+      <w:r>
+        <w:rPr>
+          <w:b/>
+        </w:rPr>
+        <w:t>Adding a new user:</w:t>
+      </w:r>
+    </w:p>
+    <w:p>
+      <w:pPr>
+        <w:pStyle w:val="ListNumber"/>
+      </w:pPr>
+      <w:r>
+        <w:t xml:space="preserve">Tap </w:t>
+      </w:r>
+      <w:r>
+        <w:rPr>
+          <w:b/>
+        </w:rPr>
+        <w:t>Add User</w:t>
+      </w:r>
+    </w:p>
+    <w:p>
+      <w:pPr>
+        <w:pStyle w:val="ListNumber"/>
+      </w:pPr>
+      <w:r>
+        <w:t>Enter a username (at least 2 characters) and a password (at least 6 characters)</w:t>
+      </w:r>
+    </w:p>
+    <w:p>
+      <w:pPr>
+        <w:pStyle w:val="ListNumber"/>
+      </w:pPr>
+      <w:r>
+        <w:t>Choose a role:</w:t>
+      </w:r>
+    </w:p>
+    <w:p>
+      <w:pPr>
+        <w:pStyle w:val="ListBullet2"/>
+      </w:pPr>
+      <w:r>
+        <w:rPr>
+          <w:b/>
+        </w:rPr>
+        <w:t>User</w:t>
+      </w:r>
+      <w:r>
+        <w:t xml:space="preserve"> — can view and manage inventory, but can't add or delete other users</w:t>
+      </w:r>
+    </w:p>
+    <w:p>
+      <w:pPr>
+        <w:pStyle w:val="ListBullet2"/>
+      </w:pPr>
+      <w:r>
+        <w:rPr>
+          <w:b/>
+        </w:rPr>
+        <w:t>Admin</w:t>
+      </w:r>
+      <w:r>
+        <w:t xml:space="preserve"> — full access including User Management</w:t>
+      </w:r>
+    </w:p>
+    <w:p>
+      <w:pPr>
+        <w:pStyle w:val="ListNumber"/>
+      </w:pPr>
+      <w:r>
+        <w:t xml:space="preserve">Tap </w:t>
+      </w:r>
+      <w:r>
+        <w:rPr>
+          <w:b/>
+        </w:rPr>
+        <w:t>Create User</w:t>
+      </w:r>
+    </w:p>
+    <w:p>
+      <w:pPr/>
+      <w:r>
+        <w:rPr>
+          <w:b/>
+        </w:rPr>
+        <w:t>Managing existing users:</w:t>
+      </w:r>
+    </w:p>
+    <w:p>
+      <w:pPr>
+        <w:pStyle w:val="ListBullet"/>
+      </w:pPr>
+      <w:r>
+        <w:rPr>
+          <w:b/>
+        </w:rPr>
+        <w:t>Change role:</w:t>
+      </w:r>
+      <w:r>
+        <w:t xml:space="preserve"> Tap the shield icon next to a user to switch them between User and Admin. (You can't change your own role.)</w:t>
+      </w:r>
+    </w:p>
+    <w:p>
+      <w:pPr>
+        <w:pStyle w:val="ListBullet"/>
+      </w:pPr>
+      <w:r>
+        <w:rPr>
+          <w:b/>
+        </w:rPr>
+        <w:t>Reset password:</w:t>
+      </w:r>
+      <w:r>
+        <w:t xml:space="preserve"> Tap the key icon next to a user and enter a new password</w:t>
+      </w:r>
+    </w:p>
+    <w:p>
+      <w:pPr>
+        <w:pStyle w:val="ListBullet"/>
+      </w:pPr>
+      <w:r>
+        <w:rPr>
+          <w:b/>
+        </w:rPr>
+        <w:t>Delete user:</w:t>
+      </w:r>
+      <w:r>
+        <w:t xml:space="preserve"> Tap the trash icon. You can't delete yourself or the last remaining admin.</w:t>
+      </w:r>
+    </w:p>
+    <w:p>
+      <w:pPr>
+        <w:pStyle w:val="Heading2"/>
+      </w:pPr>
+      <w:r>
+        <w:t>Barcode Format Reference</w:t>
+      </w:r>
+    </w:p>
+    <w:p>
+      <w:pPr/>
+      <w:r>
+        <w:t xml:space="preserve">Nail Tracker reads </w:t>
+      </w:r>
+      <w:r>
+        <w:rPr>
+          <w:b/>
+        </w:rPr>
+        <w:t>GS1-128 barcodes</w:t>
+      </w:r>
+      <w:r>
+        <w:t xml:space="preserve"> — the standard format used on medical device packaging. Each barcode contains several pieces of information identified by a two-digit code called an Application Identifier (AI).</w:t>
+      </w:r>
+    </w:p>
+    <w:tbl>
+      <w:tblPr>
+        <w:tblStyle w:val="TableGrid"/>
+        <w:tblW w:type="auto" w:w="0"/>
+        <w:tblLook w:firstColumn="1" w:firstRow="1" w:lastColumn="0" w:lastRow="0" w:noHBand="0" w:noVBand="1" w:val="04A0"/>
+      </w:tblPr>
+      <w:tblGrid>
+        <w:gridCol w:w="3024"/>
+        <w:gridCol w:w="3024"/>
+        <w:gridCol w:w="3024"/>
+      </w:tblGrid>
+      <w:tr>
+        <w:tc>
+          <w:tcPr>
+            <w:tcW w:type="dxa" w:w="3024"/>
+            <w:shd w:val="clear" w:color="auto" w:fill="2E74B5"/>
+            <w:tcBorders>
+              <w:top w:val="single" w:sz="4" w:space="0" w:color="AAAAAA"/>
+              <w:left w:val="single" w:sz="4" w:space="0" w:color="AAAAAA"/>
+              <w:bottom w:val="single" w:sz="4" w:space="0" w:color="AAAAAA"/>
+              <w:right w:val="single" w:sz="4" w:space="0" w:color="AAAAAA"/>
+            </w:tcBorders>
+          </w:tcPr>
+          <w:p>
+            <w:r>
+              <w:rPr>
+                <w:b/>
+                <w:color w:val="FFFFFF"/>
+                <w:sz w:val="20"/>
+              </w:rPr>
+              <w:t>AI Code</w:t>
+            </w:r>
+          </w:p>
+        </w:tc>
+        <w:tc>
+          <w:tcPr>
+            <w:tcW w:type="dxa" w:w="3024"/>
+            <w:shd w:val="clear" w:color="auto" w:fill="2E74B5"/>
+            <w:tcBorders>
+              <w:top w:val="single" w:sz="4" w:space="0" w:color="AAAAAA"/>
+              <w:left w:val="single" w:sz="4" w:space="0" w:color="AAAAAA"/>
+              <w:bottom w:val="single" w:sz="4" w:space="0" w:color="AAAAAA"/>
+              <w:right w:val="single" w:sz="4" w:space="0" w:color="AAAAAA"/>
+            </w:tcBorders>
+          </w:tcPr>
+          <w:p>
+            <w:r>
+              <w:rPr>
+                <w:b/>
+                <w:color w:val="FFFFFF"/>
+                <w:sz w:val="20"/>
+              </w:rPr>
+              <w:t>What It Contains</w:t>
+            </w:r>
+          </w:p>
+        </w:tc>
+        <w:tc>
+          <w:tcPr>
+            <w:tcW w:type="dxa" w:w="3024"/>
+            <w:shd w:val="clear" w:color="auto" w:fill="2E74B5"/>
+            <w:tcBorders>
+              <w:top w:val="single" w:sz="4" w:space="0" w:color="AAAAAA"/>
+              <w:left w:val="single" w:sz="4" w:space="0" w:color="AAAAAA"/>
+              <w:bottom w:val="single" w:sz="4" w:space="0" w:color="AAAAAA"/>
+              <w:right w:val="single" w:sz="4" w:space="0" w:color="AAAAAA"/>
+            </w:tcBorders>
+          </w:tcPr>
+          <w:p>
+            <w:r>
+              <w:rPr>
+                <w:b/>
+                <w:color w:val="FFFFFF"/>
+                <w:sz w:val="20"/>
+              </w:rPr>
+              <w:t>Example</w:t>
+            </w:r>
+          </w:p>
+        </w:tc>
+      </w:tr>
+      <w:tr>
+        <w:tc>
+          <w:tcPr>
+            <w:tcW w:type="dxa" w:w="3024"/>
+            <w:shd w:val="clear" w:color="auto" w:fill="F2F7FC"/>
+            <w:tcBorders>
+              <w:top w:val="single" w:sz="4" w:space="0" w:color="AAAAAA"/>
+              <w:left w:val="single" w:sz="4" w:space="0" w:color="AAAAAA"/>
+              <w:bottom w:val="single" w:sz="4" w:space="0" w:color="AAAAAA"/>
+              <w:right w:val="single" w:sz="4" w:space="0" w:color="AAAAAA"/>
             </w:tcBorders>
           </w:tcPr>
           <w:p>
@@ -2261,10 +3225,10 @@
             <w:tcW w:type="dxa" w:w="3024"/>
             <w:shd w:val="clear" w:color="auto" w:fill="F2F7FC"/>
             <w:tcBorders>
-              <w:top w:val="single" w:sz="4" w:space="0" w:color="999999"/>
-              <w:left w:val="single" w:sz="4" w:space="0" w:color="999999"/>
-              <w:bottom w:val="single" w:sz="4" w:space="0" w:color="999999"/>
-              <w:right w:val="single" w:sz="4" w:space="0" w:color="999999"/>
+              <w:top w:val="single" w:sz="4" w:space="0" w:color="AAAAAA"/>
+              <w:left w:val="single" w:sz="4" w:space="0" w:color="AAAAAA"/>
+              <w:bottom w:val="single" w:sz="4" w:space="0" w:color="AAAAAA"/>
+              <w:right w:val="single" w:sz="4" w:space="0" w:color="AAAAAA"/>
             </w:tcBorders>
           </w:tcPr>
           <w:p>
@@ -2272,7 +3236,7 @@
               <w:rPr>
                 <w:sz w:val="20"/>
               </w:rPr>
-              <w:t>GTIN</w:t>
+              <w:t>GTIN (product code, 14 digits)</w:t>
             </w:r>
           </w:p>
         </w:tc>
@@ -2281,10 +3245,10 @@
             <w:tcW w:type="dxa" w:w="3024"/>
             <w:shd w:val="clear" w:color="auto" w:fill="F2F7FC"/>
             <w:tcBorders>
-              <w:top w:val="single" w:sz="4" w:space="0" w:color="999999"/>
-              <w:left w:val="single" w:sz="4" w:space="0" w:color="999999"/>
-              <w:bottom w:val="single" w:sz="4" w:space="0" w:color="999999"/>
-              <w:right w:val="single" w:sz="4" w:space="0" w:color="999999"/>
+              <w:top w:val="single" w:sz="4" w:space="0" w:color="AAAAAA"/>
+              <w:left w:val="single" w:sz="4" w:space="0" w:color="AAAAAA"/>
+              <w:bottom w:val="single" w:sz="4" w:space="0" w:color="AAAAAA"/>
+              <w:right w:val="single" w:sz="4" w:space="0" w:color="AAAAAA"/>
             </w:tcBorders>
           </w:tcPr>
           <w:p>
@@ -2292,7 +3256,7 @@
               <w:rPr>
                 <w:sz w:val="20"/>
               </w:rPr>
-              <w:t>14 digits</w:t>
+              <w:t>08880089459148</w:t>
             </w:r>
           </w:p>
         </w:tc>
@@ -2303,10 +3267,10 @@
             <w:tcW w:type="dxa" w:w="3024"/>
             <w:shd w:val="clear" w:color="auto" w:fill="FFFFFF"/>
             <w:tcBorders>
-              <w:top w:val="single" w:sz="4" w:space="0" w:color="999999"/>
-              <w:left w:val="single" w:sz="4" w:space="0" w:color="999999"/>
-              <w:bottom w:val="single" w:sz="4" w:space="0" w:color="999999"/>
-              <w:right w:val="single" w:sz="4" w:space="0" w:color="999999"/>
+              <w:top w:val="single" w:sz="4" w:space="0" w:color="AAAAAA"/>
+              <w:left w:val="single" w:sz="4" w:space="0" w:color="AAAAAA"/>
+              <w:bottom w:val="single" w:sz="4" w:space="0" w:color="AAAAAA"/>
+              <w:right w:val="single" w:sz="4" w:space="0" w:color="AAAAAA"/>
             </w:tcBorders>
           </w:tcPr>
           <w:p>
@@ -2323,10 +3287,10 @@
             <w:tcW w:type="dxa" w:w="3024"/>
             <w:shd w:val="clear" w:color="auto" w:fill="FFFFFF"/>
             <w:tcBorders>
-              <w:top w:val="single" w:sz="4" w:space="0" w:color="999999"/>
-              <w:left w:val="single" w:sz="4" w:space="0" w:color="999999"/>
-              <w:bottom w:val="single" w:sz="4" w:space="0" w:color="999999"/>
-              <w:right w:val="single" w:sz="4" w:space="0" w:color="999999"/>
+              <w:top w:val="single" w:sz="4" w:space="0" w:color="AAAAAA"/>
+              <w:left w:val="single" w:sz="4" w:space="0" w:color="AAAAAA"/>
+              <w:bottom w:val="single" w:sz="4" w:space="0" w:color="AAAAAA"/>
+              <w:right w:val="single" w:sz="4" w:space="0" w:color="AAAAAA"/>
             </w:tcBorders>
           </w:tcPr>
           <w:p>
@@ -2334,7 +3298,7 @@
               <w:rPr>
                 <w:sz w:val="20"/>
               </w:rPr>
-              <w:t>Lot Number</w:t>
+              <w:t>Lot number</w:t>
             </w:r>
           </w:p>
         </w:tc>
@@ -2343,10 +3307,10 @@
             <w:tcW w:type="dxa" w:w="3024"/>
             <w:shd w:val="clear" w:color="auto" w:fill="FFFFFF"/>
             <w:tcBorders>
-              <w:top w:val="single" w:sz="4" w:space="0" w:color="999999"/>
-              <w:left w:val="single" w:sz="4" w:space="0" w:color="999999"/>
-              <w:bottom w:val="single" w:sz="4" w:space="0" w:color="999999"/>
-              <w:right w:val="single" w:sz="4" w:space="0" w:color="999999"/>
+              <w:top w:val="single" w:sz="4" w:space="0" w:color="AAAAAA"/>
+              <w:left w:val="single" w:sz="4" w:space="0" w:color="AAAAAA"/>
+              <w:bottom w:val="single" w:sz="4" w:space="0" w:color="AAAAAA"/>
+              <w:right w:val="single" w:sz="4" w:space="0" w:color="AAAAAA"/>
             </w:tcBorders>
           </w:tcPr>
           <w:p>
@@ -2354,7 +3318,7 @@
               <w:rPr>
                 <w:sz w:val="20"/>
               </w:rPr>
-              <w:t>Variable length</w:t>
+              <w:t>J250929-L021</w:t>
             </w:r>
           </w:p>
         </w:tc>
@@ -2365,10 +3329,10 @@
             <w:tcW w:type="dxa" w:w="3024"/>
             <w:shd w:val="clear" w:color="auto" w:fill="F2F7FC"/>
             <w:tcBorders>
-              <w:top w:val="single" w:sz="4" w:space="0" w:color="999999"/>
-              <w:left w:val="single" w:sz="4" w:space="0" w:color="999999"/>
-              <w:bottom w:val="single" w:sz="4" w:space="0" w:color="999999"/>
-              <w:right w:val="single" w:sz="4" w:space="0" w:color="999999"/>
+              <w:top w:val="single" w:sz="4" w:space="0" w:color="AAAAAA"/>
+              <w:left w:val="single" w:sz="4" w:space="0" w:color="AAAAAA"/>
+              <w:bottom w:val="single" w:sz="4" w:space="0" w:color="AAAAAA"/>
+              <w:right w:val="single" w:sz="4" w:space="0" w:color="AAAAAA"/>
             </w:tcBorders>
           </w:tcPr>
           <w:p>
@@ -2385,10 +3349,10 @@
             <w:tcW w:type="dxa" w:w="3024"/>
             <w:shd w:val="clear" w:color="auto" w:fill="F2F7FC"/>
             <w:tcBorders>
-              <w:top w:val="single" w:sz="4" w:space="0" w:color="999999"/>
-              <w:left w:val="single" w:sz="4" w:space="0" w:color="999999"/>
-              <w:bottom w:val="single" w:sz="4" w:space="0" w:color="999999"/>
-              <w:right w:val="single" w:sz="4" w:space="0" w:color="999999"/>
+              <w:top w:val="single" w:sz="4" w:space="0" w:color="AAAAAA"/>
+              <w:left w:val="single" w:sz="4" w:space="0" w:color="AAAAAA"/>
+              <w:bottom w:val="single" w:sz="4" w:space="0" w:color="AAAAAA"/>
+              <w:right w:val="single" w:sz="4" w:space="0" w:color="AAAAAA"/>
             </w:tcBorders>
           </w:tcPr>
           <w:p>
@@ -2396,7 +3360,7 @@
               <w:rPr>
                 <w:sz w:val="20"/>
               </w:rPr>
-              <w:t>Expiry Date</w:t>
+              <w:t>Expiry date (YYMMDD format)</w:t>
             </w:r>
           </w:p>
         </w:tc>
@@ -2405,10 +3369,10 @@
             <w:tcW w:type="dxa" w:w="3024"/>
             <w:shd w:val="clear" w:color="auto" w:fill="F2F7FC"/>
             <w:tcBorders>
-              <w:top w:val="single" w:sz="4" w:space="0" w:color="999999"/>
-              <w:left w:val="single" w:sz="4" w:space="0" w:color="999999"/>
-              <w:bottom w:val="single" w:sz="4" w:space="0" w:color="999999"/>
-              <w:right w:val="single" w:sz="4" w:space="0" w:color="999999"/>
+              <w:top w:val="single" w:sz="4" w:space="0" w:color="AAAAAA"/>
+              <w:left w:val="single" w:sz="4" w:space="0" w:color="AAAAAA"/>
+              <w:bottom w:val="single" w:sz="4" w:space="0" w:color="AAAAAA"/>
+              <w:right w:val="single" w:sz="4" w:space="0" w:color="AAAAAA"/>
             </w:tcBorders>
           </w:tcPr>
           <w:p>
@@ -2416,7 +3380,7 @@
               <w:rPr>
                 <w:sz w:val="20"/>
               </w:rPr>
-              <w:t>YYMMDD (6 digits)</w:t>
+              <w:t>300928 = Sept 28, 2030</w:t>
             </w:r>
           </w:p>
         </w:tc>
@@ -2429,16 +3393,11 @@
         <w:rPr>
           <w:b/>
         </w:rPr>
-        <w:t>Supported input formats:</w:t>
+        <w:t>What a full barcode string looks like:</w:t>
       </w:r>
     </w:p>
     <w:p>
-      <w:pPr>
-        <w:pStyle w:val="ListBullet"/>
-      </w:pPr>
-      <w:r>
-        <w:t xml:space="preserve">Parenthesized: </w:t>
-      </w:r>
+      <w:pPr/>
       <w:r>
         <w:rPr>
           <w:rFonts w:ascii="Courier New" w:hAnsi="Courier New"/>
@@ -2448,51 +3407,24 @@
       </w:r>
     </w:p>
     <w:p>
-      <w:pPr>
-        <w:pStyle w:val="ListBullet"/>
-      </w:pPr>
-      <w:r>
-        <w:t xml:space="preserve">Raw stream: </w:t>
-      </w:r>
-      <w:r>
-        <w:rPr>
-          <w:rFonts w:ascii="Courier New" w:hAnsi="Courier New"/>
-          <w:sz w:val="18"/>
-        </w:rPr>
-        <w:t>010888008945914810J250929-L02117300928</w:t>
-      </w:r>
-    </w:p>
-    <w:p>
-      <w:pPr>
-        <w:pStyle w:val="ListBullet"/>
-      </w:pPr>
-      <w:r>
-        <w:t xml:space="preserve">Hourglass date format: </w:t>
-      </w:r>
-      <w:r>
-        <w:rPr>
-          <w:rFonts w:ascii="Courier New" w:hAnsi="Courier New"/>
-          <w:sz w:val="18"/>
-        </w:rPr>
-        <w:t>YYYY-MM-DD</w:t>
-      </w:r>
-      <w:r>
-        <w:t xml:space="preserve"> (used on some label printers)</w:t>
+      <w:pPr/>
+      <w:r>
+        <w:t>The app also accepts the raw format without parentheses, and supports an alternate date format (YYYY-MM-DD) used by some label printers.</w:t>
       </w:r>
     </w:p>
     <w:p>
       <w:pPr/>
       <w:r>
-        <w:t xml:space="preserve">The system also recognizes </w:t>
-      </w:r>
-      <w:r>
         <w:rPr>
           <w:b/>
         </w:rPr>
-        <w:t>REF codes</w:t>
-      </w:r>
-      <w:r>
-        <w:t xml:space="preserve"> to auto-categorize products:</w:t>
+        <w:t>Product REF Code Reference:</w:t>
+      </w:r>
+    </w:p>
+    <w:p>
+      <w:pPr/>
+      <w:r>
+        <w:t>Every Summa Orthopaedics product has a REF code printed on its label. The app uses this code to automatically identify the product name. Here are the prefixes and what they mean:</w:t>
       </w:r>
     </w:p>
     <w:tbl>
@@ -2511,10 +3443,10 @@
             <w:tcW w:type="dxa" w:w="4536"/>
             <w:shd w:val="clear" w:color="auto" w:fill="2E74B5"/>
             <w:tcBorders>
-              <w:top w:val="single" w:sz="4" w:space="0" w:color="999999"/>
-              <w:left w:val="single" w:sz="4" w:space="0" w:color="999999"/>
-              <w:bottom w:val="single" w:sz="4" w:space="0" w:color="999999"/>
-              <w:right w:val="single" w:sz="4" w:space="0" w:color="999999"/>
+              <w:top w:val="single" w:sz="4" w:space="0" w:color="AAAAAA"/>
+              <w:left w:val="single" w:sz="4" w:space="0" w:color="AAAAAA"/>
+              <w:bottom w:val="single" w:sz="4" w:space="0" w:color="AAAAAA"/>
+              <w:right w:val="single" w:sz="4" w:space="0" w:color="AAAAAA"/>
             </w:tcBorders>
           </w:tcPr>
           <w:p>
@@ -2533,10 +3465,10 @@
             <w:tcW w:type="dxa" w:w="4536"/>
             <w:shd w:val="clear" w:color="auto" w:fill="2E74B5"/>
             <w:tcBorders>
-              <w:top w:val="single" w:sz="4" w:space="0" w:color="999999"/>
-              <w:left w:val="single" w:sz="4" w:space="0" w:color="999999"/>
-              <w:bottom w:val="single" w:sz="4" w:space="0" w:color="999999"/>
-              <w:right w:val="single" w:sz="4" w:space="0" w:color="999999"/>
+              <w:top w:val="single" w:sz="4" w:space="0" w:color="AAAAAA"/>
+              <w:left w:val="single" w:sz="4" w:space="0" w:color="AAAAAA"/>
+              <w:bottom w:val="single" w:sz="4" w:space="0" w:color="AAAAAA"/>
+              <w:right w:val="single" w:sz="4" w:space="0" w:color="AAAAAA"/>
             </w:tcBorders>
           </w:tcPr>
           <w:p>
@@ -2546,7 +3478,7 @@
                 <w:color w:val="FFFFFF"/>
                 <w:sz w:val="20"/>
               </w:rPr>
-              <w:t>Product</w:t>
+              <w:t>Product Type</w:t>
             </w:r>
           </w:p>
         </w:tc>
@@ -2557,10 +3489,10 @@
             <w:tcW w:type="dxa" w:w="4536"/>
             <w:shd w:val="clear" w:color="auto" w:fill="F2F7FC"/>
             <w:tcBorders>
-              <w:top w:val="single" w:sz="4" w:space="0" w:color="999999"/>
-              <w:left w:val="single" w:sz="4" w:space="0" w:color="999999"/>
-              <w:bottom w:val="single" w:sz="4" w:space="0" w:color="999999"/>
-              <w:right w:val="single" w:sz="4" w:space="0" w:color="999999"/>
+              <w:top w:val="single" w:sz="4" w:space="0" w:color="AAAAAA"/>
+              <w:left w:val="single" w:sz="4" w:space="0" w:color="AAAAAA"/>
+              <w:bottom w:val="single" w:sz="4" w:space="0" w:color="AAAAAA"/>
+              <w:right w:val="single" w:sz="4" w:space="0" w:color="AAAAAA"/>
             </w:tcBorders>
           </w:tcPr>
           <w:p>
@@ -2577,10 +3509,10 @@
             <w:tcW w:type="dxa" w:w="4536"/>
             <w:shd w:val="clear" w:color="auto" w:fill="F2F7FC"/>
             <w:tcBorders>
-              <w:top w:val="single" w:sz="4" w:space="0" w:color="999999"/>
-              <w:left w:val="single" w:sz="4" w:space="0" w:color="999999"/>
-              <w:bottom w:val="single" w:sz="4" w:space="0" w:color="999999"/>
-              <w:right w:val="single" w:sz="4" w:space="0" w:color="999999"/>
+              <w:top w:val="single" w:sz="4" w:space="0" w:color="AAAAAA"/>
+              <w:left w:val="single" w:sz="4" w:space="0" w:color="AAAAAA"/>
+              <w:bottom w:val="single" w:sz="4" w:space="0" w:color="AAAAAA"/>
+              <w:right w:val="single" w:sz="4" w:space="0" w:color="AAAAAA"/>
             </w:tcBorders>
           </w:tcPr>
           <w:p>
@@ -2599,10 +3531,10 @@
             <w:tcW w:type="dxa" w:w="4536"/>
             <w:shd w:val="clear" w:color="auto" w:fill="FFFFFF"/>
             <w:tcBorders>
-              <w:top w:val="single" w:sz="4" w:space="0" w:color="999999"/>
-              <w:left w:val="single" w:sz="4" w:space="0" w:color="999999"/>
-              <w:bottom w:val="single" w:sz="4" w:space="0" w:color="999999"/>
-              <w:right w:val="single" w:sz="4" w:space="0" w:color="999999"/>
+              <w:top w:val="single" w:sz="4" w:space="0" w:color="AAAAAA"/>
+              <w:left w:val="single" w:sz="4" w:space="0" w:color="AAAAAA"/>
+              <w:bottom w:val="single" w:sz="4" w:space="0" w:color="AAAAAA"/>
+              <w:right w:val="single" w:sz="4" w:space="0" w:color="AAAAAA"/>
             </w:tcBorders>
           </w:tcPr>
           <w:p>
@@ -2619,10 +3551,10 @@
             <w:tcW w:type="dxa" w:w="4536"/>
             <w:shd w:val="clear" w:color="auto" w:fill="FFFFFF"/>
             <w:tcBorders>
-              <w:top w:val="single" w:sz="4" w:space="0" w:color="999999"/>
-              <w:left w:val="single" w:sz="4" w:space="0" w:color="999999"/>
-              <w:bottom w:val="single" w:sz="4" w:space="0" w:color="999999"/>
-              <w:right w:val="single" w:sz="4" w:space="0" w:color="999999"/>
+              <w:top w:val="single" w:sz="4" w:space="0" w:color="AAAAAA"/>
+              <w:left w:val="single" w:sz="4" w:space="0" w:color="AAAAAA"/>
+              <w:bottom w:val="single" w:sz="4" w:space="0" w:color="AAAAAA"/>
+              <w:right w:val="single" w:sz="4" w:space="0" w:color="AAAAAA"/>
             </w:tcBorders>
           </w:tcPr>
           <w:p>
@@ -2641,10 +3573,10 @@
             <w:tcW w:type="dxa" w:w="4536"/>
             <w:shd w:val="clear" w:color="auto" w:fill="F2F7FC"/>
             <w:tcBorders>
-              <w:top w:val="single" w:sz="4" w:space="0" w:color="999999"/>
-              <w:left w:val="single" w:sz="4" w:space="0" w:color="999999"/>
-              <w:bottom w:val="single" w:sz="4" w:space="0" w:color="999999"/>
-              <w:right w:val="single" w:sz="4" w:space="0" w:color="999999"/>
+              <w:top w:val="single" w:sz="4" w:space="0" w:color="AAAAAA"/>
+              <w:left w:val="single" w:sz="4" w:space="0" w:color="AAAAAA"/>
+              <w:bottom w:val="single" w:sz="4" w:space="0" w:color="AAAAAA"/>
+              <w:right w:val="single" w:sz="4" w:space="0" w:color="AAAAAA"/>
             </w:tcBorders>
           </w:tcPr>
           <w:p>
@@ -2661,10 +3593,10 @@
             <w:tcW w:type="dxa" w:w="4536"/>
             <w:shd w:val="clear" w:color="auto" w:fill="F2F7FC"/>
             <w:tcBorders>
-              <w:top w:val="single" w:sz="4" w:space="0" w:color="999999"/>
-              <w:left w:val="single" w:sz="4" w:space="0" w:color="999999"/>
-              <w:bottom w:val="single" w:sz="4" w:space="0" w:color="999999"/>
-              <w:right w:val="single" w:sz="4" w:space="0" w:color="999999"/>
+              <w:top w:val="single" w:sz="4" w:space="0" w:color="AAAAAA"/>
+              <w:left w:val="single" w:sz="4" w:space="0" w:color="AAAAAA"/>
+              <w:bottom w:val="single" w:sz="4" w:space="0" w:color="AAAAAA"/>
+              <w:right w:val="single" w:sz="4" w:space="0" w:color="AAAAAA"/>
             </w:tcBorders>
           </w:tcPr>
           <w:p>
@@ -2683,10 +3615,10 @@
             <w:tcW w:type="dxa" w:w="4536"/>
             <w:shd w:val="clear" w:color="auto" w:fill="FFFFFF"/>
             <w:tcBorders>
-              <w:top w:val="single" w:sz="4" w:space="0" w:color="999999"/>
-              <w:left w:val="single" w:sz="4" w:space="0" w:color="999999"/>
-              <w:bottom w:val="single" w:sz="4" w:space="0" w:color="999999"/>
-              <w:right w:val="single" w:sz="4" w:space="0" w:color="999999"/>
+              <w:top w:val="single" w:sz="4" w:space="0" w:color="AAAAAA"/>
+              <w:left w:val="single" w:sz="4" w:space="0" w:color="AAAAAA"/>
+              <w:bottom w:val="single" w:sz="4" w:space="0" w:color="AAAAAA"/>
+              <w:right w:val="single" w:sz="4" w:space="0" w:color="AAAAAA"/>
             </w:tcBorders>
           </w:tcPr>
           <w:p>
@@ -2703,10 +3635,10 @@
             <w:tcW w:type="dxa" w:w="4536"/>
             <w:shd w:val="clear" w:color="auto" w:fill="FFFFFF"/>
             <w:tcBorders>
-              <w:top w:val="single" w:sz="4" w:space="0" w:color="999999"/>
-              <w:left w:val="single" w:sz="4" w:space="0" w:color="999999"/>
-              <w:bottom w:val="single" w:sz="4" w:space="0" w:color="999999"/>
-              <w:right w:val="single" w:sz="4" w:space="0" w:color="999999"/>
+              <w:top w:val="single" w:sz="4" w:space="0" w:color="AAAAAA"/>
+              <w:left w:val="single" w:sz="4" w:space="0" w:color="AAAAAA"/>
+              <w:bottom w:val="single" w:sz="4" w:space="0" w:color="AAAAAA"/>
+              <w:right w:val="single" w:sz="4" w:space="0" w:color="AAAAAA"/>
             </w:tcBorders>
           </w:tcPr>
           <w:p>
@@ -2725,10 +3657,10 @@
             <w:tcW w:type="dxa" w:w="4536"/>
             <w:shd w:val="clear" w:color="auto" w:fill="F2F7FC"/>
             <w:tcBorders>
-              <w:top w:val="single" w:sz="4" w:space="0" w:color="999999"/>
-              <w:left w:val="single" w:sz="4" w:space="0" w:color="999999"/>
-              <w:bottom w:val="single" w:sz="4" w:space="0" w:color="999999"/>
-              <w:right w:val="single" w:sz="4" w:space="0" w:color="999999"/>
+              <w:top w:val="single" w:sz="4" w:space="0" w:color="AAAAAA"/>
+              <w:left w:val="single" w:sz="4" w:space="0" w:color="AAAAAA"/>
+              <w:bottom w:val="single" w:sz="4" w:space="0" w:color="AAAAAA"/>
+              <w:right w:val="single" w:sz="4" w:space="0" w:color="AAAAAA"/>
             </w:tcBorders>
           </w:tcPr>
           <w:p>
@@ -2745,10 +3677,10 @@
             <w:tcW w:type="dxa" w:w="4536"/>
             <w:shd w:val="clear" w:color="auto" w:fill="F2F7FC"/>
             <w:tcBorders>
-              <w:top w:val="single" w:sz="4" w:space="0" w:color="999999"/>
-              <w:left w:val="single" w:sz="4" w:space="0" w:color="999999"/>
-              <w:bottom w:val="single" w:sz="4" w:space="0" w:color="999999"/>
-              <w:right w:val="single" w:sz="4" w:space="0" w:color="999999"/>
+              <w:top w:val="single" w:sz="4" w:space="0" w:color="AAAAAA"/>
+              <w:left w:val="single" w:sz="4" w:space="0" w:color="AAAAAA"/>
+              <w:bottom w:val="single" w:sz="4" w:space="0" w:color="AAAAAA"/>
+              <w:right w:val="single" w:sz="4" w:space="0" w:color="AAAAAA"/>
             </w:tcBorders>
           </w:tcPr>
           <w:p>
@@ -2767,10 +3699,10 @@
             <w:tcW w:type="dxa" w:w="4536"/>
             <w:shd w:val="clear" w:color="auto" w:fill="FFFFFF"/>
             <w:tcBorders>
-              <w:top w:val="single" w:sz="4" w:space="0" w:color="999999"/>
-              <w:left w:val="single" w:sz="4" w:space="0" w:color="999999"/>
-              <w:bottom w:val="single" w:sz="4" w:space="0" w:color="999999"/>
-              <w:right w:val="single" w:sz="4" w:space="0" w:color="999999"/>
+              <w:top w:val="single" w:sz="4" w:space="0" w:color="AAAAAA"/>
+              <w:left w:val="single" w:sz="4" w:space="0" w:color="AAAAAA"/>
+              <w:bottom w:val="single" w:sz="4" w:space="0" w:color="AAAAAA"/>
+              <w:right w:val="single" w:sz="4" w:space="0" w:color="AAAAAA"/>
             </w:tcBorders>
           </w:tcPr>
           <w:p>
@@ -2787,10 +3719,10 @@
             <w:tcW w:type="dxa" w:w="4536"/>
             <w:shd w:val="clear" w:color="auto" w:fill="FFFFFF"/>
             <w:tcBorders>
-              <w:top w:val="single" w:sz="4" w:space="0" w:color="999999"/>
-              <w:left w:val="single" w:sz="4" w:space="0" w:color="999999"/>
-              <w:bottom w:val="single" w:sz="4" w:space="0" w:color="999999"/>
-              <w:right w:val="single" w:sz="4" w:space="0" w:color="999999"/>
+              <w:top w:val="single" w:sz="4" w:space="0" w:color="AAAAAA"/>
+              <w:left w:val="single" w:sz="4" w:space="0" w:color="AAAAAA"/>
+              <w:bottom w:val="single" w:sz="4" w:space="0" w:color="AAAAAA"/>
+              <w:right w:val="single" w:sz="4" w:space="0" w:color="AAAAAA"/>
             </w:tcBorders>
           </w:tcPr>
           <w:p>
@@ -2809,10 +3741,10 @@
             <w:tcW w:type="dxa" w:w="4536"/>
             <w:shd w:val="clear" w:color="auto" w:fill="F2F7FC"/>
             <w:tcBorders>
-              <w:top w:val="single" w:sz="4" w:space="0" w:color="999999"/>
-              <w:left w:val="single" w:sz="4" w:space="0" w:color="999999"/>
-              <w:bottom w:val="single" w:sz="4" w:space="0" w:color="999999"/>
-              <w:right w:val="single" w:sz="4" w:space="0" w:color="999999"/>
+              <w:top w:val="single" w:sz="4" w:space="0" w:color="AAAAAA"/>
+              <w:left w:val="single" w:sz="4" w:space="0" w:color="AAAAAA"/>
+              <w:bottom w:val="single" w:sz="4" w:space="0" w:color="AAAAAA"/>
+              <w:right w:val="single" w:sz="4" w:space="0" w:color="AAAAAA"/>
             </w:tcBorders>
           </w:tcPr>
           <w:p>
@@ -2829,10 +3761,10 @@
             <w:tcW w:type="dxa" w:w="4536"/>
             <w:shd w:val="clear" w:color="auto" w:fill="F2F7FC"/>
             <w:tcBorders>
-              <w:top w:val="single" w:sz="4" w:space="0" w:color="999999"/>
-              <w:left w:val="single" w:sz="4" w:space="0" w:color="999999"/>
-              <w:bottom w:val="single" w:sz="4" w:space="0" w:color="999999"/>
-              <w:right w:val="single" w:sz="4" w:space="0" w:color="999999"/>
+              <w:top w:val="single" w:sz="4" w:space="0" w:color="AAAAAA"/>
+              <w:left w:val="single" w:sz="4" w:space="0" w:color="AAAAAA"/>
+              <w:bottom w:val="single" w:sz="4" w:space="0" w:color="AAAAAA"/>
+              <w:right w:val="single" w:sz="4" w:space="0" w:color="AAAAAA"/>
             </w:tcBorders>
           </w:tcPr>
           <w:p>
@@ -2851,10 +3783,10 @@
             <w:tcW w:type="dxa" w:w="4536"/>
             <w:shd w:val="clear" w:color="auto" w:fill="FFFFFF"/>
             <w:tcBorders>
-              <w:top w:val="single" w:sz="4" w:space="0" w:color="999999"/>
-              <w:left w:val="single" w:sz="4" w:space="0" w:color="999999"/>
-              <w:bottom w:val="single" w:sz="4" w:space="0" w:color="999999"/>
-              <w:right w:val="single" w:sz="4" w:space="0" w:color="999999"/>
+              <w:top w:val="single" w:sz="4" w:space="0" w:color="AAAAAA"/>
+              <w:left w:val="single" w:sz="4" w:space="0" w:color="AAAAAA"/>
+              <w:bottom w:val="single" w:sz="4" w:space="0" w:color="AAAAAA"/>
+              <w:right w:val="single" w:sz="4" w:space="0" w:color="AAAAAA"/>
             </w:tcBorders>
           </w:tcPr>
           <w:p>
@@ -2871,10 +3803,10 @@
             <w:tcW w:type="dxa" w:w="4536"/>
             <w:shd w:val="clear" w:color="auto" w:fill="FFFFFF"/>
             <w:tcBorders>
-              <w:top w:val="single" w:sz="4" w:space="0" w:color="999999"/>
-              <w:left w:val="single" w:sz="4" w:space="0" w:color="999999"/>
-              <w:bottom w:val="single" w:sz="4" w:space="0" w:color="999999"/>
-              <w:right w:val="single" w:sz="4" w:space="0" w:color="999999"/>
+              <w:top w:val="single" w:sz="4" w:space="0" w:color="AAAAAA"/>
+              <w:left w:val="single" w:sz="4" w:space="0" w:color="AAAAAA"/>
+              <w:bottom w:val="single" w:sz="4" w:space="0" w:color="AAAAAA"/>
+              <w:right w:val="single" w:sz="4" w:space="0" w:color="AAAAAA"/>
             </w:tcBorders>
           </w:tcPr>
           <w:p>
@@ -2893,10 +3825,10 @@
             <w:tcW w:type="dxa" w:w="4536"/>
             <w:shd w:val="clear" w:color="auto" w:fill="F2F7FC"/>
             <w:tcBorders>
-              <w:top w:val="single" w:sz="4" w:space="0" w:color="999999"/>
-              <w:left w:val="single" w:sz="4" w:space="0" w:color="999999"/>
-              <w:bottom w:val="single" w:sz="4" w:space="0" w:color="999999"/>
-              <w:right w:val="single" w:sz="4" w:space="0" w:color="999999"/>
+              <w:top w:val="single" w:sz="4" w:space="0" w:color="AAAAAA"/>
+              <w:left w:val="single" w:sz="4" w:space="0" w:color="AAAAAA"/>
+              <w:bottom w:val="single" w:sz="4" w:space="0" w:color="AAAAAA"/>
+              <w:right w:val="single" w:sz="4" w:space="0" w:color="AAAAAA"/>
             </w:tcBorders>
           </w:tcPr>
           <w:p>
@@ -2913,10 +3845,10 @@
             <w:tcW w:type="dxa" w:w="4536"/>
             <w:shd w:val="clear" w:color="auto" w:fill="F2F7FC"/>
             <w:tcBorders>
-              <w:top w:val="single" w:sz="4" w:space="0" w:color="999999"/>
-              <w:left w:val="single" w:sz="4" w:space="0" w:color="999999"/>
-              <w:bottom w:val="single" w:sz="4" w:space="0" w:color="999999"/>
-              <w:right w:val="single" w:sz="4" w:space="0" w:color="999999"/>
+              <w:top w:val="single" w:sz="4" w:space="0" w:color="AAAAAA"/>
+              <w:left w:val="single" w:sz="4" w:space="0" w:color="AAAAAA"/>
+              <w:bottom w:val="single" w:sz="4" w:space="0" w:color="AAAAAA"/>
+              <w:right w:val="single" w:sz="4" w:space="0" w:color="AAAAAA"/>
             </w:tcBorders>
           </w:tcPr>
           <w:p>
@@ -2924,7 +3856,7 @@
               <w:rPr>
                 <w:sz w:val="20"/>
               </w:rPr>
-              <w:t>Interlocking Screw (legacy)</w:t>
+              <w:t>Interlocking Screw (older label format)</w:t>
             </w:r>
           </w:p>
         </w:tc>
@@ -2935,10 +3867,10 @@
             <w:tcW w:type="dxa" w:w="4536"/>
             <w:shd w:val="clear" w:color="auto" w:fill="FFFFFF"/>
             <w:tcBorders>
-              <w:top w:val="single" w:sz="4" w:space="0" w:color="999999"/>
-              <w:left w:val="single" w:sz="4" w:space="0" w:color="999999"/>
-              <w:bottom w:val="single" w:sz="4" w:space="0" w:color="999999"/>
-              <w:right w:val="single" w:sz="4" w:space="0" w:color="999999"/>
+              <w:top w:val="single" w:sz="4" w:space="0" w:color="AAAAAA"/>
+              <w:left w:val="single" w:sz="4" w:space="0" w:color="AAAAAA"/>
+              <w:bottom w:val="single" w:sz="4" w:space="0" w:color="AAAAAA"/>
+              <w:right w:val="single" w:sz="4" w:space="0" w:color="AAAAAA"/>
             </w:tcBorders>
           </w:tcPr>
           <w:p>
@@ -2955,10 +3887,10 @@
             <w:tcW w:type="dxa" w:w="4536"/>
             <w:shd w:val="clear" w:color="auto" w:fill="FFFFFF"/>
             <w:tcBorders>
-              <w:top w:val="single" w:sz="4" w:space="0" w:color="999999"/>
-              <w:left w:val="single" w:sz="4" w:space="0" w:color="999999"/>
-              <w:bottom w:val="single" w:sz="4" w:space="0" w:color="999999"/>
-              <w:right w:val="single" w:sz="4" w:space="0" w:color="999999"/>
+              <w:top w:val="single" w:sz="4" w:space="0" w:color="AAAAAA"/>
+              <w:left w:val="single" w:sz="4" w:space="0" w:color="AAAAAA"/>
+              <w:bottom w:val="single" w:sz="4" w:space="0" w:color="AAAAAA"/>
+              <w:right w:val="single" w:sz="4" w:space="0" w:color="AAAAAA"/>
             </w:tcBorders>
           </w:tcPr>
           <w:p>
@@ -2966,7 +3898,7 @@
               <w:rPr>
                 <w:sz w:val="20"/>
               </w:rPr>
-              <w:t>End Cap (legacy)</w:t>
+              <w:t>End Cap (older label format)</w:t>
             </w:r>
           </w:p>
         </w:tc>
@@ -2977,10 +3909,10 @@
             <w:tcW w:type="dxa" w:w="4536"/>
             <w:shd w:val="clear" w:color="auto" w:fill="F2F7FC"/>
             <w:tcBorders>
-              <w:top w:val="single" w:sz="4" w:space="0" w:color="999999"/>
-              <w:left w:val="single" w:sz="4" w:space="0" w:color="999999"/>
-              <w:bottom w:val="single" w:sz="4" w:space="0" w:color="999999"/>
-              <w:right w:val="single" w:sz="4" w:space="0" w:color="999999"/>
+              <w:top w:val="single" w:sz="4" w:space="0" w:color="AAAAAA"/>
+              <w:left w:val="single" w:sz="4" w:space="0" w:color="AAAAAA"/>
+              <w:bottom w:val="single" w:sz="4" w:space="0" w:color="AAAAAA"/>
+              <w:right w:val="single" w:sz="4" w:space="0" w:color="AAAAAA"/>
             </w:tcBorders>
           </w:tcPr>
           <w:p>
@@ -2997,10 +3929,10 @@
             <w:tcW w:type="dxa" w:w="4536"/>
             <w:shd w:val="clear" w:color="auto" w:fill="F2F7FC"/>
             <w:tcBorders>
-              <w:top w:val="single" w:sz="4" w:space="0" w:color="999999"/>
-              <w:left w:val="single" w:sz="4" w:space="0" w:color="999999"/>
-              <w:bottom w:val="single" w:sz="4" w:space="0" w:color="999999"/>
-              <w:right w:val="single" w:sz="4" w:space="0" w:color="999999"/>
+              <w:top w:val="single" w:sz="4" w:space="0" w:color="AAAAAA"/>
+              <w:left w:val="single" w:sz="4" w:space="0" w:color="AAAAAA"/>
+              <w:bottom w:val="single" w:sz="4" w:space="0" w:color="AAAAAA"/>
+              <w:right w:val="single" w:sz="4" w:space="0" w:color="AAAAAA"/>
             </w:tcBorders>
           </w:tcPr>
           <w:p>
@@ -3008,7 +3940,7 @@
               <w:rPr>
                 <w:sz w:val="20"/>
               </w:rPr>
-              <w:t>Set Screw (legacy)</w:t>
+              <w:t>Set Screw (older label format)</w:t>
             </w:r>
           </w:p>
         </w:tc>
@@ -3018,7 +3950,7 @@
     <w:p>
       <w:pPr/>
       <w:r>
-        <w:t xml:space="preserve">All 105 Summa Orthopaedics products are recognized. Items not yet in the database show "Unknown — GTIN: XXXXXXXXXX" and can be corrected using the </w:t>
+        <w:t xml:space="preserve">All 105 Summa Orthopaedics products are in the database. If an item shows up as "Unknown — GTIN: XXXXXXXXXX," it means the product code isn't recognized yet. Use the </w:t>
       </w:r>
       <w:r>
         <w:rPr>
@@ -3027,7 +3959,7 @@
         <w:t>Edit</w:t>
       </w:r>
       <w:r>
-        <w:t xml:space="preserve"> button on the item detail page.</w:t>
+        <w:t xml:space="preserve"> button on that item's detail page to correct it, or let your manager know so it can be added to the database.</w:t>
       </w:r>
     </w:p>
     <w:p>
@@ -3035,72 +3967,178 @@
         <w:pStyle w:val="Heading2"/>
       </w:pPr>
       <w:r>
-        <w:t>Tips</w:t>
+        <w:t>Tips and Troubleshooting</w:t>
       </w:r>
     </w:p>
     <w:p>
-      <w:pPr>
-        <w:pStyle w:val="ListBullet"/>
-      </w:pPr>
+      <w:pPr/>
       <w:r>
         <w:rPr>
           <w:b/>
         </w:rPr>
-        <w:t>Best scanning results:</w:t>
-      </w:r>
-      <w:r>
-        <w:t xml:space="preserve"> Good lighting and holding the phone steady get the most reliable reads. Live Scan mode works best for continuous high-volume receiving.</w:t>
+        <w:t>Barcode won't scan?</w:t>
       </w:r>
     </w:p>
     <w:p>
       <w:pPr>
         <w:pStyle w:val="ListBullet"/>
       </w:pPr>
+      <w:r>
+        <w:t>Make sure there's good lighting — shadows on the barcode cause read failures</w:t>
+      </w:r>
+    </w:p>
+    <w:p>
+      <w:pPr>
+        <w:pStyle w:val="ListBullet"/>
+      </w:pPr>
+      <w:r>
+        <w:t>Hold the phone steady and make sure the whole barcode is in the frame</w:t>
+      </w:r>
+    </w:p>
+    <w:p>
+      <w:pPr>
+        <w:pStyle w:val="ListBullet"/>
+      </w:pPr>
+      <w:r>
+        <w:t xml:space="preserve">Try </w:t>
+      </w:r>
       <w:r>
         <w:rPr>
           <w:b/>
         </w:rPr>
-        <w:t>Same lot, multiple units:</w:t>
-      </w:r>
-      <w:r>
-        <w:t xml:space="preserve"> Scanning the same barcode label 10 times creates 10 individual inventory records — which is correct for tracking individual physical implants.</w:t>
+        <w:t>Manual Entry</w:t>
+      </w:r>
+      <w:r>
+        <w:t xml:space="preserve"> if the label is damaged or the barcode is smudged</w:t>
       </w:r>
     </w:p>
     <w:p>
-      <w:pPr>
-        <w:pStyle w:val="ListBullet"/>
-      </w:pPr>
+      <w:pPr/>
       <w:r>
         <w:rPr>
           <w:b/>
         </w:rPr>
-        <w:t>Help banners:</w:t>
-      </w:r>
-      <w:r>
-        <w:t xml:space="preserve"> Dismissible help text appears on key pages. Tap </w:t>
+        <w:t>Item shows up as "Unknown" product?</w:t>
+      </w:r>
+    </w:p>
+    <w:p>
+      <w:pPr>
+        <w:pStyle w:val="ListBullet"/>
+      </w:pPr>
+      <w:r>
+        <w:t>The product code may not be in the database yet</w:t>
+      </w:r>
+    </w:p>
+    <w:p>
+      <w:pPr>
+        <w:pStyle w:val="ListBullet"/>
+      </w:pPr>
+      <w:r>
+        <w:t xml:space="preserve">Tap the item to open its detail page, then tap </w:t>
       </w:r>
       <w:r>
         <w:rPr>
           <w:b/>
         </w:rPr>
-        <w:t>? Help</w:t>
-      </w:r>
-      <w:r>
-        <w:t xml:space="preserve"> to bring them back.</w:t>
+        <w:t>Edit</w:t>
+      </w:r>
+      <w:r>
+        <w:t xml:space="preserve"> to assign the correct product label</w:t>
       </w:r>
     </w:p>
     <w:p>
       <w:pPr>
         <w:pStyle w:val="ListBullet"/>
       </w:pPr>
+      <w:r>
+        <w:t>Every edit is logged so there's always a record of what was changed</w:t>
+      </w:r>
+    </w:p>
+    <w:p>
+      <w:pPr/>
       <w:r>
         <w:rPr>
           <w:b/>
         </w:rPr>
-        <w:t>Excel exports:</w:t>
-      </w:r>
-      <w:r>
-        <w:t xml:space="preserve"> All downloads are </w:t>
+        <w:t>Accidentally received the same item twice?</w:t>
+      </w:r>
+    </w:p>
+    <w:p>
+      <w:pPr>
+        <w:pStyle w:val="ListBullet"/>
+      </w:pPr>
+      <w:r>
+        <w:t>If it's genuinely a different physical unit (different box), that's correct — leave both records</w:t>
+      </w:r>
+    </w:p>
+    <w:p>
+      <w:pPr>
+        <w:pStyle w:val="ListBullet"/>
+      </w:pPr>
+      <w:r>
+        <w:t xml:space="preserve">If it was a duplicate scan of the same box, open one of the records and tap </w:t>
+      </w:r>
+      <w:r>
+        <w:rPr>
+          <w:b/>
+        </w:rPr>
+        <w:t>Delete</w:t>
+      </w:r>
+    </w:p>
+    <w:p>
+      <w:pPr/>
+      <w:r>
+        <w:rPr>
+          <w:b/>
+        </w:rPr>
+        <w:t>Need to correct a lot number or expiry date?</w:t>
+      </w:r>
+    </w:p>
+    <w:p>
+      <w:pPr>
+        <w:pStyle w:val="ListBullet"/>
+      </w:pPr>
+      <w:r>
+        <w:t xml:space="preserve">Open the item's detail page and tap </w:t>
+      </w:r>
+      <w:r>
+        <w:rPr>
+          <w:b/>
+        </w:rPr>
+        <w:t>Edit</w:t>
+      </w:r>
+    </w:p>
+    <w:p>
+      <w:pPr>
+        <w:pStyle w:val="ListBullet"/>
+      </w:pPr>
+      <w:r>
+        <w:t>Fix the field and save — the correction is recorded in the item's history automatically</w:t>
+      </w:r>
+    </w:p>
+    <w:p>
+      <w:pPr/>
+      <w:r>
+        <w:rPr>
+          <w:b/>
+        </w:rPr>
+        <w:t>Exported Excel file won't open?</w:t>
+      </w:r>
+    </w:p>
+    <w:p>
+      <w:pPr>
+        <w:pStyle w:val="ListBullet"/>
+      </w:pPr>
+      <w:r>
+        <w:t>Make sure you have Microsoft Excel or Google Sheets installed</w:t>
+      </w:r>
+    </w:p>
+    <w:p>
+      <w:pPr>
+        <w:pStyle w:val="ListBullet"/>
+      </w:pPr>
+      <w:r>
+        <w:t xml:space="preserve">The file is </w:t>
       </w:r>
       <w:r>
         <w:rPr>
@@ -3110,58 +4148,67 @@
         <w:t>.xlsx</w:t>
       </w:r>
       <w:r>
-        <w:t xml:space="preserve"> with a bold header row. Expired items are highlighted red. Open in Excel or Google Sheets.</w:t>
+        <w:t xml:space="preserve"> format — it won't open in Notes or similar apps</w:t>
       </w:r>
     </w:p>
     <w:p>
-      <w:pPr>
-        <w:pStyle w:val="ListBullet"/>
-      </w:pPr>
+      <w:pPr/>
       <w:r>
         <w:rPr>
           <w:b/>
         </w:rPr>
-        <w:t>Keyboard shortcut:</w:t>
-      </w:r>
-      <w:r>
-        <w:t xml:space="preserve"> Press </w:t>
-      </w:r>
+        <w:t>Lost your login or forgot your password?</w:t>
+      </w:r>
+    </w:p>
+    <w:p>
+      <w:pPr>
+        <w:pStyle w:val="ListBullet"/>
+      </w:pPr>
+      <w:r>
+        <w:t>You can't reset your own password — ask your system administrator</w:t>
+      </w:r>
+    </w:p>
+    <w:p>
+      <w:pPr/>
       <w:r>
         <w:rPr>
           <w:b/>
         </w:rPr>
-        <w:t>ESC</w:t>
-      </w:r>
-      <w:r>
-        <w:t xml:space="preserve"> to close full-screen images and modal dialogs.</w:t>
+        <w:t>Items expiring soon?</w:t>
       </w:r>
     </w:p>
     <w:p>
       <w:pPr>
         <w:pStyle w:val="ListBullet"/>
       </w:pPr>
+      <w:r>
+        <w:t>Check the bell icon at the top of the screen for a quick list</w:t>
+      </w:r>
+    </w:p>
+    <w:p>
+      <w:pPr>
+        <w:pStyle w:val="ListBullet"/>
+      </w:pPr>
+      <w:r>
+        <w:t xml:space="preserve">Or go to </w:t>
+      </w:r>
       <w:r>
         <w:rPr>
           <w:b/>
         </w:rPr>
-        <w:t>Print reports:</w:t>
-      </w:r>
-      <w:r>
-        <w:t xml:space="preserve"> Use Ctrl+P / Cmd+P — page headers and navigation are automatically hidden in print mode.</w:t>
-      </w:r>
-    </w:p>
-    <w:p>
-      <w:pPr>
-        <w:pStyle w:val="ListBullet"/>
-      </w:pPr>
+        <w:t>Reports</w:t>
+      </w:r>
+      <w:r>
+        <w:t xml:space="preserve"> and tap the </w:t>
+      </w:r>
       <w:r>
         <w:rPr>
           <w:b/>
         </w:rPr>
-        <w:t>REF code auto-fill:</w:t>
-      </w:r>
-      <w:r>
-        <w:t xml:space="preserve"> When editing an item, entering a known Item Number (REF code) auto-fills the correct GTIN and product description.</w:t>
+        <w:t>Expiring &lt; 180d</w:t>
+      </w:r>
+      <w:r>
+        <w:t xml:space="preserve"> card for the full list</w:t>
       </w:r>
     </w:p>
     <w:sectPr>

</xml_diff>

<commit_message>
feat: two-option manual entry in Receive Inventory
Adds a Manual Entry mode on the Receive screen offering two ways to add an
item when a barcode/QR code can't be scanned:

1. Paste QR Code Data — paste/type the full raw GS1/QR string (existing flow)
2. Enter Item Info Manually — Item Number (Summa REF code), Lot Number,
   Expiration Date, and Quantity Received as individual fields

Item Number is resolved to a GTIN server-side via the product map (new
POST /api/inventory/scan-manual endpoint reusing refToGtinShort /
gtinShortToFullGtin / getProductLabel), so a manual record is processed
exactly like a scan. Quantity creates one inventory row per unit.

Also bumps version to 3.15, updates CHANGELOG.md, in-app changelog, and the
User Guide (Markdown + regenerated Word doc).
</commit_message>
<xml_diff>
--- a/Nail_Tracker_User_Guide.docx
+++ b/Nail_Tracker_User_Guide.docx
@@ -13,13 +13,7 @@
     <w:p>
       <w:pPr/>
       <w:r>
-        <w:rPr>
-          <w:b/>
-        </w:rPr>
-        <w:t>Version 3.13</w:t>
-      </w:r>
-      <w:r>
-        <w:t xml:space="preserve"> | Summa Orthopaedics Inventory Management System</w:t>
+        <w:t>**Version 3.13** | Summa Orthopaedics Inventory Management System</w:t>
       </w:r>
     </w:p>
     <w:p>
@@ -69,17 +63,7 @@
         <w:pStyle w:val="ListNumber"/>
       </w:pPr>
       <w:r>
-        <w:t xml:space="preserve">On your phone or computer, open the app at your company's web address (e.g., </w:t>
-      </w:r>
-      <w:r>
-        <w:rPr>
-          <w:rFonts w:ascii="Courier New" w:hAnsi="Courier New"/>
-          <w:sz w:val="18"/>
-        </w:rPr>
-        <w:t>inventory.phillyshah.com</w:t>
-      </w:r>
-      <w:r>
-        <w:t>)</w:t>
+        <w:t>On your phone or computer, open the app at your company's web address (e.g., `inventory.phillyshah.com`)</w:t>
       </w:r>
     </w:p>
     <w:p>
@@ -107,17 +91,8 @@
       </w:r>
     </w:p>
     <w:p>
-      <w:pPr>
-        <w:ind w:left="576" w:right="576"/>
-        <w:pBdr>
-          <w:left w:val="single" w:sz="12" w:space="4" w:color="5B9BD5"/>
-        </w:pBdr>
-      </w:pPr>
+      <w:pPr/>
       <w:r>
-        <w:rPr>
-          <w:i/>
-          <w:color w:val="404040"/>
-        </w:rPr>
         <w:t>**Forgot your login?** Ask your manager or system administrator to reset it for you.</w:t>
       </w:r>
     </w:p>
@@ -138,10 +113,7 @@
     <w:p>
       <w:pPr/>
       <w:r>
-        <w:rPr>
-          <w:b/>
-        </w:rPr>
-        <w:t>On an iPhone or iPad:</w:t>
+        <w:t>**On an iPhone or iPad:**</w:t>
       </w:r>
     </w:p>
     <w:p>
@@ -149,16 +121,7 @@
         <w:pStyle w:val="ListNumber"/>
       </w:pPr>
       <w:r>
-        <w:t xml:space="preserve">Open the app in </w:t>
-      </w:r>
-      <w:r>
-        <w:rPr>
-          <w:b/>
-        </w:rPr>
-        <w:t>Safari</w:t>
-      </w:r>
-      <w:r>
-        <w:t xml:space="preserve"> (must be Safari, not Chrome)</w:t>
+        <w:t>Open the app in **Safari** (must be Safari, not Chrome)</w:t>
       </w:r>
     </w:p>
     <w:p>
@@ -166,16 +129,7 @@
         <w:pStyle w:val="ListNumber"/>
       </w:pPr>
       <w:r>
-        <w:t xml:space="preserve">Tap the </w:t>
-      </w:r>
-      <w:r>
-        <w:rPr>
-          <w:b/>
-        </w:rPr>
-        <w:t>Share</w:t>
-      </w:r>
-      <w:r>
-        <w:t xml:space="preserve"> button (the box with an arrow pointing up)</w:t>
+        <w:t>Tap the **Share** button (the box with an arrow pointing up)</w:t>
       </w:r>
     </w:p>
     <w:p>
@@ -183,13 +137,7 @@
         <w:pStyle w:val="ListNumber"/>
       </w:pPr>
       <w:r>
-        <w:t xml:space="preserve">Scroll down and tap </w:t>
-      </w:r>
-      <w:r>
-        <w:rPr>
-          <w:b/>
-        </w:rPr>
-        <w:t>"Add to Home Screen"</w:t>
+        <w:t>Scroll down and tap **"Add to Home Screen"**</w:t>
       </w:r>
     </w:p>
     <w:p>
@@ -197,25 +145,13 @@
         <w:pStyle w:val="ListNumber"/>
       </w:pPr>
       <w:r>
-        <w:t xml:space="preserve">Tap </w:t>
-      </w:r>
-      <w:r>
-        <w:rPr>
-          <w:b/>
-        </w:rPr>
-        <w:t>Add</w:t>
-      </w:r>
-      <w:r>
-        <w:t xml:space="preserve"> — the app icon will appear on your home screen</w:t>
+        <w:t>Tap **Add** — the app icon will appear on your home screen</w:t>
       </w:r>
     </w:p>
     <w:p>
       <w:pPr/>
       <w:r>
-        <w:rPr>
-          <w:b/>
-        </w:rPr>
-        <w:t>On an Android phone:</w:t>
+        <w:t>**On an Android phone:**</w:t>
       </w:r>
     </w:p>
     <w:p>
@@ -223,13 +159,7 @@
         <w:pStyle w:val="ListNumber"/>
       </w:pPr>
       <w:r>
-        <w:t xml:space="preserve">Open the app in </w:t>
-      </w:r>
-      <w:r>
-        <w:rPr>
-          <w:b/>
-        </w:rPr>
-        <w:t>Chrome</w:t>
+        <w:t>Open the app in **Chrome**</w:t>
       </w:r>
     </w:p>
     <w:p>
@@ -245,22 +175,7 @@
         <w:pStyle w:val="ListNumber"/>
       </w:pPr>
       <w:r>
-        <w:t xml:space="preserve">Tap </w:t>
-      </w:r>
-      <w:r>
-        <w:rPr>
-          <w:b/>
-        </w:rPr>
-        <w:t>"Add to Home Screen"</w:t>
-      </w:r>
-      <w:r>
-        <w:t xml:space="preserve"> or </w:t>
-      </w:r>
-      <w:r>
-        <w:rPr>
-          <w:b/>
-        </w:rPr>
-        <w:t>"Install App"</w:t>
+        <w:t>Tap **"Add to Home Screen"** or **"Install App"**</w:t>
       </w:r>
     </w:p>
     <w:p>
@@ -280,91 +195,19 @@
     <w:p>
       <w:pPr/>
       <w:r>
-        <w:rPr>
-          <w:b/>
-        </w:rPr>
-        <w:t>On a phone:</w:t>
-      </w:r>
-      <w:r>
-        <w:t xml:space="preserve"> You'll see four tabs at the bottom of the screen — </w:t>
-      </w:r>
-      <w:r>
-        <w:rPr>
-          <w:b/>
-        </w:rPr>
-        <w:t>Receive</w:t>
-      </w:r>
-      <w:r>
-        <w:t xml:space="preserve">, </w:t>
-      </w:r>
-      <w:r>
-        <w:rPr>
-          <w:b/>
-        </w:rPr>
-        <w:t>Lookup</w:t>
-      </w:r>
-      <w:r>
-        <w:t xml:space="preserve">, </w:t>
-      </w:r>
-      <w:r>
-        <w:rPr>
-          <w:b/>
-        </w:rPr>
-        <w:t>Inventory</w:t>
-      </w:r>
-      <w:r>
-        <w:t xml:space="preserve">, and </w:t>
-      </w:r>
-      <w:r>
-        <w:rPr>
-          <w:b/>
-        </w:rPr>
-        <w:t>Reports</w:t>
-      </w:r>
-      <w:r>
-        <w:t xml:space="preserve">. Tap </w:t>
-      </w:r>
-      <w:r>
-        <w:rPr>
-          <w:b/>
-        </w:rPr>
-        <w:t>More</w:t>
-      </w:r>
-      <w:r>
-        <w:t xml:space="preserve"> to access the rest: Banks, Transfer, Distributors, Batch Upload, and User Management.</w:t>
+        <w:t>**On a phone:** You'll see four tabs at the bottom of the screen — **Receive**, **Lookup**, **Inventory**, and **Reports**. Tap **More** to access the rest: Banks, Transfer, Distributors, Batch Upload, and User Management.</w:t>
       </w:r>
     </w:p>
     <w:p>
       <w:pPr/>
       <w:r>
-        <w:rPr>
-          <w:b/>
-        </w:rPr>
-        <w:t>On a computer:</w:t>
-      </w:r>
-      <w:r>
-        <w:t xml:space="preserve"> All the pages are listed in the navigation bar at the top.</w:t>
+        <w:t>**On a computer:** All the pages are listed in the navigation bar at the top.</w:t>
       </w:r>
     </w:p>
     <w:p>
       <w:pPr/>
       <w:r>
-        <w:rPr>
-          <w:b/>
-        </w:rPr>
-        <w:t>Version badge:</w:t>
-      </w:r>
-      <w:r>
-        <w:t xml:space="preserve"> You'll see a small button like </w:t>
-      </w:r>
-      <w:r>
-        <w:rPr>
-          <w:b/>
-        </w:rPr>
-        <w:t>v3.13</w:t>
-      </w:r>
-      <w:r>
-        <w:t xml:space="preserve"> near the top of the screen. Tap it to see a summary of recent changes to the app.</w:t>
+        <w:t>**Version badge:** You'll see a small button like **v3.13** near the top of the screen. Tap it to see a summary of recent changes to the app.</w:t>
       </w:r>
     </w:p>
     <w:p>
@@ -386,16 +229,7 @@
     <w:p>
       <w:pPr/>
       <w:r>
-        <w:t xml:space="preserve">Near the top-right corner of the screen, there's a </w:t>
-      </w:r>
-      <w:r>
-        <w:rPr>
-          <w:b/>
-        </w:rPr>
-        <w:t>bell icon</w:t>
-      </w:r>
-      <w:r>
-        <w:t>. This is one of the most important tools in the app — it tells you immediately if anything in your inventory is getting close to its expiration date, without you having to go looking for it.</w:t>
+        <w:t>Near the top-right corner of the screen, there's a **bell icon**. This is one of the most important tools in the app — it tells you immediately if anything in your inventory is getting close to its expiration date, without you having to go looking for it.</w:t>
       </w:r>
     </w:p>
     <w:p>
@@ -403,13 +237,7 @@
         <w:pStyle w:val="ListBullet"/>
       </w:pPr>
       <w:r>
-        <w:t xml:space="preserve">Tap the bell to see a list of all items expiring </w:t>
-      </w:r>
-      <w:r>
-        <w:rPr>
-          <w:b/>
-        </w:rPr>
-        <w:t>within the next 90 days</w:t>
+        <w:t>Tap the bell to see a list of all items expiring **within the next 90 days**</w:t>
       </w:r>
     </w:p>
     <w:p>
@@ -425,25 +253,7 @@
         <w:pStyle w:val="ListBullet"/>
       </w:pPr>
       <w:r>
-        <w:t xml:space="preserve">Once you've reviewed an alert, tap the </w:t>
-      </w:r>
-      <w:r>
-        <w:rPr>
-          <w:b/>
-        </w:rPr>
-        <w:t>X</w:t>
-      </w:r>
-      <w:r>
-        <w:t xml:space="preserve"> next to it to dismiss it, or tap </w:t>
-      </w:r>
-      <w:r>
-        <w:rPr>
-          <w:b/>
-        </w:rPr>
-        <w:t>Dismiss All</w:t>
-      </w:r>
-      <w:r>
-        <w:t xml:space="preserve"> to clear the whole list</w:t>
+        <w:t>Once you've reviewed an alert, tap the **X** next to it to dismiss it, or tap **Dismiss All** to clear the whole list</w:t>
       </w:r>
     </w:p>
     <w:p>
@@ -457,13 +267,7 @@
     <w:p>
       <w:pPr/>
       <w:r>
-        <w:rPr>
-          <w:b/>
-        </w:rPr>
-        <w:t>Why this matters:</w:t>
-      </w:r>
-      <w:r>
-        <w:t xml:space="preserve"> Expired implants cannot be used in surgery. Catching items early gives you time to arrange returns or replacements before they become a problem.</w:t>
+        <w:t>**Why this matters:** Expired implants cannot be used in surgery. Catching items early gives you time to arrange returns or replacements before they become a problem.</w:t>
       </w:r>
     </w:p>
     <w:p>
@@ -485,22 +289,7 @@
     <w:p>
       <w:pPr/>
       <w:r>
-        <w:rPr>
-          <w:b/>
-        </w:rPr>
-        <w:t>Where to go:</w:t>
-      </w:r>
-      <w:r>
-        <w:t xml:space="preserve"> Tap the </w:t>
-      </w:r>
-      <w:r>
-        <w:rPr>
-          <w:b/>
-        </w:rPr>
-        <w:t>Receive</w:t>
-      </w:r>
-      <w:r>
-        <w:t xml:space="preserve"> tab (it's the home screen when you open the app)</w:t>
+        <w:t>**Where to go:** Tap the **Receive** tab (it's the home screen when you open the app)</w:t>
       </w:r>
     </w:p>
     <w:p>
@@ -512,10 +301,7 @@
     <w:p>
       <w:pPr/>
       <w:r>
-        <w:rPr>
-          <w:b/>
-        </w:rPr>
-        <w:t>The four ways to receive an item:</w:t>
+        <w:t>**The four ways to receive an item:**</w:t>
       </w:r>
     </w:p>
     <w:p>
@@ -537,16 +323,7 @@
         <w:pStyle w:val="ListNumber"/>
       </w:pPr>
       <w:r>
-        <w:t xml:space="preserve">Tap the </w:t>
-      </w:r>
-      <w:r>
-        <w:rPr>
-          <w:b/>
-        </w:rPr>
-        <w:t>Live Scan</w:t>
-      </w:r>
-      <w:r>
-        <w:t xml:space="preserve"> button</w:t>
+        <w:t>Tap the **Live Scan** button</w:t>
       </w:r>
     </w:p>
     <w:p>
@@ -582,17 +359,8 @@
       </w:r>
     </w:p>
     <w:p>
-      <w:pPr>
-        <w:ind w:left="576" w:right="576"/>
-        <w:pBdr>
-          <w:left w:val="single" w:sz="12" w:space="4" w:color="5B9BD5"/>
-        </w:pBdr>
-      </w:pPr>
+      <w:pPr/>
       <w:r>
-        <w:rPr>
-          <w:i/>
-          <w:color w:val="404040"/>
-        </w:rPr>
         <w:t>**Tip:** Make sure the barcode is well-lit and fully in frame. The app will beep or show a confirmation when it successfully reads a barcode.</w:t>
       </w:r>
     </w:p>
@@ -661,13 +429,7 @@
         <w:pStyle w:val="ListNumber"/>
       </w:pPr>
       <w:r>
-        <w:t xml:space="preserve">Tap </w:t>
-      </w:r>
-      <w:r>
-        <w:rPr>
-          <w:b/>
-        </w:rPr>
-        <w:t>Batch Upload</w:t>
+        <w:t>Tap **Batch Upload**</w:t>
       </w:r>
     </w:p>
     <w:p>
@@ -683,13 +445,7 @@
         <w:pStyle w:val="ListNumber"/>
       </w:pPr>
       <w:r>
-        <w:t xml:space="preserve">The app will work through each photo and can detect up to </w:t>
-      </w:r>
-      <w:r>
-        <w:rPr>
-          <w:b/>
-        </w:rPr>
-        <w:t>4 barcodes per image</w:t>
+        <w:t>The app will work through each photo and can detect up to **4 barcodes per image**</w:t>
       </w:r>
     </w:p>
     <w:p>
@@ -711,36 +467,19 @@
     <w:p>
       <w:pPr/>
       <w:r>
-        <w:t>Use this if a barcode won't scan (damaged label, etc.) and you can read the numbers by eye.</w:t>
+        <w:t>Use this when a barcode won't scan (damaged label, no scanner handy, or the details came from paperwork). Tap **Manual Entry**, then choose one of two methods:</w:t>
       </w:r>
     </w:p>
     <w:p>
-      <w:pPr>
-        <w:pStyle w:val="ListNumber"/>
-      </w:pPr>
+      <w:pPr/>
       <w:r>
-        <w:t xml:space="preserve">Tap </w:t>
-      </w:r>
-      <w:r>
-        <w:rPr>
-          <w:b/>
-        </w:rPr>
-        <w:t>Manual Entry</w:t>
+        <w:t>**Method 1 — Paste QR Code Data**</w:t>
       </w:r>
     </w:p>
     <w:p>
-      <w:pPr>
-        <w:pStyle w:val="ListNumber"/>
-      </w:pPr>
+      <w:pPr/>
       <w:r>
-        <w:t xml:space="preserve">Type the barcode string exactly as it appears — for example: </w:t>
-      </w:r>
-      <w:r>
-        <w:rPr>
-          <w:rFonts w:ascii="Courier New" w:hAnsi="Courier New"/>
-          <w:sz w:val="18"/>
-        </w:rPr>
-        <w:t>(01)08880089459148(10)J250929-L021(17)300928</w:t>
+        <w:t>Best when you already have the full barcode/QR text.</w:t>
       </w:r>
     </w:p>
     <w:p>
@@ -748,37 +487,109 @@
         <w:pStyle w:val="ListNumber"/>
       </w:pPr>
       <w:r>
-        <w:t xml:space="preserve">Press Enter or tap </w:t>
-      </w:r>
-      <w:r>
-        <w:rPr>
-          <w:b/>
-        </w:rPr>
-        <w:t>Add</w:t>
+        <w:t>Make sure **Paste QR Code Data** is selected</w:t>
       </w:r>
     </w:p>
     <w:p>
       <w:pPr>
-        <w:ind w:left="576" w:right="576"/>
-        <w:pBdr>
-          <w:left w:val="single" w:sz="12" w:space="4" w:color="5B9BD5"/>
-        </w:pBdr>
+        <w:pStyle w:val="ListNumber"/>
       </w:pPr>
       <w:r>
-        <w:rPr>
-          <w:i/>
-          <w:color w:val="404040"/>
-        </w:rPr>
+        <w:t>Type or paste the barcode string exactly as it appears — for example: `(01)08880089459148(10)J250929-L021(17)300928`</w:t>
+      </w:r>
+    </w:p>
+    <w:p>
+      <w:pPr>
+        <w:pStyle w:val="ListNumber"/>
+      </w:pPr>
+      <w:r>
+        <w:t>Press Enter or tap **Add**</w:t>
+      </w:r>
+    </w:p>
+    <w:p>
+      <w:pPr/>
+      <w:r>
+        <w:t>**Method 2 — Enter Item Info Manually**</w:t>
+      </w:r>
+    </w:p>
+    <w:p>
+      <w:pPr/>
+      <w:r>
+        <w:t>Best when you can read the item details off the box or paperwork but don't have the full barcode string.</w:t>
+      </w:r>
+    </w:p>
+    <w:p>
+      <w:pPr>
+        <w:pStyle w:val="ListNumber"/>
+      </w:pPr>
+      <w:r>
+        <w:t>Tap **Enter Item Info Manually**</w:t>
+      </w:r>
+    </w:p>
+    <w:p>
+      <w:pPr>
+        <w:pStyle w:val="ListNumber"/>
+      </w:pPr>
+      <w:r>
+        <w:t>Fill in all four fields:</w:t>
+      </w:r>
+    </w:p>
+    <w:p>
+      <w:pPr>
+        <w:pStyle w:val="ListBullet"/>
+      </w:pPr>
+      <w:r>
+        <w:t>**Item Number** — the Summa REF code, e.g. `SO-SPFN-0180-10-25`</w:t>
+      </w:r>
+    </w:p>
+    <w:p>
+      <w:pPr>
+        <w:pStyle w:val="ListBullet"/>
+      </w:pPr>
+      <w:r>
+        <w:t>**Lot Number** — the lot/batch number</w:t>
+      </w:r>
+    </w:p>
+    <w:p>
+      <w:pPr>
+        <w:pStyle w:val="ListBullet"/>
+      </w:pPr>
+      <w:r>
+        <w:t>**Expiration Date** — pick the date</w:t>
+      </w:r>
+    </w:p>
+    <w:p>
+      <w:pPr>
+        <w:pStyle w:val="ListBullet"/>
+      </w:pPr>
+      <w:r>
+        <w:t>**Quantity Received** — how many of this exact item you're receiving</w:t>
+      </w:r>
+    </w:p>
+    <w:p>
+      <w:pPr>
+        <w:pStyle w:val="ListNumber"/>
+      </w:pPr>
+      <w:r>
+        <w:t>Tap **Save Receipt**</w:t>
+      </w:r>
+    </w:p>
+    <w:p>
+      <w:pPr/>
+      <w:r>
+        <w:t>The app looks up the item number, fills in the product details automatically, and creates one inventory record for each unit in the quantity — exactly as if you'd scanned that many labels. If the item number isn't recognized, you'll see a message and nothing is saved, so double-check the REF code.</w:t>
+      </w:r>
+    </w:p>
+    <w:p>
+      <w:pPr/>
+      <w:r>
         <w:t>**About duplicate lot numbers:** If you're receiving 50 screws that all came from the same manufacturing batch (same lot number), that's completely fine — scan each one individually and the system will create a separate record for each physical item. This is the correct way to do it.</w:t>
       </w:r>
     </w:p>
     <w:p>
       <w:pPr/>
       <w:r>
-        <w:rPr>
-          <w:b/>
-        </w:rPr>
-        <w:t>Assigning received items to a bank:</w:t>
+        <w:t>**Assigning received items to a bank:**</w:t>
       </w:r>
     </w:p>
     <w:p>
@@ -792,16 +603,7 @@
         <w:pStyle w:val="ListNumber"/>
       </w:pPr>
       <w:r>
-        <w:t xml:space="preserve">Tap the </w:t>
-      </w:r>
-      <w:r>
-        <w:rPr>
-          <w:b/>
-        </w:rPr>
-        <w:t>Assign to Bank</w:t>
-      </w:r>
-      <w:r>
-        <w:t xml:space="preserve"> button</w:t>
+        <w:t>Tap the **Assign to Bank** button</w:t>
       </w:r>
     </w:p>
     <w:p>
@@ -817,13 +619,7 @@
         <w:pStyle w:val="ListNumber"/>
       </w:pPr>
       <w:r>
-        <w:t xml:space="preserve">Tap </w:t>
-      </w:r>
-      <w:r>
-        <w:rPr>
-          <w:b/>
-        </w:rPr>
-        <w:t>Assign</w:t>
+        <w:t>Tap **Assign**</w:t>
       </w:r>
     </w:p>
     <w:p>
@@ -843,22 +639,7 @@
     <w:p>
       <w:pPr/>
       <w:r>
-        <w:rPr>
-          <w:b/>
-        </w:rPr>
-        <w:t>Where to go:</w:t>
-      </w:r>
-      <w:r>
-        <w:t xml:space="preserve"> Tap </w:t>
-      </w:r>
-      <w:r>
-        <w:rPr>
-          <w:b/>
-        </w:rPr>
-        <w:t>Lookup</w:t>
-      </w:r>
-      <w:r>
-        <w:t xml:space="preserve"> in the bottom navigation</w:t>
+        <w:t>**Where to go:** Tap **Lookup** in the bottom navigation</w:t>
       </w:r>
     </w:p>
     <w:p>
@@ -885,7 +666,7 @@
     </w:p>
     <w:p>
       <w:pPr>
-        <w:pStyle w:val="ListBullet2"/>
+        <w:pStyle w:val="ListBullet"/>
       </w:pPr>
       <w:r>
         <w:t>Whether the item is in the system</w:t>
@@ -893,7 +674,7 @@
     </w:p>
     <w:p>
       <w:pPr>
-        <w:pStyle w:val="ListBullet2"/>
+        <w:pStyle w:val="ListBullet"/>
       </w:pPr>
       <w:r>
         <w:t>Where it currently is (which distributor has it)</w:t>
@@ -901,7 +682,7 @@
     </w:p>
     <w:p>
       <w:pPr>
-        <w:pStyle w:val="ListBullet2"/>
+        <w:pStyle w:val="ListBullet"/>
       </w:pPr>
       <w:r>
         <w:t>Its lot number and expiry date</w:t>
@@ -909,7 +690,7 @@
     </w:p>
     <w:p>
       <w:pPr>
-        <w:pStyle w:val="ListBullet2"/>
+        <w:pStyle w:val="ListBullet"/>
       </w:pPr>
       <w:r>
         <w:t>Its full history — every time it was moved and who moved it</w:t>
@@ -920,25 +701,7 @@
         <w:pStyle w:val="ListNumber"/>
       </w:pPr>
       <w:r>
-        <w:t xml:space="preserve">From here, you can also </w:t>
-      </w:r>
-      <w:r>
-        <w:rPr>
-          <w:b/>
-        </w:rPr>
-        <w:t>transfer it</w:t>
-      </w:r>
-      <w:r>
-        <w:t xml:space="preserve"> to another location or </w:t>
-      </w:r>
-      <w:r>
-        <w:rPr>
-          <w:b/>
-        </w:rPr>
-        <w:t>mark it as used</w:t>
-      </w:r>
-      <w:r>
-        <w:t xml:space="preserve"> (meaning it was implanted in a patient)</w:t>
+        <w:t>From here, you can also **transfer it** to another location or **mark it as used** (meaning it was implanted in a patient)</w:t>
       </w:r>
     </w:p>
     <w:p>
@@ -952,22 +715,7 @@
     <w:p>
       <w:pPr/>
       <w:r>
-        <w:rPr>
-          <w:b/>
-        </w:rPr>
-        <w:t>Where to go:</w:t>
-      </w:r>
-      <w:r>
-        <w:t xml:space="preserve"> Tap </w:t>
-      </w:r>
-      <w:r>
-        <w:rPr>
-          <w:b/>
-        </w:rPr>
-        <w:t>Inventory</w:t>
-      </w:r>
-      <w:r>
-        <w:t xml:space="preserve"> in the bottom navigation</w:t>
+        <w:t>**Where to go:** Tap **Inventory** in the bottom navigation</w:t>
       </w:r>
     </w:p>
     <w:p>
@@ -979,10 +727,7 @@
     <w:p>
       <w:pPr/>
       <w:r>
-        <w:rPr>
-          <w:b/>
-        </w:rPr>
-        <w:t>Finding what you're looking for:</w:t>
+        <w:t>**Finding what you're looking for:**</w:t>
       </w:r>
     </w:p>
     <w:p>
@@ -990,13 +735,7 @@
         <w:pStyle w:val="ListBullet"/>
       </w:pPr>
       <w:r>
-        <w:rPr>
-          <w:b/>
-        </w:rPr>
-        <w:t>Search bar</w:t>
-      </w:r>
-      <w:r>
-        <w:t xml:space="preserve"> at the top: Type a product name, lot number, or item number (REF code). The list filters as you search.</w:t>
+        <w:t>**Search bar** at the top: Type a product name, lot number, or item number (REF code). The list filters as you search.</w:t>
       </w:r>
     </w:p>
     <w:p>
@@ -1004,13 +743,7 @@
         <w:pStyle w:val="ListBullet"/>
       </w:pPr>
       <w:r>
-        <w:rPr>
-          <w:b/>
-        </w:rPr>
-        <w:t>Filter button</w:t>
-      </w:r>
-      <w:r>
-        <w:t xml:space="preserve"> (the funnel icon): Narrow down by distributor or expiry date.</w:t>
+        <w:t>**Filter button** (the funnel icon): Narrow down by distributor or expiry date.</w:t>
       </w:r>
     </w:p>
     <w:p>
@@ -1018,31 +751,13 @@
         <w:pStyle w:val="ListBullet"/>
       </w:pPr>
       <w:r>
-        <w:rPr>
-          <w:b/>
-        </w:rPr>
-        <w:t>Filter chip</w:t>
-      </w:r>
-      <w:r>
-        <w:t xml:space="preserve">: If you arrive at this page by tapping a report card or clicking through from the Stock report, you'll see a blue bar at the top showing what filter is active — for example, *"Item: SO-S50I-SO-026-T @ Home Office"*. Tap </w:t>
-      </w:r>
-      <w:r>
-        <w:rPr>
-          <w:b/>
-        </w:rPr>
-        <w:t>Clear</w:t>
-      </w:r>
-      <w:r>
-        <w:t xml:space="preserve"> to go back to the full list.</w:t>
+        <w:t>**Filter chip**: If you arrive at this page by tapping a report card or clicking through from the Stock report, you'll see a blue bar at the top showing what filter is active — for example, *"Item: SO-S50I-SO-026-T @ Home Office"*. Tap **Clear** to go back to the full list.</w:t>
       </w:r>
     </w:p>
     <w:p>
       <w:pPr/>
       <w:r>
-        <w:rPr>
-          <w:b/>
-        </w:rPr>
-        <w:t>Sorting the list:</w:t>
+        <w:t>**Sorting the list:**</w:t>
       </w:r>
     </w:p>
     <w:p>
@@ -1054,10 +769,7 @@
     <w:p>
       <w:pPr/>
       <w:r>
-        <w:rPr>
-          <w:b/>
-        </w:rPr>
-        <w:t>Taking action on items:</w:t>
+        <w:t>**Taking action on items:**</w:t>
       </w:r>
     </w:p>
     <w:p>
@@ -1065,22 +777,7 @@
         <w:pStyle w:val="ListBullet"/>
       </w:pPr>
       <w:r>
-        <w:rPr>
-          <w:b/>
-        </w:rPr>
-        <w:t>Move one item:</w:t>
-      </w:r>
-      <w:r>
-        <w:t xml:space="preserve"> Tap the item row to open its detail page, then use the </w:t>
-      </w:r>
-      <w:r>
-        <w:rPr>
-          <w:b/>
-        </w:rPr>
-        <w:t>Reassign</w:t>
-      </w:r>
-      <w:r>
-        <w:t xml:space="preserve"> button there</w:t>
+        <w:t>**Move one item:** Tap the item row to open its detail page, then use the **Reassign** button there</w:t>
       </w:r>
     </w:p>
     <w:p>
@@ -1088,28 +785,7 @@
         <w:pStyle w:val="ListBullet"/>
       </w:pPr>
       <w:r>
-        <w:rPr>
-          <w:b/>
-        </w:rPr>
-        <w:t>Move several items at once:</w:t>
-      </w:r>
-      <w:r>
-        <w:t xml:space="preserve"> Check the box next to each item you want to move, then choose a destination from the </w:t>
-      </w:r>
-      <w:r>
-        <w:rPr>
-          <w:b/>
-        </w:rPr>
-        <w:t>"Move to:"</w:t>
-      </w:r>
-      <w:r>
-        <w:t xml:space="preserve"> dropdown and tap </w:t>
-      </w:r>
-      <w:r>
-        <w:rPr>
-          <w:b/>
-        </w:rPr>
-        <w:t>Reassign</w:t>
+        <w:t>**Move several items at once:** Check the box next to each item you want to move, then choose a destination from the **"Move to:"** dropdown and tap **Reassign**</w:t>
       </w:r>
     </w:p>
     <w:p>
@@ -1117,31 +793,13 @@
         <w:pStyle w:val="ListBullet"/>
       </w:pPr>
       <w:r>
-        <w:rPr>
-          <w:b/>
-        </w:rPr>
-        <w:t>Download to Excel:</w:t>
-      </w:r>
-      <w:r>
-        <w:t xml:space="preserve"> Tap the </w:t>
-      </w:r>
-      <w:r>
-        <w:rPr>
-          <w:b/>
-        </w:rPr>
-        <w:t>Export</w:t>
-      </w:r>
-      <w:r>
-        <w:t xml:space="preserve"> button to get a spreadsheet of your current filtered inventory. Expired items are highlighted in red automatically.</w:t>
+        <w:t>**Download to Excel:** Tap the **Export** button to get a spreadsheet of your current filtered inventory. Expired items are highlighted in red automatically.</w:t>
       </w:r>
     </w:p>
     <w:p>
       <w:pPr/>
       <w:r>
-        <w:rPr>
-          <w:b/>
-        </w:rPr>
-        <w:t>What the color badges mean:</w:t>
+        <w:t>**What the color badges mean:**</w:t>
       </w:r>
     </w:p>
     <w:tbl>
@@ -1151,50 +809,26 @@
         <w:tblLook w:firstColumn="1" w:firstRow="1" w:lastColumn="0" w:lastRow="0" w:noHBand="0" w:noVBand="1" w:val="04A0"/>
       </w:tblPr>
       <w:tblGrid>
-        <w:gridCol w:w="4536"/>
-        <w:gridCol w:w="4536"/>
+        <w:gridCol w:w="4320"/>
+        <w:gridCol w:w="4320"/>
       </w:tblGrid>
       <w:tr>
         <w:tc>
           <w:tcPr>
-            <w:tcW w:type="dxa" w:w="4536"/>
-            <w:shd w:val="clear" w:color="auto" w:fill="2E74B5"/>
-            <w:tcBorders>
-              <w:top w:val="single" w:sz="4" w:space="0" w:color="AAAAAA"/>
-              <w:left w:val="single" w:sz="4" w:space="0" w:color="AAAAAA"/>
-              <w:bottom w:val="single" w:sz="4" w:space="0" w:color="AAAAAA"/>
-              <w:right w:val="single" w:sz="4" w:space="0" w:color="AAAAAA"/>
-            </w:tcBorders>
+            <w:tcW w:type="dxa" w:w="4320"/>
           </w:tcPr>
           <w:p>
             <w:r>
-              <w:rPr>
-                <w:b/>
-                <w:color w:val="FFFFFF"/>
-                <w:sz w:val="20"/>
-              </w:rPr>
               <w:t>Badge Color</w:t>
             </w:r>
           </w:p>
         </w:tc>
         <w:tc>
           <w:tcPr>
-            <w:tcW w:type="dxa" w:w="4536"/>
-            <w:shd w:val="clear" w:color="auto" w:fill="2E74B5"/>
-            <w:tcBorders>
-              <w:top w:val="single" w:sz="4" w:space="0" w:color="AAAAAA"/>
-              <w:left w:val="single" w:sz="4" w:space="0" w:color="AAAAAA"/>
-              <w:bottom w:val="single" w:sz="4" w:space="0" w:color="AAAAAA"/>
-              <w:right w:val="single" w:sz="4" w:space="0" w:color="AAAAAA"/>
-            </w:tcBorders>
+            <w:tcW w:type="dxa" w:w="4320"/>
           </w:tcPr>
           <w:p>
             <w:r>
-              <w:rPr>
-                <w:b/>
-                <w:color w:val="FFFFFF"/>
-                <w:sz w:val="20"/>
-              </w:rPr>
               <w:t>What It Means</w:t>
             </w:r>
           </w:p>
@@ -1203,40 +837,20 @@
       <w:tr>
         <w:tc>
           <w:tcPr>
-            <w:tcW w:type="dxa" w:w="4536"/>
-            <w:shd w:val="clear" w:color="auto" w:fill="F2F7FC"/>
-            <w:tcBorders>
-              <w:top w:val="single" w:sz="4" w:space="0" w:color="AAAAAA"/>
-              <w:left w:val="single" w:sz="4" w:space="0" w:color="AAAAAA"/>
-              <w:bottom w:val="single" w:sz="4" w:space="0" w:color="AAAAAA"/>
-              <w:right w:val="single" w:sz="4" w:space="0" w:color="AAAAAA"/>
-            </w:tcBorders>
+            <w:tcW w:type="dxa" w:w="4320"/>
           </w:tcPr>
           <w:p>
             <w:r>
-              <w:rPr>
-                <w:sz w:val="20"/>
-              </w:rPr>
               <w:t>Red</w:t>
             </w:r>
           </w:p>
         </w:tc>
         <w:tc>
           <w:tcPr>
-            <w:tcW w:type="dxa" w:w="4536"/>
-            <w:shd w:val="clear" w:color="auto" w:fill="F2F7FC"/>
-            <w:tcBorders>
-              <w:top w:val="single" w:sz="4" w:space="0" w:color="AAAAAA"/>
-              <w:left w:val="single" w:sz="4" w:space="0" w:color="AAAAAA"/>
-              <w:bottom w:val="single" w:sz="4" w:space="0" w:color="AAAAAA"/>
-              <w:right w:val="single" w:sz="4" w:space="0" w:color="AAAAAA"/>
-            </w:tcBorders>
+            <w:tcW w:type="dxa" w:w="4320"/>
           </w:tcPr>
           <w:p>
             <w:r>
-              <w:rPr>
-                <w:sz w:val="20"/>
-              </w:rPr>
               <w:t>Expired, or expiring within 90 days — needs attention</w:t>
             </w:r>
           </w:p>
@@ -1245,40 +859,20 @@
       <w:tr>
         <w:tc>
           <w:tcPr>
-            <w:tcW w:type="dxa" w:w="4536"/>
-            <w:shd w:val="clear" w:color="auto" w:fill="FFFFFF"/>
-            <w:tcBorders>
-              <w:top w:val="single" w:sz="4" w:space="0" w:color="AAAAAA"/>
-              <w:left w:val="single" w:sz="4" w:space="0" w:color="AAAAAA"/>
-              <w:bottom w:val="single" w:sz="4" w:space="0" w:color="AAAAAA"/>
-              <w:right w:val="single" w:sz="4" w:space="0" w:color="AAAAAA"/>
-            </w:tcBorders>
+            <w:tcW w:type="dxa" w:w="4320"/>
           </w:tcPr>
           <w:p>
             <w:r>
-              <w:rPr>
-                <w:sz w:val="20"/>
-              </w:rPr>
               <w:t>Yellow</w:t>
             </w:r>
           </w:p>
         </w:tc>
         <w:tc>
           <w:tcPr>
-            <w:tcW w:type="dxa" w:w="4536"/>
-            <w:shd w:val="clear" w:color="auto" w:fill="FFFFFF"/>
-            <w:tcBorders>
-              <w:top w:val="single" w:sz="4" w:space="0" w:color="AAAAAA"/>
-              <w:left w:val="single" w:sz="4" w:space="0" w:color="AAAAAA"/>
-              <w:bottom w:val="single" w:sz="4" w:space="0" w:color="AAAAAA"/>
-              <w:right w:val="single" w:sz="4" w:space="0" w:color="AAAAAA"/>
-            </w:tcBorders>
+            <w:tcW w:type="dxa" w:w="4320"/>
           </w:tcPr>
           <w:p>
             <w:r>
-              <w:rPr>
-                <w:sz w:val="20"/>
-              </w:rPr>
               <w:t>Expiring within 6 months — keep an eye on it</w:t>
             </w:r>
           </w:p>
@@ -1287,47 +881,26 @@
       <w:tr>
         <w:tc>
           <w:tcPr>
-            <w:tcW w:type="dxa" w:w="4536"/>
-            <w:shd w:val="clear" w:color="auto" w:fill="F2F7FC"/>
-            <w:tcBorders>
-              <w:top w:val="single" w:sz="4" w:space="0" w:color="AAAAAA"/>
-              <w:left w:val="single" w:sz="4" w:space="0" w:color="AAAAAA"/>
-              <w:bottom w:val="single" w:sz="4" w:space="0" w:color="AAAAAA"/>
-              <w:right w:val="single" w:sz="4" w:space="0" w:color="AAAAAA"/>
-            </w:tcBorders>
+            <w:tcW w:type="dxa" w:w="4320"/>
           </w:tcPr>
           <w:p>
             <w:r>
-              <w:rPr>
-                <w:sz w:val="20"/>
-              </w:rPr>
               <w:t>No badge</w:t>
             </w:r>
           </w:p>
         </w:tc>
         <w:tc>
           <w:tcPr>
-            <w:tcW w:type="dxa" w:w="4536"/>
-            <w:shd w:val="clear" w:color="auto" w:fill="F2F7FC"/>
-            <w:tcBorders>
-              <w:top w:val="single" w:sz="4" w:space="0" w:color="AAAAAA"/>
-              <w:left w:val="single" w:sz="4" w:space="0" w:color="AAAAAA"/>
-              <w:bottom w:val="single" w:sz="4" w:space="0" w:color="AAAAAA"/>
-              <w:right w:val="single" w:sz="4" w:space="0" w:color="AAAAAA"/>
-            </w:tcBorders>
+            <w:tcW w:type="dxa" w:w="4320"/>
           </w:tcPr>
           <w:p>
             <w:r>
-              <w:rPr>
-                <w:sz w:val="20"/>
-              </w:rPr>
               <w:t>More than 6 months until expiry — you're fine</w:t>
             </w:r>
           </w:p>
         </w:tc>
       </w:tr>
     </w:tbl>
-    <w:p/>
     <w:p>
       <w:pPr>
         <w:pStyle w:val="Heading3"/>
@@ -1339,13 +912,7 @@
     <w:p>
       <w:pPr/>
       <w:r>
-        <w:rPr>
-          <w:b/>
-        </w:rPr>
-        <w:t>Where to go:</w:t>
-      </w:r>
-      <w:r>
-        <w:t xml:space="preserve"> Tap any item row anywhere in the app (Inventory, Distributor page, etc.)</w:t>
+        <w:t>**Where to go:** Tap any item row anywhere in the app (Inventory, Distributor page, etc.)</w:t>
       </w:r>
     </w:p>
     <w:p>
@@ -1357,10 +924,7 @@
     <w:p>
       <w:pPr/>
       <w:r>
-        <w:rPr>
-          <w:b/>
-        </w:rPr>
-        <w:t>What you'll see:</w:t>
+        <w:t>**What you'll see:**</w:t>
       </w:r>
     </w:p>
     <w:p>
@@ -1392,16 +956,7 @@
         <w:pStyle w:val="ListBullet"/>
       </w:pPr>
       <w:r>
-        <w:t xml:space="preserve">A photo of the barcode label (tap to expand; press </w:t>
-      </w:r>
-      <w:r>
-        <w:rPr>
-          <w:b/>
-        </w:rPr>
-        <w:t>ESC</w:t>
-      </w:r>
-      <w:r>
-        <w:t xml:space="preserve"> or tap outside to close)</w:t>
+        <w:t>A photo of the barcode label (tap to expand; press **ESC** or tap outside to close)</w:t>
       </w:r>
     </w:p>
     <w:p>
@@ -1415,10 +970,7 @@
     <w:p>
       <w:pPr/>
       <w:r>
-        <w:rPr>
-          <w:b/>
-        </w:rPr>
-        <w:t>What you can do:</w:t>
+        <w:t>**What you can do:**</w:t>
       </w:r>
     </w:p>
     <w:tbl>
@@ -1428,50 +980,26 @@
         <w:tblLook w:firstColumn="1" w:firstRow="1" w:lastColumn="0" w:lastRow="0" w:noHBand="0" w:noVBand="1" w:val="04A0"/>
       </w:tblPr>
       <w:tblGrid>
-        <w:gridCol w:w="4536"/>
-        <w:gridCol w:w="4536"/>
+        <w:gridCol w:w="4320"/>
+        <w:gridCol w:w="4320"/>
       </w:tblGrid>
       <w:tr>
         <w:tc>
           <w:tcPr>
-            <w:tcW w:type="dxa" w:w="4536"/>
-            <w:shd w:val="clear" w:color="auto" w:fill="2E74B5"/>
-            <w:tcBorders>
-              <w:top w:val="single" w:sz="4" w:space="0" w:color="AAAAAA"/>
-              <w:left w:val="single" w:sz="4" w:space="0" w:color="AAAAAA"/>
-              <w:bottom w:val="single" w:sz="4" w:space="0" w:color="AAAAAA"/>
-              <w:right w:val="single" w:sz="4" w:space="0" w:color="AAAAAA"/>
-            </w:tcBorders>
+            <w:tcW w:type="dxa" w:w="4320"/>
           </w:tcPr>
           <w:p>
             <w:r>
-              <w:rPr>
-                <w:b/>
-                <w:color w:val="FFFFFF"/>
-                <w:sz w:val="20"/>
-              </w:rPr>
               <w:t>Button</w:t>
             </w:r>
           </w:p>
         </w:tc>
         <w:tc>
           <w:tcPr>
-            <w:tcW w:type="dxa" w:w="4536"/>
-            <w:shd w:val="clear" w:color="auto" w:fill="2E74B5"/>
-            <w:tcBorders>
-              <w:top w:val="single" w:sz="4" w:space="0" w:color="AAAAAA"/>
-              <w:left w:val="single" w:sz="4" w:space="0" w:color="AAAAAA"/>
-              <w:bottom w:val="single" w:sz="4" w:space="0" w:color="AAAAAA"/>
-              <w:right w:val="single" w:sz="4" w:space="0" w:color="AAAAAA"/>
-            </w:tcBorders>
+            <w:tcW w:type="dxa" w:w="4320"/>
           </w:tcPr>
           <w:p>
             <w:r>
-              <w:rPr>
-                <w:b/>
-                <w:color w:val="FFFFFF"/>
-                <w:sz w:val="20"/>
-              </w:rPr>
               <w:t>What It Does</w:t>
             </w:r>
           </w:p>
@@ -1480,41 +1008,20 @@
       <w:tr>
         <w:tc>
           <w:tcPr>
-            <w:tcW w:type="dxa" w:w="4536"/>
-            <w:shd w:val="clear" w:color="auto" w:fill="F2F7FC"/>
-            <w:tcBorders>
-              <w:top w:val="single" w:sz="4" w:space="0" w:color="AAAAAA"/>
-              <w:left w:val="single" w:sz="4" w:space="0" w:color="AAAAAA"/>
-              <w:bottom w:val="single" w:sz="4" w:space="0" w:color="AAAAAA"/>
-              <w:right w:val="single" w:sz="4" w:space="0" w:color="AAAAAA"/>
-            </w:tcBorders>
+            <w:tcW w:type="dxa" w:w="4320"/>
           </w:tcPr>
           <w:p>
             <w:r>
-              <w:rPr>
-                <w:b/>
-                <w:sz w:val="20"/>
-              </w:rPr>
-              <w:t>Edit</w:t>
+              <w:t>**Edit**</w:t>
             </w:r>
           </w:p>
         </w:tc>
         <w:tc>
           <w:tcPr>
-            <w:tcW w:type="dxa" w:w="4536"/>
-            <w:shd w:val="clear" w:color="auto" w:fill="F2F7FC"/>
-            <w:tcBorders>
-              <w:top w:val="single" w:sz="4" w:space="0" w:color="AAAAAA"/>
-              <w:left w:val="single" w:sz="4" w:space="0" w:color="AAAAAA"/>
-              <w:bottom w:val="single" w:sz="4" w:space="0" w:color="AAAAAA"/>
-              <w:right w:val="single" w:sz="4" w:space="0" w:color="AAAAAA"/>
-            </w:tcBorders>
+            <w:tcW w:type="dxa" w:w="4320"/>
           </w:tcPr>
           <w:p>
             <w:r>
-              <w:rPr>
-                <w:sz w:val="20"/>
-              </w:rPr>
               <w:t>Fix a mistake — wrong lot number, wrong expiry date, wrong product label. Every change is saved with your name and the time so there's a full audit trail.</w:t>
             </w:r>
           </w:p>
@@ -1523,41 +1030,20 @@
       <w:tr>
         <w:tc>
           <w:tcPr>
-            <w:tcW w:type="dxa" w:w="4536"/>
-            <w:shd w:val="clear" w:color="auto" w:fill="FFFFFF"/>
-            <w:tcBorders>
-              <w:top w:val="single" w:sz="4" w:space="0" w:color="AAAAAA"/>
-              <w:left w:val="single" w:sz="4" w:space="0" w:color="AAAAAA"/>
-              <w:bottom w:val="single" w:sz="4" w:space="0" w:color="AAAAAA"/>
-              <w:right w:val="single" w:sz="4" w:space="0" w:color="AAAAAA"/>
-            </w:tcBorders>
+            <w:tcW w:type="dxa" w:w="4320"/>
           </w:tcPr>
           <w:p>
             <w:r>
-              <w:rPr>
-                <w:b/>
-                <w:sz w:val="20"/>
-              </w:rPr>
-              <w:t>Reassign</w:t>
+              <w:t>**Reassign**</w:t>
             </w:r>
           </w:p>
         </w:tc>
         <w:tc>
           <w:tcPr>
-            <w:tcW w:type="dxa" w:w="4536"/>
-            <w:shd w:val="clear" w:color="auto" w:fill="FFFFFF"/>
-            <w:tcBorders>
-              <w:top w:val="single" w:sz="4" w:space="0" w:color="AAAAAA"/>
-              <w:left w:val="single" w:sz="4" w:space="0" w:color="AAAAAA"/>
-              <w:bottom w:val="single" w:sz="4" w:space="0" w:color="AAAAAA"/>
-              <w:right w:val="single" w:sz="4" w:space="0" w:color="AAAAAA"/>
-            </w:tcBorders>
+            <w:tcW w:type="dxa" w:w="4320"/>
           </w:tcPr>
           <w:p>
             <w:r>
-              <w:rPr>
-                <w:sz w:val="20"/>
-              </w:rPr>
               <w:t>Move the item to a different distributor. A transfer record is created automatically.</w:t>
             </w:r>
           </w:p>
@@ -1566,41 +1052,20 @@
       <w:tr>
         <w:tc>
           <w:tcPr>
-            <w:tcW w:type="dxa" w:w="4536"/>
-            <w:shd w:val="clear" w:color="auto" w:fill="F2F7FC"/>
-            <w:tcBorders>
-              <w:top w:val="single" w:sz="4" w:space="0" w:color="AAAAAA"/>
-              <w:left w:val="single" w:sz="4" w:space="0" w:color="AAAAAA"/>
-              <w:bottom w:val="single" w:sz="4" w:space="0" w:color="AAAAAA"/>
-              <w:right w:val="single" w:sz="4" w:space="0" w:color="AAAAAA"/>
-            </w:tcBorders>
+            <w:tcW w:type="dxa" w:w="4320"/>
           </w:tcPr>
           <w:p>
             <w:r>
-              <w:rPr>
-                <w:b/>
-                <w:sz w:val="20"/>
-              </w:rPr>
-              <w:t>Mark as Used</w:t>
+              <w:t>**Mark as Used**</w:t>
             </w:r>
           </w:p>
         </w:tc>
         <w:tc>
           <w:tcPr>
-            <w:tcW w:type="dxa" w:w="4536"/>
-            <w:shd w:val="clear" w:color="auto" w:fill="F2F7FC"/>
-            <w:tcBorders>
-              <w:top w:val="single" w:sz="4" w:space="0" w:color="AAAAAA"/>
-              <w:left w:val="single" w:sz="4" w:space="0" w:color="AAAAAA"/>
-              <w:bottom w:val="single" w:sz="4" w:space="0" w:color="AAAAAA"/>
-              <w:right w:val="single" w:sz="4" w:space="0" w:color="AAAAAA"/>
-            </w:tcBorders>
+            <w:tcW w:type="dxa" w:w="4320"/>
           </w:tcPr>
           <w:p>
             <w:r>
-              <w:rPr>
-                <w:sz w:val="20"/>
-              </w:rPr>
               <w:t>Record that this item was implanted in a patient. It will disappear from active inventory.</w:t>
             </w:r>
           </w:p>
@@ -1609,60 +1074,29 @@
       <w:tr>
         <w:tc>
           <w:tcPr>
-            <w:tcW w:type="dxa" w:w="4536"/>
-            <w:shd w:val="clear" w:color="auto" w:fill="FFFFFF"/>
-            <w:tcBorders>
-              <w:top w:val="single" w:sz="4" w:space="0" w:color="AAAAAA"/>
-              <w:left w:val="single" w:sz="4" w:space="0" w:color="AAAAAA"/>
-              <w:bottom w:val="single" w:sz="4" w:space="0" w:color="AAAAAA"/>
-              <w:right w:val="single" w:sz="4" w:space="0" w:color="AAAAAA"/>
-            </w:tcBorders>
+            <w:tcW w:type="dxa" w:w="4320"/>
           </w:tcPr>
           <w:p>
             <w:r>
-              <w:rPr>
-                <w:b/>
-                <w:sz w:val="20"/>
-              </w:rPr>
-              <w:t>Delete</w:t>
+              <w:t>**Delete**</w:t>
             </w:r>
           </w:p>
         </w:tc>
         <w:tc>
           <w:tcPr>
-            <w:tcW w:type="dxa" w:w="4536"/>
-            <w:shd w:val="clear" w:color="auto" w:fill="FFFFFF"/>
-            <w:tcBorders>
-              <w:top w:val="single" w:sz="4" w:space="0" w:color="AAAAAA"/>
-              <w:left w:val="single" w:sz="4" w:space="0" w:color="AAAAAA"/>
-              <w:bottom w:val="single" w:sz="4" w:space="0" w:color="AAAAAA"/>
-              <w:right w:val="single" w:sz="4" w:space="0" w:color="AAAAAA"/>
-            </w:tcBorders>
+            <w:tcW w:type="dxa" w:w="4320"/>
           </w:tcPr>
           <w:p>
             <w:r>
-              <w:rPr>
-                <w:sz w:val="20"/>
-              </w:rPr>
               <w:t>Remove the item entirely. Use with caution.</w:t>
             </w:r>
           </w:p>
         </w:tc>
       </w:tr>
     </w:tbl>
-    <w:p/>
     <w:p>
-      <w:pPr>
-        <w:ind w:left="576" w:right="576"/>
-        <w:pBdr>
-          <w:left w:val="single" w:sz="12" w:space="4" w:color="5B9BD5"/>
-        </w:pBdr>
-      </w:pPr>
+      <w:pPr/>
       <w:r>
-        <w:rPr>
-          <w:i/>
-          <w:color w:val="404040"/>
-        </w:rPr>
         <w:t>**Keyboard shortcut:** If you're on a computer, press **ESC** at any time to close a photo or a pop-up window.</w:t>
       </w:r>
     </w:p>
@@ -1677,28 +1111,7 @@
     <w:p>
       <w:pPr/>
       <w:r>
-        <w:rPr>
-          <w:b/>
-        </w:rPr>
-        <w:t>Where to go:</w:t>
-      </w:r>
-      <w:r>
-        <w:t xml:space="preserve"> Tap </w:t>
-      </w:r>
-      <w:r>
-        <w:rPr>
-          <w:b/>
-        </w:rPr>
-        <w:t>More</w:t>
-      </w:r>
-      <w:r>
-        <w:t xml:space="preserve"> → </w:t>
-      </w:r>
-      <w:r>
-        <w:rPr>
-          <w:b/>
-        </w:rPr>
-        <w:t>Banks</w:t>
+        <w:t>**Where to go:** Tap **More** → **Banks**</w:t>
       </w:r>
     </w:p>
     <w:p>
@@ -1710,10 +1123,7 @@
     <w:p>
       <w:pPr/>
       <w:r>
-        <w:rPr>
-          <w:b/>
-        </w:rPr>
-        <w:t>Creating a bank:</w:t>
+        <w:t>**Creating a bank:**</w:t>
       </w:r>
     </w:p>
     <w:p>
@@ -1721,13 +1131,7 @@
         <w:pStyle w:val="ListNumber"/>
       </w:pPr>
       <w:r>
-        <w:t xml:space="preserve">Tap </w:t>
-      </w:r>
-      <w:r>
-        <w:rPr>
-          <w:b/>
-        </w:rPr>
-        <w:t>Create Bank</w:t>
+        <w:t>Tap **Create Bank**</w:t>
       </w:r>
     </w:p>
     <w:p>
@@ -1751,22 +1155,13 @@
         <w:pStyle w:val="ListNumber"/>
       </w:pPr>
       <w:r>
-        <w:t xml:space="preserve">Tap </w:t>
-      </w:r>
-      <w:r>
-        <w:rPr>
-          <w:b/>
-        </w:rPr>
-        <w:t>Create</w:t>
+        <w:t>Tap **Create**</w:t>
       </w:r>
     </w:p>
     <w:p>
       <w:pPr/>
       <w:r>
-        <w:rPr>
-          <w:b/>
-        </w:rPr>
-        <w:t>Adding items to a bank:</w:t>
+        <w:t>**Adding items to a bank:**</w:t>
       </w:r>
     </w:p>
     <w:p>
@@ -1774,13 +1169,7 @@
         <w:pStyle w:val="ListNumber"/>
       </w:pPr>
       <w:r>
-        <w:t xml:space="preserve">Open the bank, then tap </w:t>
-      </w:r>
-      <w:r>
-        <w:rPr>
-          <w:b/>
-        </w:rPr>
-        <w:t>Add Items</w:t>
+        <w:t>Open the bank, then tap **Add Items**</w:t>
       </w:r>
     </w:p>
     <w:p>
@@ -1796,46 +1185,25 @@
         <w:pStyle w:val="ListNumber"/>
       </w:pPr>
       <w:r>
-        <w:t xml:space="preserve">Check the items you want to add, then tap </w:t>
-      </w:r>
-      <w:r>
-        <w:rPr>
-          <w:b/>
-        </w:rPr>
-        <w:t>Add</w:t>
+        <w:t>Check the items you want to add, then tap **Add**</w:t>
       </w:r>
     </w:p>
     <w:p>
       <w:pPr/>
       <w:r>
-        <w:rPr>
-          <w:b/>
-        </w:rPr>
-        <w:t>Removing an item:</w:t>
+        <w:t>**Removing an item:**</w:t>
       </w:r>
     </w:p>
     <w:p>
       <w:pPr/>
       <w:r>
-        <w:t xml:space="preserve">Tap the </w:t>
-      </w:r>
-      <w:r>
-        <w:rPr>
-          <w:b/>
-        </w:rPr>
-        <w:t>X</w:t>
-      </w:r>
-      <w:r>
-        <w:t xml:space="preserve"> next to an item in the bank list. The item doesn't get deleted — it just leaves the bank and stays in that distributor's regular inventory.</w:t>
+        <w:t>Tap the **X** next to an item in the bank list. The item doesn't get deleted — it just leaves the bank and stays in that distributor's regular inventory.</w:t>
       </w:r>
     </w:p>
     <w:p>
       <w:pPr/>
       <w:r>
-        <w:rPr>
-          <w:b/>
-        </w:rPr>
-        <w:t>Moving a whole bank:</w:t>
+        <w:t>**Moving a whole bank:**</w:t>
       </w:r>
     </w:p>
     <w:p>
@@ -1843,13 +1211,7 @@
         <w:pStyle w:val="ListNumber"/>
       </w:pPr>
       <w:r>
-        <w:t xml:space="preserve">Open the bank, tap </w:t>
-      </w:r>
-      <w:r>
-        <w:rPr>
-          <w:b/>
-        </w:rPr>
-        <w:t>Move Bank</w:t>
+        <w:t>Open the bank, tap **Move Bank**</w:t>
       </w:r>
     </w:p>
     <w:p>
@@ -1879,53 +1241,19 @@
     <w:p>
       <w:pPr/>
       <w:r>
-        <w:rPr>
-          <w:b/>
-        </w:rPr>
-        <w:t>Where to go:</w:t>
-      </w:r>
-      <w:r>
-        <w:t xml:space="preserve"> Tap </w:t>
-      </w:r>
-      <w:r>
-        <w:rPr>
-          <w:b/>
-        </w:rPr>
-        <w:t>More</w:t>
-      </w:r>
-      <w:r>
-        <w:t xml:space="preserve"> → </w:t>
-      </w:r>
-      <w:r>
-        <w:rPr>
-          <w:b/>
-        </w:rPr>
-        <w:t>Transfer</w:t>
+        <w:t>**Where to go:** Tap **More** → **Transfer**</w:t>
       </w:r>
     </w:p>
     <w:p>
       <w:pPr/>
       <w:r>
-        <w:t xml:space="preserve">Use this when you need to officially move items from one distributor to another — for example, pulling items back from a rep or shipping a set of implants out to a new location. Every transfer gets its own ID (like </w:t>
-      </w:r>
-      <w:r>
-        <w:rPr>
-          <w:rFonts w:ascii="Courier New" w:hAnsi="Courier New"/>
-          <w:sz w:val="18"/>
-        </w:rPr>
-        <w:t>TRF-20260514-0001</w:t>
-      </w:r>
-      <w:r>
-        <w:t>) so you can reference it later.</w:t>
+        <w:t>Use this when you need to officially move items from one distributor to another — for example, pulling items back from a rep or shipping a set of implants out to a new location. Every transfer gets its own ID (like `TRF-20260514-0001`) so you can reference it later.</w:t>
       </w:r>
     </w:p>
     <w:p>
       <w:pPr/>
       <w:r>
-        <w:rPr>
-          <w:b/>
-        </w:rPr>
-        <w:t>Creating a transfer:</w:t>
+        <w:t>**Creating a transfer:**</w:t>
       </w:r>
     </w:p>
     <w:p>
@@ -1933,16 +1261,7 @@
         <w:pStyle w:val="ListNumber"/>
       </w:pPr>
       <w:r>
-        <w:t xml:space="preserve">Under </w:t>
-      </w:r>
-      <w:r>
-        <w:rPr>
-          <w:b/>
-        </w:rPr>
-        <w:t>From</w:t>
-      </w:r>
-      <w:r>
-        <w:t>, choose where the items are coming from</w:t>
+        <w:t>Under **From**, choose where the items are coming from</w:t>
       </w:r>
     </w:p>
     <w:p>
@@ -1950,16 +1269,7 @@
         <w:pStyle w:val="ListNumber"/>
       </w:pPr>
       <w:r>
-        <w:t xml:space="preserve">Under </w:t>
-      </w:r>
-      <w:r>
-        <w:rPr>
-          <w:b/>
-        </w:rPr>
-        <w:t>To</w:t>
-      </w:r>
-      <w:r>
-        <w:t>, choose where they're going</w:t>
+        <w:t>Under **To**, choose where they're going</w:t>
       </w:r>
     </w:p>
     <w:p>
@@ -1967,16 +1277,7 @@
         <w:pStyle w:val="ListNumber"/>
       </w:pPr>
       <w:r>
-        <w:t xml:space="preserve">Check the boxes next to the items you want to move. Tap </w:t>
-      </w:r>
-      <w:r>
-        <w:rPr>
-          <w:b/>
-        </w:rPr>
-        <w:t>Select All</w:t>
-      </w:r>
-      <w:r>
-        <w:t xml:space="preserve"> if you want everything.</w:t>
+        <w:t>Check the boxes next to the items you want to move. Tap **Select All** if you want everything.</w:t>
       </w:r>
     </w:p>
     <w:p>
@@ -1992,13 +1293,7 @@
         <w:pStyle w:val="ListNumber"/>
       </w:pPr>
       <w:r>
-        <w:t xml:space="preserve">Tap </w:t>
-      </w:r>
-      <w:r>
-        <w:rPr>
-          <w:b/>
-        </w:rPr>
-        <w:t>Confirm Transfer</w:t>
+        <w:t>Tap **Confirm Transfer**</w:t>
       </w:r>
     </w:p>
     <w:p>
@@ -2008,27 +1303,15 @@
       </w:r>
     </w:p>
     <w:p>
-      <w:pPr>
-        <w:ind w:left="576" w:right="576"/>
-        <w:pBdr>
-          <w:left w:val="single" w:sz="12" w:space="4" w:color="5B9BD5"/>
-        </w:pBdr>
-      </w:pPr>
+      <w:pPr/>
       <w:r>
-        <w:rPr>
-          <w:i/>
-          <w:color w:val="404040"/>
-        </w:rPr>
         <w:t>**Single-item reassignment also counts:** If you move one item from its detail page using the Reassign button, a transfer record is created for that too — so every move is always tracked.</w:t>
       </w:r>
     </w:p>
     <w:p>
       <w:pPr/>
       <w:r>
-        <w:rPr>
-          <w:b/>
-        </w:rPr>
-        <w:t>Printing a transfer report:</w:t>
+        <w:t>**Printing a transfer report:**</w:t>
       </w:r>
     </w:p>
     <w:p>
@@ -2042,25 +1325,7 @@
         <w:pStyle w:val="ListNumber"/>
       </w:pPr>
       <w:r>
-        <w:t xml:space="preserve">Find the transfer in </w:t>
-      </w:r>
-      <w:r>
-        <w:rPr>
-          <w:b/>
-        </w:rPr>
-        <w:t>Reports</w:t>
-      </w:r>
-      <w:r>
-        <w:t xml:space="preserve"> → </w:t>
-      </w:r>
-      <w:r>
-        <w:rPr>
-          <w:b/>
-        </w:rPr>
-        <w:t>Transfer History</w:t>
-      </w:r>
-      <w:r>
-        <w:t xml:space="preserve"> and tap its ID (e.g., TRF-20260514-0001)</w:t>
+        <w:t>Find the transfer in **Reports** → **Transfer History** and tap its ID (e.g., TRF-20260514-0001)</w:t>
       </w:r>
     </w:p>
     <w:p>
@@ -2068,16 +1333,7 @@
         <w:pStyle w:val="ListNumber"/>
       </w:pPr>
       <w:r>
-        <w:t xml:space="preserve">Tap the </w:t>
-      </w:r>
-      <w:r>
-        <w:rPr>
-          <w:b/>
-        </w:rPr>
-        <w:t>Print</w:t>
-      </w:r>
-      <w:r>
-        <w:t xml:space="preserve"> button</w:t>
+        <w:t>Tap the **Print** button</w:t>
       </w:r>
     </w:p>
     <w:p>
@@ -2099,22 +1355,7 @@
     <w:p>
       <w:pPr/>
       <w:r>
-        <w:rPr>
-          <w:b/>
-        </w:rPr>
-        <w:t>Where to go:</w:t>
-      </w:r>
-      <w:r>
-        <w:t xml:space="preserve"> Tap </w:t>
-      </w:r>
-      <w:r>
-        <w:rPr>
-          <w:b/>
-        </w:rPr>
-        <w:t>Reports</w:t>
-      </w:r>
-      <w:r>
-        <w:t xml:space="preserve"> in the bottom navigation</w:t>
+        <w:t>**Where to go:** Tap **Reports** in the bottom navigation</w:t>
       </w:r>
     </w:p>
     <w:p>
@@ -2126,22 +1367,13 @@
     <w:p>
       <w:pPr/>
       <w:r>
-        <w:rPr>
-          <w:b/>
-        </w:rPr>
-        <w:t>The summary cards at the top:</w:t>
+        <w:t>**The summary cards at the top:**</w:t>
       </w:r>
     </w:p>
     <w:p>
       <w:pPr/>
       <w:r>
-        <w:t xml:space="preserve">There are five colored cards that each show a number. </w:t>
-      </w:r>
-      <w:r>
-        <w:rPr>
-          <w:b/>
-        </w:rPr>
-        <w:t>Tap any card to see the matching list of items.</w:t>
+        <w:t>There are five colored cards that each show a number. **Tap any card to see the matching list of items.**</w:t>
       </w:r>
     </w:p>
     <w:tbl>
@@ -2151,73 +1383,37 @@
         <w:tblLook w:firstColumn="1" w:firstRow="1" w:lastColumn="0" w:lastRow="0" w:noHBand="0" w:noVBand="1" w:val="04A0"/>
       </w:tblPr>
       <w:tblGrid>
-        <w:gridCol w:w="3024"/>
-        <w:gridCol w:w="3024"/>
-        <w:gridCol w:w="3024"/>
+        <w:gridCol w:w="2880"/>
+        <w:gridCol w:w="2880"/>
+        <w:gridCol w:w="2880"/>
       </w:tblGrid>
       <w:tr>
         <w:tc>
           <w:tcPr>
-            <w:tcW w:type="dxa" w:w="3024"/>
-            <w:shd w:val="clear" w:color="auto" w:fill="2E74B5"/>
-            <w:tcBorders>
-              <w:top w:val="single" w:sz="4" w:space="0" w:color="AAAAAA"/>
-              <w:left w:val="single" w:sz="4" w:space="0" w:color="AAAAAA"/>
-              <w:bottom w:val="single" w:sz="4" w:space="0" w:color="AAAAAA"/>
-              <w:right w:val="single" w:sz="4" w:space="0" w:color="AAAAAA"/>
-            </w:tcBorders>
+            <w:tcW w:type="dxa" w:w="2880"/>
           </w:tcPr>
           <w:p>
             <w:r>
-              <w:rPr>
-                <w:b/>
-                <w:color w:val="FFFFFF"/>
-                <w:sz w:val="20"/>
-              </w:rPr>
               <w:t>Card</w:t>
             </w:r>
           </w:p>
         </w:tc>
         <w:tc>
           <w:tcPr>
-            <w:tcW w:type="dxa" w:w="3024"/>
-            <w:shd w:val="clear" w:color="auto" w:fill="2E74B5"/>
-            <w:tcBorders>
-              <w:top w:val="single" w:sz="4" w:space="0" w:color="AAAAAA"/>
-              <w:left w:val="single" w:sz="4" w:space="0" w:color="AAAAAA"/>
-              <w:bottom w:val="single" w:sz="4" w:space="0" w:color="AAAAAA"/>
-              <w:right w:val="single" w:sz="4" w:space="0" w:color="AAAAAA"/>
-            </w:tcBorders>
+            <w:tcW w:type="dxa" w:w="2880"/>
           </w:tcPr>
           <w:p>
             <w:r>
-              <w:rPr>
-                <w:b/>
-                <w:color w:val="FFFFFF"/>
-                <w:sz w:val="20"/>
-              </w:rPr>
               <w:t>What It Shows</w:t>
             </w:r>
           </w:p>
         </w:tc>
         <w:tc>
           <w:tcPr>
-            <w:tcW w:type="dxa" w:w="3024"/>
-            <w:shd w:val="clear" w:color="auto" w:fill="2E74B5"/>
-            <w:tcBorders>
-              <w:top w:val="single" w:sz="4" w:space="0" w:color="AAAAAA"/>
-              <w:left w:val="single" w:sz="4" w:space="0" w:color="AAAAAA"/>
-              <w:bottom w:val="single" w:sz="4" w:space="0" w:color="AAAAAA"/>
-              <w:right w:val="single" w:sz="4" w:space="0" w:color="AAAAAA"/>
-            </w:tcBorders>
+            <w:tcW w:type="dxa" w:w="2880"/>
           </w:tcPr>
           <w:p>
             <w:r>
-              <w:rPr>
-                <w:b/>
-                <w:color w:val="FFFFFF"/>
-                <w:sz w:val="20"/>
-              </w:rPr>
               <w:t>Tap to See</w:t>
             </w:r>
           </w:p>
@@ -2226,60 +1422,30 @@
       <w:tr>
         <w:tc>
           <w:tcPr>
-            <w:tcW w:type="dxa" w:w="3024"/>
-            <w:shd w:val="clear" w:color="auto" w:fill="F2F7FC"/>
-            <w:tcBorders>
-              <w:top w:val="single" w:sz="4" w:space="0" w:color="AAAAAA"/>
-              <w:left w:val="single" w:sz="4" w:space="0" w:color="AAAAAA"/>
-              <w:bottom w:val="single" w:sz="4" w:space="0" w:color="AAAAAA"/>
-              <w:right w:val="single" w:sz="4" w:space="0" w:color="AAAAAA"/>
-            </w:tcBorders>
+            <w:tcW w:type="dxa" w:w="2880"/>
           </w:tcPr>
           <w:p>
             <w:r>
-              <w:rPr>
-                <w:sz w:val="20"/>
-              </w:rPr>
               <w:t>Total Units</w:t>
             </w:r>
           </w:p>
         </w:tc>
         <w:tc>
           <w:tcPr>
-            <w:tcW w:type="dxa" w:w="3024"/>
-            <w:shd w:val="clear" w:color="auto" w:fill="F2F7FC"/>
-            <w:tcBorders>
-              <w:top w:val="single" w:sz="4" w:space="0" w:color="AAAAAA"/>
-              <w:left w:val="single" w:sz="4" w:space="0" w:color="AAAAAA"/>
-              <w:bottom w:val="single" w:sz="4" w:space="0" w:color="AAAAAA"/>
-              <w:right w:val="single" w:sz="4" w:space="0" w:color="AAAAAA"/>
-            </w:tcBorders>
+            <w:tcW w:type="dxa" w:w="2880"/>
           </w:tcPr>
           <w:p>
             <w:r>
-              <w:rPr>
-                <w:sz w:val="20"/>
-              </w:rPr>
               <w:t>How many items are in the system right now</w:t>
             </w:r>
           </w:p>
         </w:tc>
         <w:tc>
           <w:tcPr>
-            <w:tcW w:type="dxa" w:w="3024"/>
-            <w:shd w:val="clear" w:color="auto" w:fill="F2F7FC"/>
-            <w:tcBorders>
-              <w:top w:val="single" w:sz="4" w:space="0" w:color="AAAAAA"/>
-              <w:left w:val="single" w:sz="4" w:space="0" w:color="AAAAAA"/>
-              <w:bottom w:val="single" w:sz="4" w:space="0" w:color="AAAAAA"/>
-              <w:right w:val="single" w:sz="4" w:space="0" w:color="AAAAAA"/>
-            </w:tcBorders>
+            <w:tcW w:type="dxa" w:w="2880"/>
           </w:tcPr>
           <w:p>
             <w:r>
-              <w:rPr>
-                <w:sz w:val="20"/>
-              </w:rPr>
               <w:t>All inventory</w:t>
             </w:r>
           </w:p>
@@ -2288,60 +1454,30 @@
       <w:tr>
         <w:tc>
           <w:tcPr>
-            <w:tcW w:type="dxa" w:w="3024"/>
-            <w:shd w:val="clear" w:color="auto" w:fill="FFFFFF"/>
-            <w:tcBorders>
-              <w:top w:val="single" w:sz="4" w:space="0" w:color="AAAAAA"/>
-              <w:left w:val="single" w:sz="4" w:space="0" w:color="AAAAAA"/>
-              <w:bottom w:val="single" w:sz="4" w:space="0" w:color="AAAAAA"/>
-              <w:right w:val="single" w:sz="4" w:space="0" w:color="AAAAAA"/>
-            </w:tcBorders>
+            <w:tcW w:type="dxa" w:w="2880"/>
           </w:tcPr>
           <w:p>
             <w:r>
-              <w:rPr>
-                <w:sz w:val="20"/>
-              </w:rPr>
               <w:t>Active Distributors</w:t>
             </w:r>
           </w:p>
         </w:tc>
         <w:tc>
           <w:tcPr>
-            <w:tcW w:type="dxa" w:w="3024"/>
-            <w:shd w:val="clear" w:color="auto" w:fill="FFFFFF"/>
-            <w:tcBorders>
-              <w:top w:val="single" w:sz="4" w:space="0" w:color="AAAAAA"/>
-              <w:left w:val="single" w:sz="4" w:space="0" w:color="AAAAAA"/>
-              <w:bottom w:val="single" w:sz="4" w:space="0" w:color="AAAAAA"/>
-              <w:right w:val="single" w:sz="4" w:space="0" w:color="AAAAAA"/>
-            </w:tcBorders>
+            <w:tcW w:type="dxa" w:w="2880"/>
           </w:tcPr>
           <w:p>
             <w:r>
-              <w:rPr>
-                <w:sz w:val="20"/>
-              </w:rPr>
               <w:t>How many distributors have items</w:t>
             </w:r>
           </w:p>
         </w:tc>
         <w:tc>
           <w:tcPr>
-            <w:tcW w:type="dxa" w:w="3024"/>
-            <w:shd w:val="clear" w:color="auto" w:fill="FFFFFF"/>
-            <w:tcBorders>
-              <w:top w:val="single" w:sz="4" w:space="0" w:color="AAAAAA"/>
-              <w:left w:val="single" w:sz="4" w:space="0" w:color="AAAAAA"/>
-              <w:bottom w:val="single" w:sz="4" w:space="0" w:color="AAAAAA"/>
-              <w:right w:val="single" w:sz="4" w:space="0" w:color="AAAAAA"/>
-            </w:tcBorders>
+            <w:tcW w:type="dxa" w:w="2880"/>
           </w:tcPr>
           <w:p>
             <w:r>
-              <w:rPr>
-                <w:sz w:val="20"/>
-              </w:rPr>
               <w:t>Distributor list</w:t>
             </w:r>
           </w:p>
@@ -2350,60 +1486,30 @@
       <w:tr>
         <w:tc>
           <w:tcPr>
-            <w:tcW w:type="dxa" w:w="3024"/>
-            <w:shd w:val="clear" w:color="auto" w:fill="F2F7FC"/>
-            <w:tcBorders>
-              <w:top w:val="single" w:sz="4" w:space="0" w:color="AAAAAA"/>
-              <w:left w:val="single" w:sz="4" w:space="0" w:color="AAAAAA"/>
-              <w:bottom w:val="single" w:sz="4" w:space="0" w:color="AAAAAA"/>
-              <w:right w:val="single" w:sz="4" w:space="0" w:color="AAAAAA"/>
-            </w:tcBorders>
+            <w:tcW w:type="dxa" w:w="2880"/>
           </w:tcPr>
           <w:p>
             <w:r>
-              <w:rPr>
-                <w:sz w:val="20"/>
-              </w:rPr>
               <w:t>Expiring &lt; 180d</w:t>
             </w:r>
           </w:p>
         </w:tc>
         <w:tc>
           <w:tcPr>
-            <w:tcW w:type="dxa" w:w="3024"/>
-            <w:shd w:val="clear" w:color="auto" w:fill="F2F7FC"/>
-            <w:tcBorders>
-              <w:top w:val="single" w:sz="4" w:space="0" w:color="AAAAAA"/>
-              <w:left w:val="single" w:sz="4" w:space="0" w:color="AAAAAA"/>
-              <w:bottom w:val="single" w:sz="4" w:space="0" w:color="AAAAAA"/>
-              <w:right w:val="single" w:sz="4" w:space="0" w:color="AAAAAA"/>
-            </w:tcBorders>
+            <w:tcW w:type="dxa" w:w="2880"/>
           </w:tcPr>
           <w:p>
             <w:r>
-              <w:rPr>
-                <w:sz w:val="20"/>
-              </w:rPr>
               <w:t>Items that expire within 6 months</w:t>
             </w:r>
           </w:p>
         </w:tc>
         <w:tc>
           <w:tcPr>
-            <w:tcW w:type="dxa" w:w="3024"/>
-            <w:shd w:val="clear" w:color="auto" w:fill="F2F7FC"/>
-            <w:tcBorders>
-              <w:top w:val="single" w:sz="4" w:space="0" w:color="AAAAAA"/>
-              <w:left w:val="single" w:sz="4" w:space="0" w:color="AAAAAA"/>
-              <w:bottom w:val="single" w:sz="4" w:space="0" w:color="AAAAAA"/>
-              <w:right w:val="single" w:sz="4" w:space="0" w:color="AAAAAA"/>
-            </w:tcBorders>
+            <w:tcW w:type="dxa" w:w="2880"/>
           </w:tcPr>
           <w:p>
             <w:r>
-              <w:rPr>
-                <w:sz w:val="20"/>
-              </w:rPr>
               <w:t>Those specific items</w:t>
             </w:r>
           </w:p>
@@ -2412,60 +1518,30 @@
       <w:tr>
         <w:tc>
           <w:tcPr>
-            <w:tcW w:type="dxa" w:w="3024"/>
-            <w:shd w:val="clear" w:color="auto" w:fill="FFFFFF"/>
-            <w:tcBorders>
-              <w:top w:val="single" w:sz="4" w:space="0" w:color="AAAAAA"/>
-              <w:left w:val="single" w:sz="4" w:space="0" w:color="AAAAAA"/>
-              <w:bottom w:val="single" w:sz="4" w:space="0" w:color="AAAAAA"/>
-              <w:right w:val="single" w:sz="4" w:space="0" w:color="AAAAAA"/>
-            </w:tcBorders>
+            <w:tcW w:type="dxa" w:w="2880"/>
           </w:tcPr>
           <w:p>
             <w:r>
-              <w:rPr>
-                <w:sz w:val="20"/>
-              </w:rPr>
               <w:t>Expired</w:t>
             </w:r>
           </w:p>
         </w:tc>
         <w:tc>
           <w:tcPr>
-            <w:tcW w:type="dxa" w:w="3024"/>
-            <w:shd w:val="clear" w:color="auto" w:fill="FFFFFF"/>
-            <w:tcBorders>
-              <w:top w:val="single" w:sz="4" w:space="0" w:color="AAAAAA"/>
-              <w:left w:val="single" w:sz="4" w:space="0" w:color="AAAAAA"/>
-              <w:bottom w:val="single" w:sz="4" w:space="0" w:color="AAAAAA"/>
-              <w:right w:val="single" w:sz="4" w:space="0" w:color="AAAAAA"/>
-            </w:tcBorders>
+            <w:tcW w:type="dxa" w:w="2880"/>
           </w:tcPr>
           <w:p>
             <w:r>
-              <w:rPr>
-                <w:sz w:val="20"/>
-              </w:rPr>
               <w:t>Items that are already past their expiry date</w:t>
             </w:r>
           </w:p>
         </w:tc>
         <w:tc>
           <w:tcPr>
-            <w:tcW w:type="dxa" w:w="3024"/>
-            <w:shd w:val="clear" w:color="auto" w:fill="FFFFFF"/>
-            <w:tcBorders>
-              <w:top w:val="single" w:sz="4" w:space="0" w:color="AAAAAA"/>
-              <w:left w:val="single" w:sz="4" w:space="0" w:color="AAAAAA"/>
-              <w:bottom w:val="single" w:sz="4" w:space="0" w:color="AAAAAA"/>
-              <w:right w:val="single" w:sz="4" w:space="0" w:color="AAAAAA"/>
-            </w:tcBorders>
+            <w:tcW w:type="dxa" w:w="2880"/>
           </w:tcPr>
           <w:p>
             <w:r>
-              <w:rPr>
-                <w:sz w:val="20"/>
-              </w:rPr>
               <w:t>Those specific items</w:t>
             </w:r>
           </w:p>
@@ -2474,89 +1550,46 @@
       <w:tr>
         <w:tc>
           <w:tcPr>
-            <w:tcW w:type="dxa" w:w="3024"/>
-            <w:shd w:val="clear" w:color="auto" w:fill="F2F7FC"/>
-            <w:tcBorders>
-              <w:top w:val="single" w:sz="4" w:space="0" w:color="AAAAAA"/>
-              <w:left w:val="single" w:sz="4" w:space="0" w:color="AAAAAA"/>
-              <w:bottom w:val="single" w:sz="4" w:space="0" w:color="AAAAAA"/>
-              <w:right w:val="single" w:sz="4" w:space="0" w:color="AAAAAA"/>
-            </w:tcBorders>
+            <w:tcW w:type="dxa" w:w="2880"/>
           </w:tcPr>
           <w:p>
             <w:r>
-              <w:rPr>
-                <w:sz w:val="20"/>
-              </w:rPr>
               <w:t>Unassigned</w:t>
             </w:r>
           </w:p>
         </w:tc>
         <w:tc>
           <w:tcPr>
-            <w:tcW w:type="dxa" w:w="3024"/>
-            <w:shd w:val="clear" w:color="auto" w:fill="F2F7FC"/>
-            <w:tcBorders>
-              <w:top w:val="single" w:sz="4" w:space="0" w:color="AAAAAA"/>
-              <w:left w:val="single" w:sz="4" w:space="0" w:color="AAAAAA"/>
-              <w:bottom w:val="single" w:sz="4" w:space="0" w:color="AAAAAA"/>
-              <w:right w:val="single" w:sz="4" w:space="0" w:color="AAAAAA"/>
-            </w:tcBorders>
+            <w:tcW w:type="dxa" w:w="2880"/>
           </w:tcPr>
           <w:p>
             <w:r>
-              <w:rPr>
-                <w:sz w:val="20"/>
-              </w:rPr>
               <w:t>Items at Home Office not yet sent anywhere</w:t>
             </w:r>
           </w:p>
         </w:tc>
         <w:tc>
           <w:tcPr>
-            <w:tcW w:type="dxa" w:w="3024"/>
-            <w:shd w:val="clear" w:color="auto" w:fill="F2F7FC"/>
-            <w:tcBorders>
-              <w:top w:val="single" w:sz="4" w:space="0" w:color="AAAAAA"/>
-              <w:left w:val="single" w:sz="4" w:space="0" w:color="AAAAAA"/>
-              <w:bottom w:val="single" w:sz="4" w:space="0" w:color="AAAAAA"/>
-              <w:right w:val="single" w:sz="4" w:space="0" w:color="AAAAAA"/>
-            </w:tcBorders>
+            <w:tcW w:type="dxa" w:w="2880"/>
           </w:tcPr>
           <w:p>
             <w:r>
-              <w:rPr>
-                <w:sz w:val="20"/>
-              </w:rPr>
               <w:t>Those specific items</w:t>
             </w:r>
           </w:p>
         </w:tc>
       </w:tr>
     </w:tbl>
-    <w:p/>
     <w:p>
       <w:pPr/>
       <w:r>
-        <w:rPr>
-          <w:b/>
-        </w:rPr>
-        <w:t>Stock by Item Number:</w:t>
+        <w:t>**Stock by Item Number:**</w:t>
       </w:r>
     </w:p>
     <w:p>
       <w:pPr/>
       <w:r>
-        <w:t xml:space="preserve">Tap the </w:t>
-      </w:r>
-      <w:r>
-        <w:rPr>
-          <w:b/>
-        </w:rPr>
-        <w:t>Stock by Item Number</w:t>
-      </w:r>
-      <w:r>
-        <w:t xml:space="preserve"> button to open a detailed matrix view. This is one of the most useful reports in the system.</w:t>
+        <w:t>Tap the **Stock by Item Number** button to open a detailed matrix view. This is one of the most useful reports in the system.</w:t>
       </w:r>
     </w:p>
     <w:p>
@@ -2580,25 +1613,13 @@
         <w:pStyle w:val="ListBullet"/>
       </w:pPr>
       <w:r>
-        <w:t xml:space="preserve">The </w:t>
-      </w:r>
-      <w:r>
-        <w:rPr>
-          <w:b/>
-        </w:rPr>
-        <w:t>Total</w:t>
-      </w:r>
-      <w:r>
-        <w:t xml:space="preserve"> column on the right shows how many of that item exist across everywhere</w:t>
+        <w:t>The **Total** column on the right shows how many of that item exist across everywhere</w:t>
       </w:r>
     </w:p>
     <w:p>
       <w:pPr/>
       <w:r>
-        <w:rPr>
-          <w:b/>
-        </w:rPr>
-        <w:t>Drilling down:</w:t>
+        <w:t>**Drilling down:**</w:t>
       </w:r>
     </w:p>
     <w:p>
@@ -2606,16 +1627,7 @@
         <w:pStyle w:val="ListBullet"/>
       </w:pPr>
       <w:r>
-        <w:t xml:space="preserve">Tap an </w:t>
-      </w:r>
-      <w:r>
-        <w:rPr>
-          <w:b/>
-        </w:rPr>
-        <w:t>item number</w:t>
-      </w:r>
-      <w:r>
-        <w:t xml:space="preserve"> in the leftmost column (or its Total) → see all units of that product across all locations</w:t>
+        <w:t>Tap an **item number** in the leftmost column (or its Total) → see all units of that product across all locations</w:t>
       </w:r>
     </w:p>
     <w:p>
@@ -2623,16 +1635,7 @@
         <w:pStyle w:val="ListBullet"/>
       </w:pPr>
       <w:r>
-        <w:t xml:space="preserve">Tap a </w:t>
-      </w:r>
-      <w:r>
-        <w:rPr>
-          <w:b/>
-        </w:rPr>
-        <w:t>specific count</w:t>
-      </w:r>
-      <w:r>
-        <w:t xml:space="preserve"> (e.g., the "13" under a distributor's column) → see only that product at that location</w:t>
+        <w:t>Tap a **specific count** (e.g., the "13" under a distributor's column) → see only that product at that location</w:t>
       </w:r>
     </w:p>
     <w:p>
@@ -2644,10 +1647,7 @@
     <w:p>
       <w:pPr/>
       <w:r>
-        <w:rPr>
-          <w:b/>
-        </w:rPr>
-        <w:t>Transfer History:</w:t>
+        <w:t>**Transfer History:**</w:t>
       </w:r>
     </w:p>
     <w:p>
@@ -2659,10 +1659,7 @@
     <w:p>
       <w:pPr/>
       <w:r>
-        <w:rPr>
-          <w:b/>
-        </w:rPr>
-        <w:t>Expiring Items:</w:t>
+        <w:t>**Expiring Items:**</w:t>
       </w:r>
     </w:p>
     <w:p>
@@ -2682,28 +1679,7 @@
     <w:p>
       <w:pPr/>
       <w:r>
-        <w:rPr>
-          <w:b/>
-        </w:rPr>
-        <w:t>Where to go:</w:t>
-      </w:r>
-      <w:r>
-        <w:t xml:space="preserve"> Tap </w:t>
-      </w:r>
-      <w:r>
-        <w:rPr>
-          <w:b/>
-        </w:rPr>
-        <w:t>More</w:t>
-      </w:r>
-      <w:r>
-        <w:t xml:space="preserve"> → </w:t>
-      </w:r>
-      <w:r>
-        <w:rPr>
-          <w:b/>
-        </w:rPr>
-        <w:t>Batch Upload</w:t>
+        <w:t>**Where to go:** Tap **More** → **Batch Upload**</w:t>
       </w:r>
     </w:p>
     <w:p>
@@ -2715,10 +1691,7 @@
     <w:p>
       <w:pPr/>
       <w:r>
-        <w:rPr>
-          <w:b/>
-        </w:rPr>
-        <w:t>Uploading photos:</w:t>
+        <w:t>**Uploading photos:**</w:t>
       </w:r>
     </w:p>
     <w:p>
@@ -2734,13 +1707,7 @@
         <w:pStyle w:val="ListNumber"/>
       </w:pPr>
       <w:r>
-        <w:t xml:space="preserve">The app scans each photo automatically — it can find up to </w:t>
-      </w:r>
-      <w:r>
-        <w:rPr>
-          <w:b/>
-        </w:rPr>
-        <w:t>4 barcodes per image</w:t>
+        <w:t>The app scans each photo automatically — it can find up to **4 barcodes per image**</w:t>
       </w:r>
     </w:p>
     <w:p>
@@ -2754,10 +1721,7 @@
     <w:p>
       <w:pPr/>
       <w:r>
-        <w:rPr>
-          <w:b/>
-        </w:rPr>
-        <w:t>Uploading a CSV/Excel file:</w:t>
+        <w:t>**Uploading a CSV/Excel file:**</w:t>
       </w:r>
     </w:p>
     <w:p>
@@ -2793,10 +1757,7 @@
     <w:p>
       <w:pPr/>
       <w:r>
-        <w:rPr>
-          <w:b/>
-        </w:rPr>
-        <w:t>After uploading:</w:t>
+        <w:t>**After uploading:**</w:t>
       </w:r>
     </w:p>
     <w:p>
@@ -2828,16 +1789,7 @@
         <w:pStyle w:val="ListNumber"/>
       </w:pPr>
       <w:r>
-        <w:t xml:space="preserve">Tap </w:t>
-      </w:r>
-      <w:r>
-        <w:rPr>
-          <w:b/>
-        </w:rPr>
-        <w:t>Assign</w:t>
-      </w:r>
-      <w:r>
-        <w:t xml:space="preserve"> to save them</w:t>
+        <w:t>Tap **Assign** to save them</w:t>
       </w:r>
     </w:p>
     <w:p>
@@ -2851,28 +1803,7 @@
     <w:p>
       <w:pPr/>
       <w:r>
-        <w:rPr>
-          <w:b/>
-        </w:rPr>
-        <w:t>Where to go:</w:t>
-      </w:r>
-      <w:r>
-        <w:t xml:space="preserve"> Tap </w:t>
-      </w:r>
-      <w:r>
-        <w:rPr>
-          <w:b/>
-        </w:rPr>
-        <w:t>More</w:t>
-      </w:r>
-      <w:r>
-        <w:t xml:space="preserve"> → </w:t>
-      </w:r>
-      <w:r>
-        <w:rPr>
-          <w:b/>
-        </w:rPr>
-        <w:t>Distributors</w:t>
+        <w:t>**Where to go:** Tap **More** → **Distributors**</w:t>
       </w:r>
     </w:p>
     <w:p>
@@ -2910,13 +1841,7 @@
         <w:pStyle w:val="ListBullet"/>
       </w:pPr>
       <w:r>
-        <w:rPr>
-          <w:b/>
-        </w:rPr>
-        <w:t>Home Office</w:t>
-      </w:r>
-      <w:r>
-        <w:t xml:space="preserve"> is always the starting point — all items come here first before going anywhere else</w:t>
+        <w:t>**Home Office** is always the starting point — all items come here first before going anywhere else</w:t>
       </w:r>
     </w:p>
     <w:p>
@@ -2938,40 +1863,13 @@
     <w:p>
       <w:pPr/>
       <w:r>
-        <w:rPr>
-          <w:b/>
-        </w:rPr>
-        <w:t>Where to go:</w:t>
-      </w:r>
-      <w:r>
-        <w:t xml:space="preserve"> Tap </w:t>
-      </w:r>
-      <w:r>
-        <w:rPr>
-          <w:b/>
-        </w:rPr>
-        <w:t>More</w:t>
-      </w:r>
-      <w:r>
-        <w:t xml:space="preserve"> → </w:t>
-      </w:r>
-      <w:r>
-        <w:rPr>
-          <w:b/>
-        </w:rPr>
-        <w:t>User Management</w:t>
-      </w:r>
-      <w:r>
-        <w:t xml:space="preserve"> *(only visible to admins)*</w:t>
+        <w:t>**Where to go:** Tap **More** → **User Management** *(only visible to admins)*</w:t>
       </w:r>
     </w:p>
     <w:p>
       <w:pPr/>
       <w:r>
-        <w:rPr>
-          <w:b/>
-        </w:rPr>
-        <w:t>Adding a new user:</w:t>
+        <w:t>**Adding a new user:**</w:t>
       </w:r>
     </w:p>
     <w:p>
@@ -2979,13 +1877,7 @@
         <w:pStyle w:val="ListNumber"/>
       </w:pPr>
       <w:r>
-        <w:t xml:space="preserve">Tap </w:t>
-      </w:r>
-      <w:r>
-        <w:rPr>
-          <w:b/>
-        </w:rPr>
-        <w:t>Add User</w:t>
+        <w:t>Tap **Add User**</w:t>
       </w:r>
     </w:p>
     <w:p>
@@ -3006,30 +1898,18 @@
     </w:p>
     <w:p>
       <w:pPr>
-        <w:pStyle w:val="ListBullet2"/>
+        <w:pStyle w:val="ListBullet"/>
       </w:pPr>
       <w:r>
-        <w:rPr>
-          <w:b/>
-        </w:rPr>
-        <w:t>User</w:t>
-      </w:r>
-      <w:r>
-        <w:t xml:space="preserve"> — can view and manage inventory, but can't add or delete other users</w:t>
+        <w:t>**User** — can view and manage inventory, but can't add or delete other users</w:t>
       </w:r>
     </w:p>
     <w:p>
       <w:pPr>
-        <w:pStyle w:val="ListBullet2"/>
+        <w:pStyle w:val="ListBullet"/>
       </w:pPr>
       <w:r>
-        <w:rPr>
-          <w:b/>
-        </w:rPr>
-        <w:t>Admin</w:t>
-      </w:r>
-      <w:r>
-        <w:t xml:space="preserve"> — full access including User Management</w:t>
+        <w:t>**Admin** — full access including User Management</w:t>
       </w:r>
     </w:p>
     <w:p>
@@ -3037,22 +1917,13 @@
         <w:pStyle w:val="ListNumber"/>
       </w:pPr>
       <w:r>
-        <w:t xml:space="preserve">Tap </w:t>
-      </w:r>
-      <w:r>
-        <w:rPr>
-          <w:b/>
-        </w:rPr>
-        <w:t>Create User</w:t>
+        <w:t>Tap **Create User**</w:t>
       </w:r>
     </w:p>
     <w:p>
       <w:pPr/>
       <w:r>
-        <w:rPr>
-          <w:b/>
-        </w:rPr>
-        <w:t>Managing existing users:</w:t>
+        <w:t>**Managing existing users:**</w:t>
       </w:r>
     </w:p>
     <w:p>
@@ -3060,13 +1931,7 @@
         <w:pStyle w:val="ListBullet"/>
       </w:pPr>
       <w:r>
-        <w:rPr>
-          <w:b/>
-        </w:rPr>
-        <w:t>Change role:</w:t>
-      </w:r>
-      <w:r>
-        <w:t xml:space="preserve"> Tap the shield icon next to a user to switch them between User and Admin. (You can't change your own role.)</w:t>
+        <w:t>**Change role:** Tap the shield icon next to a user to switch them between User and Admin. (You can't change your own role.)</w:t>
       </w:r>
     </w:p>
     <w:p>
@@ -3074,13 +1939,7 @@
         <w:pStyle w:val="ListBullet"/>
       </w:pPr>
       <w:r>
-        <w:rPr>
-          <w:b/>
-        </w:rPr>
-        <w:t>Reset password:</w:t>
-      </w:r>
-      <w:r>
-        <w:t xml:space="preserve"> Tap the key icon next to a user and enter a new password</w:t>
+        <w:t>**Reset password:** Tap the key icon next to a user and enter a new password</w:t>
       </w:r>
     </w:p>
     <w:p>
@@ -3088,13 +1947,7 @@
         <w:pStyle w:val="ListBullet"/>
       </w:pPr>
       <w:r>
-        <w:rPr>
-          <w:b/>
-        </w:rPr>
-        <w:t>Delete user:</w:t>
-      </w:r>
-      <w:r>
-        <w:t xml:space="preserve"> Tap the trash icon. You can't delete yourself or the last remaining admin.</w:t>
+        <w:t>**Delete user:** Tap the trash icon. You can't delete yourself or the last remaining admin.</w:t>
       </w:r>
     </w:p>
     <w:p>
@@ -3108,16 +1961,7 @@
     <w:p>
       <w:pPr/>
       <w:r>
-        <w:t xml:space="preserve">Nail Tracker reads </w:t>
-      </w:r>
-      <w:r>
-        <w:rPr>
-          <w:b/>
-        </w:rPr>
-        <w:t>GS1-128 barcodes</w:t>
-      </w:r>
-      <w:r>
-        <w:t xml:space="preserve"> — the standard format used on medical device packaging. Each barcode contains several pieces of information identified by a two-digit code called an Application Identifier (AI).</w:t>
+        <w:t>Nail Tracker reads **GS1-128 barcodes** — the standard format used on medical device packaging. Each barcode contains several pieces of information identified by a two-digit code called an Application Identifier (AI).</w:t>
       </w:r>
     </w:p>
     <w:tbl>
@@ -3127,73 +1971,37 @@
         <w:tblLook w:firstColumn="1" w:firstRow="1" w:lastColumn="0" w:lastRow="0" w:noHBand="0" w:noVBand="1" w:val="04A0"/>
       </w:tblPr>
       <w:tblGrid>
-        <w:gridCol w:w="3024"/>
-        <w:gridCol w:w="3024"/>
-        <w:gridCol w:w="3024"/>
+        <w:gridCol w:w="2880"/>
+        <w:gridCol w:w="2880"/>
+        <w:gridCol w:w="2880"/>
       </w:tblGrid>
       <w:tr>
         <w:tc>
           <w:tcPr>
-            <w:tcW w:type="dxa" w:w="3024"/>
-            <w:shd w:val="clear" w:color="auto" w:fill="2E74B5"/>
-            <w:tcBorders>
-              <w:top w:val="single" w:sz="4" w:space="0" w:color="AAAAAA"/>
-              <w:left w:val="single" w:sz="4" w:space="0" w:color="AAAAAA"/>
-              <w:bottom w:val="single" w:sz="4" w:space="0" w:color="AAAAAA"/>
-              <w:right w:val="single" w:sz="4" w:space="0" w:color="AAAAAA"/>
-            </w:tcBorders>
+            <w:tcW w:type="dxa" w:w="2880"/>
           </w:tcPr>
           <w:p>
             <w:r>
-              <w:rPr>
-                <w:b/>
-                <w:color w:val="FFFFFF"/>
-                <w:sz w:val="20"/>
-              </w:rPr>
               <w:t>AI Code</w:t>
             </w:r>
           </w:p>
         </w:tc>
         <w:tc>
           <w:tcPr>
-            <w:tcW w:type="dxa" w:w="3024"/>
-            <w:shd w:val="clear" w:color="auto" w:fill="2E74B5"/>
-            <w:tcBorders>
-              <w:top w:val="single" w:sz="4" w:space="0" w:color="AAAAAA"/>
-              <w:left w:val="single" w:sz="4" w:space="0" w:color="AAAAAA"/>
-              <w:bottom w:val="single" w:sz="4" w:space="0" w:color="AAAAAA"/>
-              <w:right w:val="single" w:sz="4" w:space="0" w:color="AAAAAA"/>
-            </w:tcBorders>
+            <w:tcW w:type="dxa" w:w="2880"/>
           </w:tcPr>
           <w:p>
             <w:r>
-              <w:rPr>
-                <w:b/>
-                <w:color w:val="FFFFFF"/>
-                <w:sz w:val="20"/>
-              </w:rPr>
               <w:t>What It Contains</w:t>
             </w:r>
           </w:p>
         </w:tc>
         <w:tc>
           <w:tcPr>
-            <w:tcW w:type="dxa" w:w="3024"/>
-            <w:shd w:val="clear" w:color="auto" w:fill="2E74B5"/>
-            <w:tcBorders>
-              <w:top w:val="single" w:sz="4" w:space="0" w:color="AAAAAA"/>
-              <w:left w:val="single" w:sz="4" w:space="0" w:color="AAAAAA"/>
-              <w:bottom w:val="single" w:sz="4" w:space="0" w:color="AAAAAA"/>
-              <w:right w:val="single" w:sz="4" w:space="0" w:color="AAAAAA"/>
-            </w:tcBorders>
+            <w:tcW w:type="dxa" w:w="2880"/>
           </w:tcPr>
           <w:p>
             <w:r>
-              <w:rPr>
-                <w:b/>
-                <w:color w:val="FFFFFF"/>
-                <w:sz w:val="20"/>
-              </w:rPr>
               <w:t>Example</w:t>
             </w:r>
           </w:p>
@@ -3202,60 +2010,30 @@
       <w:tr>
         <w:tc>
           <w:tcPr>
-            <w:tcW w:type="dxa" w:w="3024"/>
-            <w:shd w:val="clear" w:color="auto" w:fill="F2F7FC"/>
-            <w:tcBorders>
-              <w:top w:val="single" w:sz="4" w:space="0" w:color="AAAAAA"/>
-              <w:left w:val="single" w:sz="4" w:space="0" w:color="AAAAAA"/>
-              <w:bottom w:val="single" w:sz="4" w:space="0" w:color="AAAAAA"/>
-              <w:right w:val="single" w:sz="4" w:space="0" w:color="AAAAAA"/>
-            </w:tcBorders>
+            <w:tcW w:type="dxa" w:w="2880"/>
           </w:tcPr>
           <w:p>
             <w:r>
-              <w:rPr>
-                <w:sz w:val="20"/>
-              </w:rPr>
               <w:t>01</w:t>
             </w:r>
           </w:p>
         </w:tc>
         <w:tc>
           <w:tcPr>
-            <w:tcW w:type="dxa" w:w="3024"/>
-            <w:shd w:val="clear" w:color="auto" w:fill="F2F7FC"/>
-            <w:tcBorders>
-              <w:top w:val="single" w:sz="4" w:space="0" w:color="AAAAAA"/>
-              <w:left w:val="single" w:sz="4" w:space="0" w:color="AAAAAA"/>
-              <w:bottom w:val="single" w:sz="4" w:space="0" w:color="AAAAAA"/>
-              <w:right w:val="single" w:sz="4" w:space="0" w:color="AAAAAA"/>
-            </w:tcBorders>
+            <w:tcW w:type="dxa" w:w="2880"/>
           </w:tcPr>
           <w:p>
             <w:r>
-              <w:rPr>
-                <w:sz w:val="20"/>
-              </w:rPr>
               <w:t>GTIN (product code, 14 digits)</w:t>
             </w:r>
           </w:p>
         </w:tc>
         <w:tc>
           <w:tcPr>
-            <w:tcW w:type="dxa" w:w="3024"/>
-            <w:shd w:val="clear" w:color="auto" w:fill="F2F7FC"/>
-            <w:tcBorders>
-              <w:top w:val="single" w:sz="4" w:space="0" w:color="AAAAAA"/>
-              <w:left w:val="single" w:sz="4" w:space="0" w:color="AAAAAA"/>
-              <w:bottom w:val="single" w:sz="4" w:space="0" w:color="AAAAAA"/>
-              <w:right w:val="single" w:sz="4" w:space="0" w:color="AAAAAA"/>
-            </w:tcBorders>
+            <w:tcW w:type="dxa" w:w="2880"/>
           </w:tcPr>
           <w:p>
             <w:r>
-              <w:rPr>
-                <w:sz w:val="20"/>
-              </w:rPr>
               <w:t>08880089459148</w:t>
             </w:r>
           </w:p>
@@ -3264,60 +2042,30 @@
       <w:tr>
         <w:tc>
           <w:tcPr>
-            <w:tcW w:type="dxa" w:w="3024"/>
-            <w:shd w:val="clear" w:color="auto" w:fill="FFFFFF"/>
-            <w:tcBorders>
-              <w:top w:val="single" w:sz="4" w:space="0" w:color="AAAAAA"/>
-              <w:left w:val="single" w:sz="4" w:space="0" w:color="AAAAAA"/>
-              <w:bottom w:val="single" w:sz="4" w:space="0" w:color="AAAAAA"/>
-              <w:right w:val="single" w:sz="4" w:space="0" w:color="AAAAAA"/>
-            </w:tcBorders>
+            <w:tcW w:type="dxa" w:w="2880"/>
           </w:tcPr>
           <w:p>
             <w:r>
-              <w:rPr>
-                <w:sz w:val="20"/>
-              </w:rPr>
               <w:t>10</w:t>
             </w:r>
           </w:p>
         </w:tc>
         <w:tc>
           <w:tcPr>
-            <w:tcW w:type="dxa" w:w="3024"/>
-            <w:shd w:val="clear" w:color="auto" w:fill="FFFFFF"/>
-            <w:tcBorders>
-              <w:top w:val="single" w:sz="4" w:space="0" w:color="AAAAAA"/>
-              <w:left w:val="single" w:sz="4" w:space="0" w:color="AAAAAA"/>
-              <w:bottom w:val="single" w:sz="4" w:space="0" w:color="AAAAAA"/>
-              <w:right w:val="single" w:sz="4" w:space="0" w:color="AAAAAA"/>
-            </w:tcBorders>
+            <w:tcW w:type="dxa" w:w="2880"/>
           </w:tcPr>
           <w:p>
             <w:r>
-              <w:rPr>
-                <w:sz w:val="20"/>
-              </w:rPr>
               <w:t>Lot number</w:t>
             </w:r>
           </w:p>
         </w:tc>
         <w:tc>
           <w:tcPr>
-            <w:tcW w:type="dxa" w:w="3024"/>
-            <w:shd w:val="clear" w:color="auto" w:fill="FFFFFF"/>
-            <w:tcBorders>
-              <w:top w:val="single" w:sz="4" w:space="0" w:color="AAAAAA"/>
-              <w:left w:val="single" w:sz="4" w:space="0" w:color="AAAAAA"/>
-              <w:bottom w:val="single" w:sz="4" w:space="0" w:color="AAAAAA"/>
-              <w:right w:val="single" w:sz="4" w:space="0" w:color="AAAAAA"/>
-            </w:tcBorders>
+            <w:tcW w:type="dxa" w:w="2880"/>
           </w:tcPr>
           <w:p>
             <w:r>
-              <w:rPr>
-                <w:sz w:val="20"/>
-              </w:rPr>
               <w:t>J250929-L021</w:t>
             </w:r>
           </w:p>
@@ -3326,84 +2074,46 @@
       <w:tr>
         <w:tc>
           <w:tcPr>
-            <w:tcW w:type="dxa" w:w="3024"/>
-            <w:shd w:val="clear" w:color="auto" w:fill="F2F7FC"/>
-            <w:tcBorders>
-              <w:top w:val="single" w:sz="4" w:space="0" w:color="AAAAAA"/>
-              <w:left w:val="single" w:sz="4" w:space="0" w:color="AAAAAA"/>
-              <w:bottom w:val="single" w:sz="4" w:space="0" w:color="AAAAAA"/>
-              <w:right w:val="single" w:sz="4" w:space="0" w:color="AAAAAA"/>
-            </w:tcBorders>
+            <w:tcW w:type="dxa" w:w="2880"/>
           </w:tcPr>
           <w:p>
             <w:r>
-              <w:rPr>
-                <w:sz w:val="20"/>
-              </w:rPr>
               <w:t>17</w:t>
             </w:r>
           </w:p>
         </w:tc>
         <w:tc>
           <w:tcPr>
-            <w:tcW w:type="dxa" w:w="3024"/>
-            <w:shd w:val="clear" w:color="auto" w:fill="F2F7FC"/>
-            <w:tcBorders>
-              <w:top w:val="single" w:sz="4" w:space="0" w:color="AAAAAA"/>
-              <w:left w:val="single" w:sz="4" w:space="0" w:color="AAAAAA"/>
-              <w:bottom w:val="single" w:sz="4" w:space="0" w:color="AAAAAA"/>
-              <w:right w:val="single" w:sz="4" w:space="0" w:color="AAAAAA"/>
-            </w:tcBorders>
+            <w:tcW w:type="dxa" w:w="2880"/>
           </w:tcPr>
           <w:p>
             <w:r>
-              <w:rPr>
-                <w:sz w:val="20"/>
-              </w:rPr>
               <w:t>Expiry date (YYMMDD format)</w:t>
             </w:r>
           </w:p>
         </w:tc>
         <w:tc>
           <w:tcPr>
-            <w:tcW w:type="dxa" w:w="3024"/>
-            <w:shd w:val="clear" w:color="auto" w:fill="F2F7FC"/>
-            <w:tcBorders>
-              <w:top w:val="single" w:sz="4" w:space="0" w:color="AAAAAA"/>
-              <w:left w:val="single" w:sz="4" w:space="0" w:color="AAAAAA"/>
-              <w:bottom w:val="single" w:sz="4" w:space="0" w:color="AAAAAA"/>
-              <w:right w:val="single" w:sz="4" w:space="0" w:color="AAAAAA"/>
-            </w:tcBorders>
+            <w:tcW w:type="dxa" w:w="2880"/>
           </w:tcPr>
           <w:p>
             <w:r>
-              <w:rPr>
-                <w:sz w:val="20"/>
-              </w:rPr>
               <w:t>300928 = Sept 28, 2030</w:t>
             </w:r>
           </w:p>
         </w:tc>
       </w:tr>
     </w:tbl>
-    <w:p/>
     <w:p>
       <w:pPr/>
       <w:r>
-        <w:rPr>
-          <w:b/>
-        </w:rPr>
-        <w:t>What a full barcode string looks like:</w:t>
+        <w:t>**What a full barcode string looks like:**</w:t>
       </w:r>
     </w:p>
     <w:p>
       <w:pPr/>
       <w:r>
-        <w:rPr>
-          <w:rFonts w:ascii="Courier New" w:hAnsi="Courier New"/>
-          <w:sz w:val="18"/>
-        </w:rPr>
-        <w:t>(01)08880089459148(10)J250929-L021(17)300928</w:t>
+        <w:t>`(01)08880089459148(10)J250929-L021(17)300928`</w:t>
       </w:r>
     </w:p>
     <w:p>
@@ -3415,10 +2125,7 @@
     <w:p>
       <w:pPr/>
       <w:r>
-        <w:rPr>
-          <w:b/>
-        </w:rPr>
-        <w:t>Product REF Code Reference:</w:t>
+        <w:t>**Product REF Code Reference:**</w:t>
       </w:r>
     </w:p>
     <w:p>
@@ -3434,50 +2141,26 @@
         <w:tblLook w:firstColumn="1" w:firstRow="1" w:lastColumn="0" w:lastRow="0" w:noHBand="0" w:noVBand="1" w:val="04A0"/>
       </w:tblPr>
       <w:tblGrid>
-        <w:gridCol w:w="4536"/>
-        <w:gridCol w:w="4536"/>
+        <w:gridCol w:w="4320"/>
+        <w:gridCol w:w="4320"/>
       </w:tblGrid>
       <w:tr>
         <w:tc>
           <w:tcPr>
-            <w:tcW w:type="dxa" w:w="4536"/>
-            <w:shd w:val="clear" w:color="auto" w:fill="2E74B5"/>
-            <w:tcBorders>
-              <w:top w:val="single" w:sz="4" w:space="0" w:color="AAAAAA"/>
-              <w:left w:val="single" w:sz="4" w:space="0" w:color="AAAAAA"/>
-              <w:bottom w:val="single" w:sz="4" w:space="0" w:color="AAAAAA"/>
-              <w:right w:val="single" w:sz="4" w:space="0" w:color="AAAAAA"/>
-            </w:tcBorders>
+            <w:tcW w:type="dxa" w:w="4320"/>
           </w:tcPr>
           <w:p>
             <w:r>
-              <w:rPr>
-                <w:b/>
-                <w:color w:val="FFFFFF"/>
-                <w:sz w:val="20"/>
-              </w:rPr>
               <w:t>REF Prefix</w:t>
             </w:r>
           </w:p>
         </w:tc>
         <w:tc>
           <w:tcPr>
-            <w:tcW w:type="dxa" w:w="4536"/>
-            <w:shd w:val="clear" w:color="auto" w:fill="2E74B5"/>
-            <w:tcBorders>
-              <w:top w:val="single" w:sz="4" w:space="0" w:color="AAAAAA"/>
-              <w:left w:val="single" w:sz="4" w:space="0" w:color="AAAAAA"/>
-              <w:bottom w:val="single" w:sz="4" w:space="0" w:color="AAAAAA"/>
-              <w:right w:val="single" w:sz="4" w:space="0" w:color="AAAAAA"/>
-            </w:tcBorders>
+            <w:tcW w:type="dxa" w:w="4320"/>
           </w:tcPr>
           <w:p>
             <w:r>
-              <w:rPr>
-                <w:b/>
-                <w:color w:val="FFFFFF"/>
-                <w:sz w:val="20"/>
-              </w:rPr>
               <w:t>Product Type</w:t>
             </w:r>
           </w:p>
@@ -3486,40 +2169,20 @@
       <w:tr>
         <w:tc>
           <w:tcPr>
-            <w:tcW w:type="dxa" w:w="4536"/>
-            <w:shd w:val="clear" w:color="auto" w:fill="F2F7FC"/>
-            <w:tcBorders>
-              <w:top w:val="single" w:sz="4" w:space="0" w:color="AAAAAA"/>
-              <w:left w:val="single" w:sz="4" w:space="0" w:color="AAAAAA"/>
-              <w:bottom w:val="single" w:sz="4" w:space="0" w:color="AAAAAA"/>
-              <w:right w:val="single" w:sz="4" w:space="0" w:color="AAAAAA"/>
-            </w:tcBorders>
+            <w:tcW w:type="dxa" w:w="4320"/>
           </w:tcPr>
           <w:p>
             <w:r>
-              <w:rPr>
-                <w:sz w:val="20"/>
-              </w:rPr>
               <w:t>SO-SPFN</w:t>
             </w:r>
           </w:p>
         </w:tc>
         <w:tc>
           <w:tcPr>
-            <w:tcW w:type="dxa" w:w="4536"/>
-            <w:shd w:val="clear" w:color="auto" w:fill="F2F7FC"/>
-            <w:tcBorders>
-              <w:top w:val="single" w:sz="4" w:space="0" w:color="AAAAAA"/>
-              <w:left w:val="single" w:sz="4" w:space="0" w:color="AAAAAA"/>
-              <w:bottom w:val="single" w:sz="4" w:space="0" w:color="AAAAAA"/>
-              <w:right w:val="single" w:sz="4" w:space="0" w:color="AAAAAA"/>
-            </w:tcBorders>
+            <w:tcW w:type="dxa" w:w="4320"/>
           </w:tcPr>
           <w:p>
             <w:r>
-              <w:rPr>
-                <w:sz w:val="20"/>
-              </w:rPr>
               <w:t>Short Femoral Nail</w:t>
             </w:r>
           </w:p>
@@ -3528,40 +2191,20 @@
       <w:tr>
         <w:tc>
           <w:tcPr>
-            <w:tcW w:type="dxa" w:w="4536"/>
-            <w:shd w:val="clear" w:color="auto" w:fill="FFFFFF"/>
-            <w:tcBorders>
-              <w:top w:val="single" w:sz="4" w:space="0" w:color="AAAAAA"/>
-              <w:left w:val="single" w:sz="4" w:space="0" w:color="AAAAAA"/>
-              <w:bottom w:val="single" w:sz="4" w:space="0" w:color="AAAAAA"/>
-              <w:right w:val="single" w:sz="4" w:space="0" w:color="AAAAAA"/>
-            </w:tcBorders>
+            <w:tcW w:type="dxa" w:w="4320"/>
           </w:tcPr>
           <w:p>
             <w:r>
-              <w:rPr>
-                <w:sz w:val="20"/>
-              </w:rPr>
               <w:t>SO-LPFN</w:t>
             </w:r>
           </w:p>
         </w:tc>
         <w:tc>
           <w:tcPr>
-            <w:tcW w:type="dxa" w:w="4536"/>
-            <w:shd w:val="clear" w:color="auto" w:fill="FFFFFF"/>
-            <w:tcBorders>
-              <w:top w:val="single" w:sz="4" w:space="0" w:color="AAAAAA"/>
-              <w:left w:val="single" w:sz="4" w:space="0" w:color="AAAAAA"/>
-              <w:bottom w:val="single" w:sz="4" w:space="0" w:color="AAAAAA"/>
-              <w:right w:val="single" w:sz="4" w:space="0" w:color="AAAAAA"/>
-            </w:tcBorders>
+            <w:tcW w:type="dxa" w:w="4320"/>
           </w:tcPr>
           <w:p>
             <w:r>
-              <w:rPr>
-                <w:sz w:val="20"/>
-              </w:rPr>
               <w:t>Long Femoral Nail</w:t>
             </w:r>
           </w:p>
@@ -3570,40 +2213,20 @@
       <w:tr>
         <w:tc>
           <w:tcPr>
-            <w:tcW w:type="dxa" w:w="4536"/>
-            <w:shd w:val="clear" w:color="auto" w:fill="F2F7FC"/>
-            <w:tcBorders>
-              <w:top w:val="single" w:sz="4" w:space="0" w:color="AAAAAA"/>
-              <w:left w:val="single" w:sz="4" w:space="0" w:color="AAAAAA"/>
-              <w:bottom w:val="single" w:sz="4" w:space="0" w:color="AAAAAA"/>
-              <w:right w:val="single" w:sz="4" w:space="0" w:color="AAAAAA"/>
-            </w:tcBorders>
+            <w:tcW w:type="dxa" w:w="4320"/>
           </w:tcPr>
           <w:p>
             <w:r>
-              <w:rPr>
-                <w:sz w:val="20"/>
-              </w:rPr>
               <w:t>SO-SPFL-N</w:t>
             </w:r>
           </w:p>
         </w:tc>
         <w:tc>
           <w:tcPr>
-            <w:tcW w:type="dxa" w:w="4536"/>
-            <w:shd w:val="clear" w:color="auto" w:fill="F2F7FC"/>
-            <w:tcBorders>
-              <w:top w:val="single" w:sz="4" w:space="0" w:color="AAAAAA"/>
-              <w:left w:val="single" w:sz="4" w:space="0" w:color="AAAAAA"/>
-              <w:bottom w:val="single" w:sz="4" w:space="0" w:color="AAAAAA"/>
-              <w:right w:val="single" w:sz="4" w:space="0" w:color="AAAAAA"/>
-            </w:tcBorders>
+            <w:tcW w:type="dxa" w:w="4320"/>
           </w:tcPr>
           <w:p>
             <w:r>
-              <w:rPr>
-                <w:sz w:val="20"/>
-              </w:rPr>
               <w:t>Lag Screw (Normal)</w:t>
             </w:r>
           </w:p>
@@ -3612,40 +2235,20 @@
       <w:tr>
         <w:tc>
           <w:tcPr>
-            <w:tcW w:type="dxa" w:w="4536"/>
-            <w:shd w:val="clear" w:color="auto" w:fill="FFFFFF"/>
-            <w:tcBorders>
-              <w:top w:val="single" w:sz="4" w:space="0" w:color="AAAAAA"/>
-              <w:left w:val="single" w:sz="4" w:space="0" w:color="AAAAAA"/>
-              <w:bottom w:val="single" w:sz="4" w:space="0" w:color="AAAAAA"/>
-              <w:right w:val="single" w:sz="4" w:space="0" w:color="AAAAAA"/>
-            </w:tcBorders>
+            <w:tcW w:type="dxa" w:w="4320"/>
           </w:tcPr>
           <w:p>
             <w:r>
-              <w:rPr>
-                <w:sz w:val="20"/>
-              </w:rPr>
               <w:t>SO-SPFL-A</w:t>
             </w:r>
           </w:p>
         </w:tc>
         <w:tc>
           <w:tcPr>
-            <w:tcW w:type="dxa" w:w="4536"/>
-            <w:shd w:val="clear" w:color="auto" w:fill="FFFFFF"/>
-            <w:tcBorders>
-              <w:top w:val="single" w:sz="4" w:space="0" w:color="AAAAAA"/>
-              <w:left w:val="single" w:sz="4" w:space="0" w:color="AAAAAA"/>
-              <w:bottom w:val="single" w:sz="4" w:space="0" w:color="AAAAAA"/>
-              <w:right w:val="single" w:sz="4" w:space="0" w:color="AAAAAA"/>
-            </w:tcBorders>
+            <w:tcW w:type="dxa" w:w="4320"/>
           </w:tcPr>
           <w:p>
             <w:r>
-              <w:rPr>
-                <w:sz w:val="20"/>
-              </w:rPr>
               <w:t>Lag Screw (Anti-Rotation)</w:t>
             </w:r>
           </w:p>
@@ -3654,40 +2257,20 @@
       <w:tr>
         <w:tc>
           <w:tcPr>
-            <w:tcW w:type="dxa" w:w="4536"/>
-            <w:shd w:val="clear" w:color="auto" w:fill="F2F7FC"/>
-            <w:tcBorders>
-              <w:top w:val="single" w:sz="4" w:space="0" w:color="AAAAAA"/>
-              <w:left w:val="single" w:sz="4" w:space="0" w:color="AAAAAA"/>
-              <w:bottom w:val="single" w:sz="4" w:space="0" w:color="AAAAAA"/>
-              <w:right w:val="single" w:sz="4" w:space="0" w:color="AAAAAA"/>
-            </w:tcBorders>
+            <w:tcW w:type="dxa" w:w="4320"/>
           </w:tcPr>
           <w:p>
             <w:r>
-              <w:rPr>
-                <w:sz w:val="20"/>
-              </w:rPr>
               <w:t>SO-SPFL-T</w:t>
             </w:r>
           </w:p>
         </w:tc>
         <w:tc>
           <w:tcPr>
-            <w:tcW w:type="dxa" w:w="4536"/>
-            <w:shd w:val="clear" w:color="auto" w:fill="F2F7FC"/>
-            <w:tcBorders>
-              <w:top w:val="single" w:sz="4" w:space="0" w:color="AAAAAA"/>
-              <w:left w:val="single" w:sz="4" w:space="0" w:color="AAAAAA"/>
-              <w:bottom w:val="single" w:sz="4" w:space="0" w:color="AAAAAA"/>
-              <w:right w:val="single" w:sz="4" w:space="0" w:color="AAAAAA"/>
-            </w:tcBorders>
+            <w:tcW w:type="dxa" w:w="4320"/>
           </w:tcPr>
           <w:p>
             <w:r>
-              <w:rPr>
-                <w:sz w:val="20"/>
-              </w:rPr>
               <w:t>Lag Screw (Telescopic)</w:t>
             </w:r>
           </w:p>
@@ -3696,40 +2279,20 @@
       <w:tr>
         <w:tc>
           <w:tcPr>
-            <w:tcW w:type="dxa" w:w="4536"/>
-            <w:shd w:val="clear" w:color="auto" w:fill="FFFFFF"/>
-            <w:tcBorders>
-              <w:top w:val="single" w:sz="4" w:space="0" w:color="AAAAAA"/>
-              <w:left w:val="single" w:sz="4" w:space="0" w:color="AAAAAA"/>
-              <w:bottom w:val="single" w:sz="4" w:space="0" w:color="AAAAAA"/>
-              <w:right w:val="single" w:sz="4" w:space="0" w:color="AAAAAA"/>
-            </w:tcBorders>
+            <w:tcW w:type="dxa" w:w="4320"/>
           </w:tcPr>
           <w:p>
             <w:r>
-              <w:rPr>
-                <w:sz w:val="20"/>
-              </w:rPr>
               <w:t>SO-S50I-SO</w:t>
             </w:r>
           </w:p>
         </w:tc>
         <w:tc>
           <w:tcPr>
-            <w:tcW w:type="dxa" w:w="4536"/>
-            <w:shd w:val="clear" w:color="auto" w:fill="FFFFFF"/>
-            <w:tcBorders>
-              <w:top w:val="single" w:sz="4" w:space="0" w:color="AAAAAA"/>
-              <w:left w:val="single" w:sz="4" w:space="0" w:color="AAAAAA"/>
-              <w:bottom w:val="single" w:sz="4" w:space="0" w:color="AAAAAA"/>
-              <w:right w:val="single" w:sz="4" w:space="0" w:color="AAAAAA"/>
-            </w:tcBorders>
+            <w:tcW w:type="dxa" w:w="4320"/>
           </w:tcPr>
           <w:p>
             <w:r>
-              <w:rPr>
-                <w:sz w:val="20"/>
-              </w:rPr>
               <w:t>Interlocking Screw</w:t>
             </w:r>
           </w:p>
@@ -3738,40 +2301,20 @@
       <w:tr>
         <w:tc>
           <w:tcPr>
-            <w:tcW w:type="dxa" w:w="4536"/>
-            <w:shd w:val="clear" w:color="auto" w:fill="F2F7FC"/>
-            <w:tcBorders>
-              <w:top w:val="single" w:sz="4" w:space="0" w:color="AAAAAA"/>
-              <w:left w:val="single" w:sz="4" w:space="0" w:color="AAAAAA"/>
-              <w:bottom w:val="single" w:sz="4" w:space="0" w:color="AAAAAA"/>
-              <w:right w:val="single" w:sz="4" w:space="0" w:color="AAAAAA"/>
-            </w:tcBorders>
+            <w:tcW w:type="dxa" w:w="4320"/>
           </w:tcPr>
           <w:p>
             <w:r>
-              <w:rPr>
-                <w:sz w:val="20"/>
-              </w:rPr>
               <w:t>SO-SPFC</w:t>
             </w:r>
           </w:p>
         </w:tc>
         <w:tc>
           <w:tcPr>
-            <w:tcW w:type="dxa" w:w="4536"/>
-            <w:shd w:val="clear" w:color="auto" w:fill="F2F7FC"/>
-            <w:tcBorders>
-              <w:top w:val="single" w:sz="4" w:space="0" w:color="AAAAAA"/>
-              <w:left w:val="single" w:sz="4" w:space="0" w:color="AAAAAA"/>
-              <w:bottom w:val="single" w:sz="4" w:space="0" w:color="AAAAAA"/>
-              <w:right w:val="single" w:sz="4" w:space="0" w:color="AAAAAA"/>
-            </w:tcBorders>
+            <w:tcW w:type="dxa" w:w="4320"/>
           </w:tcPr>
           <w:p>
             <w:r>
-              <w:rPr>
-                <w:sz w:val="20"/>
-              </w:rPr>
               <w:t>Cap Screw</w:t>
             </w:r>
           </w:p>
@@ -3780,40 +2323,20 @@
       <w:tr>
         <w:tc>
           <w:tcPr>
-            <w:tcW w:type="dxa" w:w="4536"/>
-            <w:shd w:val="clear" w:color="auto" w:fill="FFFFFF"/>
-            <w:tcBorders>
-              <w:top w:val="single" w:sz="4" w:space="0" w:color="AAAAAA"/>
-              <w:left w:val="single" w:sz="4" w:space="0" w:color="AAAAAA"/>
-              <w:bottom w:val="single" w:sz="4" w:space="0" w:color="AAAAAA"/>
-              <w:right w:val="single" w:sz="4" w:space="0" w:color="AAAAAA"/>
-            </w:tcBorders>
+            <w:tcW w:type="dxa" w:w="4320"/>
           </w:tcPr>
           <w:p>
             <w:r>
-              <w:rPr>
-                <w:sz w:val="20"/>
-              </w:rPr>
               <w:t>SO-SPFS</w:t>
             </w:r>
           </w:p>
         </w:tc>
         <w:tc>
           <w:tcPr>
-            <w:tcW w:type="dxa" w:w="4536"/>
-            <w:shd w:val="clear" w:color="auto" w:fill="FFFFFF"/>
-            <w:tcBorders>
-              <w:top w:val="single" w:sz="4" w:space="0" w:color="AAAAAA"/>
-              <w:left w:val="single" w:sz="4" w:space="0" w:color="AAAAAA"/>
-              <w:bottom w:val="single" w:sz="4" w:space="0" w:color="AAAAAA"/>
-              <w:right w:val="single" w:sz="4" w:space="0" w:color="AAAAAA"/>
-            </w:tcBorders>
+            <w:tcW w:type="dxa" w:w="4320"/>
           </w:tcPr>
           <w:p>
             <w:r>
-              <w:rPr>
-                <w:sz w:val="20"/>
-              </w:rPr>
               <w:t>Set Screw</w:t>
             </w:r>
           </w:p>
@@ -3822,40 +2345,20 @@
       <w:tr>
         <w:tc>
           <w:tcPr>
-            <w:tcW w:type="dxa" w:w="4536"/>
-            <w:shd w:val="clear" w:color="auto" w:fill="F2F7FC"/>
-            <w:tcBorders>
-              <w:top w:val="single" w:sz="4" w:space="0" w:color="AAAAAA"/>
-              <w:left w:val="single" w:sz="4" w:space="0" w:color="AAAAAA"/>
-              <w:bottom w:val="single" w:sz="4" w:space="0" w:color="AAAAAA"/>
-              <w:right w:val="single" w:sz="4" w:space="0" w:color="AAAAAA"/>
-            </w:tcBorders>
+            <w:tcW w:type="dxa" w:w="4320"/>
           </w:tcPr>
           <w:p>
             <w:r>
-              <w:rPr>
-                <w:sz w:val="20"/>
-              </w:rPr>
               <w:t>SO-IS</w:t>
             </w:r>
           </w:p>
         </w:tc>
         <w:tc>
           <w:tcPr>
-            <w:tcW w:type="dxa" w:w="4536"/>
-            <w:shd w:val="clear" w:color="auto" w:fill="F2F7FC"/>
-            <w:tcBorders>
-              <w:top w:val="single" w:sz="4" w:space="0" w:color="AAAAAA"/>
-              <w:left w:val="single" w:sz="4" w:space="0" w:color="AAAAAA"/>
-              <w:bottom w:val="single" w:sz="4" w:space="0" w:color="AAAAAA"/>
-              <w:right w:val="single" w:sz="4" w:space="0" w:color="AAAAAA"/>
-            </w:tcBorders>
+            <w:tcW w:type="dxa" w:w="4320"/>
           </w:tcPr>
           <w:p>
             <w:r>
-              <w:rPr>
-                <w:sz w:val="20"/>
-              </w:rPr>
               <w:t>Interlocking Screw (older label format)</w:t>
             </w:r>
           </w:p>
@@ -3864,40 +2367,20 @@
       <w:tr>
         <w:tc>
           <w:tcPr>
-            <w:tcW w:type="dxa" w:w="4536"/>
-            <w:shd w:val="clear" w:color="auto" w:fill="FFFFFF"/>
-            <w:tcBorders>
-              <w:top w:val="single" w:sz="4" w:space="0" w:color="AAAAAA"/>
-              <w:left w:val="single" w:sz="4" w:space="0" w:color="AAAAAA"/>
-              <w:bottom w:val="single" w:sz="4" w:space="0" w:color="AAAAAA"/>
-              <w:right w:val="single" w:sz="4" w:space="0" w:color="AAAAAA"/>
-            </w:tcBorders>
+            <w:tcW w:type="dxa" w:w="4320"/>
           </w:tcPr>
           <w:p>
             <w:r>
-              <w:rPr>
-                <w:sz w:val="20"/>
-              </w:rPr>
               <w:t>SO-EC</w:t>
             </w:r>
           </w:p>
         </w:tc>
         <w:tc>
           <w:tcPr>
-            <w:tcW w:type="dxa" w:w="4536"/>
-            <w:shd w:val="clear" w:color="auto" w:fill="FFFFFF"/>
-            <w:tcBorders>
-              <w:top w:val="single" w:sz="4" w:space="0" w:color="AAAAAA"/>
-              <w:left w:val="single" w:sz="4" w:space="0" w:color="AAAAAA"/>
-              <w:bottom w:val="single" w:sz="4" w:space="0" w:color="AAAAAA"/>
-              <w:right w:val="single" w:sz="4" w:space="0" w:color="AAAAAA"/>
-            </w:tcBorders>
+            <w:tcW w:type="dxa" w:w="4320"/>
           </w:tcPr>
           <w:p>
             <w:r>
-              <w:rPr>
-                <w:sz w:val="20"/>
-              </w:rPr>
               <w:t>End Cap (older label format)</w:t>
             </w:r>
           </w:p>
@@ -3906,60 +2389,30 @@
       <w:tr>
         <w:tc>
           <w:tcPr>
-            <w:tcW w:type="dxa" w:w="4536"/>
-            <w:shd w:val="clear" w:color="auto" w:fill="F2F7FC"/>
-            <w:tcBorders>
-              <w:top w:val="single" w:sz="4" w:space="0" w:color="AAAAAA"/>
-              <w:left w:val="single" w:sz="4" w:space="0" w:color="AAAAAA"/>
-              <w:bottom w:val="single" w:sz="4" w:space="0" w:color="AAAAAA"/>
-              <w:right w:val="single" w:sz="4" w:space="0" w:color="AAAAAA"/>
-            </w:tcBorders>
+            <w:tcW w:type="dxa" w:w="4320"/>
           </w:tcPr>
           <w:p>
             <w:r>
-              <w:rPr>
-                <w:sz w:val="20"/>
-              </w:rPr>
               <w:t>SO-SS</w:t>
             </w:r>
           </w:p>
         </w:tc>
         <w:tc>
           <w:tcPr>
-            <w:tcW w:type="dxa" w:w="4536"/>
-            <w:shd w:val="clear" w:color="auto" w:fill="F2F7FC"/>
-            <w:tcBorders>
-              <w:top w:val="single" w:sz="4" w:space="0" w:color="AAAAAA"/>
-              <w:left w:val="single" w:sz="4" w:space="0" w:color="AAAAAA"/>
-              <w:bottom w:val="single" w:sz="4" w:space="0" w:color="AAAAAA"/>
-              <w:right w:val="single" w:sz="4" w:space="0" w:color="AAAAAA"/>
-            </w:tcBorders>
+            <w:tcW w:type="dxa" w:w="4320"/>
           </w:tcPr>
           <w:p>
             <w:r>
-              <w:rPr>
-                <w:sz w:val="20"/>
-              </w:rPr>
               <w:t>Set Screw (older label format)</w:t>
             </w:r>
           </w:p>
         </w:tc>
       </w:tr>
     </w:tbl>
-    <w:p/>
     <w:p>
       <w:pPr/>
       <w:r>
-        <w:t xml:space="preserve">All 105 Summa Orthopaedics products are in the database. If an item shows up as "Unknown — GTIN: XXXXXXXXXX," it means the product code isn't recognized yet. Use the </w:t>
-      </w:r>
-      <w:r>
-        <w:rPr>
-          <w:b/>
-        </w:rPr>
-        <w:t>Edit</w:t>
-      </w:r>
-      <w:r>
-        <w:t xml:space="preserve"> button on that item's detail page to correct it, or let your manager know so it can be added to the database.</w:t>
+        <w:t>All 105 Summa Orthopaedics products are in the database. If an item shows up as "Unknown — GTIN: XXXXXXXXXX," it means the product code isn't recognized yet. Use the **Edit** button on that item's detail page to correct it, or let your manager know so it can be added to the database.</w:t>
       </w:r>
     </w:p>
     <w:p>
@@ -3973,10 +2426,7 @@
     <w:p>
       <w:pPr/>
       <w:r>
-        <w:rPr>
-          <w:b/>
-        </w:rPr>
-        <w:t>Barcode won't scan?</w:t>
+        <w:t>**Barcode won't scan?**</w:t>
       </w:r>
     </w:p>
     <w:p>
@@ -4000,25 +2450,13 @@
         <w:pStyle w:val="ListBullet"/>
       </w:pPr>
       <w:r>
-        <w:t xml:space="preserve">Try </w:t>
-      </w:r>
-      <w:r>
-        <w:rPr>
-          <w:b/>
-        </w:rPr>
-        <w:t>Manual Entry</w:t>
-      </w:r>
-      <w:r>
-        <w:t xml:space="preserve"> if the label is damaged or the barcode is smudged</w:t>
+        <w:t>Try **Manual Entry** if the label is damaged or the barcode is smudged</w:t>
       </w:r>
     </w:p>
     <w:p>
       <w:pPr/>
       <w:r>
-        <w:rPr>
-          <w:b/>
-        </w:rPr>
-        <w:t>Item shows up as "Unknown" product?</w:t>
+        <w:t>**Item shows up as "Unknown" product?**</w:t>
       </w:r>
     </w:p>
     <w:p>
@@ -4034,16 +2472,7 @@
         <w:pStyle w:val="ListBullet"/>
       </w:pPr>
       <w:r>
-        <w:t xml:space="preserve">Tap the item to open its detail page, then tap </w:t>
-      </w:r>
-      <w:r>
-        <w:rPr>
-          <w:b/>
-        </w:rPr>
-        <w:t>Edit</w:t>
-      </w:r>
-      <w:r>
-        <w:t xml:space="preserve"> to assign the correct product label</w:t>
+        <w:t>Tap the item to open its detail page, then tap **Edit** to assign the correct product label</w:t>
       </w:r>
     </w:p>
     <w:p>
@@ -4057,10 +2486,7 @@
     <w:p>
       <w:pPr/>
       <w:r>
-        <w:rPr>
-          <w:b/>
-        </w:rPr>
-        <w:t>Accidentally received the same item twice?</w:t>
+        <w:t>**Accidentally received the same item twice?**</w:t>
       </w:r>
     </w:p>
     <w:p>
@@ -4076,22 +2502,13 @@
         <w:pStyle w:val="ListBullet"/>
       </w:pPr>
       <w:r>
-        <w:t xml:space="preserve">If it was a duplicate scan of the same box, open one of the records and tap </w:t>
-      </w:r>
-      <w:r>
-        <w:rPr>
-          <w:b/>
-        </w:rPr>
-        <w:t>Delete</w:t>
+        <w:t>If it was a duplicate scan of the same box, open one of the records and tap **Delete**</w:t>
       </w:r>
     </w:p>
     <w:p>
       <w:pPr/>
       <w:r>
-        <w:rPr>
-          <w:b/>
-        </w:rPr>
-        <w:t>Need to correct a lot number or expiry date?</w:t>
+        <w:t>**Need to correct a lot number or expiry date?**</w:t>
       </w:r>
     </w:p>
     <w:p>
@@ -4099,13 +2516,7 @@
         <w:pStyle w:val="ListBullet"/>
       </w:pPr>
       <w:r>
-        <w:t xml:space="preserve">Open the item's detail page and tap </w:t>
-      </w:r>
-      <w:r>
-        <w:rPr>
-          <w:b/>
-        </w:rPr>
-        <w:t>Edit</w:t>
+        <w:t>Open the item's detail page and tap **Edit**</w:t>
       </w:r>
     </w:p>
     <w:p>
@@ -4119,10 +2530,7 @@
     <w:p>
       <w:pPr/>
       <w:r>
-        <w:rPr>
-          <w:b/>
-        </w:rPr>
-        <w:t>Exported Excel file won't open?</w:t>
+        <w:t>**Exported Excel file won't open?**</w:t>
       </w:r>
     </w:p>
     <w:p>
@@ -4138,26 +2546,13 @@
         <w:pStyle w:val="ListBullet"/>
       </w:pPr>
       <w:r>
-        <w:t xml:space="preserve">The file is </w:t>
-      </w:r>
-      <w:r>
-        <w:rPr>
-          <w:rFonts w:ascii="Courier New" w:hAnsi="Courier New"/>
-          <w:sz w:val="18"/>
-        </w:rPr>
-        <w:t>.xlsx</w:t>
-      </w:r>
-      <w:r>
-        <w:t xml:space="preserve"> format — it won't open in Notes or similar apps</w:t>
+        <w:t>The file is `.xlsx` format — it won't open in Notes or similar apps</w:t>
       </w:r>
     </w:p>
     <w:p>
       <w:pPr/>
       <w:r>
-        <w:rPr>
-          <w:b/>
-        </w:rPr>
-        <w:t>Lost your login or forgot your password?</w:t>
+        <w:t>**Lost your login or forgot your password?**</w:t>
       </w:r>
     </w:p>
     <w:p>
@@ -4171,10 +2566,7 @@
     <w:p>
       <w:pPr/>
       <w:r>
-        <w:rPr>
-          <w:b/>
-        </w:rPr>
-        <w:t>Items expiring soon?</w:t>
+        <w:t>**Items expiring soon?**</w:t>
       </w:r>
     </w:p>
     <w:p>
@@ -4190,30 +2582,12 @@
         <w:pStyle w:val="ListBullet"/>
       </w:pPr>
       <w:r>
-        <w:t xml:space="preserve">Or go to </w:t>
-      </w:r>
-      <w:r>
-        <w:rPr>
-          <w:b/>
-        </w:rPr>
-        <w:t>Reports</w:t>
-      </w:r>
-      <w:r>
-        <w:t xml:space="preserve"> and tap the </w:t>
-      </w:r>
-      <w:r>
-        <w:rPr>
-          <w:b/>
-        </w:rPr>
-        <w:t>Expiring &lt; 180d</w:t>
-      </w:r>
-      <w:r>
-        <w:t xml:space="preserve"> card for the full list</w:t>
+        <w:t>Or go to **Reports** and tap the **Expiring &lt; 180d** card for the full list</w:t>
       </w:r>
     </w:p>
     <w:sectPr>
       <w:pgSz w:w="12240" w:h="15840"/>
-      <w:pgMar w:top="1440" w:right="1584" w:bottom="1440" w:left="1584" w:header="720" w:footer="720" w:gutter="0"/>
+      <w:pgMar w:top="1440" w:right="1800" w:bottom="1440" w:left="1800" w:header="720" w:footer="720" w:gutter="0"/>
       <w:cols w:space="720"/>
       <w:docGrid w:linePitch="360"/>
     </w:sectPr>
@@ -4584,10 +2958,6 @@
     <w:name w:val="Normal"/>
     <w:qFormat/>
     <w:rsid w:val="00FC693F"/>
-    <w:rPr>
-      <w:rFonts w:ascii="Calibri" w:hAnsi="Calibri"/>
-      <w:sz w:val="22"/>
-    </w:rPr>
   </w:style>
   <w:style w:type="paragraph" w:styleId="Header">
     <w:name w:val="header"/>
@@ -4648,11 +3018,11 @@
       <w:outlineLvl w:val="0"/>
     </w:pPr>
     <w:rPr>
-      <w:rFonts w:asciiTheme="majorHAnsi" w:eastAsiaTheme="majorEastAsia" w:hAnsiTheme="majorHAnsi" w:cstheme="majorBidi" w:ascii="Calibri" w:hAnsi="Calibri"/>
+      <w:rFonts w:asciiTheme="majorHAnsi" w:eastAsiaTheme="majorEastAsia" w:hAnsiTheme="majorHAnsi" w:cstheme="majorBidi"/>
       <w:b/>
       <w:bCs/>
-      <w:color w:val="1F3864"/>
-      <w:sz w:val="44"/>
+      <w:color w:val="365F91" w:themeColor="accent1" w:themeShade="BF"/>
+      <w:sz w:val="28"/>
       <w:szCs w:val="28"/>
     </w:rPr>
   </w:style>
@@ -4672,11 +3042,11 @@
       <w:outlineLvl w:val="1"/>
     </w:pPr>
     <w:rPr>
-      <w:rFonts w:asciiTheme="majorHAnsi" w:eastAsiaTheme="majorEastAsia" w:hAnsiTheme="majorHAnsi" w:cstheme="majorBidi" w:ascii="Calibri" w:hAnsi="Calibri"/>
+      <w:rFonts w:asciiTheme="majorHAnsi" w:eastAsiaTheme="majorEastAsia" w:hAnsiTheme="majorHAnsi" w:cstheme="majorBidi"/>
       <w:b/>
       <w:bCs/>
-      <w:color w:val="2E74B5"/>
-      <w:sz w:val="32"/>
+      <w:color w:val="4F81BD" w:themeColor="accent1"/>
+      <w:sz w:val="26"/>
       <w:szCs w:val="26"/>
     </w:rPr>
   </w:style>
@@ -4696,11 +3066,10 @@
       <w:outlineLvl w:val="2"/>
     </w:pPr>
     <w:rPr>
-      <w:rFonts w:asciiTheme="majorHAnsi" w:eastAsiaTheme="majorEastAsia" w:hAnsiTheme="majorHAnsi" w:cstheme="majorBidi" w:ascii="Calibri" w:hAnsi="Calibri"/>
+      <w:rFonts w:asciiTheme="majorHAnsi" w:eastAsiaTheme="majorEastAsia" w:hAnsiTheme="majorHAnsi" w:cstheme="majorBidi"/>
       <w:b/>
       <w:bCs/>
-      <w:color w:val="2E74B5"/>
-      <w:sz w:val="26"/>
+      <w:color w:val="4F81BD" w:themeColor="accent1"/>
     </w:rPr>
   </w:style>
   <w:style w:type="paragraph" w:styleId="Heading4">
@@ -4720,13 +3089,12 @@
       <w:outlineLvl w:val="3"/>
     </w:pPr>
     <w:rPr>
-      <w:rFonts w:asciiTheme="majorHAnsi" w:eastAsiaTheme="majorEastAsia" w:hAnsiTheme="majorHAnsi" w:cstheme="majorBidi" w:ascii="Calibri" w:hAnsi="Calibri"/>
+      <w:rFonts w:asciiTheme="majorHAnsi" w:eastAsiaTheme="majorEastAsia" w:hAnsiTheme="majorHAnsi" w:cstheme="majorBidi"/>
       <w:b/>
       <w:bCs/>
       <w:i/>
       <w:iCs/>
-      <w:color w:val="404040"/>
-      <w:sz w:val="22"/>
+      <w:color w:val="4F81BD" w:themeColor="accent1"/>
     </w:rPr>
   </w:style>
   <w:style w:type="paragraph" w:styleId="Heading5">

</xml_diff>

<commit_message>
Fix: surface bank-assignment prompt after manual Receive entry
After tapping Save Receipt for a manually-entered item, the manual entry
panel now collapses so the 'Assign received items to a bank?' prompt and
the received items list are visible — previously the still-open form
pushed the prompt off-screen, making it look like it was never offered.

Bumps version to 3.16 and updates the changelogs and User Guide.

https://claude.ai/code/session_01DpEkPqTrJPSNPeh9KWpcbk
</commit_message>
<xml_diff>
--- a/Nail_Tracker_User_Guide.docx
+++ b/Nail_Tracker_User_Guide.docx
@@ -11,67 +11,69 @@
       </w:r>
     </w:p>
     <w:p>
-      <w:pPr/>
-      <w:r>
-        <w:t>**Version 3.13** | Summa Orthopaedics Inventory Management System</w:t>
+      <w:r>
+        <w:rPr>
+          <w:b/>
+        </w:rPr>
+        <w:t>Version 3.13</w:t>
+      </w:r>
+      <w:r>
+        <w:t xml:space="preserve"> | Summa Orthopaedics Inventory Management System</w:t>
       </w:r>
     </w:p>
     <w:p>
-      <w:pPr>
-        <w:pStyle w:val="Heading2"/>
-      </w:pPr>
-      <w:r>
-        <w:t>What Is Nail Tracker?</w:t>
+      <w:r>
+        <w:rPr>
+          <w:color w:val="CCCCCC"/>
+        </w:rPr>
+        <w:t>________________________________________</w:t>
       </w:r>
     </w:p>
     <w:p>
-      <w:pPr/>
-      <w:r>
-        <w:t>Nail Tracker is the system your company uses to keep track of orthopedic implants — things like nails, screws, and caps — as they move from the Home Office warehouse out to sales reps and distributors in the field.</w:t>
+      <w:pPr>
+        <w:pStyle w:val="Heading2"/>
+      </w:pPr>
+      <w:r>
+        <w:t>What Is Nail Tracker?</w:t>
       </w:r>
     </w:p>
     <w:p>
-      <w:pPr/>
-      <w:r>
-        <w:t>Every time a box of implants arrives, gets moved, or gets used in surgery, Nail Tracker records it. That way, you always know exactly what you have, where it is, and when it expires.</w:t>
+      <w:r>
+        <w:t>Nail Tracker is the system your company uses to keep track of orthopedic implants — things like nails, screws, and caps — as they move from the Home Office warehouse out to sales reps and distributors in the field.</w:t>
       </w:r>
     </w:p>
     <w:p>
-      <w:pPr/>
-      <w:r>
-        <w:t>This guide will walk you through everything you need to know to use the system confidently.</w:t>
+      <w:r>
+        <w:t>Every time a box of implants arrives, gets moved, or gets used in surgery, Nail Tracker records it. That way, you always know exactly what you have, where it is, and when it expires.</w:t>
       </w:r>
     </w:p>
     <w:p>
-      <w:pPr>
-        <w:pStyle w:val="Heading2"/>
-      </w:pPr>
-      <w:r>
-        <w:t>Getting Started</w:t>
+      <w:r>
+        <w:t>This guide will walk you through everything you need to know to use the system confidently.</w:t>
       </w:r>
     </w:p>
     <w:p>
-      <w:pPr>
-        <w:pStyle w:val="Heading3"/>
-      </w:pPr>
-      <w:r>
-        <w:t>Logging In</w:t>
+      <w:r>
+        <w:rPr>
+          <w:color w:val="CCCCCC"/>
+        </w:rPr>
+        <w:t>________________________________________</w:t>
       </w:r>
     </w:p>
     <w:p>
       <w:pPr>
-        <w:pStyle w:val="ListNumber"/>
-      </w:pPr>
-      <w:r>
-        <w:t>On your phone or computer, open the app at your company's web address (e.g., `inventory.phillyshah.com`)</w:t>
+        <w:pStyle w:val="Heading2"/>
+      </w:pPr>
+      <w:r>
+        <w:t>Getting Started</w:t>
       </w:r>
     </w:p>
     <w:p>
       <w:pPr>
-        <w:pStyle w:val="ListNumber"/>
-      </w:pPr>
-      <w:r>
-        <w:t>Type your username and password — it doesn't matter if you use capital letters or not</w:t>
+        <w:pStyle w:val="Heading3"/>
+      </w:pPr>
+      <w:r>
+        <w:t>Logging In</w:t>
       </w:r>
     </w:p>
     <w:p>
@@ -79,7 +81,17 @@
         <w:pStyle w:val="ListNumber"/>
       </w:pPr>
       <w:r>
-        <w:t>If you need to see the password you typed, tap the eye icon on the right side of the password box</w:t>
+        <w:t xml:space="preserve">On your phone or computer, open the app at your company's web address (e.g., </w:t>
+      </w:r>
+      <w:r>
+        <w:rPr>
+          <w:rFonts w:ascii="Consolas" w:hAnsi="Consolas"/>
+          <w:color w:val="C7254E"/>
+        </w:rPr>
+        <w:t>inventory.phillyshah.com</w:t>
+      </w:r>
+      <w:r>
+        <w:t>)</w:t>
       </w:r>
     </w:p>
     <w:p>
@@ -87,57 +99,66 @@
         <w:pStyle w:val="ListNumber"/>
       </w:pPr>
       <w:r>
-        <w:t>Once you're in, you'll stay logged in for 7 days before you need to sign in again</w:t>
+        <w:t>Type your username and password — it doesn't matter if you use capital letters or not</w:t>
       </w:r>
     </w:p>
     <w:p>
-      <w:pPr/>
-      <w:r>
-        <w:t>**Forgot your login?** Ask your manager or system administrator to reset it for you.</w:t>
+      <w:pPr>
+        <w:pStyle w:val="ListNumber"/>
+      </w:pPr>
+      <w:r>
+        <w:t>If you need to see the password you typed, tap the eye icon on the right side of the password box</w:t>
       </w:r>
     </w:p>
     <w:p>
       <w:pPr>
-        <w:pStyle w:val="Heading3"/>
-      </w:pPr>
-      <w:r>
-        <w:t>Installing the App on Your Phone (Recommended)</w:t>
+        <w:pStyle w:val="ListNumber"/>
+      </w:pPr>
+      <w:r>
+        <w:t>Once you're in, you'll stay logged in for 7 days before you need to sign in again</w:t>
       </w:r>
     </w:p>
     <w:p>
-      <w:pPr/>
-      <w:r>
-        <w:t>Nail Tracker works in a web browser, but you can also add it to your phone's home screen so it opens like a regular app — no browser bar, no extra steps.</w:t>
+      <w:pPr>
+        <w:pStyle w:val="IntenseQuote"/>
+      </w:pPr>
+      <w:r>
+        <w:rPr>
+          <w:b/>
+        </w:rPr>
+        <w:t>Forgot your login?</w:t>
+      </w:r>
+      <w:r>
+        <w:t xml:space="preserve"> Ask your manager or system administrator to reset it for you.</w:t>
       </w:r>
     </w:p>
     <w:p>
-      <w:pPr/>
-      <w:r>
-        <w:t>**On an iPhone or iPad:**</w:t>
+      <w:r>
+        <w:rPr>
+          <w:color w:val="CCCCCC"/>
+        </w:rPr>
+        <w:t>________________________________________</w:t>
       </w:r>
     </w:p>
     <w:p>
       <w:pPr>
-        <w:pStyle w:val="ListNumber"/>
-      </w:pPr>
-      <w:r>
-        <w:t>Open the app in **Safari** (must be Safari, not Chrome)</w:t>
+        <w:pStyle w:val="Heading3"/>
+      </w:pPr>
+      <w:r>
+        <w:t>Installing the App on Your Phone (Recommended)</w:t>
       </w:r>
     </w:p>
     <w:p>
-      <w:pPr>
-        <w:pStyle w:val="ListNumber"/>
-      </w:pPr>
-      <w:r>
-        <w:t>Tap the **Share** button (the box with an arrow pointing up)</w:t>
+      <w:r>
+        <w:t>Nail Tracker works in a web browser, but you can also add it to your phone's home screen so it opens like a regular app — no browser bar, no extra steps.</w:t>
       </w:r>
     </w:p>
     <w:p>
-      <w:pPr>
-        <w:pStyle w:val="ListNumber"/>
-      </w:pPr>
-      <w:r>
-        <w:t>Scroll down and tap **"Add to Home Screen"**</w:t>
+      <w:r>
+        <w:rPr>
+          <w:b/>
+        </w:rPr>
+        <w:t>On an iPhone or iPad:</w:t>
       </w:r>
     </w:p>
     <w:p>
@@ -145,13 +166,33 @@
         <w:pStyle w:val="ListNumber"/>
       </w:pPr>
       <w:r>
-        <w:t>Tap **Add** — the app icon will appear on your home screen</w:t>
+        <w:t xml:space="preserve">Open the app in </w:t>
+      </w:r>
+      <w:r>
+        <w:rPr>
+          <w:b/>
+        </w:rPr>
+        <w:t>Safari</w:t>
+      </w:r>
+      <w:r>
+        <w:t xml:space="preserve"> (must be Safari, not Chrome)</w:t>
       </w:r>
     </w:p>
     <w:p>
-      <w:pPr/>
-      <w:r>
-        <w:t>**On an Android phone:**</w:t>
+      <w:pPr>
+        <w:pStyle w:val="ListNumber"/>
+      </w:pPr>
+      <w:r>
+        <w:t xml:space="preserve">Tap the </w:t>
+      </w:r>
+      <w:r>
+        <w:rPr>
+          <w:b/>
+        </w:rPr>
+        <w:t>Share</w:t>
+      </w:r>
+      <w:r>
+        <w:t xml:space="preserve"> button (the box with an arrow pointing up)</w:t>
       </w:r>
     </w:p>
     <w:p>
@@ -159,7 +200,13 @@
         <w:pStyle w:val="ListNumber"/>
       </w:pPr>
       <w:r>
-        <w:t>Open the app in **Chrome**</w:t>
+        <w:t xml:space="preserve">Scroll down and tap </w:t>
+      </w:r>
+      <w:r>
+        <w:rPr>
+          <w:b/>
+        </w:rPr>
+        <w:t>"Add to Home Screen"</w:t>
       </w:r>
     </w:p>
     <w:p>
@@ -167,215 +214,377 @@
         <w:pStyle w:val="ListNumber"/>
       </w:pPr>
       <w:r>
-        <w:t>Tap the three-dot menu in the top right</w:t>
+        <w:t xml:space="preserve">Tap </w:t>
+      </w:r>
+      <w:r>
+        <w:rPr>
+          <w:b/>
+        </w:rPr>
+        <w:t>Add</w:t>
+      </w:r>
+      <w:r>
+        <w:t xml:space="preserve"> — the app icon will appear on your home screen</w:t>
       </w:r>
     </w:p>
     <w:p>
-      <w:pPr>
-        <w:pStyle w:val="ListNumber"/>
-      </w:pPr>
-      <w:r>
-        <w:t>Tap **"Add to Home Screen"** or **"Install App"**</w:t>
+      <w:r>
+        <w:rPr>
+          <w:b/>
+        </w:rPr>
+        <w:t>On an Android phone:</w:t>
       </w:r>
     </w:p>
     <w:p>
-      <w:pPr/>
-      <w:r>
-        <w:t>Once installed, it opens full-screen just like any other app on your phone.</w:t>
+      <w:pPr>
+        <w:pStyle w:val="ListNumber"/>
+      </w:pPr>
+      <w:r>
+        <w:t xml:space="preserve">Open the app in </w:t>
+      </w:r>
+      <w:r>
+        <w:rPr>
+          <w:b/>
+        </w:rPr>
+        <w:t>Chrome</w:t>
       </w:r>
     </w:p>
     <w:p>
       <w:pPr>
-        <w:pStyle w:val="Heading3"/>
-      </w:pPr>
-      <w:r>
-        <w:t>Finding Your Way Around</w:t>
+        <w:pStyle w:val="ListNumber"/>
+      </w:pPr>
+      <w:r>
+        <w:t>Tap the three-dot menu in the top right</w:t>
       </w:r>
     </w:p>
     <w:p>
-      <w:pPr/>
-      <w:r>
-        <w:t>**On a phone:** You'll see four tabs at the bottom of the screen — **Receive**, **Lookup**, **Inventory**, and **Reports**. Tap **More** to access the rest: Banks, Transfer, Distributors, Batch Upload, and User Management.</w:t>
+      <w:pPr>
+        <w:pStyle w:val="ListNumber"/>
+      </w:pPr>
+      <w:r>
+        <w:t xml:space="preserve">Tap </w:t>
+      </w:r>
+      <w:r>
+        <w:rPr>
+          <w:b/>
+        </w:rPr>
+        <w:t>"Add to Home Screen"</w:t>
+      </w:r>
+      <w:r>
+        <w:t xml:space="preserve"> or </w:t>
+      </w:r>
+      <w:r>
+        <w:rPr>
+          <w:b/>
+        </w:rPr>
+        <w:t>"Install App"</w:t>
       </w:r>
     </w:p>
     <w:p>
-      <w:pPr/>
-      <w:r>
-        <w:t>**On a computer:** All the pages are listed in the navigation bar at the top.</w:t>
+      <w:r>
+        <w:t>Once installed, it opens full-screen just like any other app on your phone.</w:t>
       </w:r>
     </w:p>
     <w:p>
-      <w:pPr/>
-      <w:r>
-        <w:t>**Version badge:** You'll see a small button like **v3.13** near the top of the screen. Tap it to see a summary of recent changes to the app.</w:t>
+      <w:r>
+        <w:rPr>
+          <w:color w:val="CCCCCC"/>
+        </w:rPr>
+        <w:t>________________________________________</w:t>
       </w:r>
     </w:p>
     <w:p>
       <w:pPr>
-        <w:pStyle w:val="Heading2"/>
-      </w:pPr>
-      <w:r>
-        <w:t>Expiry Alerts</w:t>
+        <w:pStyle w:val="Heading3"/>
+      </w:pPr>
+      <w:r>
+        <w:t>Finding Your Way Around</w:t>
       </w:r>
     </w:p>
     <w:p>
-      <w:pPr>
-        <w:pStyle w:val="Heading3"/>
-      </w:pPr>
-      <w:r>
-        <w:t>The Bell Icon — Your Early Warning System</w:t>
+      <w:r>
+        <w:rPr>
+          <w:b/>
+        </w:rPr>
+        <w:t>On a phone:</w:t>
+      </w:r>
+      <w:r>
+        <w:t xml:space="preserve"> You'll see four tabs at the bottom of the screen — </w:t>
+      </w:r>
+      <w:r>
+        <w:rPr>
+          <w:b/>
+        </w:rPr>
+        <w:t>Receive</w:t>
+      </w:r>
+      <w:r>
+        <w:t xml:space="preserve">, </w:t>
+      </w:r>
+      <w:r>
+        <w:rPr>
+          <w:b/>
+        </w:rPr>
+        <w:t>Lookup</w:t>
+      </w:r>
+      <w:r>
+        <w:t xml:space="preserve">, </w:t>
+      </w:r>
+      <w:r>
+        <w:rPr>
+          <w:b/>
+        </w:rPr>
+        <w:t>Inventory</w:t>
+      </w:r>
+      <w:r>
+        <w:t xml:space="preserve">, and </w:t>
+      </w:r>
+      <w:r>
+        <w:rPr>
+          <w:b/>
+        </w:rPr>
+        <w:t>Reports</w:t>
+      </w:r>
+      <w:r>
+        <w:t xml:space="preserve">. Tap </w:t>
+      </w:r>
+      <w:r>
+        <w:rPr>
+          <w:b/>
+        </w:rPr>
+        <w:t>More</w:t>
+      </w:r>
+      <w:r>
+        <w:t xml:space="preserve"> to access the rest: Banks, Transfer, Distributors, Batch Upload, and User Management.</w:t>
       </w:r>
     </w:p>
     <w:p>
-      <w:pPr/>
-      <w:r>
-        <w:t>Near the top-right corner of the screen, there's a **bell icon**. This is one of the most important tools in the app — it tells you immediately if anything in your inventory is getting close to its expiration date, without you having to go looking for it.</w:t>
+      <w:r>
+        <w:rPr>
+          <w:b/>
+        </w:rPr>
+        <w:t>On a computer:</w:t>
+      </w:r>
+      <w:r>
+        <w:t xml:space="preserve"> All the pages are listed in the navigation bar at the top.</w:t>
       </w:r>
     </w:p>
     <w:p>
-      <w:pPr>
-        <w:pStyle w:val="ListBullet"/>
-      </w:pPr>
-      <w:r>
-        <w:t>Tap the bell to see a list of all items expiring **within the next 90 days**</w:t>
+      <w:r>
+        <w:rPr>
+          <w:b/>
+        </w:rPr>
+        <w:t>Version badge:</w:t>
+      </w:r>
+      <w:r>
+        <w:t xml:space="preserve"> You'll see a small button like </w:t>
+      </w:r>
+      <w:r>
+        <w:rPr>
+          <w:b/>
+        </w:rPr>
+        <w:t>v3.13</w:t>
+      </w:r>
+      <w:r>
+        <w:t xml:space="preserve"> near the top of the screen. Tap it to see a summary of recent changes to the app.</w:t>
       </w:r>
     </w:p>
     <w:p>
-      <w:pPr>
-        <w:pStyle w:val="ListBullet"/>
-      </w:pPr>
-      <w:r>
-        <w:t>Each alert tells you the product name, lot number, expiry date, and where it's currently located</w:t>
+      <w:r>
+        <w:rPr>
+          <w:color w:val="CCCCCC"/>
+        </w:rPr>
+        <w:t>________________________________________</w:t>
       </w:r>
     </w:p>
     <w:p>
       <w:pPr>
-        <w:pStyle w:val="ListBullet"/>
-      </w:pPr>
-      <w:r>
-        <w:t>Once you've reviewed an alert, tap the **X** next to it to dismiss it, or tap **Dismiss All** to clear the whole list</w:t>
+        <w:pStyle w:val="Heading2"/>
+      </w:pPr>
+      <w:r>
+        <w:t>Expiry Alerts</w:t>
       </w:r>
     </w:p>
     <w:p>
       <w:pPr>
-        <w:pStyle w:val="ListBullet"/>
-      </w:pPr>
-      <w:r>
-        <w:t>The app remembers which alerts you've dismissed, so they won't keep coming back</w:t>
+        <w:pStyle w:val="Heading3"/>
+      </w:pPr>
+      <w:r>
+        <w:t>The Bell Icon — Your Early Warning System</w:t>
       </w:r>
     </w:p>
     <w:p>
-      <w:pPr/>
-      <w:r>
-        <w:t>**Why this matters:** Expired implants cannot be used in surgery. Catching items early gives you time to arrange returns or replacements before they become a problem.</w:t>
+      <w:r>
+        <w:t xml:space="preserve">Near the top-right corner of the screen, there's a </w:t>
+      </w:r>
+      <w:r>
+        <w:rPr>
+          <w:b/>
+        </w:rPr>
+        <w:t>bell icon</w:t>
+      </w:r>
+      <w:r>
+        <w:t>. This is one of the most important tools in the app — it tells you immediately if anything in your inventory is getting close to its expiration date, without you having to go looking for it.</w:t>
       </w:r>
     </w:p>
     <w:p>
       <w:pPr>
-        <w:pStyle w:val="Heading2"/>
-      </w:pPr>
-      <w:r>
-        <w:t>Core Workflows</w:t>
+        <w:pStyle w:val="ListBullet"/>
+      </w:pPr>
+      <w:r>
+        <w:t xml:space="preserve">Tap the bell to see a list of all items expiring </w:t>
+      </w:r>
+      <w:r>
+        <w:rPr>
+          <w:b/>
+        </w:rPr>
+        <w:t>within the next 90 days</w:t>
       </w:r>
     </w:p>
     <w:p>
       <w:pPr>
-        <w:pStyle w:val="Heading3"/>
-      </w:pPr>
-      <w:r>
-        <w:t>1. Receiving Inventory</w:t>
+        <w:pStyle w:val="ListBullet"/>
+      </w:pPr>
+      <w:r>
+        <w:t>Each alert tells you the product name, lot number, expiry date, and where it's currently located</w:t>
       </w:r>
     </w:p>
     <w:p>
-      <w:pPr/>
-      <w:r>
-        <w:t>**Where to go:** Tap the **Receive** tab (it's the home screen when you open the app)</w:t>
+      <w:pPr>
+        <w:pStyle w:val="ListBullet"/>
+      </w:pPr>
+      <w:r>
+        <w:t xml:space="preserve">Once you've reviewed an alert, tap the </w:t>
+      </w:r>
+      <w:r>
+        <w:rPr>
+          <w:b/>
+        </w:rPr>
+        <w:t>X</w:t>
+      </w:r>
+      <w:r>
+        <w:t xml:space="preserve"> next to it to dismiss it, or tap </w:t>
+      </w:r>
+      <w:r>
+        <w:rPr>
+          <w:b/>
+        </w:rPr>
+        <w:t>Dismiss All</w:t>
+      </w:r>
+      <w:r>
+        <w:t xml:space="preserve"> to clear the whole list</w:t>
       </w:r>
     </w:p>
     <w:p>
-      <w:pPr/>
-      <w:r>
-        <w:t>This is where you bring new items into the system. When a shipment arrives at the Home Office warehouse, you scan each item here. The system automatically records it under "Home Office."</w:t>
+      <w:pPr>
+        <w:pStyle w:val="ListBullet"/>
+      </w:pPr>
+      <w:r>
+        <w:t>The app remembers which alerts you've dismissed, so they won't keep coming back</w:t>
       </w:r>
     </w:p>
     <w:p>
-      <w:pPr/>
-      <w:r>
-        <w:t>**The four ways to receive an item:**</w:t>
+      <w:r>
+        <w:rPr>
+          <w:b/>
+        </w:rPr>
+        <w:t>Why this matters:</w:t>
+      </w:r>
+      <w:r>
+        <w:t xml:space="preserve"> Expired implants cannot be used in surgery. Catching items early gives you time to arrange returns or replacements before they become a problem.</w:t>
       </w:r>
     </w:p>
     <w:p>
-      <w:pPr>
-        <w:pStyle w:val="Heading4"/>
-      </w:pPr>
-      <w:r>
-        <w:t>Option A — Live Scan *(best for high volume)*</w:t>
+      <w:r>
+        <w:rPr>
+          <w:color w:val="CCCCCC"/>
+        </w:rPr>
+        <w:t>________________________________________</w:t>
       </w:r>
     </w:p>
     <w:p>
-      <w:pPr/>
-      <w:r>
-        <w:t>This is the fastest method for scanning many items in a row.</w:t>
+      <w:pPr>
+        <w:pStyle w:val="Heading2"/>
+      </w:pPr>
+      <w:r>
+        <w:t>Core Workflows</w:t>
       </w:r>
     </w:p>
     <w:p>
       <w:pPr>
-        <w:pStyle w:val="ListNumber"/>
-      </w:pPr>
-      <w:r>
-        <w:t>Tap the **Live Scan** button</w:t>
+        <w:pStyle w:val="Heading3"/>
+      </w:pPr>
+      <w:r>
+        <w:t>1. Receiving Inventory</w:t>
       </w:r>
     </w:p>
     <w:p>
-      <w:pPr>
-        <w:pStyle w:val="ListNumber"/>
-      </w:pPr>
-      <w:r>
-        <w:t>Hold your phone camera over a barcode label</w:t>
+      <w:r>
+        <w:rPr>
+          <w:b/>
+        </w:rPr>
+        <w:t>Where to go:</w:t>
+      </w:r>
+      <w:r>
+        <w:t xml:space="preserve"> Tap the </w:t>
+      </w:r>
+      <w:r>
+        <w:rPr>
+          <w:b/>
+        </w:rPr>
+        <w:t>Receive</w:t>
+      </w:r>
+      <w:r>
+        <w:t xml:space="preserve"> tab (it's the home screen when you open the app)</w:t>
       </w:r>
     </w:p>
     <w:p>
-      <w:pPr>
-        <w:pStyle w:val="ListNumber"/>
-      </w:pPr>
-      <w:r>
-        <w:t>The app reads it automatically — you don't have to tap anything</w:t>
+      <w:r>
+        <w:t>This is where you bring new items into the system. When a shipment arrives at the Home Office warehouse, you scan each item here. The system automatically records it under "Home Office."</w:t>
       </w:r>
     </w:p>
     <w:p>
-      <w:pPr>
-        <w:pStyle w:val="ListNumber"/>
-      </w:pPr>
-      <w:r>
-        <w:t>A green card appears confirming what was just received</w:t>
+      <w:r>
+        <w:rPr>
+          <w:color w:val="CCCCCC"/>
+        </w:rPr>
+        <w:t>________________________________________</w:t>
       </w:r>
     </w:p>
     <w:p>
-      <w:pPr>
-        <w:pStyle w:val="ListNumber"/>
-      </w:pPr>
-      <w:r>
-        <w:t>Move on to the next item — the camera stays ready</w:t>
+      <w:r>
+        <w:rPr>
+          <w:b/>
+        </w:rPr>
+        <w:t>The four ways to receive an item:</w:t>
       </w:r>
     </w:p>
     <w:p>
-      <w:pPr/>
-      <w:r>
-        <w:t>**Tip:** Make sure the barcode is well-lit and fully in frame. The app will beep or show a confirmation when it successfully reads a barcode.</w:t>
+      <w:pPr>
+        <w:pStyle w:val="Heading4"/>
+      </w:pPr>
+      <w:r>
+        <w:t>Option A — Live Scan (best for high volume)</w:t>
       </w:r>
     </w:p>
     <w:p>
-      <w:pPr>
-        <w:pStyle w:val="Heading4"/>
-      </w:pPr>
-      <w:r>
-        <w:t>Option B — Take a Photo</w:t>
+      <w:r>
+        <w:t>This is the fastest method for scanning many items in a row.</w:t>
       </w:r>
     </w:p>
     <w:p>
-      <w:pPr/>
-      <w:r>
-        <w:t>Good for single items or when Live Scan isn't working.</w:t>
+      <w:pPr>
+        <w:pStyle w:val="ListNumber"/>
+      </w:pPr>
+      <w:r>
+        <w:t xml:space="preserve">Tap the </w:t>
+      </w:r>
+      <w:r>
+        <w:rPr>
+          <w:b/>
+        </w:rPr>
+        <w:t>Live Scan</w:t>
+      </w:r>
+      <w:r>
+        <w:t xml:space="preserve"> button</w:t>
       </w:r>
     </w:p>
     <w:p>
@@ -383,7 +592,7 @@
         <w:pStyle w:val="ListNumber"/>
       </w:pPr>
       <w:r>
-        <w:t>Tap the camera area on screen</w:t>
+        <w:t>Hold your phone camera over a barcode label</w:t>
       </w:r>
     </w:p>
     <w:p>
@@ -391,7 +600,7 @@
         <w:pStyle w:val="ListNumber"/>
       </w:pPr>
       <w:r>
-        <w:t>Point at the barcode label and take a photo</w:t>
+        <w:t>The app reads it automatically — you don't have to tap anything</w:t>
       </w:r>
     </w:p>
     <w:p>
@@ -399,7 +608,7 @@
         <w:pStyle w:val="ListNumber"/>
       </w:pPr>
       <w:r>
-        <w:t>The app will analyze the photo and pull out the product details</w:t>
+        <w:t>A green card appears confirming what was just received</w:t>
       </w:r>
     </w:p>
     <w:p>
@@ -407,29 +616,34 @@
         <w:pStyle w:val="ListNumber"/>
       </w:pPr>
       <w:r>
-        <w:t>You'll see a confirmation card if it was successful, or an error message if it couldn't read the barcode</w:t>
+        <w:t>Move on to the next item — the camera stays ready</w:t>
       </w:r>
     </w:p>
     <w:p>
       <w:pPr>
-        <w:pStyle w:val="Heading4"/>
-      </w:pPr>
-      <w:r>
-        <w:t>Option C — Batch Upload *(for large shipments)*</w:t>
+        <w:pStyle w:val="IntenseQuote"/>
+      </w:pPr>
+      <w:r>
+        <w:rPr>
+          <w:b/>
+        </w:rPr>
+        <w:t>Tip:</w:t>
+      </w:r>
+      <w:r>
+        <w:t xml:space="preserve"> Make sure the barcode is well-lit and fully in frame. The app will beep or show a confirmation when it successfully reads a barcode.</w:t>
       </w:r>
     </w:p>
     <w:p>
-      <w:pPr/>
-      <w:r>
-        <w:t>If you have a lot of items to scan and want to do them all at once using photos already saved on your phone:</w:t>
+      <w:pPr>
+        <w:pStyle w:val="Heading4"/>
+      </w:pPr>
+      <w:r>
+        <w:t>Option B — Take a Photo</w:t>
       </w:r>
     </w:p>
     <w:p>
-      <w:pPr>
-        <w:pStyle w:val="ListNumber"/>
-      </w:pPr>
-      <w:r>
-        <w:t>Tap **Batch Upload**</w:t>
+      <w:r>
+        <w:t>Good for single items or when Live Scan isn't working.</w:t>
       </w:r>
     </w:p>
     <w:p>
@@ -437,7 +651,7 @@
         <w:pStyle w:val="ListNumber"/>
       </w:pPr>
       <w:r>
-        <w:t>Select multiple photos from your phone's gallery — you can pick as many as you want</w:t>
+        <w:t>Tap the camera area on screen</w:t>
       </w:r>
     </w:p>
     <w:p>
@@ -445,7 +659,7 @@
         <w:pStyle w:val="ListNumber"/>
       </w:pPr>
       <w:r>
-        <w:t>The app will work through each photo and can detect up to **4 barcodes per image**</w:t>
+        <w:t>Point at the barcode label and take a photo</w:t>
       </w:r>
     </w:p>
     <w:p>
@@ -453,33 +667,42 @@
         <w:pStyle w:val="ListNumber"/>
       </w:pPr>
       <w:r>
-        <w:t>All successfully scanned items are saved to Home Office automatically</w:t>
+        <w:t>The app will analyze the photo and pull out the product details</w:t>
       </w:r>
     </w:p>
     <w:p>
       <w:pPr>
-        <w:pStyle w:val="Heading4"/>
-      </w:pPr>
-      <w:r>
-        <w:t>Option D — Manual Entry</w:t>
+        <w:pStyle w:val="ListNumber"/>
+      </w:pPr>
+      <w:r>
+        <w:t>You'll see a confirmation card if it was successful, or an error message if it couldn't read the barcode</w:t>
       </w:r>
     </w:p>
     <w:p>
-      <w:pPr/>
-      <w:r>
-        <w:t>Use this when a barcode won't scan (damaged label, no scanner handy, or the details came from paperwork). Tap **Manual Entry**, then choose one of two methods:</w:t>
+      <w:pPr>
+        <w:pStyle w:val="Heading4"/>
+      </w:pPr>
+      <w:r>
+        <w:t>Option C — Batch Upload (for large shipments)</w:t>
       </w:r>
     </w:p>
     <w:p>
-      <w:pPr/>
-      <w:r>
-        <w:t>**Method 1 — Paste QR Code Data**</w:t>
+      <w:r>
+        <w:t>If you have a lot of items to scan and want to do them all at once using photos already saved on your phone:</w:t>
       </w:r>
     </w:p>
     <w:p>
-      <w:pPr/>
-      <w:r>
-        <w:t>Best when you already have the full barcode/QR text.</w:t>
+      <w:pPr>
+        <w:pStyle w:val="ListNumber"/>
+      </w:pPr>
+      <w:r>
+        <w:t xml:space="preserve">Tap </w:t>
+      </w:r>
+      <w:r>
+        <w:rPr>
+          <w:b/>
+        </w:rPr>
+        <w:t>Batch Upload</w:t>
       </w:r>
     </w:p>
     <w:p>
@@ -487,7 +710,7 @@
         <w:pStyle w:val="ListNumber"/>
       </w:pPr>
       <w:r>
-        <w:t>Make sure **Paste QR Code Data** is selected</w:t>
+        <w:t>Select multiple photos from your phone's gallery — you can pick as many as you want</w:t>
       </w:r>
     </w:p>
     <w:p>
@@ -495,7 +718,13 @@
         <w:pStyle w:val="ListNumber"/>
       </w:pPr>
       <w:r>
-        <w:t>Type or paste the barcode string exactly as it appears — for example: `(01)08880089459148(10)J250929-L021(17)300928`</w:t>
+        <w:t xml:space="preserve">The app will work through each photo and can detect up to </w:t>
+      </w:r>
+      <w:r>
+        <w:rPr>
+          <w:b/>
+        </w:rPr>
+        <w:t>4 barcodes per image</w:t>
       </w:r>
     </w:p>
     <w:p>
@@ -503,115 +732,186 @@
         <w:pStyle w:val="ListNumber"/>
       </w:pPr>
       <w:r>
-        <w:t>Press Enter or tap **Add**</w:t>
+        <w:t>All successfully scanned items are saved to Home Office automatically</w:t>
       </w:r>
     </w:p>
     <w:p>
-      <w:pPr/>
-      <w:r>
-        <w:t>**Method 2 — Enter Item Info Manually**</w:t>
+      <w:pPr>
+        <w:pStyle w:val="Heading4"/>
+      </w:pPr>
+      <w:r>
+        <w:t>Option D — Manual Entry</w:t>
       </w:r>
     </w:p>
     <w:p>
-      <w:pPr/>
-      <w:r>
-        <w:t>Best when you can read the item details off the box or paperwork but don't have the full barcode string.</w:t>
+      <w:r>
+        <w:t xml:space="preserve">Use this when a barcode won't scan (damaged label, no scanner handy, or the details came from paperwork). Tap </w:t>
+      </w:r>
+      <w:r>
+        <w:rPr>
+          <w:b/>
+        </w:rPr>
+        <w:t>Manual Entry</w:t>
+      </w:r>
+      <w:r>
+        <w:t>, then choose one of two methods:</w:t>
       </w:r>
     </w:p>
     <w:p>
-      <w:pPr>
-        <w:pStyle w:val="ListNumber"/>
-      </w:pPr>
-      <w:r>
-        <w:t>Tap **Enter Item Info Manually**</w:t>
+      <w:r>
+        <w:rPr>
+          <w:b/>
+        </w:rPr>
+        <w:t>Method 1 — Paste QR Code Data</w:t>
       </w:r>
     </w:p>
     <w:p>
-      <w:pPr>
-        <w:pStyle w:val="ListNumber"/>
-      </w:pPr>
-      <w:r>
-        <w:t>Fill in all four fields:</w:t>
+      <w:r>
+        <w:t>Best when you already have the full barcode/QR text.</w:t>
       </w:r>
     </w:p>
     <w:p>
       <w:pPr>
-        <w:pStyle w:val="ListBullet"/>
-      </w:pPr>
-      <w:r>
-        <w:t>**Item Number** — the Summa REF code, e.g. `SO-SPFN-0180-10-25`</w:t>
+        <w:pStyle w:val="ListNumber"/>
+      </w:pPr>
+      <w:r>
+        <w:t xml:space="preserve">Make sure </w:t>
+      </w:r>
+      <w:r>
+        <w:rPr>
+          <w:b/>
+        </w:rPr>
+        <w:t>Paste QR Code Data</w:t>
+      </w:r>
+      <w:r>
+        <w:t xml:space="preserve"> is selected</w:t>
       </w:r>
     </w:p>
     <w:p>
       <w:pPr>
-        <w:pStyle w:val="ListBullet"/>
-      </w:pPr>
-      <w:r>
-        <w:t>**Lot Number** — the lot/batch number</w:t>
+        <w:pStyle w:val="ListNumber"/>
+      </w:pPr>
+      <w:r>
+        <w:t xml:space="preserve">Type or paste the barcode string exactly as it appears — for example: </w:t>
+      </w:r>
+      <w:r>
+        <w:rPr>
+          <w:rFonts w:ascii="Consolas" w:hAnsi="Consolas"/>
+          <w:color w:val="C7254E"/>
+        </w:rPr>
+        <w:t>(01)08880089459148(10)J250929-L021(17)300928</w:t>
       </w:r>
     </w:p>
     <w:p>
       <w:pPr>
-        <w:pStyle w:val="ListBullet"/>
-      </w:pPr>
-      <w:r>
-        <w:t>**Expiration Date** — pick the date</w:t>
+        <w:pStyle w:val="ListNumber"/>
+      </w:pPr>
+      <w:r>
+        <w:t xml:space="preserve">Press Enter or tap </w:t>
+      </w:r>
+      <w:r>
+        <w:rPr>
+          <w:b/>
+        </w:rPr>
+        <w:t>Add</w:t>
       </w:r>
     </w:p>
     <w:p>
-      <w:pPr>
-        <w:pStyle w:val="ListBullet"/>
-      </w:pPr>
-      <w:r>
-        <w:t>**Quantity Received** — how many of this exact item you're receiving</w:t>
+      <w:r>
+        <w:rPr>
+          <w:b/>
+        </w:rPr>
+        <w:t>Method 2 — Enter Item Info Manually</w:t>
       </w:r>
     </w:p>
     <w:p>
-      <w:pPr>
-        <w:pStyle w:val="ListNumber"/>
-      </w:pPr>
-      <w:r>
-        <w:t>Tap **Save Receipt**</w:t>
+      <w:r>
+        <w:t>Best when you can read the item details off the box or paperwork but don't have the full barcode string.</w:t>
       </w:r>
     </w:p>
     <w:p>
-      <w:pPr/>
-      <w:r>
-        <w:t>The app looks up the item number, fills in the product details automatically, and creates one inventory record for each unit in the quantity — exactly as if you'd scanned that many labels. If the item number isn't recognized, you'll see a message and nothing is saved, so double-check the REF code.</w:t>
+      <w:pPr>
+        <w:pStyle w:val="ListNumber"/>
+      </w:pPr>
+      <w:r>
+        <w:t xml:space="preserve">Tap </w:t>
+      </w:r>
+      <w:r>
+        <w:rPr>
+          <w:b/>
+        </w:rPr>
+        <w:t>Enter Item Info Manually</w:t>
       </w:r>
     </w:p>
     <w:p>
-      <w:pPr/>
-      <w:r>
-        <w:t>**About duplicate lot numbers:** If you're receiving 50 screws that all came from the same manufacturing batch (same lot number), that's completely fine — scan each one individually and the system will create a separate record for each physical item. This is the correct way to do it.</w:t>
+      <w:pPr>
+        <w:pStyle w:val="ListNumber"/>
+      </w:pPr>
+      <w:r>
+        <w:t>Fill in all four fields:</w:t>
       </w:r>
     </w:p>
     <w:p>
-      <w:pPr/>
-      <w:r>
-        <w:t>**Assigning received items to a bank:**</w:t>
+      <w:pPr>
+        <w:pStyle w:val="ListBullet2"/>
+      </w:pPr>
+      <w:r>
+        <w:rPr>
+          <w:b/>
+        </w:rPr>
+        <w:t>Item Number</w:t>
+      </w:r>
+      <w:r>
+        <w:t xml:space="preserve"> — the Summa REF code, e.g. </w:t>
+      </w:r>
+      <w:r>
+        <w:rPr>
+          <w:rFonts w:ascii="Consolas" w:hAnsi="Consolas"/>
+          <w:color w:val="C7254E"/>
+        </w:rPr>
+        <w:t>SO-SPFN-0180-10-25</w:t>
       </w:r>
     </w:p>
     <w:p>
-      <w:pPr/>
-      <w:r>
-        <w:t>After scanning, you may see a prompt: *"Assign received items to a bank?"* A "bank" is a named group of items (like a kit or tray). If these items belong to a specific kit:</w:t>
+      <w:pPr>
+        <w:pStyle w:val="ListBullet2"/>
+      </w:pPr>
+      <w:r>
+        <w:rPr>
+          <w:b/>
+        </w:rPr>
+        <w:t>Lot Number</w:t>
+      </w:r>
+      <w:r>
+        <w:t xml:space="preserve"> — the lot/batch number</w:t>
       </w:r>
     </w:p>
     <w:p>
       <w:pPr>
-        <w:pStyle w:val="ListNumber"/>
-      </w:pPr>
-      <w:r>
-        <w:t>Tap the **Assign to Bank** button</w:t>
+        <w:pStyle w:val="ListBullet2"/>
+      </w:pPr>
+      <w:r>
+        <w:rPr>
+          <w:b/>
+        </w:rPr>
+        <w:t>Expiration Date</w:t>
+      </w:r>
+      <w:r>
+        <w:t xml:space="preserve"> — pick the date</w:t>
       </w:r>
     </w:p>
     <w:p>
       <w:pPr>
-        <w:pStyle w:val="ListNumber"/>
-      </w:pPr>
-      <w:r>
-        <w:t>Choose the bank from the dropdown</w:t>
+        <w:pStyle w:val="ListBullet2"/>
+      </w:pPr>
+      <w:r>
+        <w:rPr>
+          <w:b/>
+        </w:rPr>
+        <w:t>Quantity Received</w:t>
+      </w:r>
+      <w:r>
+        <w:t xml:space="preserve"> — how many of this exact item you're receiving</w:t>
       </w:r>
     </w:p>
     <w:p>
@@ -619,41 +919,62 @@
         <w:pStyle w:val="ListNumber"/>
       </w:pPr>
       <w:r>
-        <w:t>Tap **Assign**</w:t>
+        <w:t xml:space="preserve">Tap </w:t>
+      </w:r>
+      <w:r>
+        <w:rPr>
+          <w:b/>
+        </w:rPr>
+        <w:t>Save Receipt</w:t>
       </w:r>
     </w:p>
     <w:p>
-      <w:pPr/>
-      <w:r>
-        <w:t>If they don't belong to a kit yet, just skip this step — you can always assign them later.</w:t>
+      <w:r>
+        <w:t>The app looks up the item number, fills in the product details automatically, and creates one inventory record for each unit in the quantity — exactly as if you'd scanned that many labels. If the item number isn't recognized, you'll see a message and nothing is saved, so double-check the REF code.</w:t>
       </w:r>
     </w:p>
     <w:p>
       <w:pPr>
-        <w:pStyle w:val="Heading3"/>
-      </w:pPr>
-      <w:r>
-        <w:t>2. Looking Up an Item</w:t>
+        <w:pStyle w:val="IntenseQuote"/>
+      </w:pPr>
+      <w:r>
+        <w:rPr>
+          <w:b/>
+        </w:rPr>
+        <w:t>About duplicate lot numbers:</w:t>
+      </w:r>
+      <w:r>
+        <w:t xml:space="preserve"> If you're receiving 50 screws that all came from the same manufacturing batch (same lot number), that's completely fine — scan each one individually and the system will create a separate record for each physical item. This is the correct way to do it.</w:t>
       </w:r>
     </w:p>
     <w:p>
-      <w:pPr/>
-      <w:r>
-        <w:t>**Where to go:** Tap **Lookup** in the bottom navigation</w:t>
+      <w:r>
+        <w:rPr>
+          <w:color w:val="CCCCCC"/>
+        </w:rPr>
+        <w:t>________________________________________</w:t>
       </w:r>
     </w:p>
     <w:p>
-      <w:pPr/>
-      <w:r>
-        <w:t>Use this when you want to check on a specific item — maybe you scanned something and want to know where it is, or a rep called and wants to know the status of a particular lot.</w:t>
+      <w:r>
+        <w:rPr>
+          <w:b/>
+        </w:rPr>
+        <w:t>Assigning received items to a bank:</w:t>
       </w:r>
     </w:p>
     <w:p>
-      <w:pPr>
-        <w:pStyle w:val="ListNumber"/>
-      </w:pPr>
-      <w:r>
-        <w:t>Scan the barcode (or type it manually)</w:t>
+      <w:r>
+        <w:t xml:space="preserve">After receiving items — whether by scanning or by Manual Entry — you may see a prompt: </w:t>
+      </w:r>
+      <w:r>
+        <w:rPr>
+          <w:i/>
+        </w:rPr>
+        <w:t>"Assign received items to a bank?"</w:t>
+      </w:r>
+      <w:r>
+        <w:t xml:space="preserve"> A "bank" is a named group of items (like a kit or tray). If these items belong to a specific kit:</w:t>
       </w:r>
     </w:p>
     <w:p>
@@ -661,150 +982,400 @@
         <w:pStyle w:val="ListNumber"/>
       </w:pPr>
       <w:r>
-        <w:t>The app will show you:</w:t>
+        <w:t xml:space="preserve">Tap the </w:t>
+      </w:r>
+      <w:r>
+        <w:rPr>
+          <w:b/>
+        </w:rPr>
+        <w:t>Assign to Bank</w:t>
+      </w:r>
+      <w:r>
+        <w:t xml:space="preserve"> button</w:t>
       </w:r>
     </w:p>
     <w:p>
       <w:pPr>
-        <w:pStyle w:val="ListBullet"/>
-      </w:pPr>
-      <w:r>
-        <w:t>Whether the item is in the system</w:t>
+        <w:pStyle w:val="ListNumber"/>
+      </w:pPr>
+      <w:r>
+        <w:t>Choose the bank from the dropdown</w:t>
       </w:r>
     </w:p>
     <w:p>
       <w:pPr>
-        <w:pStyle w:val="ListBullet"/>
-      </w:pPr>
-      <w:r>
-        <w:t>Where it currently is (which distributor has it)</w:t>
+        <w:pStyle w:val="ListNumber"/>
+      </w:pPr>
+      <w:r>
+        <w:t xml:space="preserve">Tap </w:t>
+      </w:r>
+      <w:r>
+        <w:rPr>
+          <w:b/>
+        </w:rPr>
+        <w:t>Assign</w:t>
       </w:r>
     </w:p>
     <w:p>
-      <w:pPr>
-        <w:pStyle w:val="ListBullet"/>
-      </w:pPr>
-      <w:r>
-        <w:t>Its lot number and expiry date</w:t>
+      <w:r>
+        <w:t>If they don't belong to a kit yet, just skip this step — you can always assign them later.</w:t>
       </w:r>
     </w:p>
     <w:p>
-      <w:pPr>
-        <w:pStyle w:val="ListBullet"/>
-      </w:pPr>
-      <w:r>
-        <w:t>Its full history — every time it was moved and who moved it</w:t>
+      <w:r>
+        <w:rPr>
+          <w:color w:val="CCCCCC"/>
+        </w:rPr>
+        <w:t>________________________________________</w:t>
       </w:r>
     </w:p>
     <w:p>
       <w:pPr>
-        <w:pStyle w:val="ListNumber"/>
-      </w:pPr>
-      <w:r>
-        <w:t>From here, you can also **transfer it** to another location or **mark it as used** (meaning it was implanted in a patient)</w:t>
+        <w:pStyle w:val="Heading3"/>
+      </w:pPr>
+      <w:r>
+        <w:t>2. Looking Up an Item</w:t>
       </w:r>
     </w:p>
     <w:p>
-      <w:pPr>
-        <w:pStyle w:val="Heading3"/>
-      </w:pPr>
-      <w:r>
-        <w:t>3. Browsing Your Inventory</w:t>
+      <w:r>
+        <w:rPr>
+          <w:b/>
+        </w:rPr>
+        <w:t>Where to go:</w:t>
+      </w:r>
+      <w:r>
+        <w:t xml:space="preserve"> Tap </w:t>
+      </w:r>
+      <w:r>
+        <w:rPr>
+          <w:b/>
+        </w:rPr>
+        <w:t>Lookup</w:t>
+      </w:r>
+      <w:r>
+        <w:t xml:space="preserve"> in the bottom navigation</w:t>
       </w:r>
     </w:p>
     <w:p>
-      <w:pPr/>
-      <w:r>
-        <w:t>**Where to go:** Tap **Inventory** in the bottom navigation</w:t>
+      <w:r>
+        <w:t>Use this when you want to check on a specific item — maybe you scanned something and want to know where it is, or a rep called and wants to know the status of a particular lot.</w:t>
       </w:r>
     </w:p>
     <w:p>
-      <w:pPr/>
-      <w:r>
-        <w:t>This page shows all active items in the system — everything that hasn't been used or deleted. Think of it as a live spreadsheet of your entire stock.</w:t>
+      <w:pPr>
+        <w:pStyle w:val="ListNumber"/>
+      </w:pPr>
+      <w:r>
+        <w:t>Scan the barcode (or type it manually)</w:t>
       </w:r>
     </w:p>
     <w:p>
-      <w:pPr/>
-      <w:r>
-        <w:t>**Finding what you're looking for:**</w:t>
+      <w:pPr>
+        <w:pStyle w:val="ListNumber"/>
+      </w:pPr>
+      <w:r>
+        <w:t>The app will show you:</w:t>
       </w:r>
     </w:p>
     <w:p>
       <w:pPr>
-        <w:pStyle w:val="ListBullet"/>
-      </w:pPr>
-      <w:r>
-        <w:t>**Search bar** at the top: Type a product name, lot number, or item number (REF code). The list filters as you search.</w:t>
+        <w:pStyle w:val="ListBullet2"/>
+      </w:pPr>
+      <w:r>
+        <w:t>Whether the item is in the system</w:t>
       </w:r>
     </w:p>
     <w:p>
       <w:pPr>
-        <w:pStyle w:val="ListBullet"/>
-      </w:pPr>
-      <w:r>
-        <w:t>**Filter button** (the funnel icon): Narrow down by distributor or expiry date.</w:t>
+        <w:pStyle w:val="ListBullet2"/>
+      </w:pPr>
+      <w:r>
+        <w:t>Where it currently is (which distributor has it)</w:t>
       </w:r>
     </w:p>
     <w:p>
       <w:pPr>
-        <w:pStyle w:val="ListBullet"/>
-      </w:pPr>
-      <w:r>
-        <w:t>**Filter chip**: If you arrive at this page by tapping a report card or clicking through from the Stock report, you'll see a blue bar at the top showing what filter is active — for example, *"Item: SO-S50I-SO-026-T @ Home Office"*. Tap **Clear** to go back to the full list.</w:t>
+        <w:pStyle w:val="ListBullet2"/>
+      </w:pPr>
+      <w:r>
+        <w:t>Its lot number and expiry date</w:t>
       </w:r>
     </w:p>
     <w:p>
-      <w:pPr/>
-      <w:r>
-        <w:t>**Sorting the list:**</w:t>
+      <w:pPr>
+        <w:pStyle w:val="ListBullet2"/>
+      </w:pPr>
+      <w:r>
+        <w:t>Its full history — every time it was moved and who moved it</w:t>
       </w:r>
     </w:p>
     <w:p>
-      <w:pPr/>
-      <w:r>
-        <w:t>Tap any column header to sort by that column. Tap it again to reverse the order (A→Z or Z→A, newest or oldest, etc.). By default, items are sorted by Item Number.</w:t>
+      <w:pPr>
+        <w:pStyle w:val="ListNumber"/>
+      </w:pPr>
+      <w:r>
+        <w:t xml:space="preserve">From here, you can also </w:t>
+      </w:r>
+      <w:r>
+        <w:rPr>
+          <w:b/>
+        </w:rPr>
+        <w:t>transfer it</w:t>
+      </w:r>
+      <w:r>
+        <w:t xml:space="preserve"> to another location or </w:t>
+      </w:r>
+      <w:r>
+        <w:rPr>
+          <w:b/>
+        </w:rPr>
+        <w:t>mark it as used</w:t>
+      </w:r>
+      <w:r>
+        <w:t xml:space="preserve"> (meaning it was implanted in a patient)</w:t>
       </w:r>
     </w:p>
     <w:p>
-      <w:pPr/>
-      <w:r>
-        <w:t>**Taking action on items:**</w:t>
+      <w:r>
+        <w:rPr>
+          <w:color w:val="CCCCCC"/>
+        </w:rPr>
+        <w:t>________________________________________</w:t>
       </w:r>
     </w:p>
     <w:p>
       <w:pPr>
-        <w:pStyle w:val="ListBullet"/>
-      </w:pPr>
-      <w:r>
-        <w:t>**Move one item:** Tap the item row to open its detail page, then use the **Reassign** button there</w:t>
+        <w:pStyle w:val="Heading3"/>
+      </w:pPr>
+      <w:r>
+        <w:t>3. Browsing Your Inventory</w:t>
       </w:r>
     </w:p>
     <w:p>
-      <w:pPr>
-        <w:pStyle w:val="ListBullet"/>
-      </w:pPr>
-      <w:r>
-        <w:t>**Move several items at once:** Check the box next to each item you want to move, then choose a destination from the **"Move to:"** dropdown and tap **Reassign**</w:t>
+      <w:r>
+        <w:rPr>
+          <w:b/>
+        </w:rPr>
+        <w:t>Where to go:</w:t>
+      </w:r>
+      <w:r>
+        <w:t xml:space="preserve"> Tap </w:t>
+      </w:r>
+      <w:r>
+        <w:rPr>
+          <w:b/>
+        </w:rPr>
+        <w:t>Inventory</w:t>
+      </w:r>
+      <w:r>
+        <w:t xml:space="preserve"> in the bottom navigation</w:t>
       </w:r>
     </w:p>
     <w:p>
-      <w:pPr>
-        <w:pStyle w:val="ListBullet"/>
-      </w:pPr>
-      <w:r>
-        <w:t>**Download to Excel:** Tap the **Export** button to get a spreadsheet of your current filtered inventory. Expired items are highlighted in red automatically.</w:t>
+      <w:r>
+        <w:t>This page shows all active items in the system — everything that hasn't been used or deleted. Think of it as a live spreadsheet of your entire stock.</w:t>
       </w:r>
     </w:p>
     <w:p>
-      <w:pPr/>
-      <w:r>
-        <w:t>**What the color badges mean:**</w:t>
+      <w:r>
+        <w:rPr>
+          <w:color w:val="CCCCCC"/>
+        </w:rPr>
+        <w:t>________________________________________</w:t>
+      </w:r>
+    </w:p>
+    <w:p>
+      <w:r>
+        <w:rPr>
+          <w:b/>
+        </w:rPr>
+        <w:t>Finding what you're looking for:</w:t>
+      </w:r>
+    </w:p>
+    <w:p>
+      <w:pPr>
+        <w:pStyle w:val="ListBullet"/>
+      </w:pPr>
+      <w:r>
+        <w:rPr>
+          <w:b/>
+        </w:rPr>
+        <w:t>Search bar</w:t>
+      </w:r>
+      <w:r>
+        <w:t xml:space="preserve"> at the top: Type a product name, lot number, or item number (REF code). The list filters as you search.</w:t>
+      </w:r>
+    </w:p>
+    <w:p>
+      <w:pPr>
+        <w:pStyle w:val="ListBullet"/>
+      </w:pPr>
+      <w:r>
+        <w:rPr>
+          <w:b/>
+        </w:rPr>
+        <w:t>Filter button</w:t>
+      </w:r>
+      <w:r>
+        <w:t xml:space="preserve"> (the funnel icon): Narrow down by distributor or expiry date.</w:t>
+      </w:r>
+    </w:p>
+    <w:p>
+      <w:pPr>
+        <w:pStyle w:val="ListBullet"/>
+      </w:pPr>
+      <w:r>
+        <w:rPr>
+          <w:b/>
+        </w:rPr>
+        <w:t>Filter chip</w:t>
+      </w:r>
+      <w:r>
+        <w:t xml:space="preserve">: If you arrive at this page by tapping a report card or clicking through from the Stock report, you'll see a blue bar at the top showing what filter is active — for example, </w:t>
+      </w:r>
+      <w:r>
+        <w:rPr>
+          <w:i/>
+        </w:rPr>
+        <w:t>"Item: SO-S50I-SO-026-T @ Home Office"</w:t>
+      </w:r>
+      <w:r>
+        <w:t xml:space="preserve">. Tap </w:t>
+      </w:r>
+      <w:r>
+        <w:rPr>
+          <w:b/>
+        </w:rPr>
+        <w:t>Clear</w:t>
+      </w:r>
+      <w:r>
+        <w:t xml:space="preserve"> to go back to the full list.</w:t>
+      </w:r>
+    </w:p>
+    <w:p>
+      <w:r>
+        <w:rPr>
+          <w:b/>
+        </w:rPr>
+        <w:t>Sorting the list:</w:t>
+      </w:r>
+    </w:p>
+    <w:p>
+      <w:r>
+        <w:t>Tap any column header to sort by that column. Tap it again to reverse the order (A→Z or Z→A, newest or oldest, etc.). By default, items are sorted by Item Number.</w:t>
+      </w:r>
+    </w:p>
+    <w:p>
+      <w:r>
+        <w:rPr>
+          <w:color w:val="CCCCCC"/>
+        </w:rPr>
+        <w:t>________________________________________</w:t>
+      </w:r>
+    </w:p>
+    <w:p>
+      <w:r>
+        <w:rPr>
+          <w:b/>
+        </w:rPr>
+        <w:t>Taking action on items:</w:t>
+      </w:r>
+    </w:p>
+    <w:p>
+      <w:pPr>
+        <w:pStyle w:val="ListBullet"/>
+      </w:pPr>
+      <w:r>
+        <w:rPr>
+          <w:b/>
+        </w:rPr>
+        <w:t>Move one item:</w:t>
+      </w:r>
+      <w:r>
+        <w:t xml:space="preserve"> Tap the item row to open its detail page, then use the </w:t>
+      </w:r>
+      <w:r>
+        <w:rPr>
+          <w:b/>
+        </w:rPr>
+        <w:t>Reassign</w:t>
+      </w:r>
+      <w:r>
+        <w:t xml:space="preserve"> button there</w:t>
+      </w:r>
+    </w:p>
+    <w:p>
+      <w:pPr>
+        <w:pStyle w:val="ListBullet"/>
+      </w:pPr>
+      <w:r>
+        <w:rPr>
+          <w:b/>
+        </w:rPr>
+        <w:t>Move several items at once:</w:t>
+      </w:r>
+      <w:r>
+        <w:t xml:space="preserve"> Check the box next to each item you want to move, then choose a destination from the </w:t>
+      </w:r>
+      <w:r>
+        <w:rPr>
+          <w:b/>
+        </w:rPr>
+        <w:t>"Move to:"</w:t>
+      </w:r>
+      <w:r>
+        <w:t xml:space="preserve"> dropdown and tap </w:t>
+      </w:r>
+      <w:r>
+        <w:rPr>
+          <w:b/>
+        </w:rPr>
+        <w:t>Reassign</w:t>
+      </w:r>
+    </w:p>
+    <w:p>
+      <w:pPr>
+        <w:pStyle w:val="ListBullet"/>
+      </w:pPr>
+      <w:r>
+        <w:rPr>
+          <w:b/>
+        </w:rPr>
+        <w:t>Download to Excel:</w:t>
+      </w:r>
+      <w:r>
+        <w:t xml:space="preserve"> Tap the </w:t>
+      </w:r>
+      <w:r>
+        <w:rPr>
+          <w:b/>
+        </w:rPr>
+        <w:t>Export</w:t>
+      </w:r>
+      <w:r>
+        <w:t xml:space="preserve"> button to get a spreadsheet of your current filtered inventory. Expired items are highlighted in red automatically.</w:t>
+      </w:r>
+    </w:p>
+    <w:p>
+      <w:r>
+        <w:rPr>
+          <w:color w:val="CCCCCC"/>
+        </w:rPr>
+        <w:t>________________________________________</w:t>
+      </w:r>
+    </w:p>
+    <w:p>
+      <w:r>
+        <w:rPr>
+          <w:b/>
+        </w:rPr>
+        <w:t>What the color badges mean:</w:t>
       </w:r>
     </w:p>
     <w:tbl>
       <w:tblPr>
-        <w:tblStyle w:val="TableGrid"/>
+        <w:tblStyle w:val="LightGrid-Accent1"/>
         <w:tblW w:type="auto" w:w="0"/>
         <w:tblLook w:firstColumn="1" w:firstRow="1" w:lastColumn="0" w:lastRow="0" w:noHBand="0" w:noVBand="1" w:val="04A0"/>
       </w:tblPr>
@@ -819,6 +1390,9 @@
           </w:tcPr>
           <w:p>
             <w:r>
+              <w:rPr>
+                <w:b/>
+              </w:rPr>
               <w:t>Badge Color</w:t>
             </w:r>
           </w:p>
@@ -829,6 +1403,9 @@
           </w:tcPr>
           <w:p>
             <w:r>
+              <w:rPr>
+                <w:b/>
+              </w:rPr>
               <w:t>What It Means</w:t>
             </w:r>
           </w:p>
@@ -902,45 +1479,51 @@
       </w:tr>
     </w:tbl>
     <w:p>
-      <w:pPr>
-        <w:pStyle w:val="Heading3"/>
-      </w:pPr>
-      <w:r>
-        <w:t>4. Viewing and Editing an Item</w:t>
+      <w:r>
+        <w:rPr>
+          <w:color w:val="CCCCCC"/>
+        </w:rPr>
+        <w:t>________________________________________</w:t>
       </w:r>
     </w:p>
     <w:p>
-      <w:pPr/>
-      <w:r>
-        <w:t>**Where to go:** Tap any item row anywhere in the app (Inventory, Distributor page, etc.)</w:t>
+      <w:pPr>
+        <w:pStyle w:val="Heading3"/>
+      </w:pPr>
+      <w:r>
+        <w:t>4. Viewing and Editing an Item</w:t>
       </w:r>
     </w:p>
     <w:p>
-      <w:pPr/>
-      <w:r>
-        <w:t>This page shows you everything about one specific physical item.</w:t>
+      <w:r>
+        <w:rPr>
+          <w:b/>
+        </w:rPr>
+        <w:t>Where to go:</w:t>
+      </w:r>
+      <w:r>
+        <w:t xml:space="preserve"> Tap any item row anywhere in the app (Inventory, Distributor page, etc.)</w:t>
       </w:r>
     </w:p>
     <w:p>
-      <w:pPr/>
-      <w:r>
-        <w:t>**What you'll see:**</w:t>
+      <w:r>
+        <w:t>This page shows you everything about one specific physical item.</w:t>
       </w:r>
     </w:p>
     <w:p>
-      <w:pPr>
-        <w:pStyle w:val="ListBullet"/>
-      </w:pPr>
-      <w:r>
-        <w:t>Product name and Item Number (the REF code, like SO-SPFN-0180-11-25)</w:t>
+      <w:r>
+        <w:rPr>
+          <w:color w:val="CCCCCC"/>
+        </w:rPr>
+        <w:t>________________________________________</w:t>
       </w:r>
     </w:p>
     <w:p>
-      <w:pPr>
-        <w:pStyle w:val="ListBullet"/>
-      </w:pPr>
-      <w:r>
-        <w:t>GTIN (the long product code), GTIN Short, lot number, and expiry date</w:t>
+      <w:r>
+        <w:rPr>
+          <w:b/>
+        </w:rPr>
+        <w:t>What you'll see:</w:t>
       </w:r>
     </w:p>
     <w:p>
@@ -948,7 +1531,7 @@
         <w:pStyle w:val="ListBullet"/>
       </w:pPr>
       <w:r>
-        <w:t>Which distributor currently has it</w:t>
+        <w:t>Product name and Item Number (the REF code, like SO-SPFN-0180-11-25)</w:t>
       </w:r>
     </w:p>
     <w:p>
@@ -956,7 +1539,7 @@
         <w:pStyle w:val="ListBullet"/>
       </w:pPr>
       <w:r>
-        <w:t>A photo of the barcode label (tap to expand; press **ESC** or tap outside to close)</w:t>
+        <w:t>GTIN (the long product code), GTIN Short, lot number, and expiry date</w:t>
       </w:r>
     </w:p>
     <w:p>
@@ -964,18 +1547,53 @@
         <w:pStyle w:val="ListBullet"/>
       </w:pPr>
       <w:r>
-        <w:t>A full history of everywhere the item has been and who moved it</w:t>
+        <w:t>Which distributor currently has it</w:t>
       </w:r>
     </w:p>
     <w:p>
-      <w:pPr/>
-      <w:r>
-        <w:t>**What you can do:**</w:t>
+      <w:pPr>
+        <w:pStyle w:val="ListBullet"/>
+      </w:pPr>
+      <w:r>
+        <w:t xml:space="preserve">A photo of the barcode label (tap to expand; press </w:t>
+      </w:r>
+      <w:r>
+        <w:rPr>
+          <w:b/>
+        </w:rPr>
+        <w:t>ESC</w:t>
+      </w:r>
+      <w:r>
+        <w:t xml:space="preserve"> or tap outside to close)</w:t>
+      </w:r>
+    </w:p>
+    <w:p>
+      <w:pPr>
+        <w:pStyle w:val="ListBullet"/>
+      </w:pPr>
+      <w:r>
+        <w:t>A full history of everywhere the item has been and who moved it</w:t>
+      </w:r>
+    </w:p>
+    <w:p>
+      <w:r>
+        <w:rPr>
+          <w:color w:val="CCCCCC"/>
+        </w:rPr>
+        <w:t>________________________________________</w:t>
+      </w:r>
+    </w:p>
+    <w:p>
+      <w:r>
+        <w:rPr>
+          <w:b/>
+        </w:rPr>
+        <w:t>What you can do:</w:t>
       </w:r>
     </w:p>
     <w:tbl>
       <w:tblPr>
-        <w:tblStyle w:val="TableGrid"/>
+        <w:tblStyle w:val="LightGrid-Accent1"/>
         <w:tblW w:type="auto" w:w="0"/>
         <w:tblLook w:firstColumn="1" w:firstRow="1" w:lastColumn="0" w:lastRow="0" w:noHBand="0" w:noVBand="1" w:val="04A0"/>
       </w:tblPr>
@@ -990,6 +1608,9 @@
           </w:tcPr>
           <w:p>
             <w:r>
+              <w:rPr>
+                <w:b/>
+              </w:rPr>
               <w:t>Button</w:t>
             </w:r>
           </w:p>
@@ -1000,6 +1621,9 @@
           </w:tcPr>
           <w:p>
             <w:r>
+              <w:rPr>
+                <w:b/>
+              </w:rPr>
               <w:t>What It Does</w:t>
             </w:r>
           </w:p>
@@ -1012,7 +1636,10 @@
           </w:tcPr>
           <w:p>
             <w:r>
-              <w:t>**Edit**</w:t>
+              <w:rPr>
+                <w:b/>
+              </w:rPr>
+              <w:t>Edit</w:t>
             </w:r>
           </w:p>
         </w:tc>
@@ -1034,7 +1661,10 @@
           </w:tcPr>
           <w:p>
             <w:r>
-              <w:t>**Reassign**</w:t>
+              <w:rPr>
+                <w:b/>
+              </w:rPr>
+              <w:t>Reassign</w:t>
             </w:r>
           </w:p>
         </w:tc>
@@ -1056,7 +1686,10 @@
           </w:tcPr>
           <w:p>
             <w:r>
-              <w:t>**Mark as Used**</w:t>
+              <w:rPr>
+                <w:b/>
+              </w:rPr>
+              <w:t>Mark as Used</w:t>
             </w:r>
           </w:p>
         </w:tc>
@@ -1078,7 +1711,10 @@
           </w:tcPr>
           <w:p>
             <w:r>
-              <w:t>**Delete**</w:t>
+              <w:rPr>
+                <w:b/>
+              </w:rPr>
+              <w:t>Delete</w:t>
             </w:r>
           </w:p>
         </w:tc>
@@ -1095,51 +1731,89 @@
       </w:tr>
     </w:tbl>
     <w:p>
-      <w:pPr/>
-      <w:r>
-        <w:t>**Keyboard shortcut:** If you're on a computer, press **ESC** at any time to close a photo or a pop-up window.</w:t>
+      <w:pPr>
+        <w:pStyle w:val="IntenseQuote"/>
+      </w:pPr>
+      <w:r>
+        <w:rPr>
+          <w:b/>
+        </w:rPr>
+        <w:t>Keyboard shortcut:</w:t>
+      </w:r>
+      <w:r>
+        <w:t xml:space="preserve"> If you're on a computer, press </w:t>
+      </w:r>
+      <w:r>
+        <w:rPr>
+          <w:b/>
+        </w:rPr>
+        <w:t>ESC</w:t>
+      </w:r>
+      <w:r>
+        <w:t xml:space="preserve"> at any time to close a photo or a pop-up window.</w:t>
       </w:r>
     </w:p>
     <w:p>
-      <w:pPr>
-        <w:pStyle w:val="Heading3"/>
-      </w:pPr>
-      <w:r>
-        <w:t>5. Banks (Item Kits)</w:t>
+      <w:r>
+        <w:rPr>
+          <w:color w:val="CCCCCC"/>
+        </w:rPr>
+        <w:t>________________________________________</w:t>
       </w:r>
     </w:p>
     <w:p>
-      <w:pPr/>
-      <w:r>
-        <w:t>**Where to go:** Tap **More** → **Banks**</w:t>
+      <w:pPr>
+        <w:pStyle w:val="Heading3"/>
+      </w:pPr>
+      <w:r>
+        <w:t>5. Banks (Item Kits)</w:t>
       </w:r>
     </w:p>
     <w:p>
-      <w:pPr/>
-      <w:r>
-        <w:t>A "bank" is a named group of items that belong together — for example, a kit that a sales rep takes to a specific hospital, or a tray of implants for a particular surgery type. Banks make it easy to move a whole group of items at once instead of one by one.</w:t>
+      <w:r>
+        <w:rPr>
+          <w:b/>
+        </w:rPr>
+        <w:t>Where to go:</w:t>
+      </w:r>
+      <w:r>
+        <w:t xml:space="preserve"> Tap </w:t>
+      </w:r>
+      <w:r>
+        <w:rPr>
+          <w:b/>
+        </w:rPr>
+        <w:t>More</w:t>
+      </w:r>
+      <w:r>
+        <w:t xml:space="preserve"> → </w:t>
+      </w:r>
+      <w:r>
+        <w:rPr>
+          <w:b/>
+        </w:rPr>
+        <w:t>Banks</w:t>
       </w:r>
     </w:p>
     <w:p>
-      <w:pPr/>
-      <w:r>
-        <w:t>**Creating a bank:**</w:t>
+      <w:r>
+        <w:t>A "bank" is a named group of items that belong together — for example, a kit that a sales rep takes to a specific hospital, or a tray of implants for a particular surgery type. Banks make it easy to move a whole group of items at once instead of one by one.</w:t>
       </w:r>
     </w:p>
     <w:p>
-      <w:pPr>
-        <w:pStyle w:val="ListNumber"/>
-      </w:pPr>
-      <w:r>
-        <w:t>Tap **Create Bank**</w:t>
+      <w:r>
+        <w:rPr>
+          <w:color w:val="CCCCCC"/>
+        </w:rPr>
+        <w:t>________________________________________</w:t>
       </w:r>
     </w:p>
     <w:p>
-      <w:pPr>
-        <w:pStyle w:val="ListNumber"/>
-      </w:pPr>
-      <w:r>
-        <w:t>Give it a name (e.g., "Smith - General Hospital Kit") and an optional description</w:t>
+      <w:r>
+        <w:rPr>
+          <w:b/>
+        </w:rPr>
+        <w:t>Creating a bank:</w:t>
       </w:r>
     </w:p>
     <w:p>
@@ -1147,7 +1821,13 @@
         <w:pStyle w:val="ListNumber"/>
       </w:pPr>
       <w:r>
-        <w:t>Select which distributor it belongs to</w:t>
+        <w:t xml:space="preserve">Tap </w:t>
+      </w:r>
+      <w:r>
+        <w:rPr>
+          <w:b/>
+        </w:rPr>
+        <w:t>Create Bank</w:t>
       </w:r>
     </w:p>
     <w:p>
@@ -1155,13 +1835,15 @@
         <w:pStyle w:val="ListNumber"/>
       </w:pPr>
       <w:r>
-        <w:t>Tap **Create**</w:t>
+        <w:t>Give it a name (e.g., "Smith - General Hospital Kit") and an optional description</w:t>
       </w:r>
     </w:p>
     <w:p>
-      <w:pPr/>
-      <w:r>
-        <w:t>**Adding items to a bank:**</w:t>
+      <w:pPr>
+        <w:pStyle w:val="ListNumber"/>
+      </w:pPr>
+      <w:r>
+        <w:t>Select which distributor it belongs to</w:t>
       </w:r>
     </w:p>
     <w:p>
@@ -1169,15 +1851,21 @@
         <w:pStyle w:val="ListNumber"/>
       </w:pPr>
       <w:r>
-        <w:t>Open the bank, then tap **Add Items**</w:t>
+        <w:t xml:space="preserve">Tap </w:t>
+      </w:r>
+      <w:r>
+        <w:rPr>
+          <w:b/>
+        </w:rPr>
+        <w:t>Create</w:t>
       </w:r>
     </w:p>
     <w:p>
-      <w:pPr>
-        <w:pStyle w:val="ListNumber"/>
-      </w:pPr>
-      <w:r>
-        <w:t>You'll see a list of items at the same distributor as the bank — items already in another bank won't appear here</w:t>
+      <w:r>
+        <w:rPr>
+          <w:b/>
+        </w:rPr>
+        <w:t>Adding items to a bank:</w:t>
       </w:r>
     </w:p>
     <w:p>
@@ -1185,41 +1873,65 @@
         <w:pStyle w:val="ListNumber"/>
       </w:pPr>
       <w:r>
-        <w:t>Check the items you want to add, then tap **Add**</w:t>
+        <w:t xml:space="preserve">Open the bank, then tap </w:t>
+      </w:r>
+      <w:r>
+        <w:rPr>
+          <w:b/>
+        </w:rPr>
+        <w:t>Add Items</w:t>
       </w:r>
     </w:p>
     <w:p>
-      <w:pPr/>
-      <w:r>
-        <w:t>**Removing an item:**</w:t>
+      <w:pPr>
+        <w:pStyle w:val="ListNumber"/>
+      </w:pPr>
+      <w:r>
+        <w:t>You'll see a list of items at the same distributor as the bank — items already in another bank won't appear here</w:t>
       </w:r>
     </w:p>
     <w:p>
-      <w:pPr/>
-      <w:r>
-        <w:t>Tap the **X** next to an item in the bank list. The item doesn't get deleted — it just leaves the bank and stays in that distributor's regular inventory.</w:t>
+      <w:pPr>
+        <w:pStyle w:val="ListNumber"/>
+      </w:pPr>
+      <w:r>
+        <w:t xml:space="preserve">Check the items you want to add, then tap </w:t>
+      </w:r>
+      <w:r>
+        <w:rPr>
+          <w:b/>
+        </w:rPr>
+        <w:t>Add</w:t>
       </w:r>
     </w:p>
     <w:p>
-      <w:pPr/>
-      <w:r>
-        <w:t>**Moving a whole bank:**</w:t>
+      <w:r>
+        <w:rPr>
+          <w:b/>
+        </w:rPr>
+        <w:t>Removing an item:</w:t>
       </w:r>
     </w:p>
     <w:p>
-      <w:pPr>
-        <w:pStyle w:val="ListNumber"/>
-      </w:pPr>
-      <w:r>
-        <w:t>Open the bank, tap **Move Bank**</w:t>
+      <w:r>
+        <w:t xml:space="preserve">Tap the </w:t>
+      </w:r>
+      <w:r>
+        <w:rPr>
+          <w:b/>
+        </w:rPr>
+        <w:t>X</w:t>
+      </w:r>
+      <w:r>
+        <w:t xml:space="preserve"> next to an item in the bank list. The item doesn't get deleted — it just leaves the bank and stays in that distributor's regular inventory.</w:t>
       </w:r>
     </w:p>
     <w:p>
-      <w:pPr>
-        <w:pStyle w:val="ListNumber"/>
-      </w:pPr>
-      <w:r>
-        <w:t>Choose the destination distributor</w:t>
+      <w:r>
+        <w:rPr>
+          <w:b/>
+        </w:rPr>
+        <w:t>Moving a whole bank:</w:t>
       </w:r>
     </w:p>
     <w:p>
@@ -1227,65 +1939,102 @@
         <w:pStyle w:val="ListNumber"/>
       </w:pPr>
       <w:r>
-        <w:t>Every item in the bank gets reassigned to that distributor, and the move is logged in the history</w:t>
+        <w:t xml:space="preserve">Open the bank, tap </w:t>
+      </w:r>
+      <w:r>
+        <w:rPr>
+          <w:b/>
+        </w:rPr>
+        <w:t>Move Bank</w:t>
       </w:r>
     </w:p>
     <w:p>
       <w:pPr>
-        <w:pStyle w:val="Heading3"/>
-      </w:pPr>
-      <w:r>
-        <w:t>6. Transfers</w:t>
+        <w:pStyle w:val="ListNumber"/>
+      </w:pPr>
+      <w:r>
+        <w:t>Choose the destination distributor</w:t>
       </w:r>
     </w:p>
     <w:p>
-      <w:pPr/>
-      <w:r>
-        <w:t>**Where to go:** Tap **More** → **Transfer**</w:t>
+      <w:pPr>
+        <w:pStyle w:val="ListNumber"/>
+      </w:pPr>
+      <w:r>
+        <w:t>Every item in the bank gets reassigned to that distributor, and the move is logged in the history</w:t>
       </w:r>
     </w:p>
     <w:p>
-      <w:pPr/>
-      <w:r>
-        <w:t>Use this when you need to officially move items from one distributor to another — for example, pulling items back from a rep or shipping a set of implants out to a new location. Every transfer gets its own ID (like `TRF-20260514-0001`) so you can reference it later.</w:t>
+      <w:r>
+        <w:rPr>
+          <w:color w:val="CCCCCC"/>
+        </w:rPr>
+        <w:t>________________________________________</w:t>
       </w:r>
     </w:p>
     <w:p>
-      <w:pPr/>
-      <w:r>
-        <w:t>**Creating a transfer:**</w:t>
+      <w:pPr>
+        <w:pStyle w:val="Heading3"/>
+      </w:pPr>
+      <w:r>
+        <w:t>6. Transfers</w:t>
       </w:r>
     </w:p>
     <w:p>
-      <w:pPr>
-        <w:pStyle w:val="ListNumber"/>
-      </w:pPr>
-      <w:r>
-        <w:t>Under **From**, choose where the items are coming from</w:t>
+      <w:r>
+        <w:rPr>
+          <w:b/>
+        </w:rPr>
+        <w:t>Where to go:</w:t>
+      </w:r>
+      <w:r>
+        <w:t xml:space="preserve"> Tap </w:t>
+      </w:r>
+      <w:r>
+        <w:rPr>
+          <w:b/>
+        </w:rPr>
+        <w:t>More</w:t>
+      </w:r>
+      <w:r>
+        <w:t xml:space="preserve"> → </w:t>
+      </w:r>
+      <w:r>
+        <w:rPr>
+          <w:b/>
+        </w:rPr>
+        <w:t>Transfer</w:t>
       </w:r>
     </w:p>
     <w:p>
-      <w:pPr>
-        <w:pStyle w:val="ListNumber"/>
-      </w:pPr>
-      <w:r>
-        <w:t>Under **To**, choose where they're going</w:t>
+      <w:r>
+        <w:t xml:space="preserve">Use this when you need to officially move items from one distributor to another — for example, pulling items back from a rep or shipping a set of implants out to a new location. Every transfer gets its own ID (like </w:t>
+      </w:r>
+      <w:r>
+        <w:rPr>
+          <w:rFonts w:ascii="Consolas" w:hAnsi="Consolas"/>
+          <w:color w:val="C7254E"/>
+        </w:rPr>
+        <w:t>TRF-20260514-0001</w:t>
+      </w:r>
+      <w:r>
+        <w:t>) so you can reference it later.</w:t>
       </w:r>
     </w:p>
     <w:p>
-      <w:pPr>
-        <w:pStyle w:val="ListNumber"/>
-      </w:pPr>
-      <w:r>
-        <w:t>Check the boxes next to the items you want to move. Tap **Select All** if you want everything.</w:t>
+      <w:r>
+        <w:rPr>
+          <w:color w:val="CCCCCC"/>
+        </w:rPr>
+        <w:t>________________________________________</w:t>
       </w:r>
     </w:p>
     <w:p>
-      <w:pPr>
-        <w:pStyle w:val="ListNumber"/>
-      </w:pPr>
-      <w:r>
-        <w:t>Add an optional note (e.g., "Returning expired stock" or "Filling new rep order")</w:t>
+      <w:r>
+        <w:rPr>
+          <w:b/>
+        </w:rPr>
+        <w:t>Creating a transfer:</w:t>
       </w:r>
     </w:p>
     <w:p>
@@ -1293,92 +2042,236 @@
         <w:pStyle w:val="ListNumber"/>
       </w:pPr>
       <w:r>
-        <w:t>Tap **Confirm Transfer**</w:t>
+        <w:t xml:space="preserve">Under </w:t>
+      </w:r>
+      <w:r>
+        <w:rPr>
+          <w:b/>
+        </w:rPr>
+        <w:t>From</w:t>
+      </w:r>
+      <w:r>
+        <w:t>, choose where the items are coming from</w:t>
       </w:r>
     </w:p>
     <w:p>
-      <w:pPr/>
-      <w:r>
-        <w:t>The system creates a transfer record and updates every item's location automatically.</w:t>
+      <w:pPr>
+        <w:pStyle w:val="ListNumber"/>
+      </w:pPr>
+      <w:r>
+        <w:t xml:space="preserve">Under </w:t>
+      </w:r>
+      <w:r>
+        <w:rPr>
+          <w:b/>
+        </w:rPr>
+        <w:t>To</w:t>
+      </w:r>
+      <w:r>
+        <w:t>, choose where they're going</w:t>
       </w:r>
     </w:p>
     <w:p>
-      <w:pPr/>
-      <w:r>
-        <w:t>**Single-item reassignment also counts:** If you move one item from its detail page using the Reassign button, a transfer record is created for that too — so every move is always tracked.</w:t>
+      <w:pPr>
+        <w:pStyle w:val="ListNumber"/>
+      </w:pPr>
+      <w:r>
+        <w:t xml:space="preserve">Check the boxes next to the items you want to move. Tap </w:t>
+      </w:r>
+      <w:r>
+        <w:rPr>
+          <w:b/>
+        </w:rPr>
+        <w:t>Select All</w:t>
+      </w:r>
+      <w:r>
+        <w:t xml:space="preserve"> if you want everything.</w:t>
       </w:r>
     </w:p>
     <w:p>
-      <w:pPr/>
-      <w:r>
-        <w:t>**Printing a transfer report:**</w:t>
+      <w:pPr>
+        <w:pStyle w:val="ListNumber"/>
+      </w:pPr>
+      <w:r>
+        <w:t>Add an optional note (e.g., "Returning expired stock" or "Filling new rep order")</w:t>
       </w:r>
     </w:p>
     <w:p>
-      <w:pPr/>
-      <w:r>
-        <w:t>If you need a paper record of a transfer:</w:t>
+      <w:pPr>
+        <w:pStyle w:val="ListNumber"/>
+      </w:pPr>
+      <w:r>
+        <w:t xml:space="preserve">Tap </w:t>
+      </w:r>
+      <w:r>
+        <w:rPr>
+          <w:b/>
+        </w:rPr>
+        <w:t>Confirm Transfer</w:t>
       </w:r>
     </w:p>
     <w:p>
-      <w:pPr>
-        <w:pStyle w:val="ListNumber"/>
-      </w:pPr>
-      <w:r>
-        <w:t>Find the transfer in **Reports** → **Transfer History** and tap its ID (e.g., TRF-20260514-0001)</w:t>
+      <w:r>
+        <w:t>The system creates a transfer record and updates every item's location automatically.</w:t>
       </w:r>
     </w:p>
     <w:p>
       <w:pPr>
-        <w:pStyle w:val="ListNumber"/>
-      </w:pPr>
-      <w:r>
-        <w:t>Tap the **Print** button</w:t>
+        <w:pStyle w:val="IntenseQuote"/>
+      </w:pPr>
+      <w:r>
+        <w:rPr>
+          <w:b/>
+        </w:rPr>
+        <w:t>Single-item reassignment also counts:</w:t>
+      </w:r>
+      <w:r>
+        <w:t xml:space="preserve"> If you move one item from its detail page using the Reassign button, a transfer record is created for that too — so every move is always tracked.</w:t>
       </w:r>
     </w:p>
     <w:p>
-      <w:pPr>
-        <w:pStyle w:val="ListNumber"/>
-      </w:pPr>
-      <w:r>
-        <w:t>A clean, print-ready version opens — use Ctrl+P (Windows) or Cmd+P (Mac) to print or save as PDF</w:t>
+      <w:r>
+        <w:rPr>
+          <w:color w:val="CCCCCC"/>
+        </w:rPr>
+        <w:t>________________________________________</w:t>
       </w:r>
     </w:p>
     <w:p>
-      <w:pPr>
-        <w:pStyle w:val="Heading3"/>
-      </w:pPr>
-      <w:r>
-        <w:t>7. Reports</w:t>
+      <w:r>
+        <w:rPr>
+          <w:b/>
+        </w:rPr>
+        <w:t>Printing a transfer report:</w:t>
       </w:r>
     </w:p>
     <w:p>
-      <w:pPr/>
-      <w:r>
-        <w:t>**Where to go:** Tap **Reports** in the bottom navigation</w:t>
+      <w:r>
+        <w:t>If you need a paper record of a transfer:</w:t>
       </w:r>
     </w:p>
     <w:p>
-      <w:pPr/>
-      <w:r>
-        <w:t>The Reports page gives you a bird's-eye view of your entire inventory at a glance.</w:t>
+      <w:pPr>
+        <w:pStyle w:val="ListNumber"/>
+      </w:pPr>
+      <w:r>
+        <w:t xml:space="preserve">Find the transfer in </w:t>
+      </w:r>
+      <w:r>
+        <w:rPr>
+          <w:b/>
+        </w:rPr>
+        <w:t>Reports</w:t>
+      </w:r>
+      <w:r>
+        <w:t xml:space="preserve"> → </w:t>
+      </w:r>
+      <w:r>
+        <w:rPr>
+          <w:b/>
+        </w:rPr>
+        <w:t>Transfer History</w:t>
+      </w:r>
+      <w:r>
+        <w:t xml:space="preserve"> and tap its ID (e.g., TRF-20260514-0001)</w:t>
       </w:r>
     </w:p>
     <w:p>
-      <w:pPr/>
-      <w:r>
-        <w:t>**The summary cards at the top:**</w:t>
+      <w:pPr>
+        <w:pStyle w:val="ListNumber"/>
+      </w:pPr>
+      <w:r>
+        <w:t xml:space="preserve">Tap the </w:t>
+      </w:r>
+      <w:r>
+        <w:rPr>
+          <w:b/>
+        </w:rPr>
+        <w:t>Print</w:t>
+      </w:r>
+      <w:r>
+        <w:t xml:space="preserve"> button</w:t>
       </w:r>
     </w:p>
     <w:p>
-      <w:pPr/>
-      <w:r>
-        <w:t>There are five colored cards that each show a number. **Tap any card to see the matching list of items.**</w:t>
+      <w:pPr>
+        <w:pStyle w:val="ListNumber"/>
+      </w:pPr>
+      <w:r>
+        <w:t>A clean, print-ready version opens — use Ctrl+P (Windows) or Cmd+P (Mac) to print or save as PDF</w:t>
+      </w:r>
+    </w:p>
+    <w:p>
+      <w:r>
+        <w:rPr>
+          <w:color w:val="CCCCCC"/>
+        </w:rPr>
+        <w:t>________________________________________</w:t>
+      </w:r>
+    </w:p>
+    <w:p>
+      <w:pPr>
+        <w:pStyle w:val="Heading3"/>
+      </w:pPr>
+      <w:r>
+        <w:t>7. Reports</w:t>
+      </w:r>
+    </w:p>
+    <w:p>
+      <w:r>
+        <w:rPr>
+          <w:b/>
+        </w:rPr>
+        <w:t>Where to go:</w:t>
+      </w:r>
+      <w:r>
+        <w:t xml:space="preserve"> Tap </w:t>
+      </w:r>
+      <w:r>
+        <w:rPr>
+          <w:b/>
+        </w:rPr>
+        <w:t>Reports</w:t>
+      </w:r>
+      <w:r>
+        <w:t xml:space="preserve"> in the bottom navigation</w:t>
+      </w:r>
+    </w:p>
+    <w:p>
+      <w:r>
+        <w:t>The Reports page gives you a bird's-eye view of your entire inventory at a glance.</w:t>
+      </w:r>
+    </w:p>
+    <w:p>
+      <w:r>
+        <w:rPr>
+          <w:color w:val="CCCCCC"/>
+        </w:rPr>
+        <w:t>________________________________________</w:t>
+      </w:r>
+    </w:p>
+    <w:p>
+      <w:r>
+        <w:rPr>
+          <w:b/>
+        </w:rPr>
+        <w:t>The summary cards at the top:</w:t>
+      </w:r>
+    </w:p>
+    <w:p>
+      <w:r>
+        <w:t xml:space="preserve">There are five colored cards that each show a number. </w:t>
+      </w:r>
+      <w:r>
+        <w:rPr>
+          <w:b/>
+        </w:rPr>
+        <w:t>Tap any card to see the matching list of items.</w:t>
       </w:r>
     </w:p>
     <w:tbl>
       <w:tblPr>
-        <w:tblStyle w:val="TableGrid"/>
+        <w:tblStyle w:val="LightGrid-Accent1"/>
         <w:tblW w:type="auto" w:w="0"/>
         <w:tblLook w:firstColumn="1" w:firstRow="1" w:lastColumn="0" w:lastRow="0" w:noHBand="0" w:noVBand="1" w:val="04A0"/>
       </w:tblPr>
@@ -1394,6 +2287,9 @@
           </w:tcPr>
           <w:p>
             <w:r>
+              <w:rPr>
+                <w:b/>
+              </w:rPr>
               <w:t>Card</w:t>
             </w:r>
           </w:p>
@@ -1404,6 +2300,9 @@
           </w:tcPr>
           <w:p>
             <w:r>
+              <w:rPr>
+                <w:b/>
+              </w:rPr>
               <w:t>What It Shows</w:t>
             </w:r>
           </w:p>
@@ -1414,6 +2313,9 @@
           </w:tcPr>
           <w:p>
             <w:r>
+              <w:rPr>
+                <w:b/>
+              </w:rPr>
               <w:t>Tap to See</w:t>
             </w:r>
           </w:p>
@@ -1581,23 +2483,33 @@
       </w:tr>
     </w:tbl>
     <w:p>
-      <w:pPr/>
-      <w:r>
-        <w:t>**Stock by Item Number:**</w:t>
+      <w:r>
+        <w:rPr>
+          <w:color w:val="CCCCCC"/>
+        </w:rPr>
+        <w:t>________________________________________</w:t>
       </w:r>
     </w:p>
     <w:p>
-      <w:pPr/>
-      <w:r>
-        <w:t>Tap the **Stock by Item Number** button to open a detailed matrix view. This is one of the most useful reports in the system.</w:t>
+      <w:r>
+        <w:rPr>
+          <w:b/>
+        </w:rPr>
+        <w:t>Stock by Item Number:</w:t>
       </w:r>
     </w:p>
     <w:p>
-      <w:pPr>
-        <w:pStyle w:val="ListBullet"/>
-      </w:pPr>
-      <w:r>
-        <w:t>Every row is one type of product (one item number)</w:t>
+      <w:r>
+        <w:t xml:space="preserve">Tap the </w:t>
+      </w:r>
+      <w:r>
+        <w:rPr>
+          <w:b/>
+        </w:rPr>
+        <w:t>Stock by Item Number</w:t>
+      </w:r>
+      <w:r>
+        <w:t xml:space="preserve"> button to open a detailed matrix view. This is one of the most useful reports in the system.</w:t>
       </w:r>
     </w:p>
     <w:p>
@@ -1605,7 +2517,7 @@
         <w:pStyle w:val="ListBullet"/>
       </w:pPr>
       <w:r>
-        <w:t>Every column is a location (Home Office, plus each distributor)</w:t>
+        <w:t>Every row is one type of product (one item number)</w:t>
       </w:r>
     </w:p>
     <w:p>
@@ -1613,21 +2525,32 @@
         <w:pStyle w:val="ListBullet"/>
       </w:pPr>
       <w:r>
-        <w:t>The **Total** column on the right shows how many of that item exist across everywhere</w:t>
+        <w:t>Every column is a location (Home Office, plus each distributor)</w:t>
       </w:r>
     </w:p>
     <w:p>
-      <w:pPr/>
-      <w:r>
-        <w:t>**Drilling down:**</w:t>
+      <w:pPr>
+        <w:pStyle w:val="ListBullet"/>
+      </w:pPr>
+      <w:r>
+        <w:t xml:space="preserve">The </w:t>
+      </w:r>
+      <w:r>
+        <w:rPr>
+          <w:b/>
+        </w:rPr>
+        <w:t>Total</w:t>
+      </w:r>
+      <w:r>
+        <w:t xml:space="preserve"> column on the right shows how many of that item exist across everywhere</w:t>
       </w:r>
     </w:p>
     <w:p>
-      <w:pPr>
-        <w:pStyle w:val="ListBullet"/>
-      </w:pPr>
-      <w:r>
-        <w:t>Tap an **item number** in the leftmost column (or its Total) → see all units of that product across all locations</w:t>
+      <w:r>
+        <w:rPr>
+          <w:b/>
+        </w:rPr>
+        <w:t>Drilling down:</w:t>
       </w:r>
     </w:p>
     <w:p>
@@ -1635,99 +2558,143 @@
         <w:pStyle w:val="ListBullet"/>
       </w:pPr>
       <w:r>
-        <w:t>Tap a **specific count** (e.g., the "13" under a distributor's column) → see only that product at that location</w:t>
+        <w:t xml:space="preserve">Tap an </w:t>
+      </w:r>
+      <w:r>
+        <w:rPr>
+          <w:b/>
+        </w:rPr>
+        <w:t>item number</w:t>
+      </w:r>
+      <w:r>
+        <w:t xml:space="preserve"> in the leftmost column (or its Total) → see all units of that product across all locations</w:t>
       </w:r>
     </w:p>
     <w:p>
-      <w:pPr/>
-      <w:r>
-        <w:t>You can also search by item number or description at the top, sort by any column, and download the whole matrix as an Excel file.</w:t>
+      <w:pPr>
+        <w:pStyle w:val="ListBullet"/>
+      </w:pPr>
+      <w:r>
+        <w:t xml:space="preserve">Tap a </w:t>
+      </w:r>
+      <w:r>
+        <w:rPr>
+          <w:b/>
+        </w:rPr>
+        <w:t>specific count</w:t>
+      </w:r>
+      <w:r>
+        <w:t xml:space="preserve"> (e.g., the "13" under a distributor's column) → see only that product at that location</w:t>
       </w:r>
     </w:p>
     <w:p>
-      <w:pPr/>
-      <w:r>
-        <w:t>**Transfer History:**</w:t>
+      <w:r>
+        <w:t>You can also search by item number or description at the top, sort by any column, and download the whole matrix as an Excel file.</w:t>
       </w:r>
     </w:p>
     <w:p>
-      <w:pPr/>
-      <w:r>
-        <w:t>A searchable list of every transfer ever created. Type a transfer ID, distributor name, or date in the search bar to find what you're looking for. Tap any transfer ID to see the full detail and print it.</w:t>
+      <w:r>
+        <w:rPr>
+          <w:color w:val="CCCCCC"/>
+        </w:rPr>
+        <w:t>________________________________________</w:t>
       </w:r>
     </w:p>
     <w:p>
-      <w:pPr/>
-      <w:r>
-        <w:t>**Expiring Items:**</w:t>
+      <w:r>
+        <w:rPr>
+          <w:b/>
+        </w:rPr>
+        <w:t>Transfer History:</w:t>
       </w:r>
     </w:p>
     <w:p>
-      <w:pPr/>
-      <w:r>
-        <w:t>A table showing up to 20 items that expire in the next 180 days, sorted by how many days are left. Tap any column header to re-sort the list.</w:t>
+      <w:r>
+        <w:t>A searchable list of every transfer ever created. Type a transfer ID, distributor name, or date in the search bar to find what you're looking for. Tap any transfer ID to see the full detail and print it.</w:t>
       </w:r>
     </w:p>
     <w:p>
-      <w:pPr>
-        <w:pStyle w:val="Heading3"/>
-      </w:pPr>
-      <w:r>
-        <w:t>8. Batch Upload</w:t>
+      <w:r>
+        <w:rPr>
+          <w:color w:val="CCCCCC"/>
+        </w:rPr>
+        <w:t>________________________________________</w:t>
       </w:r>
     </w:p>
     <w:p>
-      <w:pPr/>
-      <w:r>
-        <w:t>**Where to go:** Tap **More** → **Batch Upload**</w:t>
+      <w:r>
+        <w:rPr>
+          <w:b/>
+        </w:rPr>
+        <w:t>Expiring Items:</w:t>
       </w:r>
     </w:p>
     <w:p>
-      <w:pPr/>
-      <w:r>
-        <w:t>Use this when you have a large number of items to add to the system and you'd rather upload photos or a spreadsheet than scan them one at a time.</w:t>
+      <w:r>
+        <w:t>A table showing up to 20 items that expire in the next 180 days, sorted by how many days are left. Tap any column header to re-sort the list.</w:t>
       </w:r>
     </w:p>
     <w:p>
-      <w:pPr/>
-      <w:r>
-        <w:t>**Uploading photos:**</w:t>
+      <w:r>
+        <w:rPr>
+          <w:color w:val="CCCCCC"/>
+        </w:rPr>
+        <w:t>________________________________________</w:t>
       </w:r>
     </w:p>
     <w:p>
       <w:pPr>
-        <w:pStyle w:val="ListNumber"/>
-      </w:pPr>
-      <w:r>
-        <w:t>Tap the upload area and select images from your phone or computer</w:t>
+        <w:pStyle w:val="Heading3"/>
+      </w:pPr>
+      <w:r>
+        <w:t>8. Batch Upload</w:t>
       </w:r>
     </w:p>
     <w:p>
-      <w:pPr>
-        <w:pStyle w:val="ListNumber"/>
-      </w:pPr>
-      <w:r>
-        <w:t>The app scans each photo automatically — it can find up to **4 barcodes per image**</w:t>
+      <w:r>
+        <w:rPr>
+          <w:b/>
+        </w:rPr>
+        <w:t>Where to go:</w:t>
+      </w:r>
+      <w:r>
+        <w:t xml:space="preserve"> Tap </w:t>
+      </w:r>
+      <w:r>
+        <w:rPr>
+          <w:b/>
+        </w:rPr>
+        <w:t>More</w:t>
+      </w:r>
+      <w:r>
+        <w:t xml:space="preserve"> → </w:t>
+      </w:r>
+      <w:r>
+        <w:rPr>
+          <w:b/>
+        </w:rPr>
+        <w:t>Batch Upload</w:t>
       </w:r>
     </w:p>
     <w:p>
-      <w:pPr>
-        <w:pStyle w:val="ListNumber"/>
-      </w:pPr>
-      <w:r>
-        <w:t>You'll see results appear one by one showing what was found (or any errors)</w:t>
+      <w:r>
+        <w:t>Use this when you have a large number of items to add to the system and you'd rather upload photos or a spreadsheet than scan them one at a time.</w:t>
       </w:r>
     </w:p>
     <w:p>
-      <w:pPr/>
-      <w:r>
-        <w:t>**Uploading a CSV/Excel file:**</w:t>
+      <w:r>
+        <w:rPr>
+          <w:color w:val="CCCCCC"/>
+        </w:rPr>
+        <w:t>________________________________________</w:t>
       </w:r>
     </w:p>
     <w:p>
-      <w:pPr/>
-      <w:r>
-        <w:t>If your shipping documents come as a spreadsheet with barcode data:</w:t>
+      <w:r>
+        <w:rPr>
+          <w:b/>
+        </w:rPr>
+        <w:t>Uploading photos:</w:t>
       </w:r>
     </w:p>
     <w:p>
@@ -1735,7 +2702,7 @@
         <w:pStyle w:val="ListNumber"/>
       </w:pPr>
       <w:r>
-        <w:t>Make sure the barcode strings are in the first column</w:t>
+        <w:t>Tap the upload area and select images from your phone or computer</w:t>
       </w:r>
     </w:p>
     <w:p>
@@ -1743,7 +2710,13 @@
         <w:pStyle w:val="ListNumber"/>
       </w:pPr>
       <w:r>
-        <w:t>Tap the upload area and select your file</w:t>
+        <w:t xml:space="preserve">The app scans each photo automatically — it can find up to </w:t>
+      </w:r>
+      <w:r>
+        <w:rPr>
+          <w:b/>
+        </w:rPr>
+        <w:t>4 barcodes per image</w:t>
       </w:r>
     </w:p>
     <w:p>
@@ -1751,21 +2724,20 @@
         <w:pStyle w:val="ListNumber"/>
       </w:pPr>
       <w:r>
-        <w:t>Each row becomes one inventory item — items that share a lot number are each created individually, not skipped</w:t>
+        <w:t>You'll see results appear one by one showing what was found (or any errors)</w:t>
       </w:r>
     </w:p>
     <w:p>
-      <w:pPr/>
-      <w:r>
-        <w:t>**After uploading:**</w:t>
+      <w:r>
+        <w:rPr>
+          <w:b/>
+        </w:rPr>
+        <w:t>Uploading a CSV/Excel file:</w:t>
       </w:r>
     </w:p>
     <w:p>
-      <w:pPr>
-        <w:pStyle w:val="ListNumber"/>
-      </w:pPr>
-      <w:r>
-        <w:t>A grid shows all the items that were found, with a checkmark (success) or X (failed to read)</w:t>
+      <w:r>
+        <w:t>If your shipping documents come as a spreadsheet with barcode data:</w:t>
       </w:r>
     </w:p>
     <w:p>
@@ -1773,7 +2745,7 @@
         <w:pStyle w:val="ListNumber"/>
       </w:pPr>
       <w:r>
-        <w:t>Select the items you want to keep</w:t>
+        <w:t>Make sure the barcode strings are in the first column</w:t>
       </w:r>
     </w:p>
     <w:p>
@@ -1781,7 +2753,7 @@
         <w:pStyle w:val="ListNumber"/>
       </w:pPr>
       <w:r>
-        <w:t>Choose a destination distributor from the dropdown</w:t>
+        <w:t>Tap the upload area and select your file</w:t>
       </w:r>
     </w:p>
     <w:p>
@@ -1789,184 +2761,373 @@
         <w:pStyle w:val="ListNumber"/>
       </w:pPr>
       <w:r>
-        <w:t>Tap **Assign** to save them</w:t>
+        <w:t>Each row becomes one inventory item — items that share a lot number are each created individually, not skipped</w:t>
       </w:r>
     </w:p>
     <w:p>
-      <w:pPr>
-        <w:pStyle w:val="Heading3"/>
-      </w:pPr>
-      <w:r>
-        <w:t>9. Distributors</w:t>
+      <w:r>
+        <w:rPr>
+          <w:b/>
+        </w:rPr>
+        <w:t>After uploading:</w:t>
       </w:r>
     </w:p>
     <w:p>
-      <w:pPr/>
-      <w:r>
-        <w:t>**Where to go:** Tap **More** → **Distributors**</w:t>
+      <w:pPr>
+        <w:pStyle w:val="ListNumber"/>
+      </w:pPr>
+      <w:r>
+        <w:t>A grid shows all the items that were found, with a checkmark (success) or X (failed to read)</w:t>
       </w:r>
     </w:p>
     <w:p>
-      <w:pPr/>
-      <w:r>
-        <w:t>This page shows your full list of distributors — the sales reps, hospitals, or other locations where your inventory lives.</w:t>
+      <w:pPr>
+        <w:pStyle w:val="ListNumber"/>
+      </w:pPr>
+      <w:r>
+        <w:t>Select the items you want to keep</w:t>
       </w:r>
     </w:p>
     <w:p>
       <w:pPr>
-        <w:pStyle w:val="ListBullet"/>
-      </w:pPr>
-      <w:r>
-        <w:t>Each distributor card shows how many items they currently have</w:t>
+        <w:pStyle w:val="ListNumber"/>
+      </w:pPr>
+      <w:r>
+        <w:t>Choose a destination distributor from the dropdown</w:t>
       </w:r>
     </w:p>
     <w:p>
       <w:pPr>
-        <w:pStyle w:val="ListBullet"/>
-      </w:pPr>
-      <w:r>
-        <w:t>Tap a distributor to see their full item list, download it as Excel, or share a link to the page</w:t>
+        <w:pStyle w:val="ListNumber"/>
+      </w:pPr>
+      <w:r>
+        <w:t xml:space="preserve">Tap </w:t>
+      </w:r>
+      <w:r>
+        <w:rPr>
+          <w:b/>
+        </w:rPr>
+        <w:t>Assign</w:t>
+      </w:r>
+      <w:r>
+        <w:t xml:space="preserve"> to save them</w:t>
       </w:r>
     </w:p>
     <w:p>
-      <w:pPr>
-        <w:pStyle w:val="ListBullet"/>
-      </w:pPr>
-      <w:r>
-        <w:t>From the distributor detail page, tap any item to open its full detail page</w:t>
+      <w:r>
+        <w:rPr>
+          <w:color w:val="CCCCCC"/>
+        </w:rPr>
+        <w:t>________________________________________</w:t>
       </w:r>
     </w:p>
     <w:p>
       <w:pPr>
-        <w:pStyle w:val="ListBullet"/>
-      </w:pPr>
-      <w:r>
-        <w:t>**Home Office** is always the starting point — all items come here first before going anywhere else</w:t>
+        <w:pStyle w:val="Heading3"/>
+      </w:pPr>
+      <w:r>
+        <w:t>9. Distributors</w:t>
       </w:r>
     </w:p>
     <w:p>
-      <w:pPr>
-        <w:pStyle w:val="Heading2"/>
-      </w:pPr>
-      <w:r>
-        <w:t>Admin Features</w:t>
+      <w:r>
+        <w:rPr>
+          <w:b/>
+        </w:rPr>
+        <w:t>Where to go:</w:t>
+      </w:r>
+      <w:r>
+        <w:t xml:space="preserve"> Tap </w:t>
+      </w:r>
+      <w:r>
+        <w:rPr>
+          <w:b/>
+        </w:rPr>
+        <w:t>More</w:t>
+      </w:r>
+      <w:r>
+        <w:t xml:space="preserve"> → </w:t>
+      </w:r>
+      <w:r>
+        <w:rPr>
+          <w:b/>
+        </w:rPr>
+        <w:t>Distributors</w:t>
       </w:r>
     </w:p>
     <w:p>
-      <w:pPr>
-        <w:pStyle w:val="Heading3"/>
-      </w:pPr>
-      <w:r>
-        <w:t>User Management</w:t>
+      <w:r>
+        <w:t>This page shows your full list of distributors — the sales reps, hospitals, or other locations where your inventory lives.</w:t>
       </w:r>
     </w:p>
     <w:p>
-      <w:pPr/>
-      <w:r>
-        <w:t>**Where to go:** Tap **More** → **User Management** *(only visible to admins)*</w:t>
+      <w:pPr>
+        <w:pStyle w:val="ListBullet"/>
+      </w:pPr>
+      <w:r>
+        <w:t>Each distributor card shows how many items they currently have</w:t>
       </w:r>
     </w:p>
     <w:p>
-      <w:pPr/>
-      <w:r>
-        <w:t>**Adding a new user:**</w:t>
+      <w:pPr>
+        <w:pStyle w:val="ListBullet"/>
+      </w:pPr>
+      <w:r>
+        <w:t>Tap a distributor to see their full item list, download it as Excel, or share a link to the page</w:t>
       </w:r>
     </w:p>
     <w:p>
       <w:pPr>
-        <w:pStyle w:val="ListNumber"/>
-      </w:pPr>
-      <w:r>
-        <w:t>Tap **Add User**</w:t>
+        <w:pStyle w:val="ListBullet"/>
+      </w:pPr>
+      <w:r>
+        <w:t>From the distributor detail page, tap any item to open its full detail page</w:t>
       </w:r>
     </w:p>
     <w:p>
       <w:pPr>
-        <w:pStyle w:val="ListNumber"/>
-      </w:pPr>
-      <w:r>
-        <w:t>Enter a username (at least 2 characters) and a password (at least 6 characters)</w:t>
+        <w:pStyle w:val="ListBullet"/>
+      </w:pPr>
+      <w:r>
+        <w:rPr>
+          <w:b/>
+        </w:rPr>
+        <w:t>Home Office</w:t>
+      </w:r>
+      <w:r>
+        <w:t xml:space="preserve"> is always the starting point — all items come here first before going anywhere else</w:t>
       </w:r>
     </w:p>
     <w:p>
-      <w:pPr>
-        <w:pStyle w:val="ListNumber"/>
-      </w:pPr>
-      <w:r>
-        <w:t>Choose a role:</w:t>
+      <w:r>
+        <w:rPr>
+          <w:color w:val="CCCCCC"/>
+        </w:rPr>
+        <w:t>________________________________________</w:t>
       </w:r>
     </w:p>
     <w:p>
       <w:pPr>
-        <w:pStyle w:val="ListBullet"/>
-      </w:pPr>
-      <w:r>
-        <w:t>**User** — can view and manage inventory, but can't add or delete other users</w:t>
+        <w:pStyle w:val="Heading2"/>
+      </w:pPr>
+      <w:r>
+        <w:t>Admin Features</w:t>
       </w:r>
     </w:p>
     <w:p>
       <w:pPr>
-        <w:pStyle w:val="ListBullet"/>
-      </w:pPr>
-      <w:r>
-        <w:t>**Admin** — full access including User Management</w:t>
+        <w:pStyle w:val="Heading3"/>
+      </w:pPr>
+      <w:r>
+        <w:t>User Management</w:t>
       </w:r>
     </w:p>
     <w:p>
-      <w:pPr>
-        <w:pStyle w:val="ListNumber"/>
-      </w:pPr>
-      <w:r>
-        <w:t>Tap **Create User**</w:t>
+      <w:r>
+        <w:rPr>
+          <w:b/>
+        </w:rPr>
+        <w:t>Where to go:</w:t>
+      </w:r>
+      <w:r>
+        <w:t xml:space="preserve"> Tap </w:t>
+      </w:r>
+      <w:r>
+        <w:rPr>
+          <w:b/>
+        </w:rPr>
+        <w:t>More</w:t>
+      </w:r>
+      <w:r>
+        <w:t xml:space="preserve"> → </w:t>
+      </w:r>
+      <w:r>
+        <w:rPr>
+          <w:b/>
+        </w:rPr>
+        <w:t>User Management</w:t>
+      </w:r>
+      <w:r>
+        <w:t xml:space="preserve"> </w:t>
+      </w:r>
+      <w:r>
+        <w:rPr>
+          <w:i/>
+        </w:rPr>
+        <w:t>(only visible to admins)</w:t>
       </w:r>
     </w:p>
     <w:p>
-      <w:pPr/>
-      <w:r>
-        <w:t>**Managing existing users:**</w:t>
+      <w:r>
+        <w:rPr>
+          <w:color w:val="CCCCCC"/>
+        </w:rPr>
+        <w:t>________________________________________</w:t>
       </w:r>
     </w:p>
     <w:p>
-      <w:pPr>
-        <w:pStyle w:val="ListBullet"/>
-      </w:pPr>
-      <w:r>
-        <w:t>**Change role:** Tap the shield icon next to a user to switch them between User and Admin. (You can't change your own role.)</w:t>
+      <w:r>
+        <w:rPr>
+          <w:b/>
+        </w:rPr>
+        <w:t>Adding a new user:</w:t>
       </w:r>
     </w:p>
     <w:p>
       <w:pPr>
-        <w:pStyle w:val="ListBullet"/>
-      </w:pPr>
-      <w:r>
-        <w:t>**Reset password:** Tap the key icon next to a user and enter a new password</w:t>
+        <w:pStyle w:val="ListNumber"/>
+      </w:pPr>
+      <w:r>
+        <w:t xml:space="preserve">Tap </w:t>
+      </w:r>
+      <w:r>
+        <w:rPr>
+          <w:b/>
+        </w:rPr>
+        <w:t>Add User</w:t>
       </w:r>
     </w:p>
     <w:p>
       <w:pPr>
-        <w:pStyle w:val="ListBullet"/>
-      </w:pPr>
-      <w:r>
-        <w:t>**Delete user:** Tap the trash icon. You can't delete yourself or the last remaining admin.</w:t>
+        <w:pStyle w:val="ListNumber"/>
+      </w:pPr>
+      <w:r>
+        <w:t>Enter a username (at least 2 characters) and a password (at least 6 characters)</w:t>
       </w:r>
     </w:p>
     <w:p>
       <w:pPr>
-        <w:pStyle w:val="Heading2"/>
-      </w:pPr>
-      <w:r>
-        <w:t>Barcode Format Reference</w:t>
+        <w:pStyle w:val="ListNumber"/>
+      </w:pPr>
+      <w:r>
+        <w:t>Choose a role:</w:t>
       </w:r>
     </w:p>
     <w:p>
-      <w:pPr/>
-      <w:r>
-        <w:t>Nail Tracker reads **GS1-128 barcodes** — the standard format used on medical device packaging. Each barcode contains several pieces of information identified by a two-digit code called an Application Identifier (AI).</w:t>
+      <w:pPr>
+        <w:pStyle w:val="ListBullet2"/>
+      </w:pPr>
+      <w:r>
+        <w:rPr>
+          <w:b/>
+        </w:rPr>
+        <w:t>User</w:t>
+      </w:r>
+      <w:r>
+        <w:t xml:space="preserve"> — can view and manage inventory, but can't add or delete other users</w:t>
+      </w:r>
+    </w:p>
+    <w:p>
+      <w:pPr>
+        <w:pStyle w:val="ListBullet2"/>
+      </w:pPr>
+      <w:r>
+        <w:rPr>
+          <w:b/>
+        </w:rPr>
+        <w:t>Admin</w:t>
+      </w:r>
+      <w:r>
+        <w:t xml:space="preserve"> — full access including User Management</w:t>
+      </w:r>
+    </w:p>
+    <w:p>
+      <w:pPr>
+        <w:pStyle w:val="ListNumber"/>
+      </w:pPr>
+      <w:r>
+        <w:t xml:space="preserve">Tap </w:t>
+      </w:r>
+      <w:r>
+        <w:rPr>
+          <w:b/>
+        </w:rPr>
+        <w:t>Create User</w:t>
+      </w:r>
+    </w:p>
+    <w:p>
+      <w:r>
+        <w:rPr>
+          <w:b/>
+        </w:rPr>
+        <w:t>Managing existing users:</w:t>
+      </w:r>
+    </w:p>
+    <w:p>
+      <w:pPr>
+        <w:pStyle w:val="ListBullet"/>
+      </w:pPr>
+      <w:r>
+        <w:rPr>
+          <w:b/>
+        </w:rPr>
+        <w:t>Change role:</w:t>
+      </w:r>
+      <w:r>
+        <w:t xml:space="preserve"> Tap the shield icon next to a user to switch them between User and Admin. (You can't change your own role.)</w:t>
+      </w:r>
+    </w:p>
+    <w:p>
+      <w:pPr>
+        <w:pStyle w:val="ListBullet"/>
+      </w:pPr>
+      <w:r>
+        <w:rPr>
+          <w:b/>
+        </w:rPr>
+        <w:t>Reset password:</w:t>
+      </w:r>
+      <w:r>
+        <w:t xml:space="preserve"> Tap the key icon next to a user and enter a new password</w:t>
+      </w:r>
+    </w:p>
+    <w:p>
+      <w:pPr>
+        <w:pStyle w:val="ListBullet"/>
+      </w:pPr>
+      <w:r>
+        <w:rPr>
+          <w:b/>
+        </w:rPr>
+        <w:t>Delete user:</w:t>
+      </w:r>
+      <w:r>
+        <w:t xml:space="preserve"> Tap the trash icon. You can't delete yourself or the last remaining admin.</w:t>
+      </w:r>
+    </w:p>
+    <w:p>
+      <w:r>
+        <w:rPr>
+          <w:color w:val="CCCCCC"/>
+        </w:rPr>
+        <w:t>________________________________________</w:t>
+      </w:r>
+    </w:p>
+    <w:p>
+      <w:pPr>
+        <w:pStyle w:val="Heading2"/>
+      </w:pPr>
+      <w:r>
+        <w:t>Barcode Format Reference</w:t>
+      </w:r>
+    </w:p>
+    <w:p>
+      <w:r>
+        <w:t xml:space="preserve">Nail Tracker reads </w:t>
+      </w:r>
+      <w:r>
+        <w:rPr>
+          <w:b/>
+        </w:rPr>
+        <w:t>GS1-128 barcodes</w:t>
+      </w:r>
+      <w:r>
+        <w:t xml:space="preserve"> — the standard format used on medical device packaging. Each barcode contains several pieces of information identified by a two-digit code called an Application Identifier (AI).</w:t>
       </w:r>
     </w:p>
     <w:tbl>
       <w:tblPr>
-        <w:tblStyle w:val="TableGrid"/>
+        <w:tblStyle w:val="LightGrid-Accent1"/>
         <w:tblW w:type="auto" w:w="0"/>
         <w:tblLook w:firstColumn="1" w:firstRow="1" w:lastColumn="0" w:lastRow="0" w:noHBand="0" w:noVBand="1" w:val="04A0"/>
       </w:tblPr>
@@ -1982,6 +3143,9 @@
           </w:tcPr>
           <w:p>
             <w:r>
+              <w:rPr>
+                <w:b/>
+              </w:rPr>
               <w:t>AI Code</w:t>
             </w:r>
           </w:p>
@@ -1992,6 +3156,9 @@
           </w:tcPr>
           <w:p>
             <w:r>
+              <w:rPr>
+                <w:b/>
+              </w:rPr>
               <w:t>What It Contains</w:t>
             </w:r>
           </w:p>
@@ -2002,6 +3169,9 @@
           </w:tcPr>
           <w:p>
             <w:r>
+              <w:rPr>
+                <w:b/>
+              </w:rPr>
               <w:t>Example</w:t>
             </w:r>
           </w:p>
@@ -2105,38 +3275,51 @@
       </w:tr>
     </w:tbl>
     <w:p>
-      <w:pPr/>
-      <w:r>
-        <w:t>**What a full barcode string looks like:**</w:t>
+      <w:r>
+        <w:rPr>
+          <w:b/>
+        </w:rPr>
+        <w:t>What a full barcode string looks like:</w:t>
       </w:r>
     </w:p>
     <w:p>
-      <w:pPr/>
-      <w:r>
-        <w:t>`(01)08880089459148(10)J250929-L021(17)300928`</w:t>
+      <w:r>
+        <w:rPr>
+          <w:rFonts w:ascii="Consolas" w:hAnsi="Consolas"/>
+          <w:color w:val="C7254E"/>
+        </w:rPr>
+        <w:t>(01)08880089459148(10)J250929-L021(17)300928</w:t>
       </w:r>
     </w:p>
     <w:p>
-      <w:pPr/>
       <w:r>
         <w:t>The app also accepts the raw format without parentheses, and supports an alternate date format (YYYY-MM-DD) used by some label printers.</w:t>
       </w:r>
     </w:p>
     <w:p>
-      <w:pPr/>
-      <w:r>
-        <w:t>**Product REF Code Reference:**</w:t>
+      <w:r>
+        <w:rPr>
+          <w:color w:val="CCCCCC"/>
+        </w:rPr>
+        <w:t>________________________________________</w:t>
       </w:r>
     </w:p>
     <w:p>
-      <w:pPr/>
+      <w:r>
+        <w:rPr>
+          <w:b/>
+        </w:rPr>
+        <w:t>Product REF Code Reference:</w:t>
+      </w:r>
+    </w:p>
+    <w:p>
       <w:r>
         <w:t>Every Summa Orthopaedics product has a REF code printed on its label. The app uses this code to automatically identify the product name. Here are the prefixes and what they mean:</w:t>
       </w:r>
     </w:p>
     <w:tbl>
       <w:tblPr>
-        <w:tblStyle w:val="TableGrid"/>
+        <w:tblStyle w:val="LightGrid-Accent1"/>
         <w:tblW w:type="auto" w:w="0"/>
         <w:tblLook w:firstColumn="1" w:firstRow="1" w:lastColumn="0" w:lastRow="0" w:noHBand="0" w:noVBand="1" w:val="04A0"/>
       </w:tblPr>
@@ -2151,6 +3334,9 @@
           </w:tcPr>
           <w:p>
             <w:r>
+              <w:rPr>
+                <w:b/>
+              </w:rPr>
               <w:t>REF Prefix</w:t>
             </w:r>
           </w:p>
@@ -2161,6 +3347,9 @@
           </w:tcPr>
           <w:p>
             <w:r>
+              <w:rPr>
+                <w:b/>
+              </w:rPr>
               <w:t>Product Type</w:t>
             </w:r>
           </w:p>
@@ -2410,31 +3599,41 @@
       </w:tr>
     </w:tbl>
     <w:p>
-      <w:pPr/>
-      <w:r>
-        <w:t>All 105 Summa Orthopaedics products are in the database. If an item shows up as "Unknown — GTIN: XXXXXXXXXX," it means the product code isn't recognized yet. Use the **Edit** button on that item's detail page to correct it, or let your manager know so it can be added to the database.</w:t>
+      <w:r>
+        <w:t xml:space="preserve">All 105 Summa Orthopaedics products are in the database. If an item shows up as "Unknown — GTIN: XXXXXXXXXX," it means the product code isn't recognized yet. Use the </w:t>
+      </w:r>
+      <w:r>
+        <w:rPr>
+          <w:b/>
+        </w:rPr>
+        <w:t>Edit</w:t>
+      </w:r>
+      <w:r>
+        <w:t xml:space="preserve"> button on that item's detail page to correct it, or let your manager know so it can be added to the database.</w:t>
       </w:r>
     </w:p>
     <w:p>
-      <w:pPr>
-        <w:pStyle w:val="Heading2"/>
-      </w:pPr>
-      <w:r>
-        <w:t>Tips and Troubleshooting</w:t>
+      <w:r>
+        <w:rPr>
+          <w:color w:val="CCCCCC"/>
+        </w:rPr>
+        <w:t>________________________________________</w:t>
       </w:r>
     </w:p>
     <w:p>
-      <w:pPr/>
-      <w:r>
-        <w:t>**Barcode won't scan?**</w:t>
+      <w:pPr>
+        <w:pStyle w:val="Heading2"/>
+      </w:pPr>
+      <w:r>
+        <w:t>Tips and Troubleshooting</w:t>
       </w:r>
     </w:p>
     <w:p>
-      <w:pPr>
-        <w:pStyle w:val="ListBullet"/>
-      </w:pPr>
-      <w:r>
-        <w:t>Make sure there's good lighting — shadows on the barcode cause read failures</w:t>
+      <w:r>
+        <w:rPr>
+          <w:b/>
+        </w:rPr>
+        <w:t>Barcode won't scan?</w:t>
       </w:r>
     </w:p>
     <w:p>
@@ -2442,7 +3641,7 @@
         <w:pStyle w:val="ListBullet"/>
       </w:pPr>
       <w:r>
-        <w:t>Hold the phone steady and make sure the whole barcode is in the frame</w:t>
+        <w:t>Make sure there's good lighting — shadows on the barcode cause read failures</w:t>
       </w:r>
     </w:p>
     <w:p>
@@ -2450,21 +3649,32 @@
         <w:pStyle w:val="ListBullet"/>
       </w:pPr>
       <w:r>
-        <w:t>Try **Manual Entry** if the label is damaged or the barcode is smudged</w:t>
+        <w:t>Hold the phone steady and make sure the whole barcode is in the frame</w:t>
       </w:r>
     </w:p>
     <w:p>
-      <w:pPr/>
-      <w:r>
-        <w:t>**Item shows up as "Unknown" product?**</w:t>
+      <w:pPr>
+        <w:pStyle w:val="ListBullet"/>
+      </w:pPr>
+      <w:r>
+        <w:t xml:space="preserve">Try </w:t>
+      </w:r>
+      <w:r>
+        <w:rPr>
+          <w:b/>
+        </w:rPr>
+        <w:t>Manual Entry</w:t>
+      </w:r>
+      <w:r>
+        <w:t xml:space="preserve"> if the label is damaged or the barcode is smudged</w:t>
       </w:r>
     </w:p>
     <w:p>
-      <w:pPr>
-        <w:pStyle w:val="ListBullet"/>
-      </w:pPr>
-      <w:r>
-        <w:t>The product code may not be in the database yet</w:t>
+      <w:r>
+        <w:rPr>
+          <w:b/>
+        </w:rPr>
+        <w:t>Item shows up as "Unknown" product?</w:t>
       </w:r>
     </w:p>
     <w:p>
@@ -2472,7 +3682,7 @@
         <w:pStyle w:val="ListBullet"/>
       </w:pPr>
       <w:r>
-        <w:t>Tap the item to open its detail page, then tap **Edit** to assign the correct product label</w:t>
+        <w:t>The product code may not be in the database yet</w:t>
       </w:r>
     </w:p>
     <w:p>
@@ -2480,21 +3690,32 @@
         <w:pStyle w:val="ListBullet"/>
       </w:pPr>
       <w:r>
-        <w:t>Every edit is logged so there's always a record of what was changed</w:t>
+        <w:t xml:space="preserve">Tap the item to open its detail page, then tap </w:t>
+      </w:r>
+      <w:r>
+        <w:rPr>
+          <w:b/>
+        </w:rPr>
+        <w:t>Edit</w:t>
+      </w:r>
+      <w:r>
+        <w:t xml:space="preserve"> to assign the correct product label</w:t>
       </w:r>
     </w:p>
     <w:p>
-      <w:pPr/>
-      <w:r>
-        <w:t>**Accidentally received the same item twice?**</w:t>
+      <w:pPr>
+        <w:pStyle w:val="ListBullet"/>
+      </w:pPr>
+      <w:r>
+        <w:t>Every edit is logged so there's always a record of what was changed</w:t>
       </w:r>
     </w:p>
     <w:p>
-      <w:pPr>
-        <w:pStyle w:val="ListBullet"/>
-      </w:pPr>
-      <w:r>
-        <w:t>If it's genuinely a different physical unit (different box), that's correct — leave both records</w:t>
+      <w:r>
+        <w:rPr>
+          <w:b/>
+        </w:rPr>
+        <w:t>Accidentally received the same item twice?</w:t>
       </w:r>
     </w:p>
     <w:p>
@@ -2502,21 +3723,29 @@
         <w:pStyle w:val="ListBullet"/>
       </w:pPr>
       <w:r>
-        <w:t>If it was a duplicate scan of the same box, open one of the records and tap **Delete**</w:t>
+        <w:t>If it's genuinely a different physical unit (different box), that's correct — leave both records</w:t>
       </w:r>
     </w:p>
     <w:p>
-      <w:pPr/>
-      <w:r>
-        <w:t>**Need to correct a lot number or expiry date?**</w:t>
+      <w:pPr>
+        <w:pStyle w:val="ListBullet"/>
+      </w:pPr>
+      <w:r>
+        <w:t xml:space="preserve">If it was a duplicate scan of the same box, open one of the records and tap </w:t>
+      </w:r>
+      <w:r>
+        <w:rPr>
+          <w:b/>
+        </w:rPr>
+        <w:t>Delete</w:t>
       </w:r>
     </w:p>
     <w:p>
-      <w:pPr>
-        <w:pStyle w:val="ListBullet"/>
-      </w:pPr>
-      <w:r>
-        <w:t>Open the item's detail page and tap **Edit**</w:t>
+      <w:r>
+        <w:rPr>
+          <w:b/>
+        </w:rPr>
+        <w:t>Need to correct a lot number or expiry date?</w:t>
       </w:r>
     </w:p>
     <w:p>
@@ -2524,21 +3753,29 @@
         <w:pStyle w:val="ListBullet"/>
       </w:pPr>
       <w:r>
-        <w:t>Fix the field and save — the correction is recorded in the item's history automatically</w:t>
+        <w:t xml:space="preserve">Open the item's detail page and tap </w:t>
+      </w:r>
+      <w:r>
+        <w:rPr>
+          <w:b/>
+        </w:rPr>
+        <w:t>Edit</w:t>
       </w:r>
     </w:p>
     <w:p>
-      <w:pPr/>
-      <w:r>
-        <w:t>**Exported Excel file won't open?**</w:t>
+      <w:pPr>
+        <w:pStyle w:val="ListBullet"/>
+      </w:pPr>
+      <w:r>
+        <w:t>Fix the field and save — the correction is recorded in the item's history automatically</w:t>
       </w:r>
     </w:p>
     <w:p>
-      <w:pPr>
-        <w:pStyle w:val="ListBullet"/>
-      </w:pPr>
-      <w:r>
-        <w:t>Make sure you have Microsoft Excel or Google Sheets installed</w:t>
+      <w:r>
+        <w:rPr>
+          <w:b/>
+        </w:rPr>
+        <w:t>Exported Excel file won't open?</w:t>
       </w:r>
     </w:p>
     <w:p>
@@ -2546,35 +3783,49 @@
         <w:pStyle w:val="ListBullet"/>
       </w:pPr>
       <w:r>
-        <w:t>The file is `.xlsx` format — it won't open in Notes or similar apps</w:t>
+        <w:t>Make sure you have Microsoft Excel or Google Sheets installed</w:t>
       </w:r>
     </w:p>
     <w:p>
-      <w:pPr/>
-      <w:r>
-        <w:t>**Lost your login or forgot your password?**</w:t>
+      <w:pPr>
+        <w:pStyle w:val="ListBullet"/>
+      </w:pPr>
+      <w:r>
+        <w:t xml:space="preserve">The file is </w:t>
+      </w:r>
+      <w:r>
+        <w:rPr>
+          <w:rFonts w:ascii="Consolas" w:hAnsi="Consolas"/>
+          <w:color w:val="C7254E"/>
+        </w:rPr>
+        <w:t>.xlsx</w:t>
+      </w:r>
+      <w:r>
+        <w:t xml:space="preserve"> format — it won't open in Notes or similar apps</w:t>
       </w:r>
     </w:p>
     <w:p>
-      <w:pPr>
-        <w:pStyle w:val="ListBullet"/>
-      </w:pPr>
-      <w:r>
-        <w:t>You can't reset your own password — ask your system administrator</w:t>
+      <w:r>
+        <w:rPr>
+          <w:b/>
+        </w:rPr>
+        <w:t>Lost your login or forgot your password?</w:t>
       </w:r>
     </w:p>
     <w:p>
-      <w:pPr/>
-      <w:r>
-        <w:t>**Items expiring soon?**</w:t>
+      <w:pPr>
+        <w:pStyle w:val="ListBullet"/>
+      </w:pPr>
+      <w:r>
+        <w:t>You can't reset your own password — ask your system administrator</w:t>
       </w:r>
     </w:p>
     <w:p>
-      <w:pPr>
-        <w:pStyle w:val="ListBullet"/>
-      </w:pPr>
-      <w:r>
-        <w:t>Check the bell icon at the top of the screen for a quick list</w:t>
+      <w:r>
+        <w:rPr>
+          <w:b/>
+        </w:rPr>
+        <w:t>Items expiring soon?</w:t>
       </w:r>
     </w:p>
     <w:p>
@@ -2582,7 +3833,33 @@
         <w:pStyle w:val="ListBullet"/>
       </w:pPr>
       <w:r>
-        <w:t>Or go to **Reports** and tap the **Expiring &lt; 180d** card for the full list</w:t>
+        <w:t>Check the bell icon at the top of the screen for a quick list</w:t>
+      </w:r>
+    </w:p>
+    <w:p>
+      <w:pPr>
+        <w:pStyle w:val="ListBullet"/>
+      </w:pPr>
+      <w:r>
+        <w:t xml:space="preserve">Or go to </w:t>
+      </w:r>
+      <w:r>
+        <w:rPr>
+          <w:b/>
+        </w:rPr>
+        <w:t>Reports</w:t>
+      </w:r>
+      <w:r>
+        <w:t xml:space="preserve"> and tap the </w:t>
+      </w:r>
+      <w:r>
+        <w:rPr>
+          <w:b/>
+        </w:rPr>
+        <w:t>Expiring &lt; 180d</w:t>
+      </w:r>
+      <w:r>
+        <w:t xml:space="preserve"> card for the full list</w:t>
       </w:r>
     </w:p>
     <w:sectPr>
@@ -2958,6 +4235,10 @@
     <w:name w:val="Normal"/>
     <w:qFormat/>
     <w:rsid w:val="00FC693F"/>
+    <w:rPr>
+      <w:rFonts w:ascii="Calibri" w:hAnsi="Calibri"/>
+      <w:sz w:val="22"/>
+    </w:rPr>
   </w:style>
   <w:style w:type="paragraph" w:styleId="Header">
     <w:name w:val="header"/>

</xml_diff>

<commit_message>
Add admin 'Fix Manual Expiry Dates' button
Admin-only maintenance button on the User Management page that calls the
backfill-manual-expiry endpoint to correct manual items saved one day early,
reporting how many were fixed. Adds the backfillManualExpiry API helper,
changelog entries, and a User Guide note (docx regenerated).

https://claude.ai/code/session_01DpEkPqTrJPSNPeh9KWpcbk
</commit_message>
<xml_diff>
--- a/Nail_Tracker_User_Guide.docx
+++ b/Nail_Tracker_User_Guide.docx
@@ -3093,6 +3093,36 @@
       </w:r>
       <w:r>
         <w:t xml:space="preserve"> Tap the trash icon. You can't delete yourself or the last remaining admin.</w:t>
+      </w:r>
+    </w:p>
+    <w:p>
+      <w:r>
+        <w:rPr>
+          <w:color w:val="CCCCCC"/>
+        </w:rPr>
+        <w:t>________________________________________</w:t>
+      </w:r>
+    </w:p>
+    <w:p>
+      <w:r>
+        <w:rPr>
+          <w:b/>
+        </w:rPr>
+        <w:t>Maintenance — Fix Manual Expiry Dates:</w:t>
+      </w:r>
+    </w:p>
+    <w:p>
+      <w:r>
+        <w:t xml:space="preserve">At the bottom of the User Management page (admins only) is a </w:t>
+      </w:r>
+      <w:r>
+        <w:rPr>
+          <w:b/>
+        </w:rPr>
+        <w:t>Fix Manual Expiry Dates</w:t>
+      </w:r>
+      <w:r>
+        <w:t xml:space="preserve"> button. Older manually-entered items could be saved with an expiration date that displayed one day early. Tap this button once to correct any affected items across the whole system. It's safe to run anytime — it only changes items that still need fixing, and reports how many it corrected.</w:t>
       </w:r>
     </w:p>
     <w:p>

</xml_diff>

<commit_message>
Consolidate Batch Upload into Receive with distributor selector (v3.21)
The standalone Batch Upload page duplicated functionality already in Receive
(multi-photo upload) while adding CSV/Excel import and any-distributor
targeting. Two destinations both labeled 'Batch Upload' was confusing.

- Receive gains a 'Receive into' distributor selector (defaults to Home Office)
  so scans, batch photos, and imports all land in the chosen distributor.
- Receive gains Import CSV / Excel (server-side parse-spreadsheet), received
  immediately like a scan.
- Bank-assignment prompt follows the selected distributor's banks.
- Removed the standalone page and its More-menu item; /batch redirects to
  /receive for old links.
- Version 3.21, changelog (app + root), user guide + regenerated .docx.
</commit_message>
<xml_diff>
--- a/Nail_Tracker_User_Guide.docx
+++ b/Nail_Tracker_User_Guide.docx
@@ -5,6 +5,7 @@
     <w:p>
       <w:pPr>
         <w:pStyle w:val="Title"/>
+        <w:jc w:val="center"/>
       </w:pPr>
       <w:r>
         <w:t>Nail Tracker — User Guide</w:t>
@@ -15,53 +16,55 @@
         <w:rPr>
           <w:b/>
         </w:rPr>
-        <w:t>Version 3.13</w:t>
+        <w:t>Version 3.21</w:t>
       </w:r>
       <w:r>
         <w:t xml:space="preserve"> | Summa Orthopaedics Inventory Management System</w:t>
+      </w:r>
+    </w:p>
+    <w:p/>
+    <w:p>
+      <w:pPr>
+        <w:pStyle w:val="Heading1"/>
+      </w:pPr>
+      <w:r>
+        <w:t>What Is Nail Tracker?</w:t>
       </w:r>
     </w:p>
     <w:p>
-      <w:pPr>
-        <w:pStyle w:val="Heading1"/>
-      </w:pPr>
-      <w:r>
-        <w:t>What Is Nail Tracker?</w:t>
+      <w:r>
+        <w:t>Nail Tracker is the system your company uses to keep track of orthopedic implants — things like nails, screws, and caps — as they move from the Home Office warehouse out to sales reps and distributors in the field.</w:t>
       </w:r>
     </w:p>
     <w:p>
       <w:r>
-        <w:t>Nail Tracker is the system your company uses to keep track of orthopedic implants — things like nails, screws, and caps — as they move from the Home Office warehouse out to sales reps and distributors in the field.</w:t>
+        <w:t>Every time a box of implants arrives, gets moved, or gets used in surgery, Nail Tracker records it. That way, you always know exactly what you have, where it is, and when it expires.</w:t>
       </w:r>
     </w:p>
     <w:p>
       <w:r>
-        <w:t>Every time a box of implants arrives, gets moved, or gets used in surgery, Nail Tracker records it. That way, you always know exactly what you have, where it is, and when it expires.</w:t>
+        <w:t>This guide will walk you through everything you need to know to use the system confidently.</w:t>
+      </w:r>
+    </w:p>
+    <w:p/>
+    <w:p>
+      <w:pPr>
+        <w:pStyle w:val="Heading1"/>
+      </w:pPr>
+      <w:r>
+        <w:t>Getting Started</w:t>
       </w:r>
     </w:p>
     <w:p>
-      <w:r>
-        <w:t>This guide will walk you through everything you need to know to use the system confidently.</w:t>
+      <w:pPr>
+        <w:pStyle w:val="Heading2"/>
+      </w:pPr>
+      <w:r>
+        <w:t>Logging In</w:t>
       </w:r>
     </w:p>
     <w:p>
       <w:pPr>
-        <w:pStyle w:val="Heading1"/>
-      </w:pPr>
-      <w:r>
-        <w:t>Getting Started</w:t>
-      </w:r>
-    </w:p>
-    <w:p>
-      <w:pPr>
-        <w:pStyle w:val="Heading2"/>
-      </w:pPr>
-      <w:r>
-        <w:t>Logging In</w:t>
-      </w:r>
-    </w:p>
-    <w:p>
-      <w:pPr>
         <w:pStyle w:val="ListNumber"/>
       </w:pPr>
       <w:r>
@@ -70,6 +73,7 @@
       <w:r>
         <w:rPr>
           <w:rFonts w:ascii="Consolas" w:hAnsi="Consolas"/>
+          <w:color w:val="B03060"/>
         </w:rPr>
         <w:t>inventory.phillyshah.com</w:t>
       </w:r>
@@ -115,6 +119,7 @@
         <w:t xml:space="preserve"> Ask your manager or system administrator to reset it for you.</w:t>
       </w:r>
     </w:p>
+    <w:p/>
     <w:p>
       <w:pPr>
         <w:pStyle w:val="Heading2"/>
@@ -259,6 +264,7 @@
         <w:t>Once installed, it opens full-screen just like any other app on your phone.</w:t>
       </w:r>
     </w:p>
+    <w:p/>
     <w:p>
       <w:pPr>
         <w:pStyle w:val="Heading2"/>
@@ -329,7 +335,7 @@
         <w:t>Tools</w:t>
       </w:r>
       <w:r>
-        <w:t xml:space="preserve"> (Lookup, Transfer, Batch Upload), </w:t>
+        <w:t xml:space="preserve"> (Lookup, Transfer), </w:t>
       </w:r>
       <w:r>
         <w:rPr>
@@ -390,6 +396,7 @@
         <w:t xml:space="preserve"> near the top of the screen. Tap it to see a summary of recent changes to the app.</w:t>
       </w:r>
     </w:p>
+    <w:p/>
     <w:p>
       <w:pPr>
         <w:pStyle w:val="Heading1"/>
@@ -487,6 +494,7 @@
         <w:t xml:space="preserve"> Expired implants cannot be used in surgery. Catching items early gives you time to arrange returns or replacements before they become a problem.</w:t>
       </w:r>
     </w:p>
+    <w:p/>
     <w:p>
       <w:pPr>
         <w:pStyle w:val="Heading1"/>
@@ -525,7 +533,7 @@
     </w:p>
     <w:p>
       <w:r>
-        <w:t>This is where you bring new items into the system. When a shipment arrives at the Home Office warehouse, you scan each item here. The system automatically records it under "Home Office."</w:t>
+        <w:t>This is where you bring new items into the system. When a shipment arrives, you scan each item here and the app records it automatically.</w:t>
       </w:r>
     </w:p>
     <w:p>
@@ -533,7 +541,37 @@
         <w:rPr>
           <w:b/>
         </w:rPr>
-        <w:t>The four ways to receive an item:</w:t>
+        <w:t>Choosing where items go:</w:t>
+      </w:r>
+      <w:r>
+        <w:t xml:space="preserve"> At the top of the Receive screen there's a </w:t>
+      </w:r>
+      <w:r>
+        <w:rPr>
+          <w:b/>
+        </w:rPr>
+        <w:t>"Receive into"</w:t>
+      </w:r>
+      <w:r>
+        <w:t xml:space="preserve"> selector. It defaults to </w:t>
+      </w:r>
+      <w:r>
+        <w:rPr>
+          <w:b/>
+        </w:rPr>
+        <w:t>Home Office</w:t>
+      </w:r>
+      <w:r>
+        <w:t xml:space="preserve"> — the usual starting point for a new shipment — but you can switch it to any distributor to receive stock directly into their inventory (handy when importing a spreadsheet of a distributor's existing stock). Everything you receive on the screen — scans, photos, and file imports — goes into whichever distributor is selected here.</w:t>
+      </w:r>
+    </w:p>
+    <w:p/>
+    <w:p>
+      <w:r>
+        <w:rPr>
+          <w:b/>
+        </w:rPr>
+        <w:t>The ways to receive an item:</w:t>
       </w:r>
     </w:p>
     <w:p>
@@ -541,7 +579,13 @@
         <w:pStyle w:val="Heading3"/>
       </w:pPr>
       <w:r>
-        <w:t>Option A — Live Scan *(best for high volume)*</w:t>
+        <w:t xml:space="preserve">Option A — Live Scan </w:t>
+      </w:r>
+      <w:r>
+        <w:rPr>
+          <w:i/>
+        </w:rPr>
+        <w:t>(best for high volume)</w:t>
       </w:r>
     </w:p>
     <w:p>
@@ -662,7 +706,13 @@
         <w:pStyle w:val="Heading3"/>
       </w:pPr>
       <w:r>
-        <w:t>Option C — Batch Upload *(for large shipments)*</w:t>
+        <w:t xml:space="preserve">Option C — Batch Photos </w:t>
+      </w:r>
+      <w:r>
+        <w:rPr>
+          <w:i/>
+        </w:rPr>
+        <w:t>(for large shipments)</w:t>
       </w:r>
     </w:p>
     <w:p>
@@ -681,7 +731,7 @@
         <w:rPr>
           <w:b/>
         </w:rPr>
-        <w:t>Batch Upload</w:t>
+        <w:t>Batch Photos</w:t>
       </w:r>
     </w:p>
     <w:p>
@@ -711,7 +761,7 @@
         <w:pStyle w:val="ListNumber"/>
       </w:pPr>
       <w:r>
-        <w:t>All successfully scanned items are saved to Home Office automatically</w:t>
+        <w:t>All successfully scanned items are saved automatically into the selected distributor</w:t>
       </w:r>
     </w:p>
     <w:p>
@@ -719,7 +769,94 @@
         <w:pStyle w:val="Heading3"/>
       </w:pPr>
       <w:r>
-        <w:t>Option D — Manual Entry</w:t>
+        <w:t xml:space="preserve">Option D — Import CSV / Excel </w:t>
+      </w:r>
+      <w:r>
+        <w:rPr>
+          <w:i/>
+        </w:rPr>
+        <w:t>(for spreadsheets of barcodes)</w:t>
+      </w:r>
+    </w:p>
+    <w:p>
+      <w:r>
+        <w:t>If you have a list of barcodes in a spreadsheet — for example a stock list from a distributor:</w:t>
+      </w:r>
+    </w:p>
+    <w:p>
+      <w:pPr>
+        <w:pStyle w:val="ListNumber"/>
+      </w:pPr>
+      <w:r>
+        <w:t xml:space="preserve">Tap </w:t>
+      </w:r>
+      <w:r>
+        <w:rPr>
+          <w:b/>
+        </w:rPr>
+        <w:t>Import CSV / Excel</w:t>
+      </w:r>
+    </w:p>
+    <w:p>
+      <w:pPr>
+        <w:pStyle w:val="ListNumber"/>
+      </w:pPr>
+      <w:r>
+        <w:t xml:space="preserve">Choose a </w:t>
+      </w:r>
+      <w:r>
+        <w:rPr>
+          <w:rFonts w:ascii="Consolas" w:hAnsi="Consolas"/>
+          <w:color w:val="B03060"/>
+        </w:rPr>
+        <w:t>.csv</w:t>
+      </w:r>
+      <w:r>
+        <w:t xml:space="preserve">, </w:t>
+      </w:r>
+      <w:r>
+        <w:rPr>
+          <w:rFonts w:ascii="Consolas" w:hAnsi="Consolas"/>
+          <w:color w:val="B03060"/>
+        </w:rPr>
+        <w:t>.txt</w:t>
+      </w:r>
+      <w:r>
+        <w:t>, or Excel (</w:t>
+      </w:r>
+      <w:r>
+        <w:rPr>
+          <w:rFonts w:ascii="Consolas" w:hAnsi="Consolas"/>
+          <w:color w:val="B03060"/>
+        </w:rPr>
+        <w:t>.xlsx</w:t>
+      </w:r>
+      <w:r>
+        <w:t>) file containing the barcode strings</w:t>
+      </w:r>
+    </w:p>
+    <w:p>
+      <w:pPr>
+        <w:pStyle w:val="ListNumber"/>
+      </w:pPr>
+      <w:r>
+        <w:t>The app reads every barcode and receives each one into the selected distributor automatically</w:t>
+      </w:r>
+    </w:p>
+    <w:p>
+      <w:pPr>
+        <w:pStyle w:val="IntenseQuote"/>
+      </w:pPr>
+      <w:r>
+        <w:t>This works the same on desktop and mobile — the file is read on the server, so real Excel files import correctly everywhere.</w:t>
+      </w:r>
+    </w:p>
+    <w:p>
+      <w:pPr>
+        <w:pStyle w:val="Heading3"/>
+      </w:pPr>
+      <w:r>
+        <w:t>Option E — Manual Entry</w:t>
       </w:r>
     </w:p>
     <w:p>
@@ -776,6 +913,7 @@
       <w:r>
         <w:rPr>
           <w:rFonts w:ascii="Consolas" w:hAnsi="Consolas"/>
+          <w:color w:val="B03060"/>
         </w:rPr>
         <w:t>(01)08880089459148(10)J250929-L021(17)300928</w:t>
       </w:r>
@@ -831,7 +969,7 @@
     </w:p>
     <w:p>
       <w:pPr>
-        <w:pStyle w:val="ListBullet"/>
+        <w:pStyle w:val="ListBullet2"/>
       </w:pPr>
       <w:r>
         <w:rPr>
@@ -845,13 +983,14 @@
       <w:r>
         <w:rPr>
           <w:rFonts w:ascii="Consolas" w:hAnsi="Consolas"/>
+          <w:color w:val="B03060"/>
         </w:rPr>
         <w:t>SO-SPFN-0180-10-25</w:t>
       </w:r>
     </w:p>
     <w:p>
       <w:pPr>
-        <w:pStyle w:val="ListBullet"/>
+        <w:pStyle w:val="ListBullet2"/>
       </w:pPr>
       <w:r>
         <w:rPr>
@@ -865,7 +1004,7 @@
     </w:p>
     <w:p>
       <w:pPr>
-        <w:pStyle w:val="ListBullet"/>
+        <w:pStyle w:val="ListBullet2"/>
       </w:pPr>
       <w:r>
         <w:rPr>
@@ -879,7 +1018,7 @@
     </w:p>
     <w:p>
       <w:pPr>
-        <w:pStyle w:val="ListBullet"/>
+        <w:pStyle w:val="ListBullet2"/>
       </w:pPr>
       <w:r>
         <w:rPr>
@@ -924,6 +1063,7 @@
         <w:t xml:space="preserve"> If you're receiving 50 screws that all came from the same manufacturing batch (same lot number), that's completely fine — scan each one individually and the system will create a separate record for each physical item. This is the correct way to do it.</w:t>
       </w:r>
     </w:p>
+    <w:p/>
     <w:p>
       <w:r>
         <w:rPr>
@@ -990,6 +1130,7 @@
         <w:t>If they don't belong to a kit yet, just skip this step — you can always assign them later.</w:t>
       </w:r>
     </w:p>
+    <w:p/>
     <w:p>
       <w:pPr>
         <w:pStyle w:val="Heading2"/>
@@ -1050,7 +1191,7 @@
     </w:p>
     <w:p>
       <w:pPr>
-        <w:pStyle w:val="ListBullet"/>
+        <w:pStyle w:val="ListBullet2"/>
       </w:pPr>
       <w:r>
         <w:t>Whether the item is in the system</w:t>
@@ -1058,7 +1199,7 @@
     </w:p>
     <w:p>
       <w:pPr>
-        <w:pStyle w:val="ListBullet"/>
+        <w:pStyle w:val="ListBullet2"/>
       </w:pPr>
       <w:r>
         <w:t>Where it currently is (which distributor has it)</w:t>
@@ -1066,7 +1207,7 @@
     </w:p>
     <w:p>
       <w:pPr>
-        <w:pStyle w:val="ListBullet"/>
+        <w:pStyle w:val="ListBullet2"/>
       </w:pPr>
       <w:r>
         <w:t>Its lot number and expiry date</w:t>
@@ -1074,7 +1215,7 @@
     </w:p>
     <w:p>
       <w:pPr>
-        <w:pStyle w:val="ListBullet"/>
+        <w:pStyle w:val="ListBullet2"/>
       </w:pPr>
       <w:r>
         <w:t>Its full history — every time it was moved and who moved it</w:t>
@@ -1106,6 +1247,7 @@
         <w:t xml:space="preserve"> (meaning it was implanted in a patient)</w:t>
       </w:r>
     </w:p>
+    <w:p/>
     <w:p>
       <w:pPr>
         <w:pStyle w:val="Heading2"/>
@@ -1139,6 +1281,7 @@
         <w:t>This page shows all active items in the system — everything that hasn't been used or deleted. Think of it as a live spreadsheet of your entire stock.</w:t>
       </w:r>
     </w:p>
+    <w:p/>
     <w:p>
       <w:r>
         <w:rPr>
@@ -1220,6 +1363,7 @@
         <w:t>Tap any column header to sort by that column. Tap it again to reverse the order (A→Z or Z→A, newest or oldest, etc.). By default, items are sorted by Item Number.</w:t>
       </w:r>
     </w:p>
+    <w:p/>
     <w:p>
       <w:r>
         <w:rPr>
@@ -1303,6 +1447,7 @@
         <w:t xml:space="preserve"> button to get a spreadsheet of your current filtered inventory. Expired items are highlighted in red automatically.</w:t>
       </w:r>
     </w:p>
+    <w:p/>
     <w:p>
       <w:r>
         <w:rPr>
@@ -1311,31 +1456,128 @@
         <w:t>What the color badges mean:</w:t>
       </w:r>
     </w:p>
-    <w:p>
-      <w:r>
-        <w:t>| Badge Color | What It Means |</w:t>
-      </w:r>
-    </w:p>
-    <w:p>
-      <w:r>
-        <w:t>|------------|---------------|</w:t>
-      </w:r>
-    </w:p>
-    <w:p>
-      <w:r>
-        <w:t>| Red | Expired, or expiring within 90 days — needs attention |</w:t>
-      </w:r>
-    </w:p>
-    <w:p>
-      <w:r>
-        <w:t>| Yellow | Expiring within 6 months — keep an eye on it |</w:t>
-      </w:r>
-    </w:p>
-    <w:p>
-      <w:r>
-        <w:t>| No badge | More than 6 months until expiry — you're fine |</w:t>
-      </w:r>
-    </w:p>
+    <w:tbl>
+      <w:tblPr>
+        <w:tblStyle w:val="LightGrid-Accent1"/>
+        <w:tblW w:type="auto" w:w="0"/>
+        <w:tblLook w:firstColumn="1" w:firstRow="1" w:lastColumn="0" w:lastRow="0" w:noHBand="0" w:noVBand="1" w:val="04A0"/>
+      </w:tblPr>
+      <w:tblGrid>
+        <w:gridCol w:w="4320"/>
+        <w:gridCol w:w="4320"/>
+      </w:tblGrid>
+      <w:tr>
+        <w:tc>
+          <w:tcPr>
+            <w:tcW w:type="dxa" w:w="4320"/>
+          </w:tcPr>
+          <w:p>
+            <w:r>
+              <w:rPr>
+                <w:b/>
+              </w:rPr>
+            </w:r>
+            <w:r>
+              <w:rPr>
+                <w:b/>
+              </w:rPr>
+              <w:t>Badge Color</w:t>
+            </w:r>
+          </w:p>
+        </w:tc>
+        <w:tc>
+          <w:tcPr>
+            <w:tcW w:type="dxa" w:w="4320"/>
+          </w:tcPr>
+          <w:p>
+            <w:r>
+              <w:rPr>
+                <w:b/>
+              </w:rPr>
+            </w:r>
+            <w:r>
+              <w:rPr>
+                <w:b/>
+              </w:rPr>
+              <w:t>What It Means</w:t>
+            </w:r>
+          </w:p>
+        </w:tc>
+      </w:tr>
+      <w:tr>
+        <w:tc>
+          <w:tcPr>
+            <w:tcW w:type="dxa" w:w="4320"/>
+          </w:tcPr>
+          <w:p>
+            <w:r/>
+            <w:r>
+              <w:t>Red</w:t>
+            </w:r>
+          </w:p>
+        </w:tc>
+        <w:tc>
+          <w:tcPr>
+            <w:tcW w:type="dxa" w:w="4320"/>
+          </w:tcPr>
+          <w:p>
+            <w:r/>
+            <w:r>
+              <w:t>Expired, or expiring within 90 days — needs attention</w:t>
+            </w:r>
+          </w:p>
+        </w:tc>
+      </w:tr>
+      <w:tr>
+        <w:tc>
+          <w:tcPr>
+            <w:tcW w:type="dxa" w:w="4320"/>
+          </w:tcPr>
+          <w:p>
+            <w:r/>
+            <w:r>
+              <w:t>Yellow</w:t>
+            </w:r>
+          </w:p>
+        </w:tc>
+        <w:tc>
+          <w:tcPr>
+            <w:tcW w:type="dxa" w:w="4320"/>
+          </w:tcPr>
+          <w:p>
+            <w:r/>
+            <w:r>
+              <w:t>Expiring within 6 months — keep an eye on it</w:t>
+            </w:r>
+          </w:p>
+        </w:tc>
+      </w:tr>
+      <w:tr>
+        <w:tc>
+          <w:tcPr>
+            <w:tcW w:type="dxa" w:w="4320"/>
+          </w:tcPr>
+          <w:p>
+            <w:r/>
+            <w:r>
+              <w:t>No badge</w:t>
+            </w:r>
+          </w:p>
+        </w:tc>
+        <w:tc>
+          <w:tcPr>
+            <w:tcW w:type="dxa" w:w="4320"/>
+          </w:tcPr>
+          <w:p>
+            <w:r/>
+            <w:r>
+              <w:t>More than 6 months until expiry — you're fine</w:t>
+            </w:r>
+          </w:p>
+        </w:tc>
+      </w:tr>
+    </w:tbl>
+    <w:p/>
     <w:p>
       <w:pPr>
         <w:pStyle w:val="Heading2"/>
@@ -1360,6 +1602,7 @@
         <w:t>This page shows you everything about one specific physical item.</w:t>
       </w:r>
     </w:p>
+    <w:p/>
     <w:p>
       <w:r>
         <w:rPr>
@@ -1417,6 +1660,7 @@
         <w:t>A full history of everywhere the item has been and who moved it</w:t>
       </w:r>
     </w:p>
+    <w:p/>
     <w:p>
       <w:r>
         <w:rPr>
@@ -1425,19 +1669,2197 @@
         <w:t>What you can do:</w:t>
       </w:r>
     </w:p>
+    <w:tbl>
+      <w:tblPr>
+        <w:tblStyle w:val="LightGrid-Accent1"/>
+        <w:tblW w:type="auto" w:w="0"/>
+        <w:tblLook w:firstColumn="1" w:firstRow="1" w:lastColumn="0" w:lastRow="0" w:noHBand="0" w:noVBand="1" w:val="04A0"/>
+      </w:tblPr>
+      <w:tblGrid>
+        <w:gridCol w:w="4320"/>
+        <w:gridCol w:w="4320"/>
+      </w:tblGrid>
+      <w:tr>
+        <w:tc>
+          <w:tcPr>
+            <w:tcW w:type="dxa" w:w="4320"/>
+          </w:tcPr>
+          <w:p>
+            <w:r>
+              <w:rPr>
+                <w:b/>
+              </w:rPr>
+            </w:r>
+            <w:r>
+              <w:rPr>
+                <w:b/>
+              </w:rPr>
+              <w:t>Button</w:t>
+            </w:r>
+          </w:p>
+        </w:tc>
+        <w:tc>
+          <w:tcPr>
+            <w:tcW w:type="dxa" w:w="4320"/>
+          </w:tcPr>
+          <w:p>
+            <w:r>
+              <w:rPr>
+                <w:b/>
+              </w:rPr>
+            </w:r>
+            <w:r>
+              <w:rPr>
+                <w:b/>
+              </w:rPr>
+              <w:t>What It Does</w:t>
+            </w:r>
+          </w:p>
+        </w:tc>
+      </w:tr>
+      <w:tr>
+        <w:tc>
+          <w:tcPr>
+            <w:tcW w:type="dxa" w:w="4320"/>
+          </w:tcPr>
+          <w:p>
+            <w:r/>
+            <w:r>
+              <w:rPr>
+                <w:b/>
+              </w:rPr>
+              <w:t>Edit</w:t>
+            </w:r>
+          </w:p>
+        </w:tc>
+        <w:tc>
+          <w:tcPr>
+            <w:tcW w:type="dxa" w:w="4320"/>
+          </w:tcPr>
+          <w:p>
+            <w:r/>
+            <w:r>
+              <w:t>Fix a mistake — wrong lot number, wrong expiry date, wrong product label. Every change is saved with your name and the time so there's a full audit trail.</w:t>
+            </w:r>
+          </w:p>
+        </w:tc>
+      </w:tr>
+      <w:tr>
+        <w:tc>
+          <w:tcPr>
+            <w:tcW w:type="dxa" w:w="4320"/>
+          </w:tcPr>
+          <w:p>
+            <w:r/>
+            <w:r>
+              <w:rPr>
+                <w:b/>
+              </w:rPr>
+              <w:t>Reassign</w:t>
+            </w:r>
+          </w:p>
+        </w:tc>
+        <w:tc>
+          <w:tcPr>
+            <w:tcW w:type="dxa" w:w="4320"/>
+          </w:tcPr>
+          <w:p>
+            <w:r/>
+            <w:r>
+              <w:t>Move the item to a different distributor. A transfer record is created automatically.</w:t>
+            </w:r>
+          </w:p>
+        </w:tc>
+      </w:tr>
+      <w:tr>
+        <w:tc>
+          <w:tcPr>
+            <w:tcW w:type="dxa" w:w="4320"/>
+          </w:tcPr>
+          <w:p>
+            <w:r/>
+            <w:r>
+              <w:rPr>
+                <w:b/>
+              </w:rPr>
+              <w:t>Mark as Used</w:t>
+            </w:r>
+          </w:p>
+        </w:tc>
+        <w:tc>
+          <w:tcPr>
+            <w:tcW w:type="dxa" w:w="4320"/>
+          </w:tcPr>
+          <w:p>
+            <w:r/>
+            <w:r>
+              <w:t>Record that this item was implanted in a patient. It will disappear from active inventory.</w:t>
+            </w:r>
+          </w:p>
+        </w:tc>
+      </w:tr>
+      <w:tr>
+        <w:tc>
+          <w:tcPr>
+            <w:tcW w:type="dxa" w:w="4320"/>
+          </w:tcPr>
+          <w:p>
+            <w:r/>
+            <w:r>
+              <w:rPr>
+                <w:b/>
+              </w:rPr>
+              <w:t>Delete</w:t>
+            </w:r>
+          </w:p>
+        </w:tc>
+        <w:tc>
+          <w:tcPr>
+            <w:tcW w:type="dxa" w:w="4320"/>
+          </w:tcPr>
+          <w:p>
+            <w:r/>
+            <w:r>
+              <w:t>Remove the item entirely. Use with caution.</w:t>
+            </w:r>
+          </w:p>
+        </w:tc>
+      </w:tr>
+    </w:tbl>
     <w:p>
-      <w:r>
-        <w:t>| Button | What It Does |</w:t>
+      <w:pPr>
+        <w:pStyle w:val="IntenseQuote"/>
+      </w:pPr>
+      <w:r>
+        <w:rPr>
+          <w:b/>
+        </w:rPr>
+        <w:t>Keyboard shortcut:</w:t>
+      </w:r>
+      <w:r>
+        <w:t xml:space="preserve"> If you're on a computer, press </w:t>
+      </w:r>
+      <w:r>
+        <w:rPr>
+          <w:b/>
+        </w:rPr>
+        <w:t>ESC</w:t>
+      </w:r>
+      <w:r>
+        <w:t xml:space="preserve"> at any time to close a photo or a pop-up window.</w:t>
+      </w:r>
+    </w:p>
+    <w:p/>
+    <w:p>
+      <w:pPr>
+        <w:pStyle w:val="Heading2"/>
+      </w:pPr>
+      <w:r>
+        <w:t>5. Banks (Item Kits)</w:t>
       </w:r>
     </w:p>
     <w:p>
       <w:r>
-        <w:t>|--------|-------------|</w:t>
+        <w:rPr>
+          <w:b/>
+        </w:rPr>
+        <w:t>Where to go:</w:t>
+      </w:r>
+      <w:r>
+        <w:t xml:space="preserve"> Tap </w:t>
+      </w:r>
+      <w:r>
+        <w:rPr>
+          <w:b/>
+        </w:rPr>
+        <w:t>More</w:t>
+      </w:r>
+      <w:r>
+        <w:t xml:space="preserve"> → </w:t>
+      </w:r>
+      <w:r>
+        <w:rPr>
+          <w:b/>
+        </w:rPr>
+        <w:t>Banks</w:t>
       </w:r>
     </w:p>
     <w:p>
       <w:r>
-        <w:t xml:space="preserve">| </w:t>
+        <w:t>A "bank" is a named group of items that belong together — for example, a kit that a sales rep takes to a specific hospital, or a tray of implants for a particular surgery type. Banks make it easy to move a whole group of items at once instead of one by one.</w:t>
+      </w:r>
+    </w:p>
+    <w:p/>
+    <w:p>
+      <w:r>
+        <w:rPr>
+          <w:b/>
+        </w:rPr>
+        <w:t>Creating a bank:</w:t>
+      </w:r>
+    </w:p>
+    <w:p>
+      <w:pPr>
+        <w:pStyle w:val="ListNumber"/>
+      </w:pPr>
+      <w:r>
+        <w:t xml:space="preserve">Tap </w:t>
+      </w:r>
+      <w:r>
+        <w:rPr>
+          <w:b/>
+        </w:rPr>
+        <w:t>Create Bank</w:t>
+      </w:r>
+    </w:p>
+    <w:p>
+      <w:pPr>
+        <w:pStyle w:val="ListNumber"/>
+      </w:pPr>
+      <w:r>
+        <w:t>Give it a name (e.g., "Smith - General Hospital Kit") and an optional description</w:t>
+      </w:r>
+    </w:p>
+    <w:p>
+      <w:pPr>
+        <w:pStyle w:val="ListNumber"/>
+      </w:pPr>
+      <w:r>
+        <w:t>Select which distributor it belongs to</w:t>
+      </w:r>
+    </w:p>
+    <w:p>
+      <w:pPr>
+        <w:pStyle w:val="ListNumber"/>
+      </w:pPr>
+      <w:r>
+        <w:t xml:space="preserve">Tap </w:t>
+      </w:r>
+      <w:r>
+        <w:rPr>
+          <w:b/>
+        </w:rPr>
+        <w:t>Create</w:t>
+      </w:r>
+    </w:p>
+    <w:p>
+      <w:r>
+        <w:rPr>
+          <w:b/>
+        </w:rPr>
+        <w:t>Adding items to a bank:</w:t>
+      </w:r>
+    </w:p>
+    <w:p>
+      <w:pPr>
+        <w:pStyle w:val="ListNumber"/>
+      </w:pPr>
+      <w:r>
+        <w:t xml:space="preserve">Open the bank, then tap </w:t>
+      </w:r>
+      <w:r>
+        <w:rPr>
+          <w:b/>
+        </w:rPr>
+        <w:t>Add Items</w:t>
+      </w:r>
+    </w:p>
+    <w:p>
+      <w:pPr>
+        <w:pStyle w:val="ListNumber"/>
+      </w:pPr>
+      <w:r>
+        <w:t>You'll see a list of items at the same distributor as the bank — items already in another bank won't appear here</w:t>
+      </w:r>
+    </w:p>
+    <w:p>
+      <w:pPr>
+        <w:pStyle w:val="ListNumber"/>
+      </w:pPr>
+      <w:r>
+        <w:t xml:space="preserve">Check the items you want to add, then tap </w:t>
+      </w:r>
+      <w:r>
+        <w:rPr>
+          <w:b/>
+        </w:rPr>
+        <w:t>Add</w:t>
+      </w:r>
+    </w:p>
+    <w:p>
+      <w:r>
+        <w:rPr>
+          <w:b/>
+        </w:rPr>
+        <w:t>Removing an item:</w:t>
+      </w:r>
+    </w:p>
+    <w:p>
+      <w:r>
+        <w:t xml:space="preserve">Tap the </w:t>
+      </w:r>
+      <w:r>
+        <w:rPr>
+          <w:b/>
+        </w:rPr>
+        <w:t>X</w:t>
+      </w:r>
+      <w:r>
+        <w:t xml:space="preserve"> next to an item in the bank list. The item doesn't get deleted — it just leaves the bank and stays in that distributor's regular inventory.</w:t>
+      </w:r>
+    </w:p>
+    <w:p>
+      <w:r>
+        <w:rPr>
+          <w:b/>
+        </w:rPr>
+        <w:t>Moving a whole bank:</w:t>
+      </w:r>
+    </w:p>
+    <w:p>
+      <w:pPr>
+        <w:pStyle w:val="ListNumber"/>
+      </w:pPr>
+      <w:r>
+        <w:t xml:space="preserve">Open the bank, tap </w:t>
+      </w:r>
+      <w:r>
+        <w:rPr>
+          <w:b/>
+        </w:rPr>
+        <w:t>Move Bank</w:t>
+      </w:r>
+    </w:p>
+    <w:p>
+      <w:pPr>
+        <w:pStyle w:val="ListNumber"/>
+      </w:pPr>
+      <w:r>
+        <w:t>Choose the destination distributor</w:t>
+      </w:r>
+    </w:p>
+    <w:p>
+      <w:pPr>
+        <w:pStyle w:val="ListNumber"/>
+      </w:pPr>
+      <w:r>
+        <w:t>Every item in the bank gets reassigned to that distributor, and the move is logged in the history</w:t>
+      </w:r>
+    </w:p>
+    <w:p/>
+    <w:p>
+      <w:pPr>
+        <w:pStyle w:val="Heading2"/>
+      </w:pPr>
+      <w:r>
+        <w:t>6. Transfers</w:t>
+      </w:r>
+    </w:p>
+    <w:p>
+      <w:r>
+        <w:rPr>
+          <w:b/>
+        </w:rPr>
+        <w:t>Where to go:</w:t>
+      </w:r>
+      <w:r>
+        <w:t xml:space="preserve"> Tap </w:t>
+      </w:r>
+      <w:r>
+        <w:rPr>
+          <w:b/>
+        </w:rPr>
+        <w:t>More</w:t>
+      </w:r>
+      <w:r>
+        <w:t xml:space="preserve"> → </w:t>
+      </w:r>
+      <w:r>
+        <w:rPr>
+          <w:b/>
+        </w:rPr>
+        <w:t>Transfer</w:t>
+      </w:r>
+    </w:p>
+    <w:p>
+      <w:r>
+        <w:t xml:space="preserve">Use this when you need to officially move items from one distributor to another — for example, pulling items back from a rep or shipping a set of implants out to a new location. Every transfer gets its own ID (like </w:t>
+      </w:r>
+      <w:r>
+        <w:rPr>
+          <w:rFonts w:ascii="Consolas" w:hAnsi="Consolas"/>
+          <w:color w:val="B03060"/>
+        </w:rPr>
+        <w:t>TRF-20260514-0001</w:t>
+      </w:r>
+      <w:r>
+        <w:t>) so you can reference it later.</w:t>
+      </w:r>
+    </w:p>
+    <w:p/>
+    <w:p>
+      <w:r>
+        <w:rPr>
+          <w:b/>
+        </w:rPr>
+        <w:t>Creating a transfer:</w:t>
+      </w:r>
+    </w:p>
+    <w:p>
+      <w:pPr>
+        <w:pStyle w:val="ListNumber"/>
+      </w:pPr>
+      <w:r>
+        <w:t xml:space="preserve">Under </w:t>
+      </w:r>
+      <w:r>
+        <w:rPr>
+          <w:b/>
+        </w:rPr>
+        <w:t>From</w:t>
+      </w:r>
+      <w:r>
+        <w:t>, choose where the items are coming from</w:t>
+      </w:r>
+    </w:p>
+    <w:p>
+      <w:pPr>
+        <w:pStyle w:val="ListNumber"/>
+      </w:pPr>
+      <w:r>
+        <w:t xml:space="preserve">Under </w:t>
+      </w:r>
+      <w:r>
+        <w:rPr>
+          <w:b/>
+        </w:rPr>
+        <w:t>To</w:t>
+      </w:r>
+      <w:r>
+        <w:t>, choose where they're going</w:t>
+      </w:r>
+    </w:p>
+    <w:p>
+      <w:pPr>
+        <w:pStyle w:val="ListNumber"/>
+      </w:pPr>
+      <w:r>
+        <w:t xml:space="preserve">Check the boxes next to the items you want to move. Tap </w:t>
+      </w:r>
+      <w:r>
+        <w:rPr>
+          <w:b/>
+        </w:rPr>
+        <w:t>Select All</w:t>
+      </w:r>
+      <w:r>
+        <w:t xml:space="preserve"> if you want everything.</w:t>
+      </w:r>
+    </w:p>
+    <w:p>
+      <w:pPr>
+        <w:pStyle w:val="ListNumber"/>
+      </w:pPr>
+      <w:r>
+        <w:t>Add an optional note (e.g., "Returning expired stock" or "Filling new rep order")</w:t>
+      </w:r>
+    </w:p>
+    <w:p>
+      <w:pPr>
+        <w:pStyle w:val="ListNumber"/>
+      </w:pPr>
+      <w:r>
+        <w:t xml:space="preserve">Tap </w:t>
+      </w:r>
+      <w:r>
+        <w:rPr>
+          <w:b/>
+        </w:rPr>
+        <w:t>Confirm Transfer</w:t>
+      </w:r>
+    </w:p>
+    <w:p>
+      <w:r>
+        <w:t>The system creates a transfer record and updates every item's location automatically.</w:t>
+      </w:r>
+    </w:p>
+    <w:p>
+      <w:pPr>
+        <w:pStyle w:val="IntenseQuote"/>
+      </w:pPr>
+      <w:r>
+        <w:rPr>
+          <w:b/>
+        </w:rPr>
+        <w:t>Single-item reassignment also counts:</w:t>
+      </w:r>
+      <w:r>
+        <w:t xml:space="preserve"> If you move one item from its detail page using the Reassign button, a transfer record is created for that too — so every move is always tracked.</w:t>
+      </w:r>
+    </w:p>
+    <w:p/>
+    <w:p>
+      <w:r>
+        <w:rPr>
+          <w:b/>
+        </w:rPr>
+        <w:t>Printing a transfer report:</w:t>
+      </w:r>
+    </w:p>
+    <w:p>
+      <w:r>
+        <w:t>If you need a paper record of a transfer:</w:t>
+      </w:r>
+    </w:p>
+    <w:p>
+      <w:pPr>
+        <w:pStyle w:val="ListNumber"/>
+      </w:pPr>
+      <w:r>
+        <w:t xml:space="preserve">Find the transfer in </w:t>
+      </w:r>
+      <w:r>
+        <w:rPr>
+          <w:b/>
+        </w:rPr>
+        <w:t>Reports</w:t>
+      </w:r>
+      <w:r>
+        <w:t xml:space="preserve"> → </w:t>
+      </w:r>
+      <w:r>
+        <w:rPr>
+          <w:b/>
+        </w:rPr>
+        <w:t>Transfer History</w:t>
+      </w:r>
+      <w:r>
+        <w:t xml:space="preserve"> and tap its ID (e.g., TRF-20260514-0001)</w:t>
+      </w:r>
+    </w:p>
+    <w:p>
+      <w:pPr>
+        <w:pStyle w:val="ListNumber"/>
+      </w:pPr>
+      <w:r>
+        <w:t xml:space="preserve">Tap the </w:t>
+      </w:r>
+      <w:r>
+        <w:rPr>
+          <w:b/>
+        </w:rPr>
+        <w:t>Print</w:t>
+      </w:r>
+      <w:r>
+        <w:t xml:space="preserve"> button</w:t>
+      </w:r>
+    </w:p>
+    <w:p>
+      <w:pPr>
+        <w:pStyle w:val="ListNumber"/>
+      </w:pPr>
+      <w:r>
+        <w:t>A clean, print-ready version opens — use Ctrl+P (Windows) or Cmd+P (Mac) to print or save as PDF</w:t>
+      </w:r>
+    </w:p>
+    <w:p/>
+    <w:p>
+      <w:pPr>
+        <w:pStyle w:val="Heading2"/>
+      </w:pPr>
+      <w:r>
+        <w:t>7. Recording Daily Usage (Usage Tickets)</w:t>
+      </w:r>
+    </w:p>
+    <w:p>
+      <w:r>
+        <w:rPr>
+          <w:b/>
+        </w:rPr>
+        <w:t>Where to go:</w:t>
+      </w:r>
+      <w:r>
+        <w:t xml:space="preserve"> Tap </w:t>
+      </w:r>
+      <w:r>
+        <w:rPr>
+          <w:b/>
+        </w:rPr>
+        <w:t>Usage</w:t>
+      </w:r>
+      <w:r>
+        <w:t xml:space="preserve"> in the bottom navigation</w:t>
+      </w:r>
+    </w:p>
+    <w:p>
+      <w:r>
+        <w:t>Use this every day to record the implants a distributor has used. You scan the product stickers from the paper usage ticket, and the app deducts those items from that distributor's inventory — but only after confirming they're actually in stock.</w:t>
+      </w:r>
+    </w:p>
+    <w:p/>
+    <w:p>
+      <w:r>
+        <w:rPr>
+          <w:b/>
+        </w:rPr>
+        <w:t>Recording a usage ticket:</w:t>
+      </w:r>
+    </w:p>
+    <w:p>
+      <w:pPr>
+        <w:pStyle w:val="ListNumber"/>
+      </w:pPr>
+      <w:r>
+        <w:rPr>
+          <w:b/>
+        </w:rPr>
+        <w:t>Pick the distributor</w:t>
+      </w:r>
+      <w:r>
+        <w:t xml:space="preserve"> at the top. (All the items on one ticket come out of this one distributor. To record a different distributor, finish this ticket first or change the selection to start over.)</w:t>
+      </w:r>
+    </w:p>
+    <w:p>
+      <w:pPr>
+        <w:pStyle w:val="ListNumber"/>
+      </w:pPr>
+      <w:r>
+        <w:rPr>
+          <w:b/>
+        </w:rPr>
+        <w:t>Scan each sticker</w:t>
+      </w:r>
+      <w:r>
+        <w:t xml:space="preserve"> — use Live Scan, Take Photo, or Upload Photo, just like receiving. You can also tap </w:t>
+      </w:r>
+      <w:r>
+        <w:rPr>
+          <w:b/>
+        </w:rPr>
+        <w:t>Enter barcode manually</w:t>
+      </w:r>
+      <w:r>
+        <w:t xml:space="preserve"> to type one in.</w:t>
+      </w:r>
+    </w:p>
+    <w:p>
+      <w:pPr>
+        <w:pStyle w:val="ListNumber"/>
+      </w:pPr>
+      <w:r>
+        <w:t>As you scan, each item shows a status:</w:t>
+      </w:r>
+    </w:p>
+    <w:p>
+      <w:pPr>
+        <w:pStyle w:val="ListBullet2"/>
+      </w:pPr>
+      <w:r>
+        <w:t xml:space="preserve">🟢 </w:t>
+      </w:r>
+      <w:r>
+        <w:rPr>
+          <w:b/>
+        </w:rPr>
+        <w:t>Available</w:t>
+      </w:r>
+      <w:r>
+        <w:t xml:space="preserve"> — found in this distributor's stock and ready to deduct. If several identical units exist, the one expiring soonest is used first.</w:t>
+      </w:r>
+    </w:p>
+    <w:p>
+      <w:pPr>
+        <w:pStyle w:val="ListBullet2"/>
+      </w:pPr>
+      <w:r>
+        <w:t xml:space="preserve">🟡 </w:t>
+      </w:r>
+      <w:r>
+        <w:rPr>
+          <w:b/>
+        </w:rPr>
+        <w:t>Not in stock</w:t>
+      </w:r>
+      <w:r>
+        <w:t xml:space="preserve"> — this item isn't in that distributor's inventory, so it </w:t>
+      </w:r>
+      <w:r>
+        <w:rPr>
+          <w:b/>
+        </w:rPr>
+        <w:t>can't</w:t>
+      </w:r>
+      <w:r>
+        <w:t xml:space="preserve"> be deducted. Double-check the distributor, or that the item was received first.</w:t>
+      </w:r>
+    </w:p>
+    <w:p>
+      <w:pPr>
+        <w:pStyle w:val="ListBullet2"/>
+      </w:pPr>
+      <w:r>
+        <w:t xml:space="preserve">🔴 </w:t>
+      </w:r>
+      <w:r>
+        <w:rPr>
+          <w:b/>
+        </w:rPr>
+        <w:t>Unreadable</w:t>
+      </w:r>
+      <w:r>
+        <w:t xml:space="preserve"> — the sticker couldn't be read; try scanning again or enter it manually.</w:t>
+      </w:r>
+    </w:p>
+    <w:p>
+      <w:pPr>
+        <w:pStyle w:val="ListNumber"/>
+      </w:pPr>
+      <w:r>
+        <w:t xml:space="preserve">Tap </w:t>
+      </w:r>
+      <w:r>
+        <w:rPr>
+          <w:b/>
+        </w:rPr>
+        <w:t>Consume N items</w:t>
+      </w:r>
+      <w:r>
+        <w:t xml:space="preserve">. Review the list, add an optional note (case number, surgeon, etc.), and tap </w:t>
+      </w:r>
+      <w:r>
+        <w:rPr>
+          <w:b/>
+        </w:rPr>
+        <w:t>Consume</w:t>
+      </w:r>
+      <w:r>
+        <w:t>.</w:t>
+      </w:r>
+    </w:p>
+    <w:p>
+      <w:pPr>
+        <w:pStyle w:val="ListNumber"/>
+      </w:pPr>
+      <w:r>
+        <w:t xml:space="preserve">The items are deducted from inventory and the ticket is saved with its own number (like </w:t>
+      </w:r>
+      <w:r>
+        <w:rPr>
+          <w:rFonts w:ascii="Consolas" w:hAnsi="Consolas"/>
+          <w:color w:val="B03060"/>
+        </w:rPr>
+        <w:t>USE-20260602-0001</w:t>
+      </w:r>
+      <w:r>
+        <w:t>).</w:t>
+      </w:r>
+    </w:p>
+    <w:p>
+      <w:pPr>
+        <w:pStyle w:val="IntenseQuote"/>
+      </w:pPr>
+      <w:r>
+        <w:rPr>
+          <w:b/>
+        </w:rPr>
+        <w:t>Only in-stock items are deducted.</w:t>
+      </w:r>
+      <w:r>
+        <w:t xml:space="preserve"> Anything flagged "not in stock" is left untouched — the app never guesses or deducts something a distributor doesn't have.</w:t>
+      </w:r>
+    </w:p>
+    <w:p/>
+    <w:p>
+      <w:r>
+        <w:rPr>
+          <w:b/>
+        </w:rPr>
+        <w:t>Usage History:</w:t>
+      </w:r>
+    </w:p>
+    <w:p>
+      <w:r>
+        <w:t xml:space="preserve">Tap </w:t>
+      </w:r>
+      <w:r>
+        <w:rPr>
+          <w:b/>
+        </w:rPr>
+        <w:t>History</w:t>
+      </w:r>
+      <w:r>
+        <w:t xml:space="preserve"> (top of the Usage page) or </w:t>
+      </w:r>
+      <w:r>
+        <w:rPr>
+          <w:b/>
+        </w:rPr>
+        <w:t>More → Usage History</w:t>
+      </w:r>
+      <w:r>
+        <w:t xml:space="preserve"> to see every ticket you've recorded. Tap a ticket to see exactly which items were consumed, and use </w:t>
+      </w:r>
+      <w:r>
+        <w:rPr>
+          <w:b/>
+        </w:rPr>
+        <w:t>Print</w:t>
+      </w:r>
+      <w:r>
+        <w:t xml:space="preserve"> for a paper or PDF record.</w:t>
+      </w:r>
+    </w:p>
+    <w:p/>
+    <w:p>
+      <w:pPr>
+        <w:pStyle w:val="Heading2"/>
+      </w:pPr>
+      <w:r>
+        <w:t>8. Reports</w:t>
+      </w:r>
+    </w:p>
+    <w:p>
+      <w:r>
+        <w:rPr>
+          <w:b/>
+        </w:rPr>
+        <w:t>Where to go:</w:t>
+      </w:r>
+      <w:r>
+        <w:t xml:space="preserve"> Tap </w:t>
+      </w:r>
+      <w:r>
+        <w:rPr>
+          <w:b/>
+        </w:rPr>
+        <w:t>Reports</w:t>
+      </w:r>
+      <w:r>
+        <w:t xml:space="preserve"> in the bottom navigation</w:t>
+      </w:r>
+    </w:p>
+    <w:p>
+      <w:r>
+        <w:t>The Reports page gives you a bird's-eye view of your entire inventory at a glance.</w:t>
+      </w:r>
+    </w:p>
+    <w:p/>
+    <w:p>
+      <w:r>
+        <w:rPr>
+          <w:b/>
+        </w:rPr>
+        <w:t>The summary cards at the top:</w:t>
+      </w:r>
+    </w:p>
+    <w:p>
+      <w:r>
+        <w:t xml:space="preserve">There are five colored cards that each show a number. </w:t>
+      </w:r>
+      <w:r>
+        <w:rPr>
+          <w:b/>
+        </w:rPr>
+        <w:t>Tap any card to see the matching list of items.</w:t>
+      </w:r>
+    </w:p>
+    <w:tbl>
+      <w:tblPr>
+        <w:tblStyle w:val="LightGrid-Accent1"/>
+        <w:tblW w:type="auto" w:w="0"/>
+        <w:tblLook w:firstColumn="1" w:firstRow="1" w:lastColumn="0" w:lastRow="0" w:noHBand="0" w:noVBand="1" w:val="04A0"/>
+      </w:tblPr>
+      <w:tblGrid>
+        <w:gridCol w:w="2880"/>
+        <w:gridCol w:w="2880"/>
+        <w:gridCol w:w="2880"/>
+      </w:tblGrid>
+      <w:tr>
+        <w:tc>
+          <w:tcPr>
+            <w:tcW w:type="dxa" w:w="2880"/>
+          </w:tcPr>
+          <w:p>
+            <w:r>
+              <w:rPr>
+                <w:b/>
+              </w:rPr>
+            </w:r>
+            <w:r>
+              <w:rPr>
+                <w:b/>
+              </w:rPr>
+              <w:t>Card</w:t>
+            </w:r>
+          </w:p>
+        </w:tc>
+        <w:tc>
+          <w:tcPr>
+            <w:tcW w:type="dxa" w:w="2880"/>
+          </w:tcPr>
+          <w:p>
+            <w:r>
+              <w:rPr>
+                <w:b/>
+              </w:rPr>
+            </w:r>
+            <w:r>
+              <w:rPr>
+                <w:b/>
+              </w:rPr>
+              <w:t>What It Shows</w:t>
+            </w:r>
+          </w:p>
+        </w:tc>
+        <w:tc>
+          <w:tcPr>
+            <w:tcW w:type="dxa" w:w="2880"/>
+          </w:tcPr>
+          <w:p>
+            <w:r>
+              <w:rPr>
+                <w:b/>
+              </w:rPr>
+            </w:r>
+            <w:r>
+              <w:rPr>
+                <w:b/>
+              </w:rPr>
+              <w:t>Tap to See</w:t>
+            </w:r>
+          </w:p>
+        </w:tc>
+      </w:tr>
+      <w:tr>
+        <w:tc>
+          <w:tcPr>
+            <w:tcW w:type="dxa" w:w="2880"/>
+          </w:tcPr>
+          <w:p>
+            <w:r/>
+            <w:r>
+              <w:t>Total Units</w:t>
+            </w:r>
+          </w:p>
+        </w:tc>
+        <w:tc>
+          <w:tcPr>
+            <w:tcW w:type="dxa" w:w="2880"/>
+          </w:tcPr>
+          <w:p>
+            <w:r/>
+            <w:r>
+              <w:t>How many items are in the system right now</w:t>
+            </w:r>
+          </w:p>
+        </w:tc>
+        <w:tc>
+          <w:tcPr>
+            <w:tcW w:type="dxa" w:w="2880"/>
+          </w:tcPr>
+          <w:p>
+            <w:r/>
+            <w:r>
+              <w:t>All inventory</w:t>
+            </w:r>
+          </w:p>
+        </w:tc>
+      </w:tr>
+      <w:tr>
+        <w:tc>
+          <w:tcPr>
+            <w:tcW w:type="dxa" w:w="2880"/>
+          </w:tcPr>
+          <w:p>
+            <w:r/>
+            <w:r>
+              <w:t>Active Distributors</w:t>
+            </w:r>
+          </w:p>
+        </w:tc>
+        <w:tc>
+          <w:tcPr>
+            <w:tcW w:type="dxa" w:w="2880"/>
+          </w:tcPr>
+          <w:p>
+            <w:r/>
+            <w:r>
+              <w:t>How many distributors have items</w:t>
+            </w:r>
+          </w:p>
+        </w:tc>
+        <w:tc>
+          <w:tcPr>
+            <w:tcW w:type="dxa" w:w="2880"/>
+          </w:tcPr>
+          <w:p>
+            <w:r/>
+            <w:r>
+              <w:t>Distributor list</w:t>
+            </w:r>
+          </w:p>
+        </w:tc>
+      </w:tr>
+      <w:tr>
+        <w:tc>
+          <w:tcPr>
+            <w:tcW w:type="dxa" w:w="2880"/>
+          </w:tcPr>
+          <w:p>
+            <w:r/>
+            <w:r>
+              <w:t>Expiring &lt; 180d</w:t>
+            </w:r>
+          </w:p>
+        </w:tc>
+        <w:tc>
+          <w:tcPr>
+            <w:tcW w:type="dxa" w:w="2880"/>
+          </w:tcPr>
+          <w:p>
+            <w:r/>
+            <w:r>
+              <w:t>Items that expire within 6 months</w:t>
+            </w:r>
+          </w:p>
+        </w:tc>
+        <w:tc>
+          <w:tcPr>
+            <w:tcW w:type="dxa" w:w="2880"/>
+          </w:tcPr>
+          <w:p>
+            <w:r/>
+            <w:r>
+              <w:t>Those specific items</w:t>
+            </w:r>
+          </w:p>
+        </w:tc>
+      </w:tr>
+      <w:tr>
+        <w:tc>
+          <w:tcPr>
+            <w:tcW w:type="dxa" w:w="2880"/>
+          </w:tcPr>
+          <w:p>
+            <w:r/>
+            <w:r>
+              <w:t>Expired</w:t>
+            </w:r>
+          </w:p>
+        </w:tc>
+        <w:tc>
+          <w:tcPr>
+            <w:tcW w:type="dxa" w:w="2880"/>
+          </w:tcPr>
+          <w:p>
+            <w:r/>
+            <w:r>
+              <w:t>Items that are already past their expiry date</w:t>
+            </w:r>
+          </w:p>
+        </w:tc>
+        <w:tc>
+          <w:tcPr>
+            <w:tcW w:type="dxa" w:w="2880"/>
+          </w:tcPr>
+          <w:p>
+            <w:r/>
+            <w:r>
+              <w:t>Those specific items</w:t>
+            </w:r>
+          </w:p>
+        </w:tc>
+      </w:tr>
+      <w:tr>
+        <w:tc>
+          <w:tcPr>
+            <w:tcW w:type="dxa" w:w="2880"/>
+          </w:tcPr>
+          <w:p>
+            <w:r/>
+            <w:r>
+              <w:t>Unassigned</w:t>
+            </w:r>
+          </w:p>
+        </w:tc>
+        <w:tc>
+          <w:tcPr>
+            <w:tcW w:type="dxa" w:w="2880"/>
+          </w:tcPr>
+          <w:p>
+            <w:r/>
+            <w:r>
+              <w:t>Items at Home Office not yet sent anywhere</w:t>
+            </w:r>
+          </w:p>
+        </w:tc>
+        <w:tc>
+          <w:tcPr>
+            <w:tcW w:type="dxa" w:w="2880"/>
+          </w:tcPr>
+          <w:p>
+            <w:r/>
+            <w:r>
+              <w:t>Those specific items</w:t>
+            </w:r>
+          </w:p>
+        </w:tc>
+      </w:tr>
+    </w:tbl>
+    <w:p/>
+    <w:p>
+      <w:r>
+        <w:rPr>
+          <w:b/>
+        </w:rPr>
+        <w:t>Stock by Item Number:</w:t>
+      </w:r>
+    </w:p>
+    <w:p>
+      <w:r>
+        <w:t xml:space="preserve">Tap the </w:t>
+      </w:r>
+      <w:r>
+        <w:rPr>
+          <w:b/>
+        </w:rPr>
+        <w:t>Stock by Item Number</w:t>
+      </w:r>
+      <w:r>
+        <w:t xml:space="preserve"> button to open a detailed matrix view. This is one of the most useful reports in the system.</w:t>
+      </w:r>
+    </w:p>
+    <w:p>
+      <w:pPr>
+        <w:pStyle w:val="ListBullet"/>
+      </w:pPr>
+      <w:r>
+        <w:t>Every row is one type of product (one item number)</w:t>
+      </w:r>
+    </w:p>
+    <w:p>
+      <w:pPr>
+        <w:pStyle w:val="ListBullet"/>
+      </w:pPr>
+      <w:r>
+        <w:t>Every column is a location (Home Office, plus each distributor)</w:t>
+      </w:r>
+    </w:p>
+    <w:p>
+      <w:pPr>
+        <w:pStyle w:val="ListBullet"/>
+      </w:pPr>
+      <w:r>
+        <w:t xml:space="preserve">The </w:t>
+      </w:r>
+      <w:r>
+        <w:rPr>
+          <w:b/>
+        </w:rPr>
+        <w:t>Total</w:t>
+      </w:r>
+      <w:r>
+        <w:t xml:space="preserve"> column on the right shows how many of that item exist across everywhere</w:t>
+      </w:r>
+    </w:p>
+    <w:p>
+      <w:r>
+        <w:rPr>
+          <w:b/>
+        </w:rPr>
+        <w:t>Drilling down:</w:t>
+      </w:r>
+    </w:p>
+    <w:p>
+      <w:pPr>
+        <w:pStyle w:val="ListBullet"/>
+      </w:pPr>
+      <w:r>
+        <w:t xml:space="preserve">Tap an </w:t>
+      </w:r>
+      <w:r>
+        <w:rPr>
+          <w:b/>
+        </w:rPr>
+        <w:t>item number</w:t>
+      </w:r>
+      <w:r>
+        <w:t xml:space="preserve"> in the leftmost column (or its Total) → see all units of that product across all locations</w:t>
+      </w:r>
+    </w:p>
+    <w:p>
+      <w:pPr>
+        <w:pStyle w:val="ListBullet"/>
+      </w:pPr>
+      <w:r>
+        <w:t xml:space="preserve">Tap a </w:t>
+      </w:r>
+      <w:r>
+        <w:rPr>
+          <w:b/>
+        </w:rPr>
+        <w:t>specific count</w:t>
+      </w:r>
+      <w:r>
+        <w:t xml:space="preserve"> (e.g., the "13" under a distributor's column) → see only that product at that location</w:t>
+      </w:r>
+    </w:p>
+    <w:p>
+      <w:r>
+        <w:t>You can also search by item number or description at the top, sort by any column, and download the whole matrix as an Excel file.</w:t>
+      </w:r>
+    </w:p>
+    <w:p/>
+    <w:p>
+      <w:r>
+        <w:rPr>
+          <w:b/>
+        </w:rPr>
+        <w:t>Usage Reports (how products are being used):</w:t>
+      </w:r>
+    </w:p>
+    <w:p>
+      <w:r>
+        <w:t xml:space="preserve">The Reports page has a </w:t>
+      </w:r>
+      <w:r>
+        <w:rPr>
+          <w:b/>
+        </w:rPr>
+        <w:t>Usage</w:t>
+      </w:r>
+      <w:r>
+        <w:t xml:space="preserve"> section with three reports that show what's actually being consumed — useful for planning orders and balancing stock between distributors. Each one has an </w:t>
+      </w:r>
+      <w:r>
+        <w:rPr>
+          <w:b/>
+        </w:rPr>
+        <w:t>Excel</w:t>
+      </w:r>
+      <w:r>
+        <w:t xml:space="preserve"> export button.</w:t>
+      </w:r>
+    </w:p>
+    <w:p>
+      <w:pPr>
+        <w:pStyle w:val="ListBullet"/>
+      </w:pPr>
+      <w:r>
+        <w:rPr>
+          <w:b/>
+        </w:rPr>
+        <w:t>Monthly Usage Report</w:t>
+      </w:r>
+      <w:r>
+        <w:t xml:space="preserve"> — pick </w:t>
+      </w:r>
+      <w:r>
+        <w:rPr>
+          <w:i/>
+        </w:rPr>
+        <w:t>any</w:t>
+      </w:r>
+      <w:r>
+        <w:t xml:space="preserve"> month and (optionally) a distributor to get a full itemized statement: every product used that month, grouped by distributor, with quantities, subtotals, and a grand total. This is your go-to "what did we use in May?" report.</w:t>
+      </w:r>
+    </w:p>
+    <w:p>
+      <w:pPr>
+        <w:pStyle w:val="ListBullet"/>
+      </w:pPr>
+      <w:r>
+        <w:rPr>
+          <w:b/>
+        </w:rPr>
+        <w:t>Usage Trends</w:t>
+      </w:r>
+      <w:r>
+        <w:t xml:space="preserve"> — units consumed each month by product category (Short Nail, Long Nail, Lag Screw, Interlocking Screw, Cap Screw, Set Screw) over the last 3, 6, or 12 months. A bar chart shows the monthly totals; the table breaks it down by category. Filter to one distributor to see just their usage.</w:t>
+      </w:r>
+    </w:p>
+    <w:p>
+      <w:pPr>
+        <w:pStyle w:val="ListBullet"/>
+      </w:pPr>
+      <w:r>
+        <w:rPr>
+          <w:b/>
+        </w:rPr>
+        <w:t>Usage by Distributor</w:t>
+      </w:r>
+      <w:r>
+        <w:t xml:space="preserve"> — a grid with product categories down the side and distributors across the top, showing how many of each were used over the window. Quickly compares who uses what.</w:t>
+      </w:r>
+    </w:p>
+    <w:p>
+      <w:pPr>
+        <w:pStyle w:val="IntenseQuote"/>
+      </w:pPr>
+      <w:r>
+        <w:t>Usage reports fill in as you record usage tickets (Usage tab). The more you record, the more useful the trends become.</w:t>
+      </w:r>
+    </w:p>
+    <w:p/>
+    <w:p>
+      <w:r>
+        <w:rPr>
+          <w:b/>
+        </w:rPr>
+        <w:t>Transfer History:</w:t>
+      </w:r>
+    </w:p>
+    <w:p>
+      <w:r>
+        <w:t>A searchable list of every transfer ever created. Type a transfer ID, distributor name, or date in the search bar to find what you're looking for. Tap any transfer ID to see the full detail and print it.</w:t>
+      </w:r>
+    </w:p>
+    <w:p/>
+    <w:p>
+      <w:r>
+        <w:rPr>
+          <w:b/>
+        </w:rPr>
+        <w:t>Expiring Items:</w:t>
+      </w:r>
+    </w:p>
+    <w:p>
+      <w:r>
+        <w:t>A table showing up to 20 items that expire in the next 180 days, sorted by how many days are left. Tap any column header to re-sort the list.</w:t>
+      </w:r>
+    </w:p>
+    <w:p/>
+    <w:p>
+      <w:pPr>
+        <w:pStyle w:val="Heading2"/>
+      </w:pPr>
+      <w:r>
+        <w:t>9. Distributors</w:t>
+      </w:r>
+    </w:p>
+    <w:p>
+      <w:r>
+        <w:rPr>
+          <w:b/>
+        </w:rPr>
+        <w:t>Where to go:</w:t>
+      </w:r>
+      <w:r>
+        <w:t xml:space="preserve"> Tap </w:t>
+      </w:r>
+      <w:r>
+        <w:rPr>
+          <w:b/>
+        </w:rPr>
+        <w:t>More</w:t>
+      </w:r>
+      <w:r>
+        <w:t xml:space="preserve"> → </w:t>
+      </w:r>
+      <w:r>
+        <w:rPr>
+          <w:b/>
+        </w:rPr>
+        <w:t>Distributors</w:t>
+      </w:r>
+    </w:p>
+    <w:p>
+      <w:r>
+        <w:t>This page shows your full list of distributors — the sales reps, hospitals, or other locations where your inventory lives.</w:t>
+      </w:r>
+    </w:p>
+    <w:p>
+      <w:pPr>
+        <w:pStyle w:val="ListBullet"/>
+      </w:pPr>
+      <w:r>
+        <w:t>Each distributor card shows how many items they currently have</w:t>
+      </w:r>
+    </w:p>
+    <w:p>
+      <w:pPr>
+        <w:pStyle w:val="ListBullet"/>
+      </w:pPr>
+      <w:r>
+        <w:t>Tap a distributor to see their full item list, download it as Excel, or share a link to the page</w:t>
+      </w:r>
+    </w:p>
+    <w:p>
+      <w:pPr>
+        <w:pStyle w:val="ListBullet"/>
+      </w:pPr>
+      <w:r>
+        <w:t>From the distributor detail page, tap any item to open its full detail page</w:t>
+      </w:r>
+    </w:p>
+    <w:p>
+      <w:pPr>
+        <w:pStyle w:val="ListBullet"/>
+      </w:pPr>
+      <w:r>
+        <w:rPr>
+          <w:b/>
+        </w:rPr>
+        <w:t>Home Office</w:t>
+      </w:r>
+      <w:r>
+        <w:t xml:space="preserve"> is always the starting point — all items come here first before going anywhere else</w:t>
+      </w:r>
+    </w:p>
+    <w:p/>
+    <w:p>
+      <w:pPr>
+        <w:pStyle w:val="Heading1"/>
+      </w:pPr>
+      <w:r>
+        <w:t>Admin Features</w:t>
+      </w:r>
+    </w:p>
+    <w:p>
+      <w:pPr>
+        <w:pStyle w:val="Heading2"/>
+      </w:pPr>
+      <w:r>
+        <w:t>User Management</w:t>
+      </w:r>
+    </w:p>
+    <w:p>
+      <w:r>
+        <w:rPr>
+          <w:b/>
+        </w:rPr>
+        <w:t>Where to go:</w:t>
+      </w:r>
+      <w:r>
+        <w:t xml:space="preserve"> Tap </w:t>
+      </w:r>
+      <w:r>
+        <w:rPr>
+          <w:b/>
+        </w:rPr>
+        <w:t>More</w:t>
+      </w:r>
+      <w:r>
+        <w:t xml:space="preserve"> → </w:t>
+      </w:r>
+      <w:r>
+        <w:rPr>
+          <w:b/>
+        </w:rPr>
+        <w:t>User Management</w:t>
+      </w:r>
+      <w:r>
+        <w:t xml:space="preserve"> </w:t>
+      </w:r>
+      <w:r>
+        <w:rPr>
+          <w:i/>
+        </w:rPr>
+        <w:t>(only visible to admins)</w:t>
+      </w:r>
+    </w:p>
+    <w:p/>
+    <w:p>
+      <w:r>
+        <w:rPr>
+          <w:b/>
+        </w:rPr>
+        <w:t>Adding a new user:</w:t>
+      </w:r>
+    </w:p>
+    <w:p>
+      <w:pPr>
+        <w:pStyle w:val="ListNumber"/>
+      </w:pPr>
+      <w:r>
+        <w:t xml:space="preserve">Tap </w:t>
+      </w:r>
+      <w:r>
+        <w:rPr>
+          <w:b/>
+        </w:rPr>
+        <w:t>Add User</w:t>
+      </w:r>
+    </w:p>
+    <w:p>
+      <w:pPr>
+        <w:pStyle w:val="ListNumber"/>
+      </w:pPr>
+      <w:r>
+        <w:t>Enter a username (at least 2 characters) and a password (at least 6 characters)</w:t>
+      </w:r>
+    </w:p>
+    <w:p>
+      <w:pPr>
+        <w:pStyle w:val="ListNumber"/>
+      </w:pPr>
+      <w:r>
+        <w:t>Choose a role:</w:t>
+      </w:r>
+    </w:p>
+    <w:p>
+      <w:pPr>
+        <w:pStyle w:val="ListBullet2"/>
+      </w:pPr>
+      <w:r>
+        <w:rPr>
+          <w:b/>
+        </w:rPr>
+        <w:t>User</w:t>
+      </w:r>
+      <w:r>
+        <w:t xml:space="preserve"> — can view and manage inventory, but can't add or delete other users</w:t>
+      </w:r>
+    </w:p>
+    <w:p>
+      <w:pPr>
+        <w:pStyle w:val="ListBullet2"/>
+      </w:pPr>
+      <w:r>
+        <w:rPr>
+          <w:b/>
+        </w:rPr>
+        <w:t>Admin</w:t>
+      </w:r>
+      <w:r>
+        <w:t xml:space="preserve"> — full access including User Management</w:t>
+      </w:r>
+    </w:p>
+    <w:p>
+      <w:pPr>
+        <w:pStyle w:val="ListNumber"/>
+      </w:pPr>
+      <w:r>
+        <w:t xml:space="preserve">Tap </w:t>
+      </w:r>
+      <w:r>
+        <w:rPr>
+          <w:b/>
+        </w:rPr>
+        <w:t>Create User</w:t>
+      </w:r>
+    </w:p>
+    <w:p>
+      <w:r>
+        <w:rPr>
+          <w:b/>
+        </w:rPr>
+        <w:t>Managing existing users:</w:t>
+      </w:r>
+    </w:p>
+    <w:p>
+      <w:pPr>
+        <w:pStyle w:val="ListBullet"/>
+      </w:pPr>
+      <w:r>
+        <w:rPr>
+          <w:b/>
+        </w:rPr>
+        <w:t>Change role:</w:t>
+      </w:r>
+      <w:r>
+        <w:t xml:space="preserve"> Tap the shield icon next to a user to switch them between User and Admin. (You can't change your own role.)</w:t>
+      </w:r>
+    </w:p>
+    <w:p>
+      <w:pPr>
+        <w:pStyle w:val="ListBullet"/>
+      </w:pPr>
+      <w:r>
+        <w:rPr>
+          <w:b/>
+        </w:rPr>
+        <w:t>Reset password:</w:t>
+      </w:r>
+      <w:r>
+        <w:t xml:space="preserve"> Tap the key icon next to a user and enter a new password</w:t>
+      </w:r>
+    </w:p>
+    <w:p>
+      <w:pPr>
+        <w:pStyle w:val="ListBullet"/>
+      </w:pPr>
+      <w:r>
+        <w:rPr>
+          <w:b/>
+        </w:rPr>
+        <w:t>Delete user:</w:t>
+      </w:r>
+      <w:r>
+        <w:t xml:space="preserve"> Tap the trash icon. You can't delete yourself or the last remaining admin.</w:t>
+      </w:r>
+    </w:p>
+    <w:p/>
+    <w:p>
+      <w:r>
+        <w:rPr>
+          <w:b/>
+        </w:rPr>
+        <w:t>Maintenance — Fix Manual Expiry Dates:</w:t>
+      </w:r>
+    </w:p>
+    <w:p>
+      <w:r>
+        <w:t xml:space="preserve">At the bottom of the User Management page (admins only) is a </w:t>
+      </w:r>
+      <w:r>
+        <w:rPr>
+          <w:b/>
+        </w:rPr>
+        <w:t>Fix Manual Expiry Dates</w:t>
+      </w:r>
+      <w:r>
+        <w:t xml:space="preserve"> button. Older manually-entered items could be saved with an expiration date that displayed one day early. Tap this button once to correct any affected items across the whole system. It's safe to run anytime — it only changes items that still need fixing, and reports how many it corrected.</w:t>
+      </w:r>
+    </w:p>
+    <w:p/>
+    <w:p>
+      <w:pPr>
+        <w:pStyle w:val="Heading1"/>
+      </w:pPr>
+      <w:r>
+        <w:t>Barcode Format Reference</w:t>
+      </w:r>
+    </w:p>
+    <w:p>
+      <w:r>
+        <w:t xml:space="preserve">Nail Tracker reads </w:t>
+      </w:r>
+      <w:r>
+        <w:rPr>
+          <w:b/>
+        </w:rPr>
+        <w:t>GS1-128 barcodes</w:t>
+      </w:r>
+      <w:r>
+        <w:t xml:space="preserve"> — the standard format used on medical device packaging. Each barcode contains several pieces of information identified by a two-digit code called an Application Identifier (AI).</w:t>
+      </w:r>
+    </w:p>
+    <w:tbl>
+      <w:tblPr>
+        <w:tblStyle w:val="LightGrid-Accent1"/>
+        <w:tblW w:type="auto" w:w="0"/>
+        <w:tblLook w:firstColumn="1" w:firstRow="1" w:lastColumn="0" w:lastRow="0" w:noHBand="0" w:noVBand="1" w:val="04A0"/>
+      </w:tblPr>
+      <w:tblGrid>
+        <w:gridCol w:w="2880"/>
+        <w:gridCol w:w="2880"/>
+        <w:gridCol w:w="2880"/>
+      </w:tblGrid>
+      <w:tr>
+        <w:tc>
+          <w:tcPr>
+            <w:tcW w:type="dxa" w:w="2880"/>
+          </w:tcPr>
+          <w:p>
+            <w:r>
+              <w:rPr>
+                <w:b/>
+              </w:rPr>
+            </w:r>
+            <w:r>
+              <w:rPr>
+                <w:b/>
+              </w:rPr>
+              <w:t>AI Code</w:t>
+            </w:r>
+          </w:p>
+        </w:tc>
+        <w:tc>
+          <w:tcPr>
+            <w:tcW w:type="dxa" w:w="2880"/>
+          </w:tcPr>
+          <w:p>
+            <w:r>
+              <w:rPr>
+                <w:b/>
+              </w:rPr>
+            </w:r>
+            <w:r>
+              <w:rPr>
+                <w:b/>
+              </w:rPr>
+              <w:t>What It Contains</w:t>
+            </w:r>
+          </w:p>
+        </w:tc>
+        <w:tc>
+          <w:tcPr>
+            <w:tcW w:type="dxa" w:w="2880"/>
+          </w:tcPr>
+          <w:p>
+            <w:r>
+              <w:rPr>
+                <w:b/>
+              </w:rPr>
+            </w:r>
+            <w:r>
+              <w:rPr>
+                <w:b/>
+              </w:rPr>
+              <w:t>Example</w:t>
+            </w:r>
+          </w:p>
+        </w:tc>
+      </w:tr>
+      <w:tr>
+        <w:tc>
+          <w:tcPr>
+            <w:tcW w:type="dxa" w:w="2880"/>
+          </w:tcPr>
+          <w:p>
+            <w:r/>
+            <w:r>
+              <w:t>01</w:t>
+            </w:r>
+          </w:p>
+        </w:tc>
+        <w:tc>
+          <w:tcPr>
+            <w:tcW w:type="dxa" w:w="2880"/>
+          </w:tcPr>
+          <w:p>
+            <w:r/>
+            <w:r>
+              <w:t>GTIN (product code, 14 digits)</w:t>
+            </w:r>
+          </w:p>
+        </w:tc>
+        <w:tc>
+          <w:tcPr>
+            <w:tcW w:type="dxa" w:w="2880"/>
+          </w:tcPr>
+          <w:p>
+            <w:r/>
+            <w:r>
+              <w:t>08880089459148</w:t>
+            </w:r>
+          </w:p>
+        </w:tc>
+      </w:tr>
+      <w:tr>
+        <w:tc>
+          <w:tcPr>
+            <w:tcW w:type="dxa" w:w="2880"/>
+          </w:tcPr>
+          <w:p>
+            <w:r/>
+            <w:r>
+              <w:t>10</w:t>
+            </w:r>
+          </w:p>
+        </w:tc>
+        <w:tc>
+          <w:tcPr>
+            <w:tcW w:type="dxa" w:w="2880"/>
+          </w:tcPr>
+          <w:p>
+            <w:r/>
+            <w:r>
+              <w:t>Lot number</w:t>
+            </w:r>
+          </w:p>
+        </w:tc>
+        <w:tc>
+          <w:tcPr>
+            <w:tcW w:type="dxa" w:w="2880"/>
+          </w:tcPr>
+          <w:p>
+            <w:r/>
+            <w:r>
+              <w:t>J250929-L021</w:t>
+            </w:r>
+          </w:p>
+        </w:tc>
+      </w:tr>
+      <w:tr>
+        <w:tc>
+          <w:tcPr>
+            <w:tcW w:type="dxa" w:w="2880"/>
+          </w:tcPr>
+          <w:p>
+            <w:r/>
+            <w:r>
+              <w:t>17</w:t>
+            </w:r>
+          </w:p>
+        </w:tc>
+        <w:tc>
+          <w:tcPr>
+            <w:tcW w:type="dxa" w:w="2880"/>
+          </w:tcPr>
+          <w:p>
+            <w:r/>
+            <w:r>
+              <w:t>Expiry date (YYMMDD format)</w:t>
+            </w:r>
+          </w:p>
+        </w:tc>
+        <w:tc>
+          <w:tcPr>
+            <w:tcW w:type="dxa" w:w="2880"/>
+          </w:tcPr>
+          <w:p>
+            <w:r/>
+            <w:r>
+              <w:t>300928 = Sept 28, 2030</w:t>
+            </w:r>
+          </w:p>
+        </w:tc>
+      </w:tr>
+    </w:tbl>
+    <w:p>
+      <w:r>
+        <w:rPr>
+          <w:b/>
+        </w:rPr>
+        <w:t>What a full barcode string looks like:</w:t>
+      </w:r>
+    </w:p>
+    <w:p>
+      <w:r>
+        <w:rPr>
+          <w:rFonts w:ascii="Consolas" w:hAnsi="Consolas"/>
+          <w:color w:val="B03060"/>
+        </w:rPr>
+        <w:t>(01)08880089459148(10)J250929-L021(17)300928</w:t>
+      </w:r>
+    </w:p>
+    <w:p>
+      <w:r>
+        <w:t>The app also accepts the raw format without parentheses, and supports an alternate date format (YYYY-MM-DD) used by some label printers.</w:t>
+      </w:r>
+    </w:p>
+    <w:p/>
+    <w:p>
+      <w:r>
+        <w:rPr>
+          <w:b/>
+        </w:rPr>
+        <w:t>Product REF Code Reference:</w:t>
+      </w:r>
+    </w:p>
+    <w:p>
+      <w:r>
+        <w:t>Every Summa Orthopaedics product has a REF code printed on its label. The app uses this code to automatically identify the product name. Here are the prefixes and what they mean:</w:t>
+      </w:r>
+    </w:p>
+    <w:tbl>
+      <w:tblPr>
+        <w:tblStyle w:val="LightGrid-Accent1"/>
+        <w:tblW w:type="auto" w:w="0"/>
+        <w:tblLook w:firstColumn="1" w:firstRow="1" w:lastColumn="0" w:lastRow="0" w:noHBand="0" w:noVBand="1" w:val="04A0"/>
+      </w:tblPr>
+      <w:tblGrid>
+        <w:gridCol w:w="4320"/>
+        <w:gridCol w:w="4320"/>
+      </w:tblGrid>
+      <w:tr>
+        <w:tc>
+          <w:tcPr>
+            <w:tcW w:type="dxa" w:w="4320"/>
+          </w:tcPr>
+          <w:p>
+            <w:r>
+              <w:rPr>
+                <w:b/>
+              </w:rPr>
+            </w:r>
+            <w:r>
+              <w:rPr>
+                <w:b/>
+              </w:rPr>
+              <w:t>REF Prefix</w:t>
+            </w:r>
+          </w:p>
+        </w:tc>
+        <w:tc>
+          <w:tcPr>
+            <w:tcW w:type="dxa" w:w="4320"/>
+          </w:tcPr>
+          <w:p>
+            <w:r>
+              <w:rPr>
+                <w:b/>
+              </w:rPr>
+            </w:r>
+            <w:r>
+              <w:rPr>
+                <w:b/>
+              </w:rPr>
+              <w:t>Product Type</w:t>
+            </w:r>
+          </w:p>
+        </w:tc>
+      </w:tr>
+      <w:tr>
+        <w:tc>
+          <w:tcPr>
+            <w:tcW w:type="dxa" w:w="4320"/>
+          </w:tcPr>
+          <w:p>
+            <w:r/>
+            <w:r>
+              <w:t>SO-SPFN</w:t>
+            </w:r>
+          </w:p>
+        </w:tc>
+        <w:tc>
+          <w:tcPr>
+            <w:tcW w:type="dxa" w:w="4320"/>
+          </w:tcPr>
+          <w:p>
+            <w:r/>
+            <w:r>
+              <w:t>Short Femoral Nail</w:t>
+            </w:r>
+          </w:p>
+        </w:tc>
+      </w:tr>
+      <w:tr>
+        <w:tc>
+          <w:tcPr>
+            <w:tcW w:type="dxa" w:w="4320"/>
+          </w:tcPr>
+          <w:p>
+            <w:r/>
+            <w:r>
+              <w:t>SO-LPFN</w:t>
+            </w:r>
+          </w:p>
+        </w:tc>
+        <w:tc>
+          <w:tcPr>
+            <w:tcW w:type="dxa" w:w="4320"/>
+          </w:tcPr>
+          <w:p>
+            <w:r/>
+            <w:r>
+              <w:t>Long Femoral Nail</w:t>
+            </w:r>
+          </w:p>
+        </w:tc>
+      </w:tr>
+      <w:tr>
+        <w:tc>
+          <w:tcPr>
+            <w:tcW w:type="dxa" w:w="4320"/>
+          </w:tcPr>
+          <w:p>
+            <w:r/>
+            <w:r>
+              <w:t>SO-SPFL-N</w:t>
+            </w:r>
+          </w:p>
+        </w:tc>
+        <w:tc>
+          <w:tcPr>
+            <w:tcW w:type="dxa" w:w="4320"/>
+          </w:tcPr>
+          <w:p>
+            <w:r/>
+            <w:r>
+              <w:t>Lag Screw (Normal)</w:t>
+            </w:r>
+          </w:p>
+        </w:tc>
+      </w:tr>
+      <w:tr>
+        <w:tc>
+          <w:tcPr>
+            <w:tcW w:type="dxa" w:w="4320"/>
+          </w:tcPr>
+          <w:p>
+            <w:r/>
+            <w:r>
+              <w:t>SO-SPFL-A</w:t>
+            </w:r>
+          </w:p>
+        </w:tc>
+        <w:tc>
+          <w:tcPr>
+            <w:tcW w:type="dxa" w:w="4320"/>
+          </w:tcPr>
+          <w:p>
+            <w:r/>
+            <w:r>
+              <w:t>Lag Screw (Anti-Rotation)</w:t>
+            </w:r>
+          </w:p>
+        </w:tc>
+      </w:tr>
+      <w:tr>
+        <w:tc>
+          <w:tcPr>
+            <w:tcW w:type="dxa" w:w="4320"/>
+          </w:tcPr>
+          <w:p>
+            <w:r/>
+            <w:r>
+              <w:t>SO-SPFL-T</w:t>
+            </w:r>
+          </w:p>
+        </w:tc>
+        <w:tc>
+          <w:tcPr>
+            <w:tcW w:type="dxa" w:w="4320"/>
+          </w:tcPr>
+          <w:p>
+            <w:r/>
+            <w:r>
+              <w:t>Lag Screw (Telescopic)</w:t>
+            </w:r>
+          </w:p>
+        </w:tc>
+      </w:tr>
+      <w:tr>
+        <w:tc>
+          <w:tcPr>
+            <w:tcW w:type="dxa" w:w="4320"/>
+          </w:tcPr>
+          <w:p>
+            <w:r/>
+            <w:r>
+              <w:t>SO-S50I-SO</w:t>
+            </w:r>
+          </w:p>
+        </w:tc>
+        <w:tc>
+          <w:tcPr>
+            <w:tcW w:type="dxa" w:w="4320"/>
+          </w:tcPr>
+          <w:p>
+            <w:r/>
+            <w:r>
+              <w:t>Interlocking Screw</w:t>
+            </w:r>
+          </w:p>
+        </w:tc>
+      </w:tr>
+      <w:tr>
+        <w:tc>
+          <w:tcPr>
+            <w:tcW w:type="dxa" w:w="4320"/>
+          </w:tcPr>
+          <w:p>
+            <w:r/>
+            <w:r>
+              <w:t>SO-SPFC</w:t>
+            </w:r>
+          </w:p>
+        </w:tc>
+        <w:tc>
+          <w:tcPr>
+            <w:tcW w:type="dxa" w:w="4320"/>
+          </w:tcPr>
+          <w:p>
+            <w:r/>
+            <w:r>
+              <w:t>Cap Screw</w:t>
+            </w:r>
+          </w:p>
+        </w:tc>
+      </w:tr>
+      <w:tr>
+        <w:tc>
+          <w:tcPr>
+            <w:tcW w:type="dxa" w:w="4320"/>
+          </w:tcPr>
+          <w:p>
+            <w:r/>
+            <w:r>
+              <w:t>SO-SPFS</w:t>
+            </w:r>
+          </w:p>
+        </w:tc>
+        <w:tc>
+          <w:tcPr>
+            <w:tcW w:type="dxa" w:w="4320"/>
+          </w:tcPr>
+          <w:p>
+            <w:r/>
+            <w:r>
+              <w:t>Set Screw</w:t>
+            </w:r>
+          </w:p>
+        </w:tc>
+      </w:tr>
+      <w:tr>
+        <w:tc>
+          <w:tcPr>
+            <w:tcW w:type="dxa" w:w="4320"/>
+          </w:tcPr>
+          <w:p>
+            <w:r/>
+            <w:r>
+              <w:t>SO-IS</w:t>
+            </w:r>
+          </w:p>
+        </w:tc>
+        <w:tc>
+          <w:tcPr>
+            <w:tcW w:type="dxa" w:w="4320"/>
+          </w:tcPr>
+          <w:p>
+            <w:r/>
+            <w:r>
+              <w:t>Interlocking Screw (older label format)</w:t>
+            </w:r>
+          </w:p>
+        </w:tc>
+      </w:tr>
+      <w:tr>
+        <w:tc>
+          <w:tcPr>
+            <w:tcW w:type="dxa" w:w="4320"/>
+          </w:tcPr>
+          <w:p>
+            <w:r/>
+            <w:r>
+              <w:t>SO-EC</w:t>
+            </w:r>
+          </w:p>
+        </w:tc>
+        <w:tc>
+          <w:tcPr>
+            <w:tcW w:type="dxa" w:w="4320"/>
+          </w:tcPr>
+          <w:p>
+            <w:r/>
+            <w:r>
+              <w:t>End Cap (older label format)</w:t>
+            </w:r>
+          </w:p>
+        </w:tc>
+      </w:tr>
+      <w:tr>
+        <w:tc>
+          <w:tcPr>
+            <w:tcW w:type="dxa" w:w="4320"/>
+          </w:tcPr>
+          <w:p>
+            <w:r/>
+            <w:r>
+              <w:t>SO-SS</w:t>
+            </w:r>
+          </w:p>
+        </w:tc>
+        <w:tc>
+          <w:tcPr>
+            <w:tcW w:type="dxa" w:w="4320"/>
+          </w:tcPr>
+          <w:p>
+            <w:r/>
+            <w:r>
+              <w:t>Set Screw (older label format)</w:t>
+            </w:r>
+          </w:p>
+        </w:tc>
+      </w:tr>
+    </w:tbl>
+    <w:p>
+      <w:r>
+        <w:t xml:space="preserve">All 105 Summa Orthopaedics products are in the database. If an item shows up as "Unknown — GTIN: XXXXXXXXXX," it means the product code isn't recognized yet. Use the </w:t>
       </w:r>
       <w:r>
         <w:rPr>
@@ -1446,40 +3868,122 @@
         <w:t>Edit</w:t>
       </w:r>
       <w:r>
-        <w:t xml:space="preserve"> | Fix a mistake — wrong lot number, wrong expiry date, wrong product label. Every change is saved with your name and the time so there's a full audit trail. |</w:t>
+        <w:t xml:space="preserve"> button on that item's detail page to correct it, or let your manager know so it can be added to the database.</w:t>
+      </w:r>
+    </w:p>
+    <w:p/>
+    <w:p>
+      <w:pPr>
+        <w:pStyle w:val="Heading1"/>
+      </w:pPr>
+      <w:r>
+        <w:t>Tips and Troubleshooting</w:t>
       </w:r>
     </w:p>
     <w:p>
-      <w:r>
-        <w:t xml:space="preserve">| </w:t>
-      </w:r>
       <w:r>
         <w:rPr>
           <w:b/>
         </w:rPr>
-        <w:t>Reassign</w:t>
-      </w:r>
-      <w:r>
-        <w:t xml:space="preserve"> | Move the item to a different distributor. A transfer record is created automatically. |</w:t>
+        <w:t>Barcode won't scan?</w:t>
       </w:r>
     </w:p>
     <w:p>
-      <w:r>
-        <w:t xml:space="preserve">| </w:t>
+      <w:pPr>
+        <w:pStyle w:val="ListBullet"/>
+      </w:pPr>
+      <w:r>
+        <w:t>Make sure there's good lighting — shadows on the barcode cause read failures</w:t>
+      </w:r>
+    </w:p>
+    <w:p>
+      <w:pPr>
+        <w:pStyle w:val="ListBullet"/>
+      </w:pPr>
+      <w:r>
+        <w:t>Hold the phone steady and make sure the whole barcode is in the frame</w:t>
+      </w:r>
+    </w:p>
+    <w:p>
+      <w:pPr>
+        <w:pStyle w:val="ListBullet"/>
+      </w:pPr>
+      <w:r>
+        <w:t xml:space="preserve">Try </w:t>
       </w:r>
       <w:r>
         <w:rPr>
           <w:b/>
         </w:rPr>
-        <w:t>Mark as Used</w:t>
-      </w:r>
-      <w:r>
-        <w:t xml:space="preserve"> | Record that this item was implanted in a patient. It will disappear from active inventory. |</w:t>
+        <w:t>Manual Entry</w:t>
+      </w:r>
+      <w:r>
+        <w:t xml:space="preserve"> if the label is damaged or the barcode is smudged</w:t>
       </w:r>
     </w:p>
     <w:p>
       <w:r>
-        <w:t xml:space="preserve">| </w:t>
+        <w:rPr>
+          <w:b/>
+        </w:rPr>
+        <w:t>Item shows up as "Unknown" product?</w:t>
+      </w:r>
+    </w:p>
+    <w:p>
+      <w:pPr>
+        <w:pStyle w:val="ListBullet"/>
+      </w:pPr>
+      <w:r>
+        <w:t>The product code may not be in the database yet</w:t>
+      </w:r>
+    </w:p>
+    <w:p>
+      <w:pPr>
+        <w:pStyle w:val="ListBullet"/>
+      </w:pPr>
+      <w:r>
+        <w:t xml:space="preserve">Tap the item to open its detail page, then tap </w:t>
+      </w:r>
+      <w:r>
+        <w:rPr>
+          <w:b/>
+        </w:rPr>
+        <w:t>Edit</w:t>
+      </w:r>
+      <w:r>
+        <w:t xml:space="preserve"> to assign the correct product label</w:t>
+      </w:r>
+    </w:p>
+    <w:p>
+      <w:pPr>
+        <w:pStyle w:val="ListBullet"/>
+      </w:pPr>
+      <w:r>
+        <w:t>Every edit is logged so there's always a record of what was changed</w:t>
+      </w:r>
+    </w:p>
+    <w:p>
+      <w:r>
+        <w:rPr>
+          <w:b/>
+        </w:rPr>
+        <w:t>Accidentally received the same item twice?</w:t>
+      </w:r>
+    </w:p>
+    <w:p>
+      <w:pPr>
+        <w:pStyle w:val="ListBullet"/>
+      </w:pPr>
+      <w:r>
+        <w:t>If it's genuinely a different physical unit (different box), that's correct — leave both records</w:t>
+      </w:r>
+    </w:p>
+    <w:p>
+      <w:pPr>
+        <w:pStyle w:val="ListBullet"/>
+      </w:pPr>
+      <w:r>
+        <w:t xml:space="preserve">If it was a duplicate scan of the same box, open one of the records and tap </w:t>
       </w:r>
       <w:r>
         <w:rPr>
@@ -1487,1580 +3991,21 @@
         </w:rPr>
         <w:t>Delete</w:t>
       </w:r>
-      <w:r>
-        <w:t xml:space="preserve"> | Remove the item entirely. Use with caution. |</w:t>
-      </w:r>
     </w:p>
     <w:p>
-      <w:pPr>
-        <w:pStyle w:val="IntenseQuote"/>
-      </w:pPr>
       <w:r>
         <w:rPr>
           <w:b/>
         </w:rPr>
-        <w:t>Keyboard shortcut:</w:t>
-      </w:r>
-      <w:r>
-        <w:t xml:space="preserve"> If you're on a computer, press </w:t>
-      </w:r>
-      <w:r>
-        <w:rPr>
-          <w:b/>
-        </w:rPr>
-        <w:t>ESC</w:t>
-      </w:r>
-      <w:r>
-        <w:t xml:space="preserve"> at any time to close a photo or a pop-up window.</w:t>
+        <w:t>Need to correct a lot number or expiry date?</w:t>
       </w:r>
     </w:p>
     <w:p>
       <w:pPr>
-        <w:pStyle w:val="Heading2"/>
-      </w:pPr>
-      <w:r>
-        <w:t>5. Banks (Item Kits)</w:t>
-      </w:r>
-    </w:p>
-    <w:p>
-      <w:r>
-        <w:rPr>
-          <w:b/>
-        </w:rPr>
-        <w:t>Where to go:</w:t>
-      </w:r>
-      <w:r>
-        <w:t xml:space="preserve"> Tap </w:t>
-      </w:r>
-      <w:r>
-        <w:rPr>
-          <w:b/>
-        </w:rPr>
-        <w:t>More</w:t>
-      </w:r>
-      <w:r>
-        <w:t xml:space="preserve"> → </w:t>
-      </w:r>
-      <w:r>
-        <w:rPr>
-          <w:b/>
-        </w:rPr>
-        <w:t>Banks</w:t>
-      </w:r>
-    </w:p>
-    <w:p>
-      <w:r>
-        <w:t>A "bank" is a named group of items that belong together — for example, a kit that a sales rep takes to a specific hospital, or a tray of implants for a particular surgery type. Banks make it easy to move a whole group of items at once instead of one by one.</w:t>
-      </w:r>
-    </w:p>
-    <w:p>
-      <w:r>
-        <w:rPr>
-          <w:b/>
-        </w:rPr>
-        <w:t>Creating a bank:</w:t>
-      </w:r>
-    </w:p>
-    <w:p>
-      <w:pPr>
-        <w:pStyle w:val="ListNumber"/>
-      </w:pPr>
-      <w:r>
-        <w:t xml:space="preserve">Tap </w:t>
-      </w:r>
-      <w:r>
-        <w:rPr>
-          <w:b/>
-        </w:rPr>
-        <w:t>Create Bank</w:t>
-      </w:r>
-    </w:p>
-    <w:p>
-      <w:pPr>
-        <w:pStyle w:val="ListNumber"/>
-      </w:pPr>
-      <w:r>
-        <w:t>Give it a name (e.g., "Smith - General Hospital Kit") and an optional description</w:t>
-      </w:r>
-    </w:p>
-    <w:p>
-      <w:pPr>
-        <w:pStyle w:val="ListNumber"/>
-      </w:pPr>
-      <w:r>
-        <w:t>Select which distributor it belongs to</w:t>
-      </w:r>
-    </w:p>
-    <w:p>
-      <w:pPr>
-        <w:pStyle w:val="ListNumber"/>
-      </w:pPr>
-      <w:r>
-        <w:t xml:space="preserve">Tap </w:t>
-      </w:r>
-      <w:r>
-        <w:rPr>
-          <w:b/>
-        </w:rPr>
-        <w:t>Create</w:t>
-      </w:r>
-    </w:p>
-    <w:p>
-      <w:r>
-        <w:rPr>
-          <w:b/>
-        </w:rPr>
-        <w:t>Adding items to a bank:</w:t>
-      </w:r>
-    </w:p>
-    <w:p>
-      <w:pPr>
-        <w:pStyle w:val="ListNumber"/>
-      </w:pPr>
-      <w:r>
-        <w:t xml:space="preserve">Open the bank, then tap </w:t>
-      </w:r>
-      <w:r>
-        <w:rPr>
-          <w:b/>
-        </w:rPr>
-        <w:t>Add Items</w:t>
-      </w:r>
-    </w:p>
-    <w:p>
-      <w:pPr>
-        <w:pStyle w:val="ListNumber"/>
-      </w:pPr>
-      <w:r>
-        <w:t>You'll see a list of items at the same distributor as the bank — items already in another bank won't appear here</w:t>
-      </w:r>
-    </w:p>
-    <w:p>
-      <w:pPr>
-        <w:pStyle w:val="ListNumber"/>
-      </w:pPr>
-      <w:r>
-        <w:t xml:space="preserve">Check the items you want to add, then tap </w:t>
-      </w:r>
-      <w:r>
-        <w:rPr>
-          <w:b/>
-        </w:rPr>
-        <w:t>Add</w:t>
-      </w:r>
-    </w:p>
-    <w:p>
-      <w:r>
-        <w:rPr>
-          <w:b/>
-        </w:rPr>
-        <w:t>Removing an item:</w:t>
-      </w:r>
-    </w:p>
-    <w:p>
-      <w:r>
-        <w:t xml:space="preserve">Tap the </w:t>
-      </w:r>
-      <w:r>
-        <w:rPr>
-          <w:b/>
-        </w:rPr>
-        <w:t>X</w:t>
-      </w:r>
-      <w:r>
-        <w:t xml:space="preserve"> next to an item in the bank list. The item doesn't get deleted — it just leaves the bank and stays in that distributor's regular inventory.</w:t>
-      </w:r>
-    </w:p>
-    <w:p>
-      <w:r>
-        <w:rPr>
-          <w:b/>
-        </w:rPr>
-        <w:t>Moving a whole bank:</w:t>
-      </w:r>
-    </w:p>
-    <w:p>
-      <w:pPr>
-        <w:pStyle w:val="ListNumber"/>
-      </w:pPr>
-      <w:r>
-        <w:t xml:space="preserve">Open the bank, tap </w:t>
-      </w:r>
-      <w:r>
-        <w:rPr>
-          <w:b/>
-        </w:rPr>
-        <w:t>Move Bank</w:t>
-      </w:r>
-    </w:p>
-    <w:p>
-      <w:pPr>
-        <w:pStyle w:val="ListNumber"/>
-      </w:pPr>
-      <w:r>
-        <w:t>Choose the destination distributor</w:t>
-      </w:r>
-    </w:p>
-    <w:p>
-      <w:pPr>
-        <w:pStyle w:val="ListNumber"/>
-      </w:pPr>
-      <w:r>
-        <w:t>Every item in the bank gets reassigned to that distributor, and the move is logged in the history</w:t>
-      </w:r>
-    </w:p>
-    <w:p>
-      <w:pPr>
-        <w:pStyle w:val="Heading2"/>
-      </w:pPr>
-      <w:r>
-        <w:t>6. Transfers</w:t>
-      </w:r>
-    </w:p>
-    <w:p>
-      <w:r>
-        <w:rPr>
-          <w:b/>
-        </w:rPr>
-        <w:t>Where to go:</w:t>
-      </w:r>
-      <w:r>
-        <w:t xml:space="preserve"> Tap </w:t>
-      </w:r>
-      <w:r>
-        <w:rPr>
-          <w:b/>
-        </w:rPr>
-        <w:t>More</w:t>
-      </w:r>
-      <w:r>
-        <w:t xml:space="preserve"> → </w:t>
-      </w:r>
-      <w:r>
-        <w:rPr>
-          <w:b/>
-        </w:rPr>
-        <w:t>Transfer</w:t>
-      </w:r>
-    </w:p>
-    <w:p>
-      <w:r>
-        <w:t xml:space="preserve">Use this when you need to officially move items from one distributor to another — for example, pulling items back from a rep or shipping a set of implants out to a new location. Every transfer gets its own ID (like </w:t>
-      </w:r>
-      <w:r>
-        <w:rPr>
-          <w:rFonts w:ascii="Consolas" w:hAnsi="Consolas"/>
-        </w:rPr>
-        <w:t>TRF-20260514-0001</w:t>
-      </w:r>
-      <w:r>
-        <w:t>) so you can reference it later.</w:t>
-      </w:r>
-    </w:p>
-    <w:p>
-      <w:r>
-        <w:rPr>
-          <w:b/>
-        </w:rPr>
-        <w:t>Creating a transfer:</w:t>
-      </w:r>
-    </w:p>
-    <w:p>
-      <w:pPr>
-        <w:pStyle w:val="ListNumber"/>
-      </w:pPr>
-      <w:r>
-        <w:t xml:space="preserve">Under </w:t>
-      </w:r>
-      <w:r>
-        <w:rPr>
-          <w:b/>
-        </w:rPr>
-        <w:t>From</w:t>
-      </w:r>
-      <w:r>
-        <w:t>, choose where the items are coming from</w:t>
-      </w:r>
-    </w:p>
-    <w:p>
-      <w:pPr>
-        <w:pStyle w:val="ListNumber"/>
-      </w:pPr>
-      <w:r>
-        <w:t xml:space="preserve">Under </w:t>
-      </w:r>
-      <w:r>
-        <w:rPr>
-          <w:b/>
-        </w:rPr>
-        <w:t>To</w:t>
-      </w:r>
-      <w:r>
-        <w:t>, choose where they're going</w:t>
-      </w:r>
-    </w:p>
-    <w:p>
-      <w:pPr>
-        <w:pStyle w:val="ListNumber"/>
-      </w:pPr>
-      <w:r>
-        <w:t xml:space="preserve">Check the boxes next to the items you want to move. Tap </w:t>
-      </w:r>
-      <w:r>
-        <w:rPr>
-          <w:b/>
-        </w:rPr>
-        <w:t>Select All</w:t>
-      </w:r>
-      <w:r>
-        <w:t xml:space="preserve"> if you want everything.</w:t>
-      </w:r>
-    </w:p>
-    <w:p>
-      <w:pPr>
-        <w:pStyle w:val="ListNumber"/>
-      </w:pPr>
-      <w:r>
-        <w:t>Add an optional note (e.g., "Returning expired stock" or "Filling new rep order")</w:t>
-      </w:r>
-    </w:p>
-    <w:p>
-      <w:pPr>
-        <w:pStyle w:val="ListNumber"/>
-      </w:pPr>
-      <w:r>
-        <w:t xml:space="preserve">Tap </w:t>
-      </w:r>
-      <w:r>
-        <w:rPr>
-          <w:b/>
-        </w:rPr>
-        <w:t>Confirm Transfer</w:t>
-      </w:r>
-    </w:p>
-    <w:p>
-      <w:r>
-        <w:t>The system creates a transfer record and updates every item's location automatically.</w:t>
-      </w:r>
-    </w:p>
-    <w:p>
-      <w:pPr>
-        <w:pStyle w:val="IntenseQuote"/>
-      </w:pPr>
-      <w:r>
-        <w:rPr>
-          <w:b/>
-        </w:rPr>
-        <w:t>Single-item reassignment also counts:</w:t>
-      </w:r>
-      <w:r>
-        <w:t xml:space="preserve"> If you move one item from its detail page using the Reassign button, a transfer record is created for that too — so every move is always tracked.</w:t>
-      </w:r>
-    </w:p>
-    <w:p>
-      <w:r>
-        <w:rPr>
-          <w:b/>
-        </w:rPr>
-        <w:t>Printing a transfer report:</w:t>
-      </w:r>
-    </w:p>
-    <w:p>
-      <w:r>
-        <w:t>If you need a paper record of a transfer:</w:t>
-      </w:r>
-    </w:p>
-    <w:p>
-      <w:pPr>
-        <w:pStyle w:val="ListNumber"/>
-      </w:pPr>
-      <w:r>
-        <w:t xml:space="preserve">Find the transfer in </w:t>
-      </w:r>
-      <w:r>
-        <w:rPr>
-          <w:b/>
-        </w:rPr>
-        <w:t>Reports</w:t>
-      </w:r>
-      <w:r>
-        <w:t xml:space="preserve"> → </w:t>
-      </w:r>
-      <w:r>
-        <w:rPr>
-          <w:b/>
-        </w:rPr>
-        <w:t>Transfer History</w:t>
-      </w:r>
-      <w:r>
-        <w:t xml:space="preserve"> and tap its ID (e.g., TRF-20260514-0001)</w:t>
-      </w:r>
-    </w:p>
-    <w:p>
-      <w:pPr>
-        <w:pStyle w:val="ListNumber"/>
-      </w:pPr>
-      <w:r>
-        <w:t xml:space="preserve">Tap the </w:t>
-      </w:r>
-      <w:r>
-        <w:rPr>
-          <w:b/>
-        </w:rPr>
-        <w:t>Print</w:t>
-      </w:r>
-      <w:r>
-        <w:t xml:space="preserve"> button</w:t>
-      </w:r>
-    </w:p>
-    <w:p>
-      <w:pPr>
-        <w:pStyle w:val="ListNumber"/>
-      </w:pPr>
-      <w:r>
-        <w:t>A clean, print-ready version opens — use Ctrl+P (Windows) or Cmd+P (Mac) to print or save as PDF</w:t>
-      </w:r>
-    </w:p>
-    <w:p>
-      <w:pPr>
-        <w:pStyle w:val="Heading2"/>
-      </w:pPr>
-      <w:r>
-        <w:t>7. Recording Daily Usage (Usage Tickets)</w:t>
-      </w:r>
-    </w:p>
-    <w:p>
-      <w:r>
-        <w:rPr>
-          <w:b/>
-        </w:rPr>
-        <w:t>Where to go:</w:t>
-      </w:r>
-      <w:r>
-        <w:t xml:space="preserve"> Tap </w:t>
-      </w:r>
-      <w:r>
-        <w:rPr>
-          <w:b/>
-        </w:rPr>
-        <w:t>Usage</w:t>
-      </w:r>
-      <w:r>
-        <w:t xml:space="preserve"> in the bottom navigation</w:t>
-      </w:r>
-    </w:p>
-    <w:p>
-      <w:r>
-        <w:t>Use this every day to record the implants a distributor has used. You scan the product stickers from the paper usage ticket, and the app deducts those items from that distributor's inventory — but only after confirming they're actually in stock.</w:t>
-      </w:r>
-    </w:p>
-    <w:p>
-      <w:r>
-        <w:rPr>
-          <w:b/>
-        </w:rPr>
-        <w:t>Recording a usage ticket:</w:t>
-      </w:r>
-    </w:p>
-    <w:p>
-      <w:pPr>
-        <w:pStyle w:val="ListNumber"/>
-      </w:pPr>
-      <w:r>
-        <w:rPr>
-          <w:b/>
-        </w:rPr>
-        <w:t>Pick the distributor</w:t>
-      </w:r>
-      <w:r>
-        <w:t xml:space="preserve"> at the top. (All the items on one ticket come out of this one distributor. To record a different distributor, finish this ticket first or change the selection to start over.)</w:t>
-      </w:r>
-    </w:p>
-    <w:p>
-      <w:pPr>
-        <w:pStyle w:val="ListNumber"/>
-      </w:pPr>
-      <w:r>
-        <w:rPr>
-          <w:b/>
-        </w:rPr>
-        <w:t>Scan each sticker</w:t>
-      </w:r>
-      <w:r>
-        <w:t xml:space="preserve"> — use Live Scan, Take Photo, or Upload Photo, just like receiving. You can also tap </w:t>
-      </w:r>
-      <w:r>
-        <w:rPr>
-          <w:b/>
-        </w:rPr>
-        <w:t>Enter barcode manually</w:t>
-      </w:r>
-      <w:r>
-        <w:t xml:space="preserve"> to type one in.</w:t>
-      </w:r>
-    </w:p>
-    <w:p>
-      <w:pPr>
-        <w:pStyle w:val="ListNumber"/>
-      </w:pPr>
-      <w:r>
-        <w:t>As you scan, each item shows a status:</w:t>
-      </w:r>
-    </w:p>
-    <w:p>
-      <w:pPr>
         <w:pStyle w:val="ListBullet"/>
       </w:pPr>
       <w:r>
-        <w:t xml:space="preserve">🟢 </w:t>
-      </w:r>
-      <w:r>
-        <w:rPr>
-          <w:b/>
-        </w:rPr>
-        <w:t>Available</w:t>
-      </w:r>
-      <w:r>
-        <w:t xml:space="preserve"> — found in this distributor's stock and ready to deduct. If several identical units exist, the one expiring soonest is used first.</w:t>
-      </w:r>
-    </w:p>
-    <w:p>
-      <w:pPr>
-        <w:pStyle w:val="ListBullet"/>
-      </w:pPr>
-      <w:r>
-        <w:t xml:space="preserve">🟡 </w:t>
-      </w:r>
-      <w:r>
-        <w:rPr>
-          <w:b/>
-        </w:rPr>
-        <w:t>Not in stock</w:t>
-      </w:r>
-      <w:r>
-        <w:t xml:space="preserve"> — this item isn't in that distributor's inventory, so it </w:t>
-      </w:r>
-      <w:r>
-        <w:rPr>
-          <w:b/>
-        </w:rPr>
-        <w:t>can't</w:t>
-      </w:r>
-      <w:r>
-        <w:t xml:space="preserve"> be deducted. Double-check the distributor, or that the item was received first.</w:t>
-      </w:r>
-    </w:p>
-    <w:p>
-      <w:pPr>
-        <w:pStyle w:val="ListBullet"/>
-      </w:pPr>
-      <w:r>
-        <w:t xml:space="preserve">🔴 </w:t>
-      </w:r>
-      <w:r>
-        <w:rPr>
-          <w:b/>
-        </w:rPr>
-        <w:t>Unreadable</w:t>
-      </w:r>
-      <w:r>
-        <w:t xml:space="preserve"> — the sticker couldn't be read; try scanning again or enter it manually.</w:t>
-      </w:r>
-    </w:p>
-    <w:p>
-      <w:pPr>
-        <w:pStyle w:val="ListNumber"/>
-      </w:pPr>
-      <w:r>
-        <w:t xml:space="preserve">Tap </w:t>
-      </w:r>
-      <w:r>
-        <w:rPr>
-          <w:b/>
-        </w:rPr>
-        <w:t>Consume N items</w:t>
-      </w:r>
-      <w:r>
-        <w:t xml:space="preserve">. Review the list, add an optional note (case number, surgeon, etc.), and tap </w:t>
-      </w:r>
-      <w:r>
-        <w:rPr>
-          <w:b/>
-        </w:rPr>
-        <w:t>Consume</w:t>
-      </w:r>
-      <w:r>
-        <w:t>.</w:t>
-      </w:r>
-    </w:p>
-    <w:p>
-      <w:pPr>
-        <w:pStyle w:val="ListNumber"/>
-      </w:pPr>
-      <w:r>
-        <w:t xml:space="preserve">The items are deducted from inventory and the ticket is saved with its own number (like </w:t>
-      </w:r>
-      <w:r>
-        <w:rPr>
-          <w:rFonts w:ascii="Consolas" w:hAnsi="Consolas"/>
-        </w:rPr>
-        <w:t>USE-20260602-0001</w:t>
-      </w:r>
-      <w:r>
-        <w:t>).</w:t>
-      </w:r>
-    </w:p>
-    <w:p>
-      <w:pPr>
-        <w:pStyle w:val="IntenseQuote"/>
-      </w:pPr>
-      <w:r>
-        <w:rPr>
-          <w:b/>
-        </w:rPr>
-        <w:t>Only in-stock items are deducted.</w:t>
-      </w:r>
-      <w:r>
-        <w:t xml:space="preserve"> Anything flagged "not in stock" is left untouched — the app never guesses or deducts something a distributor doesn't have.</w:t>
-      </w:r>
-    </w:p>
-    <w:p>
-      <w:r>
-        <w:rPr>
-          <w:b/>
-        </w:rPr>
-        <w:t>Usage History:</w:t>
-      </w:r>
-    </w:p>
-    <w:p>
-      <w:r>
-        <w:t xml:space="preserve">Tap </w:t>
-      </w:r>
-      <w:r>
-        <w:rPr>
-          <w:b/>
-        </w:rPr>
-        <w:t>History</w:t>
-      </w:r>
-      <w:r>
-        <w:t xml:space="preserve"> (top of the Usage page) or </w:t>
-      </w:r>
-      <w:r>
-        <w:rPr>
-          <w:b/>
-        </w:rPr>
-        <w:t>More → Usage History</w:t>
-      </w:r>
-      <w:r>
-        <w:t xml:space="preserve"> to see every ticket you've recorded. Tap a ticket to see exactly which items were consumed, and use </w:t>
-      </w:r>
-      <w:r>
-        <w:rPr>
-          <w:b/>
-        </w:rPr>
-        <w:t>Print</w:t>
-      </w:r>
-      <w:r>
-        <w:t xml:space="preserve"> for a paper or PDF record.</w:t>
-      </w:r>
-    </w:p>
-    <w:p>
-      <w:pPr>
-        <w:pStyle w:val="Heading2"/>
-      </w:pPr>
-      <w:r>
-        <w:t>8. Reports</w:t>
-      </w:r>
-    </w:p>
-    <w:p>
-      <w:r>
-        <w:rPr>
-          <w:b/>
-        </w:rPr>
-        <w:t>Where to go:</w:t>
-      </w:r>
-      <w:r>
-        <w:t xml:space="preserve"> Tap </w:t>
-      </w:r>
-      <w:r>
-        <w:rPr>
-          <w:b/>
-        </w:rPr>
-        <w:t>Reports</w:t>
-      </w:r>
-      <w:r>
-        <w:t xml:space="preserve"> in the bottom navigation</w:t>
-      </w:r>
-    </w:p>
-    <w:p>
-      <w:r>
-        <w:t>The Reports page gives you a bird's-eye view of your entire inventory at a glance.</w:t>
-      </w:r>
-    </w:p>
-    <w:p>
-      <w:r>
-        <w:rPr>
-          <w:b/>
-        </w:rPr>
-        <w:t>The summary cards at the top:</w:t>
-      </w:r>
-    </w:p>
-    <w:p>
-      <w:r>
-        <w:t xml:space="preserve">There are five colored cards that each show a number. </w:t>
-      </w:r>
-      <w:r>
-        <w:rPr>
-          <w:b/>
-        </w:rPr>
-        <w:t>Tap any card to see the matching list of items.</w:t>
-      </w:r>
-    </w:p>
-    <w:p>
-      <w:r>
-        <w:t>| Card | What It Shows | Tap to See |</w:t>
-      </w:r>
-    </w:p>
-    <w:p>
-      <w:r>
-        <w:t>|------|--------------|------------|</w:t>
-      </w:r>
-    </w:p>
-    <w:p>
-      <w:r>
-        <w:t>| Total Units | How many items are in the system right now | All inventory |</w:t>
-      </w:r>
-    </w:p>
-    <w:p>
-      <w:r>
-        <w:t>| Active Distributors | How many distributors have items | Distributor list |</w:t>
-      </w:r>
-    </w:p>
-    <w:p>
-      <w:r>
-        <w:t>| Expiring &lt; 180d | Items that expire within 6 months | Those specific items |</w:t>
-      </w:r>
-    </w:p>
-    <w:p>
-      <w:r>
-        <w:t>| Expired | Items that are already past their expiry date | Those specific items |</w:t>
-      </w:r>
-    </w:p>
-    <w:p>
-      <w:r>
-        <w:t>| Unassigned | Items at Home Office not yet sent anywhere | Those specific items |</w:t>
-      </w:r>
-    </w:p>
-    <w:p>
-      <w:r>
-        <w:rPr>
-          <w:b/>
-        </w:rPr>
-        <w:t>Stock by Item Number:</w:t>
-      </w:r>
-    </w:p>
-    <w:p>
-      <w:r>
-        <w:t xml:space="preserve">Tap the </w:t>
-      </w:r>
-      <w:r>
-        <w:rPr>
-          <w:b/>
-        </w:rPr>
-        <w:t>Stock by Item Number</w:t>
-      </w:r>
-      <w:r>
-        <w:t xml:space="preserve"> button to open a detailed matrix view. This is one of the most useful reports in the system.</w:t>
-      </w:r>
-    </w:p>
-    <w:p>
-      <w:pPr>
-        <w:pStyle w:val="ListBullet"/>
-      </w:pPr>
-      <w:r>
-        <w:t>Every row is one type of product (one item number)</w:t>
-      </w:r>
-    </w:p>
-    <w:p>
-      <w:pPr>
-        <w:pStyle w:val="ListBullet"/>
-      </w:pPr>
-      <w:r>
-        <w:t>Every column is a location (Home Office, plus each distributor)</w:t>
-      </w:r>
-    </w:p>
-    <w:p>
-      <w:pPr>
-        <w:pStyle w:val="ListBullet"/>
-      </w:pPr>
-      <w:r>
-        <w:t xml:space="preserve">The </w:t>
-      </w:r>
-      <w:r>
-        <w:rPr>
-          <w:b/>
-        </w:rPr>
-        <w:t>Total</w:t>
-      </w:r>
-      <w:r>
-        <w:t xml:space="preserve"> column on the right shows how many of that item exist across everywhere</w:t>
-      </w:r>
-    </w:p>
-    <w:p>
-      <w:r>
-        <w:rPr>
-          <w:b/>
-        </w:rPr>
-        <w:t>Drilling down:</w:t>
-      </w:r>
-    </w:p>
-    <w:p>
-      <w:pPr>
-        <w:pStyle w:val="ListBullet"/>
-      </w:pPr>
-      <w:r>
-        <w:t xml:space="preserve">Tap an </w:t>
-      </w:r>
-      <w:r>
-        <w:rPr>
-          <w:b/>
-        </w:rPr>
-        <w:t>item number</w:t>
-      </w:r>
-      <w:r>
-        <w:t xml:space="preserve"> in the leftmost column (or its Total) → see all units of that product across all locations</w:t>
-      </w:r>
-    </w:p>
-    <w:p>
-      <w:pPr>
-        <w:pStyle w:val="ListBullet"/>
-      </w:pPr>
-      <w:r>
-        <w:t xml:space="preserve">Tap a </w:t>
-      </w:r>
-      <w:r>
-        <w:rPr>
-          <w:b/>
-        </w:rPr>
-        <w:t>specific count</w:t>
-      </w:r>
-      <w:r>
-        <w:t xml:space="preserve"> (e.g., the "13" under a distributor's column) → see only that product at that location</w:t>
-      </w:r>
-    </w:p>
-    <w:p>
-      <w:r>
-        <w:t>You can also search by item number or description at the top, sort by any column, and download the whole matrix as an Excel file.</w:t>
-      </w:r>
-    </w:p>
-    <w:p>
-      <w:r>
-        <w:rPr>
-          <w:b/>
-        </w:rPr>
-        <w:t>Usage Reports (how products are being used):</w:t>
-      </w:r>
-    </w:p>
-    <w:p>
-      <w:r>
-        <w:t xml:space="preserve">The Reports page has a </w:t>
-      </w:r>
-      <w:r>
-        <w:rPr>
-          <w:b/>
-        </w:rPr>
-        <w:t>Usage</w:t>
-      </w:r>
-      <w:r>
-        <w:t xml:space="preserve"> section with three reports that show what's actually being consumed — useful for planning orders and balancing stock between distributors. Each one has an </w:t>
-      </w:r>
-      <w:r>
-        <w:rPr>
-          <w:b/>
-        </w:rPr>
-        <w:t>Excel</w:t>
-      </w:r>
-      <w:r>
-        <w:t xml:space="preserve"> export button.</w:t>
-      </w:r>
-    </w:p>
-    <w:p>
-      <w:pPr>
-        <w:pStyle w:val="ListBullet"/>
-      </w:pPr>
-      <w:r>
-        <w:rPr>
-          <w:b/>
-        </w:rPr>
-        <w:t>Monthly Usage Report</w:t>
-      </w:r>
-      <w:r>
-        <w:t xml:space="preserve"> — pick </w:t>
-      </w:r>
-      <w:r>
-        <w:rPr>
-          <w:i/>
-        </w:rPr>
-        <w:t>any</w:t>
-      </w:r>
-      <w:r>
-        <w:t xml:space="preserve"> month and (optionally) a distributor to get a full itemized statement: every product used that month, grouped by distributor, with quantities, subtotals, and a grand total. This is your go-to "what did we use in May?" report.</w:t>
-      </w:r>
-    </w:p>
-    <w:p>
-      <w:pPr>
-        <w:pStyle w:val="ListBullet"/>
-      </w:pPr>
-      <w:r>
-        <w:rPr>
-          <w:b/>
-        </w:rPr>
-        <w:t>Usage Trends</w:t>
-      </w:r>
-      <w:r>
-        <w:t xml:space="preserve"> — units consumed each month by product category (Short Nail, Long Nail, Lag Screw, Interlocking Screw, Cap Screw, Set Screw) over the last 3, 6, or 12 months. A bar chart shows the monthly totals; the table breaks it down by category. Filter to one distributor to see just their usage.</w:t>
-      </w:r>
-    </w:p>
-    <w:p>
-      <w:pPr>
-        <w:pStyle w:val="ListBullet"/>
-      </w:pPr>
-      <w:r>
-        <w:rPr>
-          <w:b/>
-        </w:rPr>
-        <w:t>Usage by Distributor</w:t>
-      </w:r>
-      <w:r>
-        <w:t xml:space="preserve"> — a grid with product categories down the side and distributors across the top, showing how many of each were used over the window. Quickly compares who uses what.</w:t>
-      </w:r>
-    </w:p>
-    <w:p>
-      <w:pPr>
-        <w:pStyle w:val="IntenseQuote"/>
-      </w:pPr>
-      <w:r>
-        <w:t>Usage reports fill in as you record usage tickets (Usage tab). The more you record, the more useful the trends become.</w:t>
-      </w:r>
-    </w:p>
-    <w:p>
-      <w:r>
-        <w:rPr>
-          <w:b/>
-        </w:rPr>
-        <w:t>Transfer History:</w:t>
-      </w:r>
-    </w:p>
-    <w:p>
-      <w:r>
-        <w:t>A searchable list of every transfer ever created. Type a transfer ID, distributor name, or date in the search bar to find what you're looking for. Tap any transfer ID to see the full detail and print it.</w:t>
-      </w:r>
-    </w:p>
-    <w:p>
-      <w:r>
-        <w:rPr>
-          <w:b/>
-        </w:rPr>
-        <w:t>Expiring Items:</w:t>
-      </w:r>
-    </w:p>
-    <w:p>
-      <w:r>
-        <w:t>A table showing up to 20 items that expire in the next 180 days, sorted by how many days are left. Tap any column header to re-sort the list.</w:t>
-      </w:r>
-    </w:p>
-    <w:p>
-      <w:pPr>
-        <w:pStyle w:val="Heading2"/>
-      </w:pPr>
-      <w:r>
-        <w:t>9. Batch Upload</w:t>
-      </w:r>
-    </w:p>
-    <w:p>
-      <w:r>
-        <w:rPr>
-          <w:b/>
-        </w:rPr>
-        <w:t>Where to go:</w:t>
-      </w:r>
-      <w:r>
-        <w:t xml:space="preserve"> Tap </w:t>
-      </w:r>
-      <w:r>
-        <w:rPr>
-          <w:b/>
-        </w:rPr>
-        <w:t>More</w:t>
-      </w:r>
-      <w:r>
-        <w:t xml:space="preserve"> → </w:t>
-      </w:r>
-      <w:r>
-        <w:rPr>
-          <w:b/>
-        </w:rPr>
-        <w:t>Batch Upload</w:t>
-      </w:r>
-    </w:p>
-    <w:p>
-      <w:r>
-        <w:t>Use this when you have a large number of items to add to the system and you'd rather upload photos or a spreadsheet than scan them one at a time.</w:t>
-      </w:r>
-    </w:p>
-    <w:p>
-      <w:r>
-        <w:rPr>
-          <w:b/>
-        </w:rPr>
-        <w:t>Uploading photos:</w:t>
-      </w:r>
-    </w:p>
-    <w:p>
-      <w:pPr>
-        <w:pStyle w:val="ListNumber"/>
-      </w:pPr>
-      <w:r>
-        <w:t>Tap the upload area and select images from your phone or computer</w:t>
-      </w:r>
-    </w:p>
-    <w:p>
-      <w:pPr>
-        <w:pStyle w:val="ListNumber"/>
-      </w:pPr>
-      <w:r>
-        <w:t xml:space="preserve">The app scans each photo automatically — it can find up to </w:t>
-      </w:r>
-      <w:r>
-        <w:rPr>
-          <w:b/>
-        </w:rPr>
-        <w:t>4 barcodes per image</w:t>
-      </w:r>
-    </w:p>
-    <w:p>
-      <w:pPr>
-        <w:pStyle w:val="ListNumber"/>
-      </w:pPr>
-      <w:r>
-        <w:t>You'll see results appear one by one showing what was found (or any errors)</w:t>
-      </w:r>
-    </w:p>
-    <w:p>
-      <w:r>
-        <w:rPr>
-          <w:b/>
-        </w:rPr>
-        <w:t>Uploading a CSV/Excel file:</w:t>
-      </w:r>
-    </w:p>
-    <w:p>
-      <w:r>
-        <w:t>If your shipping documents come as a spreadsheet with barcode data:</w:t>
-      </w:r>
-    </w:p>
-    <w:p>
-      <w:pPr>
-        <w:pStyle w:val="ListNumber"/>
-      </w:pPr>
-      <w:r>
-        <w:t>Make sure the barcode strings are in the first column</w:t>
-      </w:r>
-    </w:p>
-    <w:p>
-      <w:pPr>
-        <w:pStyle w:val="ListNumber"/>
-      </w:pPr>
-      <w:r>
-        <w:t>Tap the upload area and select your file</w:t>
-      </w:r>
-    </w:p>
-    <w:p>
-      <w:pPr>
-        <w:pStyle w:val="ListNumber"/>
-      </w:pPr>
-      <w:r>
-        <w:t>Each row becomes one inventory item — items that share a lot number are each created individually, not skipped</w:t>
-      </w:r>
-    </w:p>
-    <w:p>
-      <w:r>
-        <w:rPr>
-          <w:b/>
-        </w:rPr>
-        <w:t>After uploading:</w:t>
-      </w:r>
-    </w:p>
-    <w:p>
-      <w:pPr>
-        <w:pStyle w:val="ListNumber"/>
-      </w:pPr>
-      <w:r>
-        <w:t>A grid shows all the items that were found, with a checkmark (success) or X (failed to read)</w:t>
-      </w:r>
-    </w:p>
-    <w:p>
-      <w:pPr>
-        <w:pStyle w:val="ListNumber"/>
-      </w:pPr>
-      <w:r>
-        <w:t>Select the items you want to keep</w:t>
-      </w:r>
-    </w:p>
-    <w:p>
-      <w:pPr>
-        <w:pStyle w:val="ListNumber"/>
-      </w:pPr>
-      <w:r>
-        <w:t>Choose a destination distributor from the dropdown</w:t>
-      </w:r>
-    </w:p>
-    <w:p>
-      <w:pPr>
-        <w:pStyle w:val="ListNumber"/>
-      </w:pPr>
-      <w:r>
-        <w:t xml:space="preserve">Tap </w:t>
-      </w:r>
-      <w:r>
-        <w:rPr>
-          <w:b/>
-        </w:rPr>
-        <w:t>Assign</w:t>
-      </w:r>
-      <w:r>
-        <w:t xml:space="preserve"> to save them</w:t>
-      </w:r>
-    </w:p>
-    <w:p>
-      <w:pPr>
-        <w:pStyle w:val="Heading2"/>
-      </w:pPr>
-      <w:r>
-        <w:t>10. Distributors</w:t>
-      </w:r>
-    </w:p>
-    <w:p>
-      <w:r>
-        <w:rPr>
-          <w:b/>
-        </w:rPr>
-        <w:t>Where to go:</w:t>
-      </w:r>
-      <w:r>
-        <w:t xml:space="preserve"> Tap </w:t>
-      </w:r>
-      <w:r>
-        <w:rPr>
-          <w:b/>
-        </w:rPr>
-        <w:t>More</w:t>
-      </w:r>
-      <w:r>
-        <w:t xml:space="preserve"> → </w:t>
-      </w:r>
-      <w:r>
-        <w:rPr>
-          <w:b/>
-        </w:rPr>
-        <w:t>Distributors</w:t>
-      </w:r>
-    </w:p>
-    <w:p>
-      <w:r>
-        <w:t>This page shows your full list of distributors — the sales reps, hospitals, or other locations where your inventory lives.</w:t>
-      </w:r>
-    </w:p>
-    <w:p>
-      <w:pPr>
-        <w:pStyle w:val="ListBullet"/>
-      </w:pPr>
-      <w:r>
-        <w:t>Each distributor card shows how many items they currently have</w:t>
-      </w:r>
-    </w:p>
-    <w:p>
-      <w:pPr>
-        <w:pStyle w:val="ListBullet"/>
-      </w:pPr>
-      <w:r>
-        <w:t>Tap a distributor to see their full item list, download it as Excel, or share a link to the page</w:t>
-      </w:r>
-    </w:p>
-    <w:p>
-      <w:pPr>
-        <w:pStyle w:val="ListBullet"/>
-      </w:pPr>
-      <w:r>
-        <w:t>From the distributor detail page, tap any item to open its full detail page</w:t>
-      </w:r>
-    </w:p>
-    <w:p>
-      <w:pPr>
-        <w:pStyle w:val="ListBullet"/>
-      </w:pPr>
-      <w:r>
-        <w:rPr>
-          <w:b/>
-        </w:rPr>
-        <w:t>Home Office</w:t>
-      </w:r>
-      <w:r>
-        <w:t xml:space="preserve"> is always the starting point — all items come here first before going anywhere else</w:t>
-      </w:r>
-    </w:p>
-    <w:p>
-      <w:pPr>
-        <w:pStyle w:val="Heading1"/>
-      </w:pPr>
-      <w:r>
-        <w:t>Admin Features</w:t>
-      </w:r>
-    </w:p>
-    <w:p>
-      <w:pPr>
-        <w:pStyle w:val="Heading2"/>
-      </w:pPr>
-      <w:r>
-        <w:t>User Management</w:t>
-      </w:r>
-    </w:p>
-    <w:p>
-      <w:r>
-        <w:rPr>
-          <w:b/>
-        </w:rPr>
-        <w:t>Where to go:</w:t>
-      </w:r>
-      <w:r>
-        <w:t xml:space="preserve"> Tap </w:t>
-      </w:r>
-      <w:r>
-        <w:rPr>
-          <w:b/>
-        </w:rPr>
-        <w:t>More</w:t>
-      </w:r>
-      <w:r>
-        <w:t xml:space="preserve"> → </w:t>
-      </w:r>
-      <w:r>
-        <w:rPr>
-          <w:b/>
-        </w:rPr>
-        <w:t>User Management</w:t>
-      </w:r>
-      <w:r>
-        <w:t xml:space="preserve"> </w:t>
-      </w:r>
-      <w:r>
-        <w:rPr>
-          <w:i/>
-        </w:rPr>
-        <w:t>(only visible to admins)</w:t>
-      </w:r>
-    </w:p>
-    <w:p>
-      <w:r>
-        <w:rPr>
-          <w:b/>
-        </w:rPr>
-        <w:t>Adding a new user:</w:t>
-      </w:r>
-    </w:p>
-    <w:p>
-      <w:pPr>
-        <w:pStyle w:val="ListNumber"/>
-      </w:pPr>
-      <w:r>
-        <w:t xml:space="preserve">Tap </w:t>
-      </w:r>
-      <w:r>
-        <w:rPr>
-          <w:b/>
-        </w:rPr>
-        <w:t>Add User</w:t>
-      </w:r>
-    </w:p>
-    <w:p>
-      <w:pPr>
-        <w:pStyle w:val="ListNumber"/>
-      </w:pPr>
-      <w:r>
-        <w:t>Enter a username (at least 2 characters) and a password (at least 6 characters)</w:t>
-      </w:r>
-    </w:p>
-    <w:p>
-      <w:pPr>
-        <w:pStyle w:val="ListNumber"/>
-      </w:pPr>
-      <w:r>
-        <w:t>Choose a role:</w:t>
-      </w:r>
-    </w:p>
-    <w:p>
-      <w:pPr>
-        <w:pStyle w:val="ListBullet"/>
-      </w:pPr>
-      <w:r>
-        <w:rPr>
-          <w:b/>
-        </w:rPr>
-        <w:t>User</w:t>
-      </w:r>
-      <w:r>
-        <w:t xml:space="preserve"> — can view and manage inventory, but can't add or delete other users</w:t>
-      </w:r>
-    </w:p>
-    <w:p>
-      <w:pPr>
-        <w:pStyle w:val="ListBullet"/>
-      </w:pPr>
-      <w:r>
-        <w:rPr>
-          <w:b/>
-        </w:rPr>
-        <w:t>Admin</w:t>
-      </w:r>
-      <w:r>
-        <w:t xml:space="preserve"> — full access including User Management</w:t>
-      </w:r>
-    </w:p>
-    <w:p>
-      <w:pPr>
-        <w:pStyle w:val="ListNumber"/>
-      </w:pPr>
-      <w:r>
-        <w:t xml:space="preserve">Tap </w:t>
-      </w:r>
-      <w:r>
-        <w:rPr>
-          <w:b/>
-        </w:rPr>
-        <w:t>Create User</w:t>
-      </w:r>
-    </w:p>
-    <w:p>
-      <w:r>
-        <w:rPr>
-          <w:b/>
-        </w:rPr>
-        <w:t>Managing existing users:</w:t>
-      </w:r>
-    </w:p>
-    <w:p>
-      <w:pPr>
-        <w:pStyle w:val="ListBullet"/>
-      </w:pPr>
-      <w:r>
-        <w:rPr>
-          <w:b/>
-        </w:rPr>
-        <w:t>Change role:</w:t>
-      </w:r>
-      <w:r>
-        <w:t xml:space="preserve"> Tap the shield icon next to a user to switch them between User and Admin. (You can't change your own role.)</w:t>
-      </w:r>
-    </w:p>
-    <w:p>
-      <w:pPr>
-        <w:pStyle w:val="ListBullet"/>
-      </w:pPr>
-      <w:r>
-        <w:rPr>
-          <w:b/>
-        </w:rPr>
-        <w:t>Reset password:</w:t>
-      </w:r>
-      <w:r>
-        <w:t xml:space="preserve"> Tap the key icon next to a user and enter a new password</w:t>
-      </w:r>
-    </w:p>
-    <w:p>
-      <w:pPr>
-        <w:pStyle w:val="ListBullet"/>
-      </w:pPr>
-      <w:r>
-        <w:rPr>
-          <w:b/>
-        </w:rPr>
-        <w:t>Delete user:</w:t>
-      </w:r>
-      <w:r>
-        <w:t xml:space="preserve"> Tap the trash icon. You can't delete yourself or the last remaining admin.</w:t>
-      </w:r>
-    </w:p>
-    <w:p>
-      <w:r>
-        <w:rPr>
-          <w:b/>
-        </w:rPr>
-        <w:t>Maintenance — Fix Manual Expiry Dates:</w:t>
-      </w:r>
-    </w:p>
-    <w:p>
-      <w:r>
-        <w:t xml:space="preserve">At the bottom of the User Management page (admins only) is a </w:t>
-      </w:r>
-      <w:r>
-        <w:rPr>
-          <w:b/>
-        </w:rPr>
-        <w:t>Fix Manual Expiry Dates</w:t>
-      </w:r>
-      <w:r>
-        <w:t xml:space="preserve"> button. Older manually-entered items could be saved with an expiration date that displayed one day early. Tap this button once to correct any affected items across the whole system. It's safe to run anytime — it only changes items that still need fixing, and reports how many it corrected.</w:t>
-      </w:r>
-    </w:p>
-    <w:p>
-      <w:pPr>
-        <w:pStyle w:val="Heading1"/>
-      </w:pPr>
-      <w:r>
-        <w:t>Barcode Format Reference</w:t>
-      </w:r>
-    </w:p>
-    <w:p>
-      <w:r>
-        <w:t xml:space="preserve">Nail Tracker reads </w:t>
-      </w:r>
-      <w:r>
-        <w:rPr>
-          <w:b/>
-        </w:rPr>
-        <w:t>GS1-128 barcodes</w:t>
-      </w:r>
-      <w:r>
-        <w:t xml:space="preserve"> — the standard format used on medical device packaging. Each barcode contains several pieces of information identified by a two-digit code called an Application Identifier (AI).</w:t>
-      </w:r>
-    </w:p>
-    <w:p>
-      <w:r>
-        <w:t>| AI Code | What It Contains | Example |</w:t>
-      </w:r>
-    </w:p>
-    <w:p>
-      <w:r>
-        <w:t>|---------|-----------------|---------|</w:t>
-      </w:r>
-    </w:p>
-    <w:p>
-      <w:r>
-        <w:t>| 01 | GTIN (product code, 14 digits) | 08880089459148 |</w:t>
-      </w:r>
-    </w:p>
-    <w:p>
-      <w:r>
-        <w:t>| 10 | Lot number | J250929-L021 |</w:t>
-      </w:r>
-    </w:p>
-    <w:p>
-      <w:r>
-        <w:t>| 17 | Expiry date (YYMMDD format) | 300928 = Sept 28, 2030 |</w:t>
-      </w:r>
-    </w:p>
-    <w:p>
-      <w:r>
-        <w:rPr>
-          <w:b/>
-        </w:rPr>
-        <w:t>What a full barcode string looks like:</w:t>
-      </w:r>
-    </w:p>
-    <w:p>
-      <w:r>
-        <w:rPr>
-          <w:rFonts w:ascii="Consolas" w:hAnsi="Consolas"/>
-        </w:rPr>
-        <w:t>(01)08880089459148(10)J250929-L021(17)300928</w:t>
-      </w:r>
-    </w:p>
-    <w:p>
-      <w:r>
-        <w:t>The app also accepts the raw format without parentheses, and supports an alternate date format (YYYY-MM-DD) used by some label printers.</w:t>
-      </w:r>
-    </w:p>
-    <w:p>
-      <w:r>
-        <w:rPr>
-          <w:b/>
-        </w:rPr>
-        <w:t>Product REF Code Reference:</w:t>
-      </w:r>
-    </w:p>
-    <w:p>
-      <w:r>
-        <w:t>Every Summa Orthopaedics product has a REF code printed on its label. The app uses this code to automatically identify the product name. Here are the prefixes and what they mean:</w:t>
-      </w:r>
-    </w:p>
-    <w:p>
-      <w:r>
-        <w:t>| REF Prefix | Product Type |</w:t>
-      </w:r>
-    </w:p>
-    <w:p>
-      <w:r>
-        <w:t>|------------|-------------|</w:t>
-      </w:r>
-    </w:p>
-    <w:p>
-      <w:r>
-        <w:t>| SO-SPFN | Short Femoral Nail |</w:t>
-      </w:r>
-    </w:p>
-    <w:p>
-      <w:r>
-        <w:t>| SO-LPFN | Long Femoral Nail |</w:t>
-      </w:r>
-    </w:p>
-    <w:p>
-      <w:r>
-        <w:t>| SO-SPFL-N | Lag Screw (Normal) |</w:t>
-      </w:r>
-    </w:p>
-    <w:p>
-      <w:r>
-        <w:t>| SO-SPFL-A | Lag Screw (Anti-Rotation) |</w:t>
-      </w:r>
-    </w:p>
-    <w:p>
-      <w:r>
-        <w:t>| SO-SPFL-T | Lag Screw (Telescopic) |</w:t>
-      </w:r>
-    </w:p>
-    <w:p>
-      <w:r>
-        <w:t>| SO-S50I-SO | Interlocking Screw |</w:t>
-      </w:r>
-    </w:p>
-    <w:p>
-      <w:r>
-        <w:t>| SO-SPFC | Cap Screw |</w:t>
-      </w:r>
-    </w:p>
-    <w:p>
-      <w:r>
-        <w:t>| SO-SPFS | Set Screw |</w:t>
-      </w:r>
-    </w:p>
-    <w:p>
-      <w:r>
-        <w:t>| SO-IS | Interlocking Screw (older label format) |</w:t>
-      </w:r>
-    </w:p>
-    <w:p>
-      <w:r>
-        <w:t>| SO-EC | End Cap (older label format) |</w:t>
-      </w:r>
-    </w:p>
-    <w:p>
-      <w:r>
-        <w:t>| SO-SS | Set Screw (older label format) |</w:t>
-      </w:r>
-    </w:p>
-    <w:p>
-      <w:r>
-        <w:t xml:space="preserve">All 105 Summa Orthopaedics products are in the database. If an item shows up as "Unknown — GTIN: XXXXXXXXXX," it means the product code isn't recognized yet. Use the </w:t>
+        <w:t xml:space="preserve">Open the item's detail page and tap </w:t>
       </w:r>
       <w:r>
         <w:rPr>
@@ -3068,151 +4013,6 @@
         </w:rPr>
         <w:t>Edit</w:t>
       </w:r>
-      <w:r>
-        <w:t xml:space="preserve"> button on that item's detail page to correct it, or let your manager know so it can be added to the database.</w:t>
-      </w:r>
-    </w:p>
-    <w:p>
-      <w:pPr>
-        <w:pStyle w:val="Heading1"/>
-      </w:pPr>
-      <w:r>
-        <w:t>Tips and Troubleshooting</w:t>
-      </w:r>
-    </w:p>
-    <w:p>
-      <w:r>
-        <w:rPr>
-          <w:b/>
-        </w:rPr>
-        <w:t>Barcode won't scan?</w:t>
-      </w:r>
-    </w:p>
-    <w:p>
-      <w:pPr>
-        <w:pStyle w:val="ListBullet"/>
-      </w:pPr>
-      <w:r>
-        <w:t>Make sure there's good lighting — shadows on the barcode cause read failures</w:t>
-      </w:r>
-    </w:p>
-    <w:p>
-      <w:pPr>
-        <w:pStyle w:val="ListBullet"/>
-      </w:pPr>
-      <w:r>
-        <w:t>Hold the phone steady and make sure the whole barcode is in the frame</w:t>
-      </w:r>
-    </w:p>
-    <w:p>
-      <w:pPr>
-        <w:pStyle w:val="ListBullet"/>
-      </w:pPr>
-      <w:r>
-        <w:t xml:space="preserve">Try </w:t>
-      </w:r>
-      <w:r>
-        <w:rPr>
-          <w:b/>
-        </w:rPr>
-        <w:t>Manual Entry</w:t>
-      </w:r>
-      <w:r>
-        <w:t xml:space="preserve"> if the label is damaged or the barcode is smudged</w:t>
-      </w:r>
-    </w:p>
-    <w:p>
-      <w:r>
-        <w:rPr>
-          <w:b/>
-        </w:rPr>
-        <w:t>Item shows up as "Unknown" product?</w:t>
-      </w:r>
-    </w:p>
-    <w:p>
-      <w:pPr>
-        <w:pStyle w:val="ListBullet"/>
-      </w:pPr>
-      <w:r>
-        <w:t>The product code may not be in the database yet</w:t>
-      </w:r>
-    </w:p>
-    <w:p>
-      <w:pPr>
-        <w:pStyle w:val="ListBullet"/>
-      </w:pPr>
-      <w:r>
-        <w:t xml:space="preserve">Tap the item to open its detail page, then tap </w:t>
-      </w:r>
-      <w:r>
-        <w:rPr>
-          <w:b/>
-        </w:rPr>
-        <w:t>Edit</w:t>
-      </w:r>
-      <w:r>
-        <w:t xml:space="preserve"> to assign the correct product label</w:t>
-      </w:r>
-    </w:p>
-    <w:p>
-      <w:pPr>
-        <w:pStyle w:val="ListBullet"/>
-      </w:pPr>
-      <w:r>
-        <w:t>Every edit is logged so there's always a record of what was changed</w:t>
-      </w:r>
-    </w:p>
-    <w:p>
-      <w:r>
-        <w:rPr>
-          <w:b/>
-        </w:rPr>
-        <w:t>Accidentally received the same item twice?</w:t>
-      </w:r>
-    </w:p>
-    <w:p>
-      <w:pPr>
-        <w:pStyle w:val="ListBullet"/>
-      </w:pPr>
-      <w:r>
-        <w:t>If it's genuinely a different physical unit (different box), that's correct — leave both records</w:t>
-      </w:r>
-    </w:p>
-    <w:p>
-      <w:pPr>
-        <w:pStyle w:val="ListBullet"/>
-      </w:pPr>
-      <w:r>
-        <w:t xml:space="preserve">If it was a duplicate scan of the same box, open one of the records and tap </w:t>
-      </w:r>
-      <w:r>
-        <w:rPr>
-          <w:b/>
-        </w:rPr>
-        <w:t>Delete</w:t>
-      </w:r>
-    </w:p>
-    <w:p>
-      <w:r>
-        <w:rPr>
-          <w:b/>
-        </w:rPr>
-        <w:t>Need to correct a lot number or expiry date?</w:t>
-      </w:r>
-    </w:p>
-    <w:p>
-      <w:pPr>
-        <w:pStyle w:val="ListBullet"/>
-      </w:pPr>
-      <w:r>
-        <w:t xml:space="preserve">Open the item's detail page and tap </w:t>
-      </w:r>
-      <w:r>
-        <w:rPr>
-          <w:b/>
-        </w:rPr>
-        <w:t>Edit</w:t>
-      </w:r>
     </w:p>
     <w:p>
       <w:pPr>
@@ -3248,6 +4048,7 @@
       <w:r>
         <w:rPr>
           <w:rFonts w:ascii="Consolas" w:hAnsi="Consolas"/>
+          <w:color w:val="B03060"/>
         </w:rPr>
         <w:t>.xlsx</w:t>
       </w:r>
@@ -3687,6 +4488,7 @@
     <w:qFormat/>
     <w:rsid w:val="00FC693F"/>
     <w:rPr>
+      <w:rFonts w:ascii="Calibri" w:hAnsi="Calibri"/>
       <w:sz w:val="22"/>
     </w:rPr>
   </w:style>

</xml_diff>

<commit_message>
Interactive Repair Barcodes stepper (v3.26)
Repair Barcodes (admin maintenance) now walks the user through each damaged
item one at a time — a Find & Replace–style modal showing stored vs. corrected
lot/expiry/product/item#, with Repair / Skip / Repair all remaining and a
running tally — instead of a single bulk fire-and-forget.

- Server: GET /inventory/reparse-preview (read-only before/after for drifted
  rows) and POST /inventory/reparse-apply { ids } (repairs only chosen ids,
  re-parsed server-side from rawBarcode; idempotent). Shared reparsePatch /
  reparseCandidate helper; backfill-reparse refactored onto it.
- Client: RepairBarcodesModal.tsx stepper; Maintenance button opens it.
- Tests: inventory.reparse.test.ts extended (preview filters to drifted rows
  with before/after; apply repairs chosen ids, 400 on empty, idempotent).
- Version 3.26; changelog (app + root); user guide + regenerated .docx.
</commit_message>
<xml_diff>
--- a/Nail_Tracker_User_Guide.docx
+++ b/Nail_Tracker_User_Guide.docx
@@ -3590,7 +3590,77 @@
         <w:t>Repair Barcodes</w:t>
       </w:r>
       <w:r>
-        <w:t xml:space="preserve"> button. Some items imported from a spreadsheet before a parsing fix had their lot number cut short (for example showing "…-L" instead of the full "…-L170") and an incorrect expiry date. Tap this button once and the app re-reads each item's original barcode and restores the correct lot number and expiration date. It's safe to run anytime — it only changes items that need it, leaves manually-entered items alone, and reports how many it repaired.</w:t>
+        <w:t xml:space="preserve"> button. Some items imported from a spreadsheet before a parsing fix had their lot number cut short (for example showing "…-L" instead of the full "…-L170") and an incorrect expiry date.</w:t>
+      </w:r>
+    </w:p>
+    <w:p>
+      <w:r>
+        <w:t xml:space="preserve">Tap </w:t>
+      </w:r>
+      <w:r>
+        <w:rPr>
+          <w:b/>
+        </w:rPr>
+        <w:t>Repair Barcodes</w:t>
+      </w:r>
+      <w:r>
+        <w:t xml:space="preserve"> and the app finds every item whose stored details don't match its original barcode, then walks you through them </w:t>
+      </w:r>
+      <w:r>
+        <w:rPr>
+          <w:b/>
+        </w:rPr>
+        <w:t>one at a time</w:t>
+      </w:r>
+      <w:r>
+        <w:t xml:space="preserve"> — much like Find &amp; Replace in Word or Excel. For each item you'll see the current value crossed out next to the corrected value (lot, expiry, product, and item number), and you can:</w:t>
+      </w:r>
+    </w:p>
+    <w:p>
+      <w:pPr>
+        <w:pStyle w:val="ListBullet"/>
+      </w:pPr>
+      <w:r>
+        <w:rPr>
+          <w:b/>
+        </w:rPr>
+        <w:t>Repair</w:t>
+      </w:r>
+      <w:r>
+        <w:t xml:space="preserve"> — apply the correction to this item and move to the next</w:t>
+      </w:r>
+    </w:p>
+    <w:p>
+      <w:pPr>
+        <w:pStyle w:val="ListBullet"/>
+      </w:pPr>
+      <w:r>
+        <w:rPr>
+          <w:b/>
+        </w:rPr>
+        <w:t>Skip</w:t>
+      </w:r>
+      <w:r>
+        <w:t xml:space="preserve"> — leave this item as-is and move to the next</w:t>
+      </w:r>
+    </w:p>
+    <w:p>
+      <w:pPr>
+        <w:pStyle w:val="ListBullet"/>
+      </w:pPr>
+      <w:r>
+        <w:rPr>
+          <w:b/>
+        </w:rPr>
+        <w:t>Repair all remaining</w:t>
+      </w:r>
+      <w:r>
+        <w:t xml:space="preserve"> — fix every remaining item at once</w:t>
+      </w:r>
+    </w:p>
+    <w:p>
+      <w:r>
+        <w:t>A running count of repaired/skipped is shown, and a summary appears when you reach the end. Nothing changes until you tap Repair (or Repair all remaining), it only ever touches items that need it, and it leaves manually-entered items alone.</w:t>
       </w:r>
     </w:p>
     <w:p/>

</xml_diff>

<commit_message>
Keep Import from Excel as its own top-level tab on Transfer
Restore Excel import as a dedicated tab alongside the new Manual Transfer
mode (three-way toggle: Pick from list | Manual Transfer | Import from
Excel). Excel and Manual share the same staged preview/commit pipeline, so
nothing about the spreadsheet flow changed — it's just surfaced as its own
tab again for discoverability. Docs updated; user guide .docx regenerated.
</commit_message>
<xml_diff>
--- a/Nail_Tracker_User_Guide.docx
+++ b/Nail_Tracker_User_Guide.docx
@@ -1944,7 +1944,7 @@
         <w:rPr>
           <w:b/>
         </w:rPr>
-        <w:t>Two ways to build a transfer.</w:t>
+        <w:t>Three ways to build a transfer.</w:t>
       </w:r>
       <w:r>
         <w:t xml:space="preserve"> At the top of the Transfer page there's a toggle:</w:t>
@@ -1979,6 +1979,20 @@
       </w:r>
     </w:p>
     <w:p>
+      <w:pPr>
+        <w:pStyle w:val="ListBullet"/>
+      </w:pPr>
+      <w:r>
+        <w:rPr>
+          <w:b/>
+        </w:rPr>
+        <w:t>Import from Excel</w:t>
+      </w:r>
+      <w:r>
+        <w:t xml:space="preserve"> — upload a CSV/Excel file of barcodes. Best for moving many items at once from a spreadsheet.</w:t>
+      </w:r>
+    </w:p>
+    <w:p>
       <w:r>
         <w:br/>
       </w:r>
@@ -2171,7 +2185,7 @@
         <w:rPr>
           <w:b/>
         </w:rPr>
-        <w:t>Manual Transfer (scan, photo, paste, type, or spreadsheet):</w:t>
+        <w:t>Manual Transfer (scan, photo, paste, or type):</w:t>
       </w:r>
     </w:p>
     <w:p>
@@ -2281,20 +2295,6 @@
         <w:rPr>
           <w:b/>
         </w:rPr>
-        <w:t>Import CSV / Excel</w:t>
-      </w:r>
-      <w:r>
-        <w:t xml:space="preserve"> — load a spreadsheet of barcodes (the same as before)</w:t>
-      </w:r>
-    </w:p>
-    <w:p>
-      <w:pPr>
-        <w:pStyle w:val="ListBullet"/>
-      </w:pPr>
-      <w:r>
-        <w:rPr>
-          <w:b/>
-        </w:rPr>
         <w:t>Manual Entry</w:t>
       </w:r>
       <w:r>
@@ -2499,6 +2499,189 @@
       </w:r>
       <w:r>
         <w:t xml:space="preserve"> scan the same item twice and the app correctly stages two units — and if the source only has one, the second is flagged "Not in stock" rather than double-counting.</w:t>
+      </w:r>
+    </w:p>
+    <w:p>
+      <w:r>
+        <w:br/>
+      </w:r>
+    </w:p>
+    <w:p>
+      <w:r>
+        <w:rPr>
+          <w:b/>
+        </w:rPr>
+        <w:t>Import from Excel (move many items from a spreadsheet):</w:t>
+      </w:r>
+    </w:p>
+    <w:p>
+      <w:r>
+        <w:t xml:space="preserve">When you have a spreadsheet of barcodes and need to move a lot of items at once, use the </w:t>
+      </w:r>
+      <w:r>
+        <w:rPr>
+          <w:b/>
+        </w:rPr>
+        <w:t>Import from Excel</w:t>
+      </w:r>
+      <w:r>
+        <w:t xml:space="preserve"> tab instead of adding them one by one.</w:t>
+      </w:r>
+    </w:p>
+    <w:p>
+      <w:pPr>
+        <w:pStyle w:val="ListNumber"/>
+      </w:pPr>
+      <w:r>
+        <w:t xml:space="preserve">Pick the </w:t>
+      </w:r>
+      <w:r>
+        <w:rPr>
+          <w:b/>
+        </w:rPr>
+        <w:t>From</w:t>
+      </w:r>
+      <w:r>
+        <w:t xml:space="preserve"> and </w:t>
+      </w:r>
+      <w:r>
+        <w:rPr>
+          <w:b/>
+        </w:rPr>
+        <w:t>To</w:t>
+      </w:r>
+      <w:r>
+        <w:t xml:space="preserve"> distributors</w:t>
+      </w:r>
+    </w:p>
+    <w:p>
+      <w:pPr>
+        <w:pStyle w:val="ListNumber"/>
+      </w:pPr>
+      <w:r>
+        <w:t xml:space="preserve">Tap the </w:t>
+      </w:r>
+      <w:r>
+        <w:rPr>
+          <w:b/>
+        </w:rPr>
+        <w:t>Import from Excel</w:t>
+      </w:r>
+      <w:r>
+        <w:t xml:space="preserve"> tab, then </w:t>
+      </w:r>
+      <w:r>
+        <w:rPr>
+          <w:b/>
+        </w:rPr>
+        <w:t>Choose CSV / Excel file</w:t>
+      </w:r>
+    </w:p>
+    <w:p>
+      <w:pPr>
+        <w:pStyle w:val="ListNumber"/>
+      </w:pPr>
+      <w:r>
+        <w:t xml:space="preserve">The app reads every barcode and checks it against the </w:t>
+      </w:r>
+      <w:r>
+        <w:rPr>
+          <w:b/>
+        </w:rPr>
+        <w:t>From</w:t>
+      </w:r>
+      <w:r>
+        <w:t xml:space="preserve"> distributor's stock, showing one row per barcode with the same </w:t>
+      </w:r>
+      <w:r>
+        <w:rPr>
+          <w:b/>
+        </w:rPr>
+        <w:t>Ready / Not in stock / Error</w:t>
+      </w:r>
+      <w:r>
+        <w:t xml:space="preserve"> badges as Manual Transfer</w:t>
+      </w:r>
+    </w:p>
+    <w:p>
+      <w:pPr>
+        <w:pStyle w:val="ListNumber"/>
+      </w:pPr>
+      <w:r>
+        <w:t xml:space="preserve">Handle any </w:t>
+      </w:r>
+      <w:r>
+        <w:rPr>
+          <w:b/>
+        </w:rPr>
+        <w:t>Not in stock</w:t>
+      </w:r>
+      <w:r>
+        <w:t xml:space="preserve"> rows with </w:t>
+      </w:r>
+      <w:r>
+        <w:rPr>
+          <w:b/>
+        </w:rPr>
+        <w:t>Add to source</w:t>
+      </w:r>
+      <w:r>
+        <w:t xml:space="preserve">, </w:t>
+      </w:r>
+      <w:r>
+        <w:rPr>
+          <w:b/>
+        </w:rPr>
+        <w:t>Skip</w:t>
+      </w:r>
+      <w:r>
+        <w:t xml:space="preserve">, or </w:t>
+      </w:r>
+      <w:r>
+        <w:rPr>
+          <w:b/>
+        </w:rPr>
+        <w:t>Add all missing items to source &amp; include</w:t>
+      </w:r>
+      <w:r>
+        <w:t xml:space="preserve"> — exactly as in Manual Transfer</w:t>
+      </w:r>
+    </w:p>
+    <w:p>
+      <w:pPr>
+        <w:pStyle w:val="ListNumber"/>
+      </w:pPr>
+      <w:r>
+        <w:t xml:space="preserve">Tap </w:t>
+      </w:r>
+      <w:r>
+        <w:rPr>
+          <w:b/>
+        </w:rPr>
+        <w:t>Review Transfer</w:t>
+      </w:r>
+      <w:r>
+        <w:t xml:space="preserve">, then </w:t>
+      </w:r>
+      <w:r>
+        <w:rPr>
+          <w:b/>
+        </w:rPr>
+        <w:t>Confirm Transfer</w:t>
+      </w:r>
+    </w:p>
+    <w:p>
+      <w:pPr>
+        <w:pStyle w:val="IntenseQuote"/>
+      </w:pPr>
+      <w:r>
+        <w:rPr>
+          <w:b/>
+        </w:rPr>
+        <w:t>Mix and match:</w:t>
+      </w:r>
+      <w:r>
+        <w:t xml:space="preserve"> items you scan or type in Manual Transfer and rows from a spreadsheet feed the same staged list, so you can combine them in one transfer if you like.</w:t>
       </w:r>
     </w:p>
     <w:p>

</xml_diff>

<commit_message>
Add admin-only TrackerLabs section (v3.32)
Introduce TrackerLabs, a gated space for features that are still in testing.
Adds a new admin-only nav group (filtered in Layout via buildMoreGroups), an
AdminRoute guard that redirects non-admins away from /labs URLs, a hub page
listing upcoming Beta experiments, and ComingSoon placeholders for the
Par Levels and Cycle Count features that ship next.

Bump to v3.32; update changelog, in-app changelog, user guide and Word doc.
</commit_message>
<xml_diff>
--- a/Nail_Tracker_User_Guide.docx
+++ b/Nail_Tracker_User_Guide.docx
@@ -15,7 +15,7 @@
         <w:rPr>
           <w:b/>
         </w:rPr>
-        <w:t>Version 3.31</w:t>
+        <w:t>Version 3.32</w:t>
       </w:r>
       <w:r>
         <w:t xml:space="preserve"> | Summa Orthopaedics Inventory Management System</w:t>
@@ -358,7 +358,16 @@
         <w:t>Admin</w:t>
       </w:r>
       <w:r>
-        <w:t xml:space="preserve"> (User Management). All reports and histories — including Usage History and Transfer History — live under </w:t>
+        <w:t xml:space="preserve"> (User Management). Admins also see a </w:t>
+      </w:r>
+      <w:r>
+        <w:rPr>
+          <w:b/>
+        </w:rPr>
+        <w:t>TrackerLabs</w:t>
+      </w:r>
+      <w:r>
+        <w:t xml:space="preserve"> group for features in testing. All reports and histories — including Usage History and Transfer History — live under </w:t>
       </w:r>
       <w:r>
         <w:rPr>
@@ -4096,6 +4105,102 @@
     <w:p>
       <w:r>
         <w:t>A running count of repaired/skipped is shown, and a summary appears when you reach the end. Nothing changes until you tap Repair (or Repair all remaining), it only ever touches items that need it, and it leaves manually-entered items alone.</w:t>
+      </w:r>
+    </w:p>
+    <w:p>
+      <w:r>
+        <w:br/>
+      </w:r>
+    </w:p>
+    <w:p>
+      <w:pPr>
+        <w:pStyle w:val="Heading3"/>
+      </w:pPr>
+      <w:r>
+        <w:t>TrackerLabs (Beta — Admins Only)</w:t>
+      </w:r>
+    </w:p>
+    <w:p>
+      <w:r>
+        <w:rPr>
+          <w:b/>
+        </w:rPr>
+        <w:t>Where to go:</w:t>
+      </w:r>
+      <w:r>
+        <w:t xml:space="preserve"> Tap </w:t>
+      </w:r>
+      <w:r>
+        <w:rPr>
+          <w:b/>
+        </w:rPr>
+        <w:t>More</w:t>
+      </w:r>
+      <w:r>
+        <w:t xml:space="preserve"> → </w:t>
+      </w:r>
+      <w:r>
+        <w:rPr>
+          <w:b/>
+        </w:rPr>
+        <w:t>TrackerLabs</w:t>
+      </w:r>
+      <w:r>
+        <w:t xml:space="preserve"> *(only visible to admins)*</w:t>
+      </w:r>
+    </w:p>
+    <w:p>
+      <w:r>
+        <w:t xml:space="preserve">TrackerLabs is a dedicated space for </w:t>
+      </w:r>
+      <w:r>
+        <w:rPr>
+          <w:b/>
+        </w:rPr>
+        <w:t>new features that are still being tested</w:t>
+      </w:r>
+      <w:r>
+        <w:t xml:space="preserve">. Features here are marked with a </w:t>
+      </w:r>
+      <w:r>
+        <w:rPr>
+          <w:b/>
+        </w:rPr>
+        <w:t>Beta</w:t>
+      </w:r>
+      <w:r>
+        <w:t xml:space="preserve"> badge, are only visible to admins, and may change as we refine them based on your feedback. When a feature is solid, it graduates out of TrackerLabs into the main menu.</w:t>
+      </w:r>
+    </w:p>
+    <w:p>
+      <w:r>
+        <w:t xml:space="preserve">Open TrackerLabs to see the current experiments. Each one has its own help banner explaining how it works. The first experiments arriving here are </w:t>
+      </w:r>
+      <w:r>
+        <w:rPr>
+          <w:b/>
+        </w:rPr>
+        <w:t>Par Levels &amp; Reorder</w:t>
+      </w:r>
+      <w:r>
+        <w:t xml:space="preserve"> (set minimum stock levels and get a reorder report) and </w:t>
+      </w:r>
+      <w:r>
+        <w:rPr>
+          <w:b/>
+        </w:rPr>
+        <w:t>Cycle Count</w:t>
+      </w:r>
+      <w:r>
+        <w:t xml:space="preserve"> (scan a distributor's shelf and reconcile it against the system).</w:t>
+      </w:r>
+    </w:p>
+    <w:p>
+      <w:pPr>
+        <w:pStyle w:val="IntenseQuote"/>
+      </w:pPr>
+      <w:r>
+        <w:t>Because TrackerLabs features are in testing, try them on real data with a little caution and let us know what's working or what feels off — that feedback is exactly what shapes the final version.</w:t>
       </w:r>
     </w:p>
     <w:p>

</xml_diff>

<commit_message>
Add Par Levels & Reorder Report (TrackerLabs, v3.33)
First TrackerLabs feature. Admins set a minimum stock level per item — a
global default plus optional per-distributor overrides — backed by a new
ParLevel table (migration 0007). The Reorder Report lists everything below
par by distributor with a suggested order quantity (par - on hand) and recent
monthly usage for context, with search, distributor filter, and Excel export.

Server: parlevel.controller (list/upsert/reorder/export) + /api/par-levels
route behind authMiddleware + adminOnly; pure helper utils/parLevels.ts
(effectivePar, buildReorderRows) with 8 tests. Reorder aggregation reuses the
stockByItem pivot and usageReport windowing.

Bump to v3.33; update changelog, in-app changelog, user guide and Word doc.
</commit_message>
<xml_diff>
--- a/Nail_Tracker_User_Guide.docx
+++ b/Nail_Tracker_User_Guide.docx
@@ -15,7 +15,7 @@
         <w:rPr>
           <w:b/>
         </w:rPr>
-        <w:t>Version 3.32</w:t>
+        <w:t>Version 3.33</w:t>
       </w:r>
       <w:r>
         <w:t xml:space="preserve"> | Summa Orthopaedics Inventory Management System</w:t>
@@ -4174,25 +4174,143 @@
     </w:p>
     <w:p>
       <w:r>
-        <w:t xml:space="preserve">Open TrackerLabs to see the current experiments. Each one has its own help banner explaining how it works. The first experiments arriving here are </w:t>
-      </w:r>
+        <w:t>Open TrackerLabs to see the current experiments. Each one has its own help banner explaining how it works.</w:t>
+      </w:r>
+    </w:p>
+    <w:p>
+      <w:pPr>
+        <w:pStyle w:val="IntenseQuote"/>
+      </w:pPr>
+      <w:r>
+        <w:t>Because TrackerLabs features are in testing, try them on real data with a little caution and let us know what's working or what feels off — that feedback is exactly what shapes the final version.</w:t>
+      </w:r>
+    </w:p>
+    <w:p>
       <w:r>
         <w:rPr>
           <w:b/>
         </w:rPr>
-        <w:t>Par Levels &amp; Reorder</w:t>
-      </w:r>
-      <w:r>
-        <w:t xml:space="preserve"> (set minimum stock levels and get a reorder report) and </w:t>
+        <w:t>Par Levels &amp; Reorder (Beta):</w:t>
+      </w:r>
+    </w:p>
+    <w:p>
+      <w:r>
+        <w:t>This experiment helps you answer "what do I need to order?" instead of just "what do I have?"</w:t>
+      </w:r>
+    </w:p>
+    <w:p>
+      <w:pPr>
+        <w:pStyle w:val="ListNumber"/>
+      </w:pPr>
+      <w:r>
+        <w:t xml:space="preserve">From TrackerLabs, open </w:t>
       </w:r>
       <w:r>
         <w:rPr>
           <w:b/>
         </w:rPr>
-        <w:t>Cycle Count</w:t>
-      </w:r>
-      <w:r>
-        <w:t xml:space="preserve"> (scan a distributor's shelf and reconcile it against the system).</w:t>
+        <w:t>Par Levels</w:t>
+      </w:r>
+    </w:p>
+    <w:p>
+      <w:pPr>
+        <w:pStyle w:val="ListNumber"/>
+      </w:pPr>
+      <w:r>
+        <w:t xml:space="preserve">For each item, set a </w:t>
+      </w:r>
+      <w:r>
+        <w:rPr>
+          <w:b/>
+        </w:rPr>
+        <w:t>Global</w:t>
+      </w:r>
+      <w:r>
+        <w:t xml:space="preserve"> minimum — the stock level you want to keep at every distributor</w:t>
+      </w:r>
+    </w:p>
+    <w:p>
+      <w:pPr>
+        <w:pStyle w:val="ListNumber"/>
+      </w:pPr>
+      <w:r>
+        <w:t xml:space="preserve">To fine-tune a specific site, expand the item and set a </w:t>
+      </w:r>
+      <w:r>
+        <w:rPr>
+          <w:b/>
+        </w:rPr>
+        <w:t>per-distributor override</w:t>
+      </w:r>
+      <w:r>
+        <w:t xml:space="preserve"> (a site that needs more or fewer than the global). Leave a field blank or 0 to clear it — values save automatically as you move off each field</w:t>
+      </w:r>
+    </w:p>
+    <w:p>
+      <w:pPr>
+        <w:pStyle w:val="ListNumber"/>
+      </w:pPr>
+      <w:r>
+        <w:t xml:space="preserve">Open the </w:t>
+      </w:r>
+      <w:r>
+        <w:rPr>
+          <w:b/>
+        </w:rPr>
+        <w:t>Reorder Report</w:t>
+      </w:r>
+      <w:r>
+        <w:t xml:space="preserve"> to see every item that's below its par, grouped by distributor</w:t>
+      </w:r>
+    </w:p>
+    <w:p>
+      <w:r>
+        <w:t xml:space="preserve">The Reorder Report shows, for each low item: how many are </w:t>
+      </w:r>
+      <w:r>
+        <w:rPr>
+          <w:b/>
+        </w:rPr>
+        <w:t>on hand</w:t>
+      </w:r>
+      <w:r>
+        <w:t xml:space="preserve">, the </w:t>
+      </w:r>
+      <w:r>
+        <w:rPr>
+          <w:b/>
+        </w:rPr>
+        <w:t>par</w:t>
+      </w:r>
+      <w:r>
+        <w:t xml:space="preserve"> level, a </w:t>
+      </w:r>
+      <w:r>
+        <w:rPr>
+          <w:b/>
+        </w:rPr>
+        <w:t>suggested order</w:t>
+      </w:r>
+      <w:r>
+        <w:t xml:space="preserve"> quantity (how many to bring it back up to par), and the recent </w:t>
+      </w:r>
+      <w:r>
+        <w:rPr>
+          <w:b/>
+        </w:rPr>
+        <w:t>usage per month</w:t>
+      </w:r>
+      <w:r>
+        <w:t xml:space="preserve"> for context. You can search, filter to one distributor, and </w:t>
+      </w:r>
+      <w:r>
+        <w:rPr>
+          <w:b/>
+        </w:rPr>
+        <w:t>download the report as an Excel file</w:t>
+      </w:r>
+      <w:r>
+        <w:t xml:space="preserve"> to use as an order sheet.</w:t>
       </w:r>
     </w:p>
     <w:p>
@@ -4200,7 +4318,7 @@
         <w:pStyle w:val="IntenseQuote"/>
       </w:pPr>
       <w:r>
-        <w:t>Because TrackerLabs features are in testing, try them on real data with a little caution and let us know what's working or what feels off — that feedback is exactly what shapes the final version.</w:t>
+        <w:t>Par levels apply to distributors (the field sites you replenish), not to Home Office — Home Office is the warehouse you reorder into.</w:t>
       </w:r>
     </w:p>
     <w:p>

</xml_diff>

<commit_message>
Add Cycle Count / Physical Audit (TrackerLabs, v3.34)
Second TrackerLabs feature. Pick a distributor, scan the shelf, and reconcile
against the system into matched / missing / extra. Resolve discrepancies in one
step — add extras as stock, remove missing units — saved as an AuditSession
(AUD-…) viewable under Audit History. Migration 0008.

Server: audit.controller (preview/commit/list + generateAuditId) + /api/audits
behind authMiddleware + adminOnly. Commit applies all fixes in one
$transaction, re-scoping missing removals to units still present. Pure helper
utils/auditReconcile.ts (FIFO match, per-request claim) with 6 tests; commit
with 6 controller tests. Reuses parseGS1, BarcodeScanner, Usage preview/commit
shape. Removed the now-unused ComingSoon placeholder.

Bump to v3.34; update changelog, in-app changelog, user guide and Word doc.
</commit_message>
<xml_diff>
--- a/Nail_Tracker_User_Guide.docx
+++ b/Nail_Tracker_User_Guide.docx
@@ -15,7 +15,7 @@
         <w:rPr>
           <w:b/>
         </w:rPr>
-        <w:t>Version 3.33</w:t>
+        <w:t>Version 3.34</w:t>
       </w:r>
       <w:r>
         <w:t xml:space="preserve"> | Summa Orthopaedics Inventory Management System</w:t>
@@ -4319,6 +4319,206 @@
       </w:pPr>
       <w:r>
         <w:t>Par levels apply to distributors (the field sites you replenish), not to Home Office — Home Office is the warehouse you reorder into.</w:t>
+      </w:r>
+    </w:p>
+    <w:p>
+      <w:r>
+        <w:rPr>
+          <w:b/>
+        </w:rPr>
+        <w:t>Cycle Count (Beta):</w:t>
+      </w:r>
+    </w:p>
+    <w:p>
+      <w:r>
+        <w:t>This experiment lets you verify the system against the physical shelf, so the numbers in Nail Tracker stay honest.</w:t>
+      </w:r>
+    </w:p>
+    <w:p>
+      <w:pPr>
+        <w:pStyle w:val="ListNumber"/>
+      </w:pPr>
+      <w:r>
+        <w:t xml:space="preserve">From TrackerLabs, open </w:t>
+      </w:r>
+      <w:r>
+        <w:rPr>
+          <w:b/>
+        </w:rPr>
+        <w:t>Cycle Count</w:t>
+      </w:r>
+    </w:p>
+    <w:p>
+      <w:pPr>
+        <w:pStyle w:val="ListNumber"/>
+      </w:pPr>
+      <w:r>
+        <w:t xml:space="preserve">Choose the </w:t>
+      </w:r>
+      <w:r>
+        <w:rPr>
+          <w:b/>
+        </w:rPr>
+        <w:t>distributor</w:t>
+      </w:r>
+      <w:r>
+        <w:t xml:space="preserve"> you're counting</w:t>
+      </w:r>
+    </w:p>
+    <w:p>
+      <w:pPr>
+        <w:pStyle w:val="ListNumber"/>
+      </w:pPr>
+      <w:r>
+        <w:rPr>
+          <w:b/>
+        </w:rPr>
+        <w:t>Scan everything physically on the shelf</w:t>
+      </w:r>
+      <w:r>
+        <w:t xml:space="preserve"> (use the camera, or type/paste barcodes for anything that won't scan)</w:t>
+      </w:r>
+    </w:p>
+    <w:p>
+      <w:pPr>
+        <w:pStyle w:val="ListNumber"/>
+      </w:pPr>
+      <w:r>
+        <w:t xml:space="preserve">Tap </w:t>
+      </w:r>
+      <w:r>
+        <w:rPr>
+          <w:b/>
+        </w:rPr>
+        <w:t>Review count</w:t>
+      </w:r>
+      <w:r>
+        <w:t>. The app reconciles your scans against what the system says that distributor has, and sorts everything into three groups:</w:t>
+      </w:r>
+    </w:p>
+    <w:p>
+      <w:pPr>
+        <w:pStyle w:val="ListBullet"/>
+      </w:pPr>
+      <w:r>
+        <w:rPr>
+          <w:b/>
+        </w:rPr>
+        <w:t>Matched</w:t>
+      </w:r>
+      <w:r>
+        <w:t xml:space="preserve"> — scanned items the system already knew about (nothing to do)</w:t>
+      </w:r>
+    </w:p>
+    <w:p>
+      <w:pPr>
+        <w:pStyle w:val="ListBullet"/>
+      </w:pPr>
+      <w:r>
+        <w:rPr>
+          <w:b/>
+        </w:rPr>
+        <w:t>Missing</w:t>
+      </w:r>
+      <w:r>
+        <w:t xml:space="preserve"> — items the system has at this site but that you didn't scan (maybe they're gone)</w:t>
+      </w:r>
+    </w:p>
+    <w:p>
+      <w:pPr>
+        <w:pStyle w:val="ListBullet"/>
+      </w:pPr>
+      <w:r>
+        <w:rPr>
+          <w:b/>
+        </w:rPr>
+        <w:t>Extra</w:t>
+      </w:r>
+      <w:r>
+        <w:t xml:space="preserve"> — items you scanned that the system doesn't have here (untracked stock)</w:t>
+      </w:r>
+    </w:p>
+    <w:p>
+      <w:pPr>
+        <w:pStyle w:val="ListNumber"/>
+      </w:pPr>
+      <w:r>
+        <w:t xml:space="preserve">Resolve the differences: check the </w:t>
+      </w:r>
+      <w:r>
+        <w:rPr>
+          <w:b/>
+        </w:rPr>
+        <w:t>Extra</w:t>
+      </w:r>
+      <w:r>
+        <w:t xml:space="preserve"> items you want to </w:t>
+      </w:r>
+      <w:r>
+        <w:rPr>
+          <w:b/>
+        </w:rPr>
+        <w:t>add</w:t>
+      </w:r>
+      <w:r>
+        <w:t xml:space="preserve"> as stock at this distributor, and check the </w:t>
+      </w:r>
+      <w:r>
+        <w:rPr>
+          <w:b/>
+        </w:rPr>
+        <w:t>Missing</w:t>
+      </w:r>
+      <w:r>
+        <w:t xml:space="preserve"> items you want to </w:t>
+      </w:r>
+      <w:r>
+        <w:rPr>
+          <w:b/>
+        </w:rPr>
+        <w:t>remove</w:t>
+      </w:r>
+      <w:r>
+        <w:t xml:space="preserve"> from inventory</w:t>
+      </w:r>
+    </w:p>
+    <w:p>
+      <w:pPr>
+        <w:pStyle w:val="ListNumber"/>
+      </w:pPr>
+      <w:r>
+        <w:t xml:space="preserve">Tap </w:t>
+      </w:r>
+      <w:r>
+        <w:rPr>
+          <w:b/>
+        </w:rPr>
+        <w:t>Finish</w:t>
+      </w:r>
+      <w:r>
+        <w:t>. Your fixes are applied together, and the count is saved as an audit record</w:t>
+      </w:r>
+    </w:p>
+    <w:p>
+      <w:r>
+        <w:t xml:space="preserve">You can review every past count under </w:t>
+      </w:r>
+      <w:r>
+        <w:rPr>
+          <w:b/>
+        </w:rPr>
+        <w:t>Audit History</w:t>
+      </w:r>
+      <w:r>
+        <w:t>, each with its own ID (AUD-…) and a breakdown of how many items were matched, added, and removed.</w:t>
+      </w:r>
+    </w:p>
+    <w:p>
+      <w:pPr>
+        <w:pStyle w:val="IntenseQuote"/>
+      </w:pPr>
+      <w:r>
+        <w:t>Removing a "missing" item doesn't delete its history — the record of where it had been is kept. And if a unit gets used or moved between Review and Finish, the app won't remove it by mistake.</w:t>
       </w:r>
     </w:p>
     <w:p>

</xml_diff>

<commit_message>
Add OCR debug toggle to the photo scanner (v3.37)
When a text-only implant sticker won't read, there's now a small "OCR
debug" switch beneath the Take Photo / Upload Photo buttons. With it on,
each photo shows the exact raw text Tesseract read, how many labels were
parsed from it, and a Copy button — so an unreadable sticker can be
reported with the real OCR output to tune the patterns.

- ocrBarcode: capture the last raw OCR text; expose getLastOcrText().
- BarcodeScanner: persisted toggle (localStorage 'ocrDebug') + debug
  panel; benefits Usage, Receive, and Transfer (shared scanner).
- Docs: version 3.37, CHANGELOG, in-app changelog, USER_GUIDE
  troubleshooting note + regenerated .docx.

https://claude.ai/code/session_01DpEkPqTrJPSNPeh9KWpcbk
</commit_message>
<xml_diff>
--- a/Nail_Tracker_User_Guide.docx
+++ b/Nail_Tracker_User_Guide.docx
@@ -15,7 +15,7 @@
         <w:rPr>
           <w:b/>
         </w:rPr>
-        <w:t>Version 3.36</w:t>
+        <w:t>Version 3.37</w:t>
       </w:r>
       <w:r>
         <w:t xml:space="preserve"> | Summa Orthopaedics Inventory Management System</w:t>
@@ -4340,6 +4340,65 @@
       </w:r>
       <w:r>
         <w:t xml:space="preserve"> if the label is damaged or the barcode is smudged</w:t>
+      </w:r>
+    </w:p>
+    <w:p>
+      <w:r>
+        <w:rPr>
+          <w:b/>
+        </w:rPr>
+        <w:t>A text-only sticker won't read?</w:t>
+      </w:r>
+    </w:p>
+    <w:p>
+      <w:pPr>
+        <w:pStyle w:val="ListBullet"/>
+      </w:pPr>
+      <w:r>
+        <w:t>Take a sharper, well-lit photo of just that one label, then try again</w:t>
+      </w:r>
+    </w:p>
+    <w:p>
+      <w:pPr>
+        <w:pStyle w:val="ListBullet"/>
+      </w:pPr>
+      <w:r>
+        <w:t xml:space="preserve">Use </w:t>
+      </w:r>
+      <w:r>
+        <w:rPr>
+          <w:b/>
+        </w:rPr>
+        <w:t>Enter from the label</w:t>
+      </w:r>
+      <w:r>
+        <w:t xml:space="preserve"> (on the Usage page) to type the item number, lot, and expiry directly</w:t>
+      </w:r>
+    </w:p>
+    <w:p>
+      <w:pPr>
+        <w:pStyle w:val="ListBullet"/>
+      </w:pPr>
+      <w:r>
+        <w:t xml:space="preserve">To help us improve reading, turn on the small </w:t>
+      </w:r>
+      <w:r>
+        <w:rPr>
+          <w:b/>
+        </w:rPr>
+        <w:t>OCR debug</w:t>
+      </w:r>
+      <w:r>
+        <w:t xml:space="preserve"> switch beneath the photo buttons, retake the photo, and tap </w:t>
+      </w:r>
+      <w:r>
+        <w:rPr>
+          <w:b/>
+        </w:rPr>
+        <w:t>Copy</w:t>
+      </w:r>
+      <w:r>
+        <w:t xml:space="preserve"> — that copies the exact text the app read off the label so you can send it to your administrator</w:t>
       </w:r>
     </w:p>
     <w:p>

</xml_diff>

<commit_message>
Add Who Has What report to TrackerLabs (v3.43)
See who holds each item, grouped by distributor, with an optional
point-in-time "as of a date" mode reconstructed from assignment history.

- server: pure helper holdings.ts (holdingsAsOf, groupHoldings) + 8 unit
  tests; holdings.controller.ts + routes/holdings.ts at /api/holdings.
  AssignmentHistory is not a complete ledger, so past locations fall back
  to current location when no placement row exists; usage/removal rows are
  not treated as placements.
- client: labs/WhoHasWhat.tsx (mode toggle, date picker, grouped cards,
  search, Excel export) + api/holdings.ts, linked from Labs hub.
- docs: version 3.43, changelog, CHANGELOG.md, USER_GUIDE.md + .docx

Co-Authored-By: Claude <noreply@anthropic.com>
</commit_message>
<xml_diff>
--- a/Nail_Tracker_User_Guide.docx
+++ b/Nail_Tracker_User_Guide.docx
@@ -15,7 +15,7 @@
         <w:rPr>
           <w:b/>
         </w:rPr>
-        <w:t>Version 3.42</w:t>
+        <w:t>Version 3.43</w:t>
       </w:r>
       <w:r>
         <w:t xml:space="preserve"> | Summa Orthopaedics Inventory Management System</w:t>
@@ -4552,6 +4552,101 @@
       </w:r>
       <w:r>
         <w:t xml:space="preserve"> into the system. The backup deliberately includes items that have since been used, transferred, or removed — so it's a true record of everything that came in during that window, not just what's on the shelf today.</w:t>
+      </w:r>
+    </w:p>
+    <w:p>
+      <w:r>
+        <w:rPr>
+          <w:b/>
+        </w:rPr>
+        <w:t>Who Has What (Beta):</w:t>
+      </w:r>
+    </w:p>
+    <w:p>
+      <w:r>
+        <w:t>This experiment answers a simple question: who is holding what, right now — or at any point in the past?</w:t>
+      </w:r>
+    </w:p>
+    <w:p>
+      <w:pPr>
+        <w:pStyle w:val="ListNumber"/>
+      </w:pPr>
+      <w:r>
+        <w:t xml:space="preserve">From TrackerLabs, open </w:t>
+      </w:r>
+      <w:r>
+        <w:rPr>
+          <w:b/>
+        </w:rPr>
+        <w:t>Who Has What</w:t>
+      </w:r>
+    </w:p>
+    <w:p>
+      <w:pPr>
+        <w:pStyle w:val="ListNumber"/>
+      </w:pPr>
+      <w:r>
+        <w:t xml:space="preserve">In </w:t>
+      </w:r>
+      <w:r>
+        <w:rPr>
+          <w:b/>
+        </w:rPr>
+        <w:t>Current</w:t>
+      </w:r>
+      <w:r>
+        <w:t xml:space="preserve"> mode, you'll see every in-stock item grouped by distributor (and Home Office), with a count on each group. Tap a group to expand or collapse its items</w:t>
+      </w:r>
+    </w:p>
+    <w:p>
+      <w:pPr>
+        <w:pStyle w:val="ListNumber"/>
+      </w:pPr>
+      <w:r>
+        <w:t xml:space="preserve">Switch to </w:t>
+      </w:r>
+      <w:r>
+        <w:rPr>
+          <w:b/>
+        </w:rPr>
+        <w:t>As of a date</w:t>
+      </w:r>
+      <w:r>
+        <w:t xml:space="preserve"> and pick a date to reconstruct who held what on that day</w:t>
+      </w:r>
+    </w:p>
+    <w:p>
+      <w:pPr>
+        <w:pStyle w:val="ListNumber"/>
+      </w:pPr>
+      <w:r>
+        <w:t xml:space="preserve">Use the </w:t>
+      </w:r>
+      <w:r>
+        <w:rPr>
+          <w:b/>
+        </w:rPr>
+        <w:t>search</w:t>
+      </w:r>
+      <w:r>
+        <w:t xml:space="preserve"> box to narrow to an item number or product, and </w:t>
+      </w:r>
+      <w:r>
+        <w:rPr>
+          <w:b/>
+        </w:rPr>
+        <w:t>Excel</w:t>
+      </w:r>
+      <w:r>
+        <w:t xml:space="preserve"> to export the list</w:t>
+      </w:r>
+    </w:p>
+    <w:p>
+      <w:pPr>
+        <w:pStyle w:val="IntenseQuote"/>
+      </w:pPr>
+      <w:r>
+        <w:t>The "As of a date" view is reconstructed from each item's movement history. Items that were never moved are shown at their current location. It's a close reconstruction for past dates, not a guaranteed exact snapshot.</w:t>
       </w:r>
     </w:p>
     <w:p>

</xml_diff>